<commit_message>
docs: findings updated to 42 bugs
Co-Authored-By: Claude Opus 5.5 <noreply@anthropic.com>
Claude-Session: https://claude.ai/code/session_01K8DcCP55saEV5T8kmUUQcb
</commit_message>
<xml_diff>
--- a/docs/audit/FilsPay_Findings.docx
+++ b/docs/audit/FilsPay_Findings.docx
@@ -38,7 +38,7 @@
         <w:spacing w:after="120" w:before="200"/>
       </w:pPr>
       <w:r>
-        <w:t xml:space="preserve">Summary: 36 bugs found and fixed, plus the refunds feature</w:t>
+        <w:t xml:space="preserve">Summary: 42 bugs found and fixed, plus the refunds feature</w:t>
       </w:r>
     </w:p>
     <w:p>
@@ -49,7 +49,7 @@
         <w:rPr>
           <w:color w:val="595959"/>
         </w:rPr>
-        <w:t xml:space="preserve">Every fix is covered by an automated test run against a real Postgres 16 database. Where it matters most, the new test was also run against the ORIGINAL code to prove it catches the bug. Final runs: API 377/377, settlement (Go) all packages, reporting 11/11, money 40/40, events 4/4, scripts 7/7.</w:t>
+        <w:t xml:space="preserve">Every fix is covered by an automated test run against a real Postgres 16 database. Where it matters most, the new test was also run against the ORIGINAL code to prove it catches the bug. Final runs: API 381/381, settlement (Go) all packages, reporting 12/12, money 40/40, events 4/4, scripts 7/7.</w:t>
       </w:r>
     </w:p>
     <w:tbl>
@@ -2399,6 +2399,374 @@
                 <w:sz w:val="20"/>
                 <w:szCs w:val="20"/>
               </w:rPr>
+              <w:t xml:space="preserve">37</w:t>
+            </w:r>
+          </w:p>
+        </w:tc>
+        <w:tc>
+          <w:tcPr>
+            <w:tcW w:type="dxa" w:w="6226"/>
+            <w:tcBorders>
+              <w:top w:val="single" w:color="BFBFBF" w:sz="4"/>
+              <w:left w:val="single" w:color="BFBFBF" w:sz="4"/>
+              <w:bottom w:val="single" w:color="BFBFBF" w:sz="4"/>
+              <w:right w:val="single" w:color="BFBFBF" w:sz="4"/>
+            </w:tcBorders>
+            <w:tcMar>
+              <w:top w:type="dxa" w:w="80"/>
+              <w:left w:type="dxa" w:w="120"/>
+              <w:bottom w:type="dxa" w:w="80"/>
+              <w:right w:type="dxa" w:w="120"/>
+            </w:tcMar>
+          </w:tcPr>
+          <w:p>
+            <w:r>
+              <w:rPr>
+                <w:b w:val="false"/>
+                <w:bCs w:val="false"/>
+                <w:i w:val="false"/>
+                <w:iCs w:val="false"/>
+                <w:sz w:val="20"/>
+                <w:szCs w:val="20"/>
+              </w:rPr>
+              <w:t xml:space="preserve">Admin impersonation could act as the merchant owner, and outlived disabled admins</w:t>
+            </w:r>
+          </w:p>
+        </w:tc>
+        <w:tc>
+          <w:tcPr>
+            <w:tcW w:type="dxa" w:w="2100"/>
+            <w:tcBorders>
+              <w:top w:val="single" w:color="BFBFBF" w:sz="4"/>
+              <w:left w:val="single" w:color="BFBFBF" w:sz="4"/>
+              <w:bottom w:val="single" w:color="BFBFBF" w:sz="4"/>
+              <w:right w:val="single" w:color="BFBFBF" w:sz="4"/>
+            </w:tcBorders>
+            <w:tcMar>
+              <w:top w:type="dxa" w:w="80"/>
+              <w:left w:type="dxa" w:w="120"/>
+              <w:bottom w:type="dxa" w:w="80"/>
+              <w:right w:type="dxa" w:w="120"/>
+            </w:tcMar>
+          </w:tcPr>
+          <w:p>
+            <w:r>
+              <w:rPr>
+                <w:b w:val="false"/>
+                <w:bCs w:val="false"/>
+                <w:i w:val="false"/>
+                <w:iCs w:val="false"/>
+                <w:sz w:val="20"/>
+                <w:szCs w:val="20"/>
+              </w:rPr>
+              <w:t xml:space="preserve">High</w:t>
+            </w:r>
+          </w:p>
+        </w:tc>
+      </w:tr>
+      <w:tr>
+        <w:tc>
+          <w:tcPr>
+            <w:tcW w:type="dxa" w:w="700"/>
+            <w:tcBorders>
+              <w:top w:val="single" w:color="BFBFBF" w:sz="4"/>
+              <w:left w:val="single" w:color="BFBFBF" w:sz="4"/>
+              <w:bottom w:val="single" w:color="BFBFBF" w:sz="4"/>
+              <w:right w:val="single" w:color="BFBFBF" w:sz="4"/>
+            </w:tcBorders>
+            <w:tcMar>
+              <w:top w:type="dxa" w:w="80"/>
+              <w:left w:type="dxa" w:w="120"/>
+              <w:bottom w:type="dxa" w:w="80"/>
+              <w:right w:type="dxa" w:w="120"/>
+            </w:tcMar>
+          </w:tcPr>
+          <w:p>
+            <w:r>
+              <w:rPr>
+                <w:b w:val="false"/>
+                <w:bCs w:val="false"/>
+                <w:i w:val="false"/>
+                <w:iCs w:val="false"/>
+                <w:sz w:val="20"/>
+                <w:szCs w:val="20"/>
+              </w:rPr>
+              <w:t xml:space="preserve">38</w:t>
+            </w:r>
+          </w:p>
+        </w:tc>
+        <w:tc>
+          <w:tcPr>
+            <w:tcW w:type="dxa" w:w="6226"/>
+            <w:tcBorders>
+              <w:top w:val="single" w:color="BFBFBF" w:sz="4"/>
+              <w:left w:val="single" w:color="BFBFBF" w:sz="4"/>
+              <w:bottom w:val="single" w:color="BFBFBF" w:sz="4"/>
+              <w:right w:val="single" w:color="BFBFBF" w:sz="4"/>
+            </w:tcBorders>
+            <w:tcMar>
+              <w:top w:type="dxa" w:w="80"/>
+              <w:left w:type="dxa" w:w="120"/>
+              <w:bottom w:type="dxa" w:w="80"/>
+              <w:right w:type="dxa" w:w="120"/>
+            </w:tcMar>
+          </w:tcPr>
+          <w:p>
+            <w:r>
+              <w:rPr>
+                <w:b w:val="false"/>
+                <w:bCs w:val="false"/>
+                <w:i w:val="false"/>
+                <w:iCs w:val="false"/>
+                <w:sz w:val="20"/>
+                <w:szCs w:val="20"/>
+              </w:rPr>
+              <w:t xml:space="preserve">"Adjust balance" only changed the cached number, never the ledger</w:t>
+            </w:r>
+          </w:p>
+        </w:tc>
+        <w:tc>
+          <w:tcPr>
+            <w:tcW w:type="dxa" w:w="2100"/>
+            <w:tcBorders>
+              <w:top w:val="single" w:color="BFBFBF" w:sz="4"/>
+              <w:left w:val="single" w:color="BFBFBF" w:sz="4"/>
+              <w:bottom w:val="single" w:color="BFBFBF" w:sz="4"/>
+              <w:right w:val="single" w:color="BFBFBF" w:sz="4"/>
+            </w:tcBorders>
+            <w:tcMar>
+              <w:top w:type="dxa" w:w="80"/>
+              <w:left w:type="dxa" w:w="120"/>
+              <w:bottom w:type="dxa" w:w="80"/>
+              <w:right w:type="dxa" w:w="120"/>
+            </w:tcMar>
+          </w:tcPr>
+          <w:p>
+            <w:r>
+              <w:rPr>
+                <w:b w:val="false"/>
+                <w:bCs w:val="false"/>
+                <w:i w:val="false"/>
+                <w:iCs w:val="false"/>
+                <w:sz w:val="20"/>
+                <w:szCs w:val="20"/>
+              </w:rPr>
+              <w:t xml:space="preserve">High</w:t>
+            </w:r>
+          </w:p>
+        </w:tc>
+      </w:tr>
+      <w:tr>
+        <w:tc>
+          <w:tcPr>
+            <w:tcW w:type="dxa" w:w="700"/>
+            <w:tcBorders>
+              <w:top w:val="single" w:color="BFBFBF" w:sz="4"/>
+              <w:left w:val="single" w:color="BFBFBF" w:sz="4"/>
+              <w:bottom w:val="single" w:color="BFBFBF" w:sz="4"/>
+              <w:right w:val="single" w:color="BFBFBF" w:sz="4"/>
+            </w:tcBorders>
+            <w:tcMar>
+              <w:top w:type="dxa" w:w="80"/>
+              <w:left w:type="dxa" w:w="120"/>
+              <w:bottom w:type="dxa" w:w="80"/>
+              <w:right w:type="dxa" w:w="120"/>
+            </w:tcMar>
+          </w:tcPr>
+          <w:p>
+            <w:r>
+              <w:rPr>
+                <w:b w:val="false"/>
+                <w:bCs w:val="false"/>
+                <w:i w:val="false"/>
+                <w:iCs w:val="false"/>
+                <w:sz w:val="20"/>
+                <w:szCs w:val="20"/>
+              </w:rPr>
+              <w:t xml:space="preserve">39</w:t>
+            </w:r>
+          </w:p>
+        </w:tc>
+        <w:tc>
+          <w:tcPr>
+            <w:tcW w:type="dxa" w:w="6226"/>
+            <w:tcBorders>
+              <w:top w:val="single" w:color="BFBFBF" w:sz="4"/>
+              <w:left w:val="single" w:color="BFBFBF" w:sz="4"/>
+              <w:bottom w:val="single" w:color="BFBFBF" w:sz="4"/>
+              <w:right w:val="single" w:color="BFBFBF" w:sz="4"/>
+            </w:tcBorders>
+            <w:tcMar>
+              <w:top w:type="dxa" w:w="80"/>
+              <w:left w:type="dxa" w:w="120"/>
+              <w:bottom w:type="dxa" w:w="80"/>
+              <w:right w:type="dxa" w:w="120"/>
+            </w:tcMar>
+          </w:tcPr>
+          <w:p>
+            <w:r>
+              <w:rPr>
+                <w:b w:val="false"/>
+                <w:bCs w:val="false"/>
+                <w:i w:val="false"/>
+                <w:iCs w:val="false"/>
+                <w:sz w:val="20"/>
+                <w:szCs w:val="20"/>
+              </w:rPr>
+              <w:t xml:space="preserve">The same adjustments CSV could be applied twice</w:t>
+            </w:r>
+          </w:p>
+        </w:tc>
+        <w:tc>
+          <w:tcPr>
+            <w:tcW w:type="dxa" w:w="2100"/>
+            <w:tcBorders>
+              <w:top w:val="single" w:color="BFBFBF" w:sz="4"/>
+              <w:left w:val="single" w:color="BFBFBF" w:sz="4"/>
+              <w:bottom w:val="single" w:color="BFBFBF" w:sz="4"/>
+              <w:right w:val="single" w:color="BFBFBF" w:sz="4"/>
+            </w:tcBorders>
+            <w:tcMar>
+              <w:top w:type="dxa" w:w="80"/>
+              <w:left w:type="dxa" w:w="120"/>
+              <w:bottom w:type="dxa" w:w="80"/>
+              <w:right w:type="dxa" w:w="120"/>
+            </w:tcMar>
+          </w:tcPr>
+          <w:p>
+            <w:r>
+              <w:rPr>
+                <w:b w:val="false"/>
+                <w:bCs w:val="false"/>
+                <w:i w:val="false"/>
+                <w:iCs w:val="false"/>
+                <w:sz w:val="20"/>
+                <w:szCs w:val="20"/>
+              </w:rPr>
+              <w:t xml:space="preserve">High</w:t>
+            </w:r>
+          </w:p>
+        </w:tc>
+      </w:tr>
+      <w:tr>
+        <w:tc>
+          <w:tcPr>
+            <w:tcW w:type="dxa" w:w="700"/>
+            <w:tcBorders>
+              <w:top w:val="single" w:color="BFBFBF" w:sz="4"/>
+              <w:left w:val="single" w:color="BFBFBF" w:sz="4"/>
+              <w:bottom w:val="single" w:color="BFBFBF" w:sz="4"/>
+              <w:right w:val="single" w:color="BFBFBF" w:sz="4"/>
+            </w:tcBorders>
+            <w:tcMar>
+              <w:top w:type="dxa" w:w="80"/>
+              <w:left w:type="dxa" w:w="120"/>
+              <w:bottom w:type="dxa" w:w="80"/>
+              <w:right w:type="dxa" w:w="120"/>
+            </w:tcMar>
+          </w:tcPr>
+          <w:p>
+            <w:r>
+              <w:rPr>
+                <w:b w:val="false"/>
+                <w:bCs w:val="false"/>
+                <w:i w:val="false"/>
+                <w:iCs w:val="false"/>
+                <w:sz w:val="20"/>
+                <w:szCs w:val="20"/>
+              </w:rPr>
+              <w:t xml:space="preserve">41</w:t>
+            </w:r>
+          </w:p>
+        </w:tc>
+        <w:tc>
+          <w:tcPr>
+            <w:tcW w:type="dxa" w:w="6226"/>
+            <w:tcBorders>
+              <w:top w:val="single" w:color="BFBFBF" w:sz="4"/>
+              <w:left w:val="single" w:color="BFBFBF" w:sz="4"/>
+              <w:bottom w:val="single" w:color="BFBFBF" w:sz="4"/>
+              <w:right w:val="single" w:color="BFBFBF" w:sz="4"/>
+            </w:tcBorders>
+            <w:tcMar>
+              <w:top w:type="dxa" w:w="80"/>
+              <w:left w:type="dxa" w:w="120"/>
+              <w:bottom w:type="dxa" w:w="80"/>
+              <w:right w:type="dxa" w:w="120"/>
+            </w:tcMar>
+          </w:tcPr>
+          <w:p>
+            <w:r>
+              <w:rPr>
+                <w:b w:val="false"/>
+                <w:bCs w:val="false"/>
+                <w:i w:val="false"/>
+                <w:iCs w:val="false"/>
+                <w:sz w:val="20"/>
+                <w:szCs w:val="20"/>
+              </w:rPr>
+              <w:t xml:space="preserve">Reports silently skipped events that committed late</w:t>
+            </w:r>
+          </w:p>
+        </w:tc>
+        <w:tc>
+          <w:tcPr>
+            <w:tcW w:type="dxa" w:w="2100"/>
+            <w:tcBorders>
+              <w:top w:val="single" w:color="BFBFBF" w:sz="4"/>
+              <w:left w:val="single" w:color="BFBFBF" w:sz="4"/>
+              <w:bottom w:val="single" w:color="BFBFBF" w:sz="4"/>
+              <w:right w:val="single" w:color="BFBFBF" w:sz="4"/>
+            </w:tcBorders>
+            <w:tcMar>
+              <w:top w:type="dxa" w:w="80"/>
+              <w:left w:type="dxa" w:w="120"/>
+              <w:bottom w:type="dxa" w:w="80"/>
+              <w:right w:type="dxa" w:w="120"/>
+            </w:tcMar>
+          </w:tcPr>
+          <w:p>
+            <w:r>
+              <w:rPr>
+                <w:b w:val="false"/>
+                <w:bCs w:val="false"/>
+                <w:i w:val="false"/>
+                <w:iCs w:val="false"/>
+                <w:sz w:val="20"/>
+                <w:szCs w:val="20"/>
+              </w:rPr>
+              <w:t xml:space="preserve">High</w:t>
+            </w:r>
+          </w:p>
+        </w:tc>
+      </w:tr>
+      <w:tr>
+        <w:tc>
+          <w:tcPr>
+            <w:tcW w:type="dxa" w:w="700"/>
+            <w:tcBorders>
+              <w:top w:val="single" w:color="BFBFBF" w:sz="4"/>
+              <w:left w:val="single" w:color="BFBFBF" w:sz="4"/>
+              <w:bottom w:val="single" w:color="BFBFBF" w:sz="4"/>
+              <w:right w:val="single" w:color="BFBFBF" w:sz="4"/>
+            </w:tcBorders>
+            <w:tcMar>
+              <w:top w:type="dxa" w:w="80"/>
+              <w:left w:type="dxa" w:w="120"/>
+              <w:bottom w:type="dxa" w:w="80"/>
+              <w:right w:type="dxa" w:w="120"/>
+            </w:tcMar>
+          </w:tcPr>
+          <w:p>
+            <w:r>
+              <w:rPr>
+                <w:b w:val="false"/>
+                <w:bCs w:val="false"/>
+                <w:i w:val="false"/>
+                <w:iCs w:val="false"/>
+                <w:sz w:val="20"/>
+                <w:szCs w:val="20"/>
+              </w:rPr>
               <w:t xml:space="preserve">3</w:t>
             </w:r>
           </w:p>
@@ -3442,6 +3810,190 @@
                 <w:szCs w:val="20"/>
               </w:rPr>
               <w:t xml:space="preserve">Support saw 245 bps while payments went through at 225 bps</w:t>
+            </w:r>
+          </w:p>
+        </w:tc>
+        <w:tc>
+          <w:tcPr>
+            <w:tcW w:type="dxa" w:w="2100"/>
+            <w:tcBorders>
+              <w:top w:val="single" w:color="BFBFBF" w:sz="4"/>
+              <w:left w:val="single" w:color="BFBFBF" w:sz="4"/>
+              <w:bottom w:val="single" w:color="BFBFBF" w:sz="4"/>
+              <w:right w:val="single" w:color="BFBFBF" w:sz="4"/>
+            </w:tcBorders>
+            <w:tcMar>
+              <w:top w:type="dxa" w:w="80"/>
+              <w:left w:type="dxa" w:w="120"/>
+              <w:bottom w:type="dxa" w:w="80"/>
+              <w:right w:type="dxa" w:w="120"/>
+            </w:tcMar>
+          </w:tcPr>
+          <w:p>
+            <w:r>
+              <w:rPr>
+                <w:b w:val="false"/>
+                <w:bCs w:val="false"/>
+                <w:i w:val="false"/>
+                <w:iCs w:val="false"/>
+                <w:sz w:val="20"/>
+                <w:szCs w:val="20"/>
+              </w:rPr>
+              <w:t xml:space="preserve">Medium</w:t>
+            </w:r>
+          </w:p>
+        </w:tc>
+      </w:tr>
+      <w:tr>
+        <w:tc>
+          <w:tcPr>
+            <w:tcW w:type="dxa" w:w="700"/>
+            <w:tcBorders>
+              <w:top w:val="single" w:color="BFBFBF" w:sz="4"/>
+              <w:left w:val="single" w:color="BFBFBF" w:sz="4"/>
+              <w:bottom w:val="single" w:color="BFBFBF" w:sz="4"/>
+              <w:right w:val="single" w:color="BFBFBF" w:sz="4"/>
+            </w:tcBorders>
+            <w:tcMar>
+              <w:top w:type="dxa" w:w="80"/>
+              <w:left w:type="dxa" w:w="120"/>
+              <w:bottom w:type="dxa" w:w="80"/>
+              <w:right w:type="dxa" w:w="120"/>
+            </w:tcMar>
+          </w:tcPr>
+          <w:p>
+            <w:r>
+              <w:rPr>
+                <w:b w:val="false"/>
+                <w:bCs w:val="false"/>
+                <w:i w:val="false"/>
+                <w:iCs w:val="false"/>
+                <w:sz w:val="20"/>
+                <w:szCs w:val="20"/>
+              </w:rPr>
+              <w:t xml:space="preserve">40</w:t>
+            </w:r>
+          </w:p>
+        </w:tc>
+        <w:tc>
+          <w:tcPr>
+            <w:tcW w:type="dxa" w:w="6226"/>
+            <w:tcBorders>
+              <w:top w:val="single" w:color="BFBFBF" w:sz="4"/>
+              <w:left w:val="single" w:color="BFBFBF" w:sz="4"/>
+              <w:bottom w:val="single" w:color="BFBFBF" w:sz="4"/>
+              <w:right w:val="single" w:color="BFBFBF" w:sz="4"/>
+            </w:tcBorders>
+            <w:tcMar>
+              <w:top w:type="dxa" w:w="80"/>
+              <w:left w:type="dxa" w:w="120"/>
+              <w:bottom w:type="dxa" w:w="80"/>
+              <w:right w:type="dxa" w:w="120"/>
+            </w:tcMar>
+          </w:tcPr>
+          <w:p>
+            <w:r>
+              <w:rPr>
+                <w:b w:val="false"/>
+                <w:bCs w:val="false"/>
+                <w:i w:val="false"/>
+                <w:iCs w:val="false"/>
+                <w:sz w:val="20"/>
+                <w:szCs w:val="20"/>
+              </w:rPr>
+              <w:t xml:space="preserve">Payment-link payments never got the merchant's negotiated discount</w:t>
+            </w:r>
+          </w:p>
+        </w:tc>
+        <w:tc>
+          <w:tcPr>
+            <w:tcW w:type="dxa" w:w="2100"/>
+            <w:tcBorders>
+              <w:top w:val="single" w:color="BFBFBF" w:sz="4"/>
+              <w:left w:val="single" w:color="BFBFBF" w:sz="4"/>
+              <w:bottom w:val="single" w:color="BFBFBF" w:sz="4"/>
+              <w:right w:val="single" w:color="BFBFBF" w:sz="4"/>
+            </w:tcBorders>
+            <w:tcMar>
+              <w:top w:type="dxa" w:w="80"/>
+              <w:left w:type="dxa" w:w="120"/>
+              <w:bottom w:type="dxa" w:w="80"/>
+              <w:right w:type="dxa" w:w="120"/>
+            </w:tcMar>
+          </w:tcPr>
+          <w:p>
+            <w:r>
+              <w:rPr>
+                <w:b w:val="false"/>
+                <w:bCs w:val="false"/>
+                <w:i w:val="false"/>
+                <w:iCs w:val="false"/>
+                <w:sz w:val="20"/>
+                <w:szCs w:val="20"/>
+              </w:rPr>
+              <w:t xml:space="preserve">Medium</w:t>
+            </w:r>
+          </w:p>
+        </w:tc>
+      </w:tr>
+      <w:tr>
+        <w:tc>
+          <w:tcPr>
+            <w:tcW w:type="dxa" w:w="700"/>
+            <w:tcBorders>
+              <w:top w:val="single" w:color="BFBFBF" w:sz="4"/>
+              <w:left w:val="single" w:color="BFBFBF" w:sz="4"/>
+              <w:bottom w:val="single" w:color="BFBFBF" w:sz="4"/>
+              <w:right w:val="single" w:color="BFBFBF" w:sz="4"/>
+            </w:tcBorders>
+            <w:tcMar>
+              <w:top w:type="dxa" w:w="80"/>
+              <w:left w:type="dxa" w:w="120"/>
+              <w:bottom w:type="dxa" w:w="80"/>
+              <w:right w:type="dxa" w:w="120"/>
+            </w:tcMar>
+          </w:tcPr>
+          <w:p>
+            <w:r>
+              <w:rPr>
+                <w:b w:val="false"/>
+                <w:bCs w:val="false"/>
+                <w:i w:val="false"/>
+                <w:iCs w:val="false"/>
+                <w:sz w:val="20"/>
+                <w:szCs w:val="20"/>
+              </w:rPr>
+              <w:t xml:space="preserve">42</w:t>
+            </w:r>
+          </w:p>
+        </w:tc>
+        <w:tc>
+          <w:tcPr>
+            <w:tcW w:type="dxa" w:w="6226"/>
+            <w:tcBorders>
+              <w:top w:val="single" w:color="BFBFBF" w:sz="4"/>
+              <w:left w:val="single" w:color="BFBFBF" w:sz="4"/>
+              <w:bottom w:val="single" w:color="BFBFBF" w:sz="4"/>
+              <w:right w:val="single" w:color="BFBFBF" w:sz="4"/>
+            </w:tcBorders>
+            <w:tcMar>
+              <w:top w:type="dxa" w:w="80"/>
+              <w:left w:type="dxa" w:w="120"/>
+              <w:bottom w:type="dxa" w:w="80"/>
+              <w:right w:type="dxa" w:w="120"/>
+            </w:tcMar>
+          </w:tcPr>
+          <w:p>
+            <w:r>
+              <w:rPr>
+                <w:b w:val="false"/>
+                <w:bCs w:val="false"/>
+                <w:i w:val="false"/>
+                <w:iCs w:val="false"/>
+                <w:sz w:val="20"/>
+                <w:szCs w:val="20"/>
+              </w:rPr>
+              <w:t xml:space="preserve">Two reporting processes could apply the same events twice</w:t>
             </w:r>
           </w:p>
         </w:tc>
@@ -22796,6 +23348,3225 @@
                 <w:szCs w:val="20"/>
               </w:rPr>
               <w:t xml:space="preserve">Test: after a recompute, a test-mode merchant is still in test mode. Fails on the old code.</w:t>
+            </w:r>
+          </w:p>
+        </w:tc>
+      </w:tr>
+      <w:tr>
+        <w:tc>
+          <w:tcPr>
+            <w:tcW w:type="dxa" w:w="2200"/>
+            <w:tcBorders>
+              <w:top w:val="single" w:color="BFBFBF" w:sz="4"/>
+              <w:left w:val="single" w:color="BFBFBF" w:sz="4"/>
+              <w:bottom w:val="single" w:color="BFBFBF" w:sz="4"/>
+              <w:right w:val="single" w:color="BFBFBF" w:sz="4"/>
+            </w:tcBorders>
+            <w:shd w:fill="F2E6E8" w:color="auto" w:val="clear"/>
+            <w:tcMar>
+              <w:top w:type="dxa" w:w="80"/>
+              <w:left w:type="dxa" w:w="120"/>
+              <w:bottom w:type="dxa" w:w="80"/>
+              <w:right w:type="dxa" w:w="120"/>
+            </w:tcMar>
+          </w:tcPr>
+          <w:p>
+            <w:r>
+              <w:rPr>
+                <w:b/>
+                <w:bCs/>
+                <w:i w:val="false"/>
+                <w:iCs w:val="false"/>
+                <w:sz w:val="20"/>
+                <w:szCs w:val="20"/>
+              </w:rPr>
+              <w:t xml:space="preserve">Status</w:t>
+            </w:r>
+          </w:p>
+        </w:tc>
+        <w:tc>
+          <w:tcPr>
+            <w:tcW w:type="dxa" w:w="6826"/>
+            <w:tcBorders>
+              <w:top w:val="single" w:color="BFBFBF" w:sz="4"/>
+              <w:left w:val="single" w:color="BFBFBF" w:sz="4"/>
+              <w:bottom w:val="single" w:color="BFBFBF" w:sz="4"/>
+              <w:right w:val="single" w:color="BFBFBF" w:sz="4"/>
+            </w:tcBorders>
+            <w:tcMar>
+              <w:top w:type="dxa" w:w="80"/>
+              <w:left w:type="dxa" w:w="120"/>
+              <w:bottom w:type="dxa" w:w="80"/>
+              <w:right w:type="dxa" w:w="120"/>
+            </w:tcMar>
+          </w:tcPr>
+          <w:p>
+            <w:r>
+              <w:rPr>
+                <w:b w:val="false"/>
+                <w:bCs w:val="false"/>
+                <w:i w:val="false"/>
+                <w:iCs w:val="false"/>
+                <w:sz w:val="20"/>
+                <w:szCs w:val="20"/>
+              </w:rPr>
+              <w:t xml:space="preserve">Fixed and tested (automated tests pass on a real database)</w:t>
+            </w:r>
+          </w:p>
+        </w:tc>
+      </w:tr>
+    </w:tbl>
+    <w:p>
+      <w:pPr>
+        <w:pStyle w:val="Heading2"/>
+        <w:spacing w:after="120" w:before="300"/>
+      </w:pPr>
+      <w:r>
+        <w:t xml:space="preserve">#37  Admin impersonation could act as the merchant owner, and outlived disabled admins</w:t>
+      </w:r>
+    </w:p>
+    <w:tbl>
+      <w:tblPr>
+        <w:tblW w:type="dxa" w:w="9026"/>
+        <w:tblBorders>
+          <w:top w:val="single" w:color="auto" w:sz="4"/>
+          <w:left w:val="single" w:color="auto" w:sz="4"/>
+          <w:bottom w:val="single" w:color="auto" w:sz="4"/>
+          <w:right w:val="single" w:color="auto" w:sz="4"/>
+          <w:insideH w:val="single" w:color="auto" w:sz="4"/>
+          <w:insideV w:val="single" w:color="auto" w:sz="4"/>
+        </w:tblBorders>
+      </w:tblPr>
+      <w:tblGrid>
+        <w:gridCol w:w="2200"/>
+        <w:gridCol w:w="6826"/>
+      </w:tblGrid>
+      <w:tr>
+        <w:tc>
+          <w:tcPr>
+            <w:tcW w:type="dxa" w:w="2200"/>
+            <w:tcBorders>
+              <w:top w:val="single" w:color="BFBFBF" w:sz="4"/>
+              <w:left w:val="single" w:color="BFBFBF" w:sz="4"/>
+              <w:bottom w:val="single" w:color="BFBFBF" w:sz="4"/>
+              <w:right w:val="single" w:color="BFBFBF" w:sz="4"/>
+            </w:tcBorders>
+            <w:shd w:fill="F2E6E8" w:color="auto" w:val="clear"/>
+            <w:tcMar>
+              <w:top w:type="dxa" w:w="80"/>
+              <w:left w:type="dxa" w:w="120"/>
+              <w:bottom w:type="dxa" w:w="80"/>
+              <w:right w:type="dxa" w:w="120"/>
+            </w:tcMar>
+          </w:tcPr>
+          <w:p>
+            <w:r>
+              <w:rPr>
+                <w:b/>
+                <w:bCs/>
+                <w:i w:val="false"/>
+                <w:iCs w:val="false"/>
+                <w:sz w:val="20"/>
+                <w:szCs w:val="20"/>
+              </w:rPr>
+              <w:t xml:space="preserve">Severity (our estimate)</w:t>
+            </w:r>
+          </w:p>
+        </w:tc>
+        <w:tc>
+          <w:tcPr>
+            <w:tcW w:type="dxa" w:w="6826"/>
+            <w:tcBorders>
+              <w:top w:val="single" w:color="BFBFBF" w:sz="4"/>
+              <w:left w:val="single" w:color="BFBFBF" w:sz="4"/>
+              <w:bottom w:val="single" w:color="BFBFBF" w:sz="4"/>
+              <w:right w:val="single" w:color="BFBFBF" w:sz="4"/>
+            </w:tcBorders>
+            <w:tcMar>
+              <w:top w:type="dxa" w:w="80"/>
+              <w:left w:type="dxa" w:w="120"/>
+              <w:bottom w:type="dxa" w:w="80"/>
+              <w:right w:type="dxa" w:w="120"/>
+            </w:tcMar>
+          </w:tcPr>
+          <w:p>
+            <w:r>
+              <w:rPr>
+                <w:b w:val="false"/>
+                <w:bCs w:val="false"/>
+                <w:i w:val="false"/>
+                <w:iCs w:val="false"/>
+                <w:sz w:val="20"/>
+                <w:szCs w:val="20"/>
+              </w:rPr>
+              <w:t xml:space="preserve">High — security</w:t>
+            </w:r>
+          </w:p>
+        </w:tc>
+      </w:tr>
+      <w:tr>
+        <w:tc>
+          <w:tcPr>
+            <w:tcW w:type="dxa" w:w="2200"/>
+            <w:tcBorders>
+              <w:top w:val="single" w:color="BFBFBF" w:sz="4"/>
+              <w:left w:val="single" w:color="BFBFBF" w:sz="4"/>
+              <w:bottom w:val="single" w:color="BFBFBF" w:sz="4"/>
+              <w:right w:val="single" w:color="BFBFBF" w:sz="4"/>
+            </w:tcBorders>
+            <w:shd w:fill="F2E6E8" w:color="auto" w:val="clear"/>
+            <w:tcMar>
+              <w:top w:type="dxa" w:w="80"/>
+              <w:left w:type="dxa" w:w="120"/>
+              <w:bottom w:type="dxa" w:w="80"/>
+              <w:right w:type="dxa" w:w="120"/>
+            </w:tcMar>
+          </w:tcPr>
+          <w:p>
+            <w:r>
+              <w:rPr>
+                <w:b/>
+                <w:bCs/>
+                <w:i w:val="false"/>
+                <w:iCs w:val="false"/>
+                <w:sz w:val="20"/>
+                <w:szCs w:val="20"/>
+              </w:rPr>
+              <w:t xml:space="preserve">Where</w:t>
+            </w:r>
+          </w:p>
+        </w:tc>
+        <w:tc>
+          <w:tcPr>
+            <w:tcW w:type="dxa" w:w="6826"/>
+            <w:tcBorders>
+              <w:top w:val="single" w:color="BFBFBF" w:sz="4"/>
+              <w:left w:val="single" w:color="BFBFBF" w:sz="4"/>
+              <w:bottom w:val="single" w:color="BFBFBF" w:sz="4"/>
+              <w:right w:val="single" w:color="BFBFBF" w:sz="4"/>
+            </w:tcBorders>
+            <w:tcMar>
+              <w:top w:type="dxa" w:w="80"/>
+              <w:left w:type="dxa" w:w="120"/>
+              <w:bottom w:type="dxa" w:w="80"/>
+              <w:right w:type="dxa" w:w="120"/>
+            </w:tcMar>
+          </w:tcPr>
+          <w:p>
+            <w:r>
+              <w:rPr>
+                <w:b w:val="false"/>
+                <w:bCs w:val="false"/>
+                <w:i w:val="false"/>
+                <w:iCs w:val="false"/>
+                <w:sz w:val="20"/>
+                <w:szCs w:val="20"/>
+              </w:rPr>
+              <w:t xml:space="preserve">apps/api/src/admin/impersonation.ts</w:t>
+            </w:r>
+          </w:p>
+        </w:tc>
+      </w:tr>
+      <w:tr>
+        <w:tc>
+          <w:tcPr>
+            <w:tcW w:type="dxa" w:w="2200"/>
+            <w:tcBorders>
+              <w:top w:val="single" w:color="BFBFBF" w:sz="4"/>
+              <w:left w:val="single" w:color="BFBFBF" w:sz="4"/>
+              <w:bottom w:val="single" w:color="BFBFBF" w:sz="4"/>
+              <w:right w:val="single" w:color="BFBFBF" w:sz="4"/>
+            </w:tcBorders>
+            <w:shd w:fill="F2E6E8" w:color="auto" w:val="clear"/>
+            <w:tcMar>
+              <w:top w:type="dxa" w:w="80"/>
+              <w:left w:type="dxa" w:w="120"/>
+              <w:bottom w:type="dxa" w:w="80"/>
+              <w:right w:type="dxa" w:w="120"/>
+            </w:tcMar>
+          </w:tcPr>
+          <w:p>
+            <w:r>
+              <w:rPr>
+                <w:b/>
+                <w:bCs/>
+                <w:i w:val="false"/>
+                <w:iCs w:val="false"/>
+                <w:sz w:val="20"/>
+                <w:szCs w:val="20"/>
+              </w:rPr>
+              <w:t xml:space="preserve">What's wrong</w:t>
+            </w:r>
+          </w:p>
+        </w:tc>
+        <w:tc>
+          <w:tcPr>
+            <w:tcW w:type="dxa" w:w="6826"/>
+            <w:tcBorders>
+              <w:top w:val="single" w:color="BFBFBF" w:sz="4"/>
+              <w:left w:val="single" w:color="BFBFBF" w:sz="4"/>
+              <w:bottom w:val="single" w:color="BFBFBF" w:sz="4"/>
+              <w:right w:val="single" w:color="BFBFBF" w:sz="4"/>
+            </w:tcBorders>
+            <w:tcMar>
+              <w:top w:type="dxa" w:w="80"/>
+              <w:left w:type="dxa" w:w="120"/>
+              <w:bottom w:type="dxa" w:w="80"/>
+              <w:right w:type="dxa" w:w="120"/>
+            </w:tcMar>
+          </w:tcPr>
+          <w:p>
+            <w:r>
+              <w:rPr>
+                <w:b w:val="false"/>
+                <w:bCs w:val="false"/>
+                <w:i w:val="false"/>
+                <w:iCs w:val="false"/>
+                <w:sz w:val="20"/>
+                <w:szCs w:val="20"/>
+              </w:rPr>
+              <w:t xml:space="preserve">"View as merchant" gave finance admins the merchant's finance role and super_admins the owner role — full write access as the merchant (refunds, payment links, API keys). A disabled admin's grant also kept working until it expired.</w:t>
+            </w:r>
+          </w:p>
+        </w:tc>
+      </w:tr>
+      <w:tr>
+        <w:tc>
+          <w:tcPr>
+            <w:tcW w:type="dxa" w:w="2200"/>
+            <w:tcBorders>
+              <w:top w:val="single" w:color="BFBFBF" w:sz="4"/>
+              <w:left w:val="single" w:color="BFBFBF" w:sz="4"/>
+              <w:bottom w:val="single" w:color="BFBFBF" w:sz="4"/>
+              <w:right w:val="single" w:color="BFBFBF" w:sz="4"/>
+            </w:tcBorders>
+            <w:shd w:fill="F2E6E8" w:color="auto" w:val="clear"/>
+            <w:tcMar>
+              <w:top w:type="dxa" w:w="80"/>
+              <w:left w:type="dxa" w:w="120"/>
+              <w:bottom w:type="dxa" w:w="80"/>
+              <w:right w:type="dxa" w:w="120"/>
+            </w:tcMar>
+          </w:tcPr>
+          <w:p>
+            <w:r>
+              <w:rPr>
+                <w:b/>
+                <w:bCs/>
+                <w:i w:val="false"/>
+                <w:iCs w:val="false"/>
+                <w:sz w:val="20"/>
+                <w:szCs w:val="20"/>
+              </w:rPr>
+              <w:t xml:space="preserve">Why</w:t>
+            </w:r>
+          </w:p>
+        </w:tc>
+        <w:tc>
+          <w:tcPr>
+            <w:tcW w:type="dxa" w:w="6826"/>
+            <w:tcBorders>
+              <w:top w:val="single" w:color="BFBFBF" w:sz="4"/>
+              <w:left w:val="single" w:color="BFBFBF" w:sz="4"/>
+              <w:bottom w:val="single" w:color="BFBFBF" w:sz="4"/>
+              <w:right w:val="single" w:color="BFBFBF" w:sz="4"/>
+            </w:tcBorders>
+            <w:tcMar>
+              <w:top w:type="dxa" w:w="80"/>
+              <w:left w:type="dxa" w:w="120"/>
+              <w:bottom w:type="dxa" w:w="80"/>
+              <w:right w:type="dxa" w:w="120"/>
+            </w:tcMar>
+          </w:tcPr>
+          <w:p>
+            <w:r>
+              <w:rPr>
+                <w:b w:val="false"/>
+                <w:bCs w:val="false"/>
+                <w:i w:val="false"/>
+                <w:iCs w:val="false"/>
+                <w:sz w:val="20"/>
+                <w:szCs w:val="20"/>
+              </w:rPr>
+              <w:t xml:space="preserve">HANDOVER and the code's own comment say impersonation is always read-only "support". A comment says disabling is "covered by the admin-disable trigger" — no such trigger exists in any migration.</w:t>
+            </w:r>
+          </w:p>
+        </w:tc>
+      </w:tr>
+      <w:tr>
+        <w:tc>
+          <w:tcPr>
+            <w:tcW w:type="dxa" w:w="2200"/>
+            <w:tcBorders>
+              <w:top w:val="single" w:color="BFBFBF" w:sz="4"/>
+              <w:left w:val="single" w:color="BFBFBF" w:sz="4"/>
+              <w:bottom w:val="single" w:color="BFBFBF" w:sz="4"/>
+              <w:right w:val="single" w:color="BFBFBF" w:sz="4"/>
+            </w:tcBorders>
+            <w:shd w:fill="F2E6E8" w:color="auto" w:val="clear"/>
+            <w:tcMar>
+              <w:top w:type="dxa" w:w="80"/>
+              <w:left w:type="dxa" w:w="120"/>
+              <w:bottom w:type="dxa" w:w="80"/>
+              <w:right w:type="dxa" w:w="120"/>
+            </w:tcMar>
+          </w:tcPr>
+          <w:p>
+            <w:r>
+              <w:rPr>
+                <w:b/>
+                <w:bCs/>
+                <w:i w:val="false"/>
+                <w:iCs w:val="false"/>
+                <w:sz w:val="20"/>
+                <w:szCs w:val="20"/>
+              </w:rPr>
+              <w:t xml:space="preserve">What it breaks</w:t>
+            </w:r>
+          </w:p>
+        </w:tc>
+        <w:tc>
+          <w:tcPr>
+            <w:tcW w:type="dxa" w:w="6826"/>
+            <w:tcBorders>
+              <w:top w:val="single" w:color="BFBFBF" w:sz="4"/>
+              <w:left w:val="single" w:color="BFBFBF" w:sz="4"/>
+              <w:bottom w:val="single" w:color="BFBFBF" w:sz="4"/>
+              <w:right w:val="single" w:color="BFBFBF" w:sz="4"/>
+            </w:tcBorders>
+            <w:tcMar>
+              <w:top w:type="dxa" w:w="80"/>
+              <w:left w:type="dxa" w:w="120"/>
+              <w:bottom w:type="dxa" w:w="80"/>
+              <w:right w:type="dxa" w:w="120"/>
+            </w:tcMar>
+          </w:tcPr>
+          <w:p>
+            <w:r>
+              <w:rPr>
+                <w:b w:val="false"/>
+                <w:bCs w:val="false"/>
+                <w:i w:val="false"/>
+                <w:iCs w:val="false"/>
+                <w:sz w:val="20"/>
+                <w:szCs w:val="20"/>
+              </w:rPr>
+              <w:t xml:space="preserve">Staff could move a merchant's money while 'just looking'; a fired admin keeps access.</w:t>
+            </w:r>
+          </w:p>
+        </w:tc>
+      </w:tr>
+      <w:tr>
+        <w:tc>
+          <w:tcPr>
+            <w:tcW w:type="dxa" w:w="2200"/>
+            <w:tcBorders>
+              <w:top w:val="single" w:color="BFBFBF" w:sz="4"/>
+              <w:left w:val="single" w:color="BFBFBF" w:sz="4"/>
+              <w:bottom w:val="single" w:color="BFBFBF" w:sz="4"/>
+              <w:right w:val="single" w:color="BFBFBF" w:sz="4"/>
+            </w:tcBorders>
+            <w:shd w:fill="F2E6E8" w:color="auto" w:val="clear"/>
+            <w:tcMar>
+              <w:top w:type="dxa" w:w="80"/>
+              <w:left w:type="dxa" w:w="120"/>
+              <w:bottom w:type="dxa" w:w="80"/>
+              <w:right w:type="dxa" w:w="120"/>
+            </w:tcMar>
+          </w:tcPr>
+          <w:p>
+            <w:r>
+              <w:rPr>
+                <w:b/>
+                <w:bCs/>
+                <w:i w:val="false"/>
+                <w:iCs w:val="false"/>
+                <w:sz w:val="20"/>
+                <w:szCs w:val="20"/>
+              </w:rPr>
+              <w:t xml:space="preserve">Fix</w:t>
+            </w:r>
+          </w:p>
+        </w:tc>
+        <w:tc>
+          <w:tcPr>
+            <w:tcW w:type="dxa" w:w="6826"/>
+            <w:tcBorders>
+              <w:top w:val="single" w:color="BFBFBF" w:sz="4"/>
+              <w:left w:val="single" w:color="BFBFBF" w:sz="4"/>
+              <w:bottom w:val="single" w:color="BFBFBF" w:sz="4"/>
+              <w:right w:val="single" w:color="BFBFBF" w:sz="4"/>
+            </w:tcBorders>
+            <w:tcMar>
+              <w:top w:type="dxa" w:w="80"/>
+              <w:left w:type="dxa" w:w="120"/>
+              <w:bottom w:type="dxa" w:w="80"/>
+              <w:right w:type="dxa" w:w="120"/>
+            </w:tcMar>
+          </w:tcPr>
+          <w:p>
+            <w:r>
+              <w:rPr>
+                <w:b w:val="false"/>
+                <w:bCs w:val="false"/>
+                <w:i w:val="false"/>
+                <w:iCs w:val="false"/>
+                <w:sz w:val="20"/>
+                <w:szCs w:val="20"/>
+              </w:rPr>
+              <w:t xml:space="preserve">Every admin role maps to read-only support; the grant lookup also requires the admin account to be active.</w:t>
+            </w:r>
+          </w:p>
+        </w:tc>
+      </w:tr>
+      <w:tr>
+        <w:tc>
+          <w:tcPr>
+            <w:tcW w:type="dxa" w:w="2200"/>
+            <w:tcBorders>
+              <w:top w:val="single" w:color="BFBFBF" w:sz="4"/>
+              <w:left w:val="single" w:color="BFBFBF" w:sz="4"/>
+              <w:bottom w:val="single" w:color="BFBFBF" w:sz="4"/>
+              <w:right w:val="single" w:color="BFBFBF" w:sz="4"/>
+            </w:tcBorders>
+            <w:shd w:fill="F2E6E8" w:color="auto" w:val="clear"/>
+            <w:tcMar>
+              <w:top w:type="dxa" w:w="80"/>
+              <w:left w:type="dxa" w:w="120"/>
+              <w:bottom w:type="dxa" w:w="80"/>
+              <w:right w:type="dxa" w:w="120"/>
+            </w:tcMar>
+          </w:tcPr>
+          <w:p>
+            <w:r>
+              <w:rPr>
+                <w:b/>
+                <w:bCs/>
+                <w:i w:val="false"/>
+                <w:iCs w:val="false"/>
+                <w:sz w:val="20"/>
+                <w:szCs w:val="20"/>
+              </w:rPr>
+              <w:t xml:space="preserve">Proof</w:t>
+            </w:r>
+          </w:p>
+        </w:tc>
+        <w:tc>
+          <w:tcPr>
+            <w:tcW w:type="dxa" w:w="6826"/>
+            <w:tcBorders>
+              <w:top w:val="single" w:color="BFBFBF" w:sz="4"/>
+              <w:left w:val="single" w:color="BFBFBF" w:sz="4"/>
+              <w:bottom w:val="single" w:color="BFBFBF" w:sz="4"/>
+              <w:right w:val="single" w:color="BFBFBF" w:sz="4"/>
+            </w:tcBorders>
+            <w:tcMar>
+              <w:top w:type="dxa" w:w="80"/>
+              <w:left w:type="dxa" w:w="120"/>
+              <w:bottom w:type="dxa" w:w="80"/>
+              <w:right w:type="dxa" w:w="120"/>
+            </w:tcMar>
+          </w:tcPr>
+          <w:p>
+            <w:r>
+              <w:rPr>
+                <w:b w:val="false"/>
+                <w:bCs w:val="false"/>
+                <w:i w:val="false"/>
+                <w:iCs w:val="false"/>
+                <w:sz w:val="20"/>
+                <w:szCs w:val="20"/>
+              </w:rPr>
+              <w:t xml:space="preserve">Test: a super_admin's grant gets 403 on creating a payment link, and 401 once the admin is disabled. Fails on the old code.</w:t>
+            </w:r>
+          </w:p>
+        </w:tc>
+      </w:tr>
+      <w:tr>
+        <w:tc>
+          <w:tcPr>
+            <w:tcW w:type="dxa" w:w="2200"/>
+            <w:tcBorders>
+              <w:top w:val="single" w:color="BFBFBF" w:sz="4"/>
+              <w:left w:val="single" w:color="BFBFBF" w:sz="4"/>
+              <w:bottom w:val="single" w:color="BFBFBF" w:sz="4"/>
+              <w:right w:val="single" w:color="BFBFBF" w:sz="4"/>
+            </w:tcBorders>
+            <w:shd w:fill="F2E6E8" w:color="auto" w:val="clear"/>
+            <w:tcMar>
+              <w:top w:type="dxa" w:w="80"/>
+              <w:left w:type="dxa" w:w="120"/>
+              <w:bottom w:type="dxa" w:w="80"/>
+              <w:right w:type="dxa" w:w="120"/>
+            </w:tcMar>
+          </w:tcPr>
+          <w:p>
+            <w:r>
+              <w:rPr>
+                <w:b/>
+                <w:bCs/>
+                <w:i w:val="false"/>
+                <w:iCs w:val="false"/>
+                <w:sz w:val="20"/>
+                <w:szCs w:val="20"/>
+              </w:rPr>
+              <w:t xml:space="preserve">Status</w:t>
+            </w:r>
+          </w:p>
+        </w:tc>
+        <w:tc>
+          <w:tcPr>
+            <w:tcW w:type="dxa" w:w="6826"/>
+            <w:tcBorders>
+              <w:top w:val="single" w:color="BFBFBF" w:sz="4"/>
+              <w:left w:val="single" w:color="BFBFBF" w:sz="4"/>
+              <w:bottom w:val="single" w:color="BFBFBF" w:sz="4"/>
+              <w:right w:val="single" w:color="BFBFBF" w:sz="4"/>
+            </w:tcBorders>
+            <w:tcMar>
+              <w:top w:type="dxa" w:w="80"/>
+              <w:left w:type="dxa" w:w="120"/>
+              <w:bottom w:type="dxa" w:w="80"/>
+              <w:right w:type="dxa" w:w="120"/>
+            </w:tcMar>
+          </w:tcPr>
+          <w:p>
+            <w:r>
+              <w:rPr>
+                <w:b w:val="false"/>
+                <w:bCs w:val="false"/>
+                <w:i w:val="false"/>
+                <w:iCs w:val="false"/>
+                <w:sz w:val="20"/>
+                <w:szCs w:val="20"/>
+              </w:rPr>
+              <w:t xml:space="preserve">Fixed and tested (automated tests pass on a real database)</w:t>
+            </w:r>
+          </w:p>
+        </w:tc>
+      </w:tr>
+    </w:tbl>
+    <w:p>
+      <w:pPr>
+        <w:pStyle w:val="Heading2"/>
+        <w:spacing w:after="120" w:before="300"/>
+      </w:pPr>
+      <w:r>
+        <w:t xml:space="preserve">#38  "Adjust balance" only changed the cached number, never the ledger</w:t>
+      </w:r>
+    </w:p>
+    <w:tbl>
+      <w:tblPr>
+        <w:tblW w:type="dxa" w:w="9026"/>
+        <w:tblBorders>
+          <w:top w:val="single" w:color="auto" w:sz="4"/>
+          <w:left w:val="single" w:color="auto" w:sz="4"/>
+          <w:bottom w:val="single" w:color="auto" w:sz="4"/>
+          <w:right w:val="single" w:color="auto" w:sz="4"/>
+          <w:insideH w:val="single" w:color="auto" w:sz="4"/>
+          <w:insideV w:val="single" w:color="auto" w:sz="4"/>
+        </w:tblBorders>
+      </w:tblPr>
+      <w:tblGrid>
+        <w:gridCol w:w="2200"/>
+        <w:gridCol w:w="6826"/>
+      </w:tblGrid>
+      <w:tr>
+        <w:tc>
+          <w:tcPr>
+            <w:tcW w:type="dxa" w:w="2200"/>
+            <w:tcBorders>
+              <w:top w:val="single" w:color="BFBFBF" w:sz="4"/>
+              <w:left w:val="single" w:color="BFBFBF" w:sz="4"/>
+              <w:bottom w:val="single" w:color="BFBFBF" w:sz="4"/>
+              <w:right w:val="single" w:color="BFBFBF" w:sz="4"/>
+            </w:tcBorders>
+            <w:shd w:fill="F2E6E8" w:color="auto" w:val="clear"/>
+            <w:tcMar>
+              <w:top w:type="dxa" w:w="80"/>
+              <w:left w:type="dxa" w:w="120"/>
+              <w:bottom w:type="dxa" w:w="80"/>
+              <w:right w:type="dxa" w:w="120"/>
+            </w:tcMar>
+          </w:tcPr>
+          <w:p>
+            <w:r>
+              <w:rPr>
+                <w:b/>
+                <w:bCs/>
+                <w:i w:val="false"/>
+                <w:iCs w:val="false"/>
+                <w:sz w:val="20"/>
+                <w:szCs w:val="20"/>
+              </w:rPr>
+              <w:t xml:space="preserve">Severity (our estimate)</w:t>
+            </w:r>
+          </w:p>
+        </w:tc>
+        <w:tc>
+          <w:tcPr>
+            <w:tcW w:type="dxa" w:w="6826"/>
+            <w:tcBorders>
+              <w:top w:val="single" w:color="BFBFBF" w:sz="4"/>
+              <w:left w:val="single" w:color="BFBFBF" w:sz="4"/>
+              <w:bottom w:val="single" w:color="BFBFBF" w:sz="4"/>
+              <w:right w:val="single" w:color="BFBFBF" w:sz="4"/>
+            </w:tcBorders>
+            <w:tcMar>
+              <w:top w:type="dxa" w:w="80"/>
+              <w:left w:type="dxa" w:w="120"/>
+              <w:bottom w:type="dxa" w:w="80"/>
+              <w:right w:type="dxa" w:w="120"/>
+            </w:tcMar>
+          </w:tcPr>
+          <w:p>
+            <w:r>
+              <w:rPr>
+                <w:b w:val="false"/>
+                <w:bCs w:val="false"/>
+                <w:i w:val="false"/>
+                <w:iCs w:val="false"/>
+                <w:sz w:val="20"/>
+                <w:szCs w:val="20"/>
+              </w:rPr>
+              <w:t xml:space="preserve">High — money</w:t>
+            </w:r>
+          </w:p>
+        </w:tc>
+      </w:tr>
+      <w:tr>
+        <w:tc>
+          <w:tcPr>
+            <w:tcW w:type="dxa" w:w="2200"/>
+            <w:tcBorders>
+              <w:top w:val="single" w:color="BFBFBF" w:sz="4"/>
+              <w:left w:val="single" w:color="BFBFBF" w:sz="4"/>
+              <w:bottom w:val="single" w:color="BFBFBF" w:sz="4"/>
+              <w:right w:val="single" w:color="BFBFBF" w:sz="4"/>
+            </w:tcBorders>
+            <w:shd w:fill="F2E6E8" w:color="auto" w:val="clear"/>
+            <w:tcMar>
+              <w:top w:type="dxa" w:w="80"/>
+              <w:left w:type="dxa" w:w="120"/>
+              <w:bottom w:type="dxa" w:w="80"/>
+              <w:right w:type="dxa" w:w="120"/>
+            </w:tcMar>
+          </w:tcPr>
+          <w:p>
+            <w:r>
+              <w:rPr>
+                <w:b/>
+                <w:bCs/>
+                <w:i w:val="false"/>
+                <w:iCs w:val="false"/>
+                <w:sz w:val="20"/>
+                <w:szCs w:val="20"/>
+              </w:rPr>
+              <w:t xml:space="preserve">Where</w:t>
+            </w:r>
+          </w:p>
+        </w:tc>
+        <w:tc>
+          <w:tcPr>
+            <w:tcW w:type="dxa" w:w="6826"/>
+            <w:tcBorders>
+              <w:top w:val="single" w:color="BFBFBF" w:sz="4"/>
+              <w:left w:val="single" w:color="BFBFBF" w:sz="4"/>
+              <w:bottom w:val="single" w:color="BFBFBF" w:sz="4"/>
+              <w:right w:val="single" w:color="BFBFBF" w:sz="4"/>
+            </w:tcBorders>
+            <w:tcMar>
+              <w:top w:type="dxa" w:w="80"/>
+              <w:left w:type="dxa" w:w="120"/>
+              <w:bottom w:type="dxa" w:w="80"/>
+              <w:right w:type="dxa" w:w="120"/>
+            </w:tcMar>
+          </w:tcPr>
+          <w:p>
+            <w:r>
+              <w:rPr>
+                <w:b w:val="false"/>
+                <w:bCs w:val="false"/>
+                <w:i w:val="false"/>
+                <w:iCs w:val="false"/>
+                <w:sz w:val="20"/>
+                <w:szCs w:val="20"/>
+              </w:rPr>
+              <w:t xml:space="preserve">apps/api/src/routes/adminBalanceAdjustments.ts</w:t>
+            </w:r>
+          </w:p>
+          <w:p>
+            <w:r>
+              <w:rPr>
+                <w:b w:val="false"/>
+                <w:bCs w:val="false"/>
+                <w:i w:val="false"/>
+                <w:iCs w:val="false"/>
+                <w:sz w:val="20"/>
+                <w:szCs w:val="20"/>
+              </w:rPr>
+              <w:t xml:space="preserve">apps/api/src/admin/balanceAdjustments.ts</w:t>
+            </w:r>
+          </w:p>
+        </w:tc>
+      </w:tr>
+      <w:tr>
+        <w:tc>
+          <w:tcPr>
+            <w:tcW w:type="dxa" w:w="2200"/>
+            <w:tcBorders>
+              <w:top w:val="single" w:color="BFBFBF" w:sz="4"/>
+              <w:left w:val="single" w:color="BFBFBF" w:sz="4"/>
+              <w:bottom w:val="single" w:color="BFBFBF" w:sz="4"/>
+              <w:right w:val="single" w:color="BFBFBF" w:sz="4"/>
+            </w:tcBorders>
+            <w:shd w:fill="F2E6E8" w:color="auto" w:val="clear"/>
+            <w:tcMar>
+              <w:top w:type="dxa" w:w="80"/>
+              <w:left w:type="dxa" w:w="120"/>
+              <w:bottom w:type="dxa" w:w="80"/>
+              <w:right w:type="dxa" w:w="120"/>
+            </w:tcMar>
+          </w:tcPr>
+          <w:p>
+            <w:r>
+              <w:rPr>
+                <w:b/>
+                <w:bCs/>
+                <w:i w:val="false"/>
+                <w:iCs w:val="false"/>
+                <w:sz w:val="20"/>
+                <w:szCs w:val="20"/>
+              </w:rPr>
+              <w:t xml:space="preserve">What's wrong</w:t>
+            </w:r>
+          </w:p>
+        </w:tc>
+        <w:tc>
+          <w:tcPr>
+            <w:tcW w:type="dxa" w:w="6826"/>
+            <w:tcBorders>
+              <w:top w:val="single" w:color="BFBFBF" w:sz="4"/>
+              <w:left w:val="single" w:color="BFBFBF" w:sz="4"/>
+              <w:bottom w:val="single" w:color="BFBFBF" w:sz="4"/>
+              <w:right w:val="single" w:color="BFBFBF" w:sz="4"/>
+            </w:tcBorders>
+            <w:tcMar>
+              <w:top w:type="dxa" w:w="80"/>
+              <w:left w:type="dxa" w:w="120"/>
+              <w:bottom w:type="dxa" w:w="80"/>
+              <w:right w:type="dxa" w:w="120"/>
+            </w:tcMar>
+          </w:tcPr>
+          <w:p>
+            <w:r>
+              <w:rPr>
+                <w:b w:val="false"/>
+                <w:bCs w:val="false"/>
+                <w:i w:val="false"/>
+                <w:iCs w:val="false"/>
+                <w:sz w:val="20"/>
+                <w:szCs w:val="20"/>
+              </w:rPr>
+              <w:t xml:space="preserve">The admin balance-adjustment route used the cache-only variant: it changed merchant_balances but posted nothing to the ledger, even though a journaled variant already existed in the same file.</w:t>
+            </w:r>
+          </w:p>
+        </w:tc>
+      </w:tr>
+      <w:tr>
+        <w:tc>
+          <w:tcPr>
+            <w:tcW w:type="dxa" w:w="2200"/>
+            <w:tcBorders>
+              <w:top w:val="single" w:color="BFBFBF" w:sz="4"/>
+              <w:left w:val="single" w:color="BFBFBF" w:sz="4"/>
+              <w:bottom w:val="single" w:color="BFBFBF" w:sz="4"/>
+              <w:right w:val="single" w:color="BFBFBF" w:sz="4"/>
+            </w:tcBorders>
+            <w:shd w:fill="F2E6E8" w:color="auto" w:val="clear"/>
+            <w:tcMar>
+              <w:top w:type="dxa" w:w="80"/>
+              <w:left w:type="dxa" w:w="120"/>
+              <w:bottom w:type="dxa" w:w="80"/>
+              <w:right w:type="dxa" w:w="120"/>
+            </w:tcMar>
+          </w:tcPr>
+          <w:p>
+            <w:r>
+              <w:rPr>
+                <w:b/>
+                <w:bCs/>
+                <w:i w:val="false"/>
+                <w:iCs w:val="false"/>
+                <w:sz w:val="20"/>
+                <w:szCs w:val="20"/>
+              </w:rPr>
+              <w:t xml:space="preserve">Why</w:t>
+            </w:r>
+          </w:p>
+        </w:tc>
+        <w:tc>
+          <w:tcPr>
+            <w:tcW w:type="dxa" w:w="6826"/>
+            <w:tcBorders>
+              <w:top w:val="single" w:color="BFBFBF" w:sz="4"/>
+              <w:left w:val="single" w:color="BFBFBF" w:sz="4"/>
+              <w:bottom w:val="single" w:color="BFBFBF" w:sz="4"/>
+              <w:right w:val="single" w:color="BFBFBF" w:sz="4"/>
+            </w:tcBorders>
+            <w:tcMar>
+              <w:top w:type="dxa" w:w="80"/>
+              <w:left w:type="dxa" w:w="120"/>
+              <w:bottom w:type="dxa" w:w="80"/>
+              <w:right w:type="dxa" w:w="120"/>
+            </w:tcMar>
+          </w:tcPr>
+          <w:p>
+            <w:r>
+              <w:rPr>
+                <w:b w:val="false"/>
+                <w:bCs w:val="false"/>
+                <w:i w:val="false"/>
+                <w:iCs w:val="false"/>
+                <w:sz w:val="20"/>
+                <w:szCs w:val="20"/>
+              </w:rPr>
+              <w:t xml:space="preserve">ADR-0004 even notes these corrections "are overwritten by a rebuild and must be re-applied". Now that every rebuild reads the ledger (#2), each correction silently disappears at the next rebuild or nightly refresh.</w:t>
+            </w:r>
+          </w:p>
+        </w:tc>
+      </w:tr>
+      <w:tr>
+        <w:tc>
+          <w:tcPr>
+            <w:tcW w:type="dxa" w:w="2200"/>
+            <w:tcBorders>
+              <w:top w:val="single" w:color="BFBFBF" w:sz="4"/>
+              <w:left w:val="single" w:color="BFBFBF" w:sz="4"/>
+              <w:bottom w:val="single" w:color="BFBFBF" w:sz="4"/>
+              <w:right w:val="single" w:color="BFBFBF" w:sz="4"/>
+            </w:tcBorders>
+            <w:shd w:fill="F2E6E8" w:color="auto" w:val="clear"/>
+            <w:tcMar>
+              <w:top w:type="dxa" w:w="80"/>
+              <w:left w:type="dxa" w:w="120"/>
+              <w:bottom w:type="dxa" w:w="80"/>
+              <w:right w:type="dxa" w:w="120"/>
+            </w:tcMar>
+          </w:tcPr>
+          <w:p>
+            <w:r>
+              <w:rPr>
+                <w:b/>
+                <w:bCs/>
+                <w:i w:val="false"/>
+                <w:iCs w:val="false"/>
+                <w:sz w:val="20"/>
+                <w:szCs w:val="20"/>
+              </w:rPr>
+              <w:t xml:space="preserve">What it breaks</w:t>
+            </w:r>
+          </w:p>
+        </w:tc>
+        <w:tc>
+          <w:tcPr>
+            <w:tcW w:type="dxa" w:w="6826"/>
+            <w:tcBorders>
+              <w:top w:val="single" w:color="BFBFBF" w:sz="4"/>
+              <w:left w:val="single" w:color="BFBFBF" w:sz="4"/>
+              <w:bottom w:val="single" w:color="BFBFBF" w:sz="4"/>
+              <w:right w:val="single" w:color="BFBFBF" w:sz="4"/>
+            </w:tcBorders>
+            <w:tcMar>
+              <w:top w:type="dxa" w:w="80"/>
+              <w:left w:type="dxa" w:w="120"/>
+              <w:bottom w:type="dxa" w:w="80"/>
+              <w:right w:type="dxa" w:w="120"/>
+            </w:tcMar>
+          </w:tcPr>
+          <w:p>
+            <w:r>
+              <w:rPr>
+                <w:b w:val="false"/>
+                <w:bCs w:val="false"/>
+                <w:i w:val="false"/>
+                <w:iCs w:val="false"/>
+                <w:sz w:val="20"/>
+                <w:szCs w:val="20"/>
+              </w:rPr>
+              <w:t xml:space="preserve">Corrections to what a merchant is owed vanish; the ledger and the balance disagree.</w:t>
+            </w:r>
+          </w:p>
+        </w:tc>
+      </w:tr>
+      <w:tr>
+        <w:tc>
+          <w:tcPr>
+            <w:tcW w:type="dxa" w:w="2200"/>
+            <w:tcBorders>
+              <w:top w:val="single" w:color="BFBFBF" w:sz="4"/>
+              <w:left w:val="single" w:color="BFBFBF" w:sz="4"/>
+              <w:bottom w:val="single" w:color="BFBFBF" w:sz="4"/>
+              <w:right w:val="single" w:color="BFBFBF" w:sz="4"/>
+            </w:tcBorders>
+            <w:shd w:fill="F2E6E8" w:color="auto" w:val="clear"/>
+            <w:tcMar>
+              <w:top w:type="dxa" w:w="80"/>
+              <w:left w:type="dxa" w:w="120"/>
+              <w:bottom w:type="dxa" w:w="80"/>
+              <w:right w:type="dxa" w:w="120"/>
+            </w:tcMar>
+          </w:tcPr>
+          <w:p>
+            <w:r>
+              <w:rPr>
+                <w:b/>
+                <w:bCs/>
+                <w:i w:val="false"/>
+                <w:iCs w:val="false"/>
+                <w:sz w:val="20"/>
+                <w:szCs w:val="20"/>
+              </w:rPr>
+              <w:t xml:space="preserve">Fix</w:t>
+            </w:r>
+          </w:p>
+        </w:tc>
+        <w:tc>
+          <w:tcPr>
+            <w:tcW w:type="dxa" w:w="6826"/>
+            <w:tcBorders>
+              <w:top w:val="single" w:color="BFBFBF" w:sz="4"/>
+              <w:left w:val="single" w:color="BFBFBF" w:sz="4"/>
+              <w:bottom w:val="single" w:color="BFBFBF" w:sz="4"/>
+              <w:right w:val="single" w:color="BFBFBF" w:sz="4"/>
+            </w:tcBorders>
+            <w:tcMar>
+              <w:top w:type="dxa" w:w="80"/>
+              <w:left w:type="dxa" w:w="120"/>
+              <w:bottom w:type="dxa" w:w="80"/>
+              <w:right w:type="dxa" w:w="120"/>
+            </w:tcMar>
+          </w:tcPr>
+          <w:p>
+            <w:r>
+              <w:rPr>
+                <w:b w:val="false"/>
+                <w:bCs w:val="false"/>
+                <w:i w:val="false"/>
+                <w:iCs w:val="false"/>
+                <w:sz w:val="20"/>
+                <w:szCs w:val="20"/>
+              </w:rPr>
+              <w:t xml:space="preserve">Route the endpoint to adjustMerchantBalanceJournaled (balanced ledger entries + cache in one transaction).</w:t>
+            </w:r>
+          </w:p>
+        </w:tc>
+      </w:tr>
+      <w:tr>
+        <w:tc>
+          <w:tcPr>
+            <w:tcW w:type="dxa" w:w="2200"/>
+            <w:tcBorders>
+              <w:top w:val="single" w:color="BFBFBF" w:sz="4"/>
+              <w:left w:val="single" w:color="BFBFBF" w:sz="4"/>
+              <w:bottom w:val="single" w:color="BFBFBF" w:sz="4"/>
+              <w:right w:val="single" w:color="BFBFBF" w:sz="4"/>
+            </w:tcBorders>
+            <w:shd w:fill="F2E6E8" w:color="auto" w:val="clear"/>
+            <w:tcMar>
+              <w:top w:type="dxa" w:w="80"/>
+              <w:left w:type="dxa" w:w="120"/>
+              <w:bottom w:type="dxa" w:w="80"/>
+              <w:right w:type="dxa" w:w="120"/>
+            </w:tcMar>
+          </w:tcPr>
+          <w:p>
+            <w:r>
+              <w:rPr>
+                <w:b/>
+                <w:bCs/>
+                <w:i w:val="false"/>
+                <w:iCs w:val="false"/>
+                <w:sz w:val="20"/>
+                <w:szCs w:val="20"/>
+              </w:rPr>
+              <w:t xml:space="preserve">Proof</w:t>
+            </w:r>
+          </w:p>
+        </w:tc>
+        <w:tc>
+          <w:tcPr>
+            <w:tcW w:type="dxa" w:w="6826"/>
+            <w:tcBorders>
+              <w:top w:val="single" w:color="BFBFBF" w:sz="4"/>
+              <w:left w:val="single" w:color="BFBFBF" w:sz="4"/>
+              <w:bottom w:val="single" w:color="BFBFBF" w:sz="4"/>
+              <w:right w:val="single" w:color="BFBFBF" w:sz="4"/>
+            </w:tcBorders>
+            <w:tcMar>
+              <w:top w:type="dxa" w:w="80"/>
+              <w:left w:type="dxa" w:w="120"/>
+              <w:bottom w:type="dxa" w:w="80"/>
+              <w:right w:type="dxa" w:w="120"/>
+            </w:tcMar>
+          </w:tcPr>
+          <w:p>
+            <w:r>
+              <w:rPr>
+                <w:b w:val="false"/>
+                <w:bCs w:val="false"/>
+                <w:i w:val="false"/>
+                <w:iCs w:val="false"/>
+                <w:sz w:val="20"/>
+                <w:szCs w:val="20"/>
+              </w:rPr>
+              <w:t xml:space="preserve">Test: after an adjustment, merchant_payable in the ledger carries it. Fails on the old code.</w:t>
+            </w:r>
+          </w:p>
+        </w:tc>
+      </w:tr>
+      <w:tr>
+        <w:tc>
+          <w:tcPr>
+            <w:tcW w:type="dxa" w:w="2200"/>
+            <w:tcBorders>
+              <w:top w:val="single" w:color="BFBFBF" w:sz="4"/>
+              <w:left w:val="single" w:color="BFBFBF" w:sz="4"/>
+              <w:bottom w:val="single" w:color="BFBFBF" w:sz="4"/>
+              <w:right w:val="single" w:color="BFBFBF" w:sz="4"/>
+            </w:tcBorders>
+            <w:shd w:fill="F2E6E8" w:color="auto" w:val="clear"/>
+            <w:tcMar>
+              <w:top w:type="dxa" w:w="80"/>
+              <w:left w:type="dxa" w:w="120"/>
+              <w:bottom w:type="dxa" w:w="80"/>
+              <w:right w:type="dxa" w:w="120"/>
+            </w:tcMar>
+          </w:tcPr>
+          <w:p>
+            <w:r>
+              <w:rPr>
+                <w:b/>
+                <w:bCs/>
+                <w:i w:val="false"/>
+                <w:iCs w:val="false"/>
+                <w:sz w:val="20"/>
+                <w:szCs w:val="20"/>
+              </w:rPr>
+              <w:t xml:space="preserve">Status</w:t>
+            </w:r>
+          </w:p>
+        </w:tc>
+        <w:tc>
+          <w:tcPr>
+            <w:tcW w:type="dxa" w:w="6826"/>
+            <w:tcBorders>
+              <w:top w:val="single" w:color="BFBFBF" w:sz="4"/>
+              <w:left w:val="single" w:color="BFBFBF" w:sz="4"/>
+              <w:bottom w:val="single" w:color="BFBFBF" w:sz="4"/>
+              <w:right w:val="single" w:color="BFBFBF" w:sz="4"/>
+            </w:tcBorders>
+            <w:tcMar>
+              <w:top w:type="dxa" w:w="80"/>
+              <w:left w:type="dxa" w:w="120"/>
+              <w:bottom w:type="dxa" w:w="80"/>
+              <w:right w:type="dxa" w:w="120"/>
+            </w:tcMar>
+          </w:tcPr>
+          <w:p>
+            <w:r>
+              <w:rPr>
+                <w:b w:val="false"/>
+                <w:bCs w:val="false"/>
+                <w:i w:val="false"/>
+                <w:iCs w:val="false"/>
+                <w:sz w:val="20"/>
+                <w:szCs w:val="20"/>
+              </w:rPr>
+              <w:t xml:space="preserve">Fixed and tested (automated tests pass on a real database)</w:t>
+            </w:r>
+          </w:p>
+        </w:tc>
+      </w:tr>
+    </w:tbl>
+    <w:p>
+      <w:pPr>
+        <w:pStyle w:val="Heading2"/>
+        <w:spacing w:after="120" w:before="300"/>
+      </w:pPr>
+      <w:r>
+        <w:t xml:space="preserve">#39  The same adjustments CSV could be applied twice</w:t>
+      </w:r>
+    </w:p>
+    <w:tbl>
+      <w:tblPr>
+        <w:tblW w:type="dxa" w:w="9026"/>
+        <w:tblBorders>
+          <w:top w:val="single" w:color="auto" w:sz="4"/>
+          <w:left w:val="single" w:color="auto" w:sz="4"/>
+          <w:bottom w:val="single" w:color="auto" w:sz="4"/>
+          <w:right w:val="single" w:color="auto" w:sz="4"/>
+          <w:insideH w:val="single" w:color="auto" w:sz="4"/>
+          <w:insideV w:val="single" w:color="auto" w:sz="4"/>
+        </w:tblBorders>
+      </w:tblPr>
+      <w:tblGrid>
+        <w:gridCol w:w="2200"/>
+        <w:gridCol w:w="6826"/>
+      </w:tblGrid>
+      <w:tr>
+        <w:tc>
+          <w:tcPr>
+            <w:tcW w:type="dxa" w:w="2200"/>
+            <w:tcBorders>
+              <w:top w:val="single" w:color="BFBFBF" w:sz="4"/>
+              <w:left w:val="single" w:color="BFBFBF" w:sz="4"/>
+              <w:bottom w:val="single" w:color="BFBFBF" w:sz="4"/>
+              <w:right w:val="single" w:color="BFBFBF" w:sz="4"/>
+            </w:tcBorders>
+            <w:shd w:fill="F2E6E8" w:color="auto" w:val="clear"/>
+            <w:tcMar>
+              <w:top w:type="dxa" w:w="80"/>
+              <w:left w:type="dxa" w:w="120"/>
+              <w:bottom w:type="dxa" w:w="80"/>
+              <w:right w:type="dxa" w:w="120"/>
+            </w:tcMar>
+          </w:tcPr>
+          <w:p>
+            <w:r>
+              <w:rPr>
+                <w:b/>
+                <w:bCs/>
+                <w:i w:val="false"/>
+                <w:iCs w:val="false"/>
+                <w:sz w:val="20"/>
+                <w:szCs w:val="20"/>
+              </w:rPr>
+              <w:t xml:space="preserve">Severity (our estimate)</w:t>
+            </w:r>
+          </w:p>
+        </w:tc>
+        <w:tc>
+          <w:tcPr>
+            <w:tcW w:type="dxa" w:w="6826"/>
+            <w:tcBorders>
+              <w:top w:val="single" w:color="BFBFBF" w:sz="4"/>
+              <w:left w:val="single" w:color="BFBFBF" w:sz="4"/>
+              <w:bottom w:val="single" w:color="BFBFBF" w:sz="4"/>
+              <w:right w:val="single" w:color="BFBFBF" w:sz="4"/>
+            </w:tcBorders>
+            <w:tcMar>
+              <w:top w:type="dxa" w:w="80"/>
+              <w:left w:type="dxa" w:w="120"/>
+              <w:bottom w:type="dxa" w:w="80"/>
+              <w:right w:type="dxa" w:w="120"/>
+            </w:tcMar>
+          </w:tcPr>
+          <w:p>
+            <w:r>
+              <w:rPr>
+                <w:b w:val="false"/>
+                <w:bCs w:val="false"/>
+                <w:i w:val="false"/>
+                <w:iCs w:val="false"/>
+                <w:sz w:val="20"/>
+                <w:szCs w:val="20"/>
+              </w:rPr>
+              <w:t xml:space="preserve">High — money</w:t>
+            </w:r>
+          </w:p>
+        </w:tc>
+      </w:tr>
+      <w:tr>
+        <w:tc>
+          <w:tcPr>
+            <w:tcW w:type="dxa" w:w="2200"/>
+            <w:tcBorders>
+              <w:top w:val="single" w:color="BFBFBF" w:sz="4"/>
+              <w:left w:val="single" w:color="BFBFBF" w:sz="4"/>
+              <w:bottom w:val="single" w:color="BFBFBF" w:sz="4"/>
+              <w:right w:val="single" w:color="BFBFBF" w:sz="4"/>
+            </w:tcBorders>
+            <w:shd w:fill="F2E6E8" w:color="auto" w:val="clear"/>
+            <w:tcMar>
+              <w:top w:type="dxa" w:w="80"/>
+              <w:left w:type="dxa" w:w="120"/>
+              <w:bottom w:type="dxa" w:w="80"/>
+              <w:right w:type="dxa" w:w="120"/>
+            </w:tcMar>
+          </w:tcPr>
+          <w:p>
+            <w:r>
+              <w:rPr>
+                <w:b/>
+                <w:bCs/>
+                <w:i w:val="false"/>
+                <w:iCs w:val="false"/>
+                <w:sz w:val="20"/>
+                <w:szCs w:val="20"/>
+              </w:rPr>
+              <w:t xml:space="preserve">Where</w:t>
+            </w:r>
+          </w:p>
+        </w:tc>
+        <w:tc>
+          <w:tcPr>
+            <w:tcW w:type="dxa" w:w="6826"/>
+            <w:tcBorders>
+              <w:top w:val="single" w:color="BFBFBF" w:sz="4"/>
+              <w:left w:val="single" w:color="BFBFBF" w:sz="4"/>
+              <w:bottom w:val="single" w:color="BFBFBF" w:sz="4"/>
+              <w:right w:val="single" w:color="BFBFBF" w:sz="4"/>
+            </w:tcBorders>
+            <w:tcMar>
+              <w:top w:type="dxa" w:w="80"/>
+              <w:left w:type="dxa" w:w="120"/>
+              <w:bottom w:type="dxa" w:w="80"/>
+              <w:right w:type="dxa" w:w="120"/>
+            </w:tcMar>
+          </w:tcPr>
+          <w:p>
+            <w:r>
+              <w:rPr>
+                <w:b w:val="false"/>
+                <w:bCs w:val="false"/>
+                <w:i w:val="false"/>
+                <w:iCs w:val="false"/>
+                <w:sz w:val="20"/>
+                <w:szCs w:val="20"/>
+              </w:rPr>
+              <w:t xml:space="preserve">apps/api/src/admin/adjustmentImport.ts</w:t>
+            </w:r>
+          </w:p>
+          <w:p>
+            <w:r>
+              <w:rPr>
+                <w:b w:val="false"/>
+                <w:bCs w:val="false"/>
+                <w:i w:val="false"/>
+                <w:iCs w:val="false"/>
+                <w:sz w:val="20"/>
+                <w:szCs w:val="20"/>
+              </w:rPr>
+              <w:t xml:space="preserve">db/migrations/0077_adjustment_imports_content_hash.sql (new)</w:t>
+            </w:r>
+          </w:p>
+        </w:tc>
+      </w:tr>
+      <w:tr>
+        <w:tc>
+          <w:tcPr>
+            <w:tcW w:type="dxa" w:w="2200"/>
+            <w:tcBorders>
+              <w:top w:val="single" w:color="BFBFBF" w:sz="4"/>
+              <w:left w:val="single" w:color="BFBFBF" w:sz="4"/>
+              <w:bottom w:val="single" w:color="BFBFBF" w:sz="4"/>
+              <w:right w:val="single" w:color="BFBFBF" w:sz="4"/>
+            </w:tcBorders>
+            <w:shd w:fill="F2E6E8" w:color="auto" w:val="clear"/>
+            <w:tcMar>
+              <w:top w:type="dxa" w:w="80"/>
+              <w:left w:type="dxa" w:w="120"/>
+              <w:bottom w:type="dxa" w:w="80"/>
+              <w:right w:type="dxa" w:w="120"/>
+            </w:tcMar>
+          </w:tcPr>
+          <w:p>
+            <w:r>
+              <w:rPr>
+                <w:b/>
+                <w:bCs/>
+                <w:i w:val="false"/>
+                <w:iCs w:val="false"/>
+                <w:sz w:val="20"/>
+                <w:szCs w:val="20"/>
+              </w:rPr>
+              <w:t xml:space="preserve">What's wrong</w:t>
+            </w:r>
+          </w:p>
+        </w:tc>
+        <w:tc>
+          <w:tcPr>
+            <w:tcW w:type="dxa" w:w="6826"/>
+            <w:tcBorders>
+              <w:top w:val="single" w:color="BFBFBF" w:sz="4"/>
+              <w:left w:val="single" w:color="BFBFBF" w:sz="4"/>
+              <w:bottom w:val="single" w:color="BFBFBF" w:sz="4"/>
+              <w:right w:val="single" w:color="BFBFBF" w:sz="4"/>
+            </w:tcBorders>
+            <w:tcMar>
+              <w:top w:type="dxa" w:w="80"/>
+              <w:left w:type="dxa" w:w="120"/>
+              <w:bottom w:type="dxa" w:w="80"/>
+              <w:right w:type="dxa" w:w="120"/>
+            </w:tcMar>
+          </w:tcPr>
+          <w:p>
+            <w:r>
+              <w:rPr>
+                <w:b w:val="false"/>
+                <w:bCs w:val="false"/>
+                <w:i w:val="false"/>
+                <w:iCs w:val="false"/>
+                <w:sz w:val="20"/>
+                <w:szCs w:val="20"/>
+              </w:rPr>
+              <w:t xml:space="preserve">Nothing stopped the same file being imported again; every adjustment was posted twice. The finance channel shows it happening: "the audit log now shows two imports of it a few seconds apart (I think I double-clicked)".</w:t>
+            </w:r>
+          </w:p>
+        </w:tc>
+      </w:tr>
+      <w:tr>
+        <w:tc>
+          <w:tcPr>
+            <w:tcW w:type="dxa" w:w="2200"/>
+            <w:tcBorders>
+              <w:top w:val="single" w:color="BFBFBF" w:sz="4"/>
+              <w:left w:val="single" w:color="BFBFBF" w:sz="4"/>
+              <w:bottom w:val="single" w:color="BFBFBF" w:sz="4"/>
+              <w:right w:val="single" w:color="BFBFBF" w:sz="4"/>
+            </w:tcBorders>
+            <w:shd w:fill="F2E6E8" w:color="auto" w:val="clear"/>
+            <w:tcMar>
+              <w:top w:type="dxa" w:w="80"/>
+              <w:left w:type="dxa" w:w="120"/>
+              <w:bottom w:type="dxa" w:w="80"/>
+              <w:right w:type="dxa" w:w="120"/>
+            </w:tcMar>
+          </w:tcPr>
+          <w:p>
+            <w:r>
+              <w:rPr>
+                <w:b/>
+                <w:bCs/>
+                <w:i w:val="false"/>
+                <w:iCs w:val="false"/>
+                <w:sz w:val="20"/>
+                <w:szCs w:val="20"/>
+              </w:rPr>
+              <w:t xml:space="preserve">Why</w:t>
+            </w:r>
+          </w:p>
+        </w:tc>
+        <w:tc>
+          <w:tcPr>
+            <w:tcW w:type="dxa" w:w="6826"/>
+            <w:tcBorders>
+              <w:top w:val="single" w:color="BFBFBF" w:sz="4"/>
+              <w:left w:val="single" w:color="BFBFBF" w:sz="4"/>
+              <w:bottom w:val="single" w:color="BFBFBF" w:sz="4"/>
+              <w:right w:val="single" w:color="BFBFBF" w:sz="4"/>
+            </w:tcBorders>
+            <w:tcMar>
+              <w:top w:type="dxa" w:w="80"/>
+              <w:left w:type="dxa" w:w="120"/>
+              <w:bottom w:type="dxa" w:w="80"/>
+              <w:right w:type="dxa" w:w="120"/>
+            </w:tcMar>
+          </w:tcPr>
+          <w:p>
+            <w:r>
+              <w:rPr>
+                <w:b w:val="false"/>
+                <w:bCs w:val="false"/>
+                <w:i w:val="false"/>
+                <w:iCs w:val="false"/>
+                <w:sz w:val="20"/>
+                <w:szCs w:val="20"/>
+              </w:rPr>
+              <w:t xml:space="preserve">A comment guessed "re-upload is blocked by the unique original_filename" — there is no such constraint.</w:t>
+            </w:r>
+          </w:p>
+        </w:tc>
+      </w:tr>
+      <w:tr>
+        <w:tc>
+          <w:tcPr>
+            <w:tcW w:type="dxa" w:w="2200"/>
+            <w:tcBorders>
+              <w:top w:val="single" w:color="BFBFBF" w:sz="4"/>
+              <w:left w:val="single" w:color="BFBFBF" w:sz="4"/>
+              <w:bottom w:val="single" w:color="BFBFBF" w:sz="4"/>
+              <w:right w:val="single" w:color="BFBFBF" w:sz="4"/>
+            </w:tcBorders>
+            <w:shd w:fill="F2E6E8" w:color="auto" w:val="clear"/>
+            <w:tcMar>
+              <w:top w:type="dxa" w:w="80"/>
+              <w:left w:type="dxa" w:w="120"/>
+              <w:bottom w:type="dxa" w:w="80"/>
+              <w:right w:type="dxa" w:w="120"/>
+            </w:tcMar>
+          </w:tcPr>
+          <w:p>
+            <w:r>
+              <w:rPr>
+                <w:b/>
+                <w:bCs/>
+                <w:i w:val="false"/>
+                <w:iCs w:val="false"/>
+                <w:sz w:val="20"/>
+                <w:szCs w:val="20"/>
+              </w:rPr>
+              <w:t xml:space="preserve">What it breaks</w:t>
+            </w:r>
+          </w:p>
+        </w:tc>
+        <w:tc>
+          <w:tcPr>
+            <w:tcW w:type="dxa" w:w="6826"/>
+            <w:tcBorders>
+              <w:top w:val="single" w:color="BFBFBF" w:sz="4"/>
+              <w:left w:val="single" w:color="BFBFBF" w:sz="4"/>
+              <w:bottom w:val="single" w:color="BFBFBF" w:sz="4"/>
+              <w:right w:val="single" w:color="BFBFBF" w:sz="4"/>
+            </w:tcBorders>
+            <w:tcMar>
+              <w:top w:type="dxa" w:w="80"/>
+              <w:left w:type="dxa" w:w="120"/>
+              <w:bottom w:type="dxa" w:w="80"/>
+              <w:right w:type="dxa" w:w="120"/>
+            </w:tcMar>
+          </w:tcPr>
+          <w:p>
+            <w:r>
+              <w:rPr>
+                <w:b w:val="false"/>
+                <w:bCs w:val="false"/>
+                <w:i w:val="false"/>
+                <w:iCs w:val="false"/>
+                <w:sz w:val="20"/>
+                <w:szCs w:val="20"/>
+              </w:rPr>
+              <w:t xml:space="preserve">Merchant balances double-credited or double-debited.</w:t>
+            </w:r>
+          </w:p>
+        </w:tc>
+      </w:tr>
+      <w:tr>
+        <w:tc>
+          <w:tcPr>
+            <w:tcW w:type="dxa" w:w="2200"/>
+            <w:tcBorders>
+              <w:top w:val="single" w:color="BFBFBF" w:sz="4"/>
+              <w:left w:val="single" w:color="BFBFBF" w:sz="4"/>
+              <w:bottom w:val="single" w:color="BFBFBF" w:sz="4"/>
+              <w:right w:val="single" w:color="BFBFBF" w:sz="4"/>
+            </w:tcBorders>
+            <w:shd w:fill="F2E6E8" w:color="auto" w:val="clear"/>
+            <w:tcMar>
+              <w:top w:type="dxa" w:w="80"/>
+              <w:left w:type="dxa" w:w="120"/>
+              <w:bottom w:type="dxa" w:w="80"/>
+              <w:right w:type="dxa" w:w="120"/>
+            </w:tcMar>
+          </w:tcPr>
+          <w:p>
+            <w:r>
+              <w:rPr>
+                <w:b/>
+                <w:bCs/>
+                <w:i w:val="false"/>
+                <w:iCs w:val="false"/>
+                <w:sz w:val="20"/>
+                <w:szCs w:val="20"/>
+              </w:rPr>
+              <w:t xml:space="preserve">Fix</w:t>
+            </w:r>
+          </w:p>
+        </w:tc>
+        <w:tc>
+          <w:tcPr>
+            <w:tcW w:type="dxa" w:w="6826"/>
+            <w:tcBorders>
+              <w:top w:val="single" w:color="BFBFBF" w:sz="4"/>
+              <w:left w:val="single" w:color="BFBFBF" w:sz="4"/>
+              <w:bottom w:val="single" w:color="BFBFBF" w:sz="4"/>
+              <w:right w:val="single" w:color="BFBFBF" w:sz="4"/>
+            </w:tcBorders>
+            <w:tcMar>
+              <w:top w:type="dxa" w:w="80"/>
+              <w:left w:type="dxa" w:w="120"/>
+              <w:bottom w:type="dxa" w:w="80"/>
+              <w:right w:type="dxa" w:w="120"/>
+            </w:tcMar>
+          </w:tcPr>
+          <w:p>
+            <w:r>
+              <w:rPr>
+                <w:b w:val="false"/>
+                <w:bCs w:val="false"/>
+                <w:i w:val="false"/>
+                <w:iCs w:val="false"/>
+                <w:sz w:val="20"/>
+                <w:szCs w:val="20"/>
+              </w:rPr>
+              <w:t xml:space="preserve">Each import stores a hash of its rows with a unique index; identical content is refused with 409 already_imported.</w:t>
+            </w:r>
+          </w:p>
+        </w:tc>
+      </w:tr>
+      <w:tr>
+        <w:tc>
+          <w:tcPr>
+            <w:tcW w:type="dxa" w:w="2200"/>
+            <w:tcBorders>
+              <w:top w:val="single" w:color="BFBFBF" w:sz="4"/>
+              <w:left w:val="single" w:color="BFBFBF" w:sz="4"/>
+              <w:bottom w:val="single" w:color="BFBFBF" w:sz="4"/>
+              <w:right w:val="single" w:color="BFBFBF" w:sz="4"/>
+            </w:tcBorders>
+            <w:shd w:fill="F2E6E8" w:color="auto" w:val="clear"/>
+            <w:tcMar>
+              <w:top w:type="dxa" w:w="80"/>
+              <w:left w:type="dxa" w:w="120"/>
+              <w:bottom w:type="dxa" w:w="80"/>
+              <w:right w:type="dxa" w:w="120"/>
+            </w:tcMar>
+          </w:tcPr>
+          <w:p>
+            <w:r>
+              <w:rPr>
+                <w:b/>
+                <w:bCs/>
+                <w:i w:val="false"/>
+                <w:iCs w:val="false"/>
+                <w:sz w:val="20"/>
+                <w:szCs w:val="20"/>
+              </w:rPr>
+              <w:t xml:space="preserve">Proof</w:t>
+            </w:r>
+          </w:p>
+        </w:tc>
+        <w:tc>
+          <w:tcPr>
+            <w:tcW w:type="dxa" w:w="6826"/>
+            <w:tcBorders>
+              <w:top w:val="single" w:color="BFBFBF" w:sz="4"/>
+              <w:left w:val="single" w:color="BFBFBF" w:sz="4"/>
+              <w:bottom w:val="single" w:color="BFBFBF" w:sz="4"/>
+              <w:right w:val="single" w:color="BFBFBF" w:sz="4"/>
+            </w:tcBorders>
+            <w:tcMar>
+              <w:top w:type="dxa" w:w="80"/>
+              <w:left w:type="dxa" w:w="120"/>
+              <w:bottom w:type="dxa" w:w="80"/>
+              <w:right w:type="dxa" w:w="120"/>
+            </w:tcMar>
+          </w:tcPr>
+          <w:p>
+            <w:r>
+              <w:rPr>
+                <w:b w:val="false"/>
+                <w:bCs w:val="false"/>
+                <w:i w:val="false"/>
+                <w:iCs w:val="false"/>
+                <w:sz w:val="20"/>
+                <w:szCs w:val="20"/>
+              </w:rPr>
+              <w:t xml:space="preserve">Test: importing the same rows under a different filename is refused and only one set of ledger legs exists.</w:t>
+            </w:r>
+          </w:p>
+        </w:tc>
+      </w:tr>
+      <w:tr>
+        <w:tc>
+          <w:tcPr>
+            <w:tcW w:type="dxa" w:w="2200"/>
+            <w:tcBorders>
+              <w:top w:val="single" w:color="BFBFBF" w:sz="4"/>
+              <w:left w:val="single" w:color="BFBFBF" w:sz="4"/>
+              <w:bottom w:val="single" w:color="BFBFBF" w:sz="4"/>
+              <w:right w:val="single" w:color="BFBFBF" w:sz="4"/>
+            </w:tcBorders>
+            <w:shd w:fill="F2E6E8" w:color="auto" w:val="clear"/>
+            <w:tcMar>
+              <w:top w:type="dxa" w:w="80"/>
+              <w:left w:type="dxa" w:w="120"/>
+              <w:bottom w:type="dxa" w:w="80"/>
+              <w:right w:type="dxa" w:w="120"/>
+            </w:tcMar>
+          </w:tcPr>
+          <w:p>
+            <w:r>
+              <w:rPr>
+                <w:b/>
+                <w:bCs/>
+                <w:i w:val="false"/>
+                <w:iCs w:val="false"/>
+                <w:sz w:val="20"/>
+                <w:szCs w:val="20"/>
+              </w:rPr>
+              <w:t xml:space="preserve">Status</w:t>
+            </w:r>
+          </w:p>
+        </w:tc>
+        <w:tc>
+          <w:tcPr>
+            <w:tcW w:type="dxa" w:w="6826"/>
+            <w:tcBorders>
+              <w:top w:val="single" w:color="BFBFBF" w:sz="4"/>
+              <w:left w:val="single" w:color="BFBFBF" w:sz="4"/>
+              <w:bottom w:val="single" w:color="BFBFBF" w:sz="4"/>
+              <w:right w:val="single" w:color="BFBFBF" w:sz="4"/>
+            </w:tcBorders>
+            <w:tcMar>
+              <w:top w:type="dxa" w:w="80"/>
+              <w:left w:type="dxa" w:w="120"/>
+              <w:bottom w:type="dxa" w:w="80"/>
+              <w:right w:type="dxa" w:w="120"/>
+            </w:tcMar>
+          </w:tcPr>
+          <w:p>
+            <w:r>
+              <w:rPr>
+                <w:b w:val="false"/>
+                <w:bCs w:val="false"/>
+                <w:i w:val="false"/>
+                <w:iCs w:val="false"/>
+                <w:sz w:val="20"/>
+                <w:szCs w:val="20"/>
+              </w:rPr>
+              <w:t xml:space="preserve">Fixed and tested (automated tests pass on a real database)</w:t>
+            </w:r>
+          </w:p>
+        </w:tc>
+      </w:tr>
+    </w:tbl>
+    <w:p>
+      <w:pPr>
+        <w:pStyle w:val="Heading2"/>
+        <w:spacing w:after="120" w:before="300"/>
+      </w:pPr>
+      <w:r>
+        <w:t xml:space="preserve">#40  Payment-link payments never got the merchant's negotiated discount</w:t>
+      </w:r>
+    </w:p>
+    <w:tbl>
+      <w:tblPr>
+        <w:tblW w:type="dxa" w:w="9026"/>
+        <w:tblBorders>
+          <w:top w:val="single" w:color="auto" w:sz="4"/>
+          <w:left w:val="single" w:color="auto" w:sz="4"/>
+          <w:bottom w:val="single" w:color="auto" w:sz="4"/>
+          <w:right w:val="single" w:color="auto" w:sz="4"/>
+          <w:insideH w:val="single" w:color="auto" w:sz="4"/>
+          <w:insideV w:val="single" w:color="auto" w:sz="4"/>
+        </w:tblBorders>
+      </w:tblPr>
+      <w:tblGrid>
+        <w:gridCol w:w="2200"/>
+        <w:gridCol w:w="6826"/>
+      </w:tblGrid>
+      <w:tr>
+        <w:tc>
+          <w:tcPr>
+            <w:tcW w:type="dxa" w:w="2200"/>
+            <w:tcBorders>
+              <w:top w:val="single" w:color="BFBFBF" w:sz="4"/>
+              <w:left w:val="single" w:color="BFBFBF" w:sz="4"/>
+              <w:bottom w:val="single" w:color="BFBFBF" w:sz="4"/>
+              <w:right w:val="single" w:color="BFBFBF" w:sz="4"/>
+            </w:tcBorders>
+            <w:shd w:fill="F2E6E8" w:color="auto" w:val="clear"/>
+            <w:tcMar>
+              <w:top w:type="dxa" w:w="80"/>
+              <w:left w:type="dxa" w:w="120"/>
+              <w:bottom w:type="dxa" w:w="80"/>
+              <w:right w:type="dxa" w:w="120"/>
+            </w:tcMar>
+          </w:tcPr>
+          <w:p>
+            <w:r>
+              <w:rPr>
+                <w:b/>
+                <w:bCs/>
+                <w:i w:val="false"/>
+                <w:iCs w:val="false"/>
+                <w:sz w:val="20"/>
+                <w:szCs w:val="20"/>
+              </w:rPr>
+              <w:t xml:space="preserve">Severity (our estimate)</w:t>
+            </w:r>
+          </w:p>
+        </w:tc>
+        <w:tc>
+          <w:tcPr>
+            <w:tcW w:type="dxa" w:w="6826"/>
+            <w:tcBorders>
+              <w:top w:val="single" w:color="BFBFBF" w:sz="4"/>
+              <w:left w:val="single" w:color="BFBFBF" w:sz="4"/>
+              <w:bottom w:val="single" w:color="BFBFBF" w:sz="4"/>
+              <w:right w:val="single" w:color="BFBFBF" w:sz="4"/>
+            </w:tcBorders>
+            <w:tcMar>
+              <w:top w:type="dxa" w:w="80"/>
+              <w:left w:type="dxa" w:w="120"/>
+              <w:bottom w:type="dxa" w:w="80"/>
+              <w:right w:type="dxa" w:w="120"/>
+            </w:tcMar>
+          </w:tcPr>
+          <w:p>
+            <w:r>
+              <w:rPr>
+                <w:b w:val="false"/>
+                <w:bCs w:val="false"/>
+                <w:i w:val="false"/>
+                <w:iCs w:val="false"/>
+                <w:sz w:val="20"/>
+                <w:szCs w:val="20"/>
+              </w:rPr>
+              <w:t xml:space="preserve">Medium — money</w:t>
+            </w:r>
+          </w:p>
+        </w:tc>
+      </w:tr>
+      <w:tr>
+        <w:tc>
+          <w:tcPr>
+            <w:tcW w:type="dxa" w:w="2200"/>
+            <w:tcBorders>
+              <w:top w:val="single" w:color="BFBFBF" w:sz="4"/>
+              <w:left w:val="single" w:color="BFBFBF" w:sz="4"/>
+              <w:bottom w:val="single" w:color="BFBFBF" w:sz="4"/>
+              <w:right w:val="single" w:color="BFBFBF" w:sz="4"/>
+            </w:tcBorders>
+            <w:shd w:fill="F2E6E8" w:color="auto" w:val="clear"/>
+            <w:tcMar>
+              <w:top w:type="dxa" w:w="80"/>
+              <w:left w:type="dxa" w:w="120"/>
+              <w:bottom w:type="dxa" w:w="80"/>
+              <w:right w:type="dxa" w:w="120"/>
+            </w:tcMar>
+          </w:tcPr>
+          <w:p>
+            <w:r>
+              <w:rPr>
+                <w:b/>
+                <w:bCs/>
+                <w:i w:val="false"/>
+                <w:iCs w:val="false"/>
+                <w:sz w:val="20"/>
+                <w:szCs w:val="20"/>
+              </w:rPr>
+              <w:t xml:space="preserve">Where</w:t>
+            </w:r>
+          </w:p>
+        </w:tc>
+        <w:tc>
+          <w:tcPr>
+            <w:tcW w:type="dxa" w:w="6826"/>
+            <w:tcBorders>
+              <w:top w:val="single" w:color="BFBFBF" w:sz="4"/>
+              <w:left w:val="single" w:color="BFBFBF" w:sz="4"/>
+              <w:bottom w:val="single" w:color="BFBFBF" w:sz="4"/>
+              <w:right w:val="single" w:color="BFBFBF" w:sz="4"/>
+            </w:tcBorders>
+            <w:tcMar>
+              <w:top w:type="dxa" w:w="80"/>
+              <w:left w:type="dxa" w:w="120"/>
+              <w:bottom w:type="dxa" w:w="80"/>
+              <w:right w:type="dxa" w:w="120"/>
+            </w:tcMar>
+          </w:tcPr>
+          <w:p>
+            <w:r>
+              <w:rPr>
+                <w:b w:val="false"/>
+                <w:bCs w:val="false"/>
+                <w:i w:val="false"/>
+                <w:iCs w:val="false"/>
+                <w:sz w:val="20"/>
+                <w:szCs w:val="20"/>
+              </w:rPr>
+              <w:t xml:space="preserve">apps/api/src/paymentLinks/pay.ts</w:t>
+            </w:r>
+          </w:p>
+        </w:tc>
+      </w:tr>
+      <w:tr>
+        <w:tc>
+          <w:tcPr>
+            <w:tcW w:type="dxa" w:w="2200"/>
+            <w:tcBorders>
+              <w:top w:val="single" w:color="BFBFBF" w:sz="4"/>
+              <w:left w:val="single" w:color="BFBFBF" w:sz="4"/>
+              <w:bottom w:val="single" w:color="BFBFBF" w:sz="4"/>
+              <w:right w:val="single" w:color="BFBFBF" w:sz="4"/>
+            </w:tcBorders>
+            <w:shd w:fill="F2E6E8" w:color="auto" w:val="clear"/>
+            <w:tcMar>
+              <w:top w:type="dxa" w:w="80"/>
+              <w:left w:type="dxa" w:w="120"/>
+              <w:bottom w:type="dxa" w:w="80"/>
+              <w:right w:type="dxa" w:w="120"/>
+            </w:tcMar>
+          </w:tcPr>
+          <w:p>
+            <w:r>
+              <w:rPr>
+                <w:b/>
+                <w:bCs/>
+                <w:i w:val="false"/>
+                <w:iCs w:val="false"/>
+                <w:sz w:val="20"/>
+                <w:szCs w:val="20"/>
+              </w:rPr>
+              <w:t xml:space="preserve">What's wrong</w:t>
+            </w:r>
+          </w:p>
+        </w:tc>
+        <w:tc>
+          <w:tcPr>
+            <w:tcW w:type="dxa" w:w="6826"/>
+            <w:tcBorders>
+              <w:top w:val="single" w:color="BFBFBF" w:sz="4"/>
+              <w:left w:val="single" w:color="BFBFBF" w:sz="4"/>
+              <w:bottom w:val="single" w:color="BFBFBF" w:sz="4"/>
+              <w:right w:val="single" w:color="BFBFBF" w:sz="4"/>
+            </w:tcBorders>
+            <w:tcMar>
+              <w:top w:type="dxa" w:w="80"/>
+              <w:left w:type="dxa" w:w="120"/>
+              <w:bottom w:type="dxa" w:w="80"/>
+              <w:right w:type="dxa" w:w="120"/>
+            </w:tcMar>
+          </w:tcPr>
+          <w:p>
+            <w:r>
+              <w:rPr>
+                <w:b w:val="false"/>
+                <w:bCs w:val="false"/>
+                <w:i w:val="false"/>
+                <w:iCs w:val="false"/>
+                <w:sz w:val="20"/>
+                <w:szCs w:val="20"/>
+              </w:rPr>
+              <w:t xml:space="preserve">The /v1/transactions capture route applies the negotiated discount after capture; the payment-link pay flow calls capture directly and never did.</w:t>
+            </w:r>
+          </w:p>
+        </w:tc>
+      </w:tr>
+      <w:tr>
+        <w:tc>
+          <w:tcPr>
+            <w:tcW w:type="dxa" w:w="2200"/>
+            <w:tcBorders>
+              <w:top w:val="single" w:color="BFBFBF" w:sz="4"/>
+              <w:left w:val="single" w:color="BFBFBF" w:sz="4"/>
+              <w:bottom w:val="single" w:color="BFBFBF" w:sz="4"/>
+              <w:right w:val="single" w:color="BFBFBF" w:sz="4"/>
+            </w:tcBorders>
+            <w:shd w:fill="F2E6E8" w:color="auto" w:val="clear"/>
+            <w:tcMar>
+              <w:top w:type="dxa" w:w="80"/>
+              <w:left w:type="dxa" w:w="120"/>
+              <w:bottom w:type="dxa" w:w="80"/>
+              <w:right w:type="dxa" w:w="120"/>
+            </w:tcMar>
+          </w:tcPr>
+          <w:p>
+            <w:r>
+              <w:rPr>
+                <w:b/>
+                <w:bCs/>
+                <w:i w:val="false"/>
+                <w:iCs w:val="false"/>
+                <w:sz w:val="20"/>
+                <w:szCs w:val="20"/>
+              </w:rPr>
+              <w:t xml:space="preserve">Why</w:t>
+            </w:r>
+          </w:p>
+        </w:tc>
+        <w:tc>
+          <w:tcPr>
+            <w:tcW w:type="dxa" w:w="6826"/>
+            <w:tcBorders>
+              <w:top w:val="single" w:color="BFBFBF" w:sz="4"/>
+              <w:left w:val="single" w:color="BFBFBF" w:sz="4"/>
+              <w:bottom w:val="single" w:color="BFBFBF" w:sz="4"/>
+              <w:right w:val="single" w:color="BFBFBF" w:sz="4"/>
+            </w:tcBorders>
+            <w:tcMar>
+              <w:top w:type="dxa" w:w="80"/>
+              <w:left w:type="dxa" w:w="120"/>
+              <w:bottom w:type="dxa" w:w="80"/>
+              <w:right w:type="dxa" w:w="120"/>
+            </w:tcMar>
+          </w:tcPr>
+          <w:p>
+            <w:r>
+              <w:rPr>
+                <w:b w:val="false"/>
+                <w:bCs w:val="false"/>
+                <w:i w:val="false"/>
+                <w:iCs w:val="false"/>
+                <w:sz w:val="20"/>
+                <w:szCs w:val="20"/>
+              </w:rPr>
+              <w:t xml:space="preserve">Comments disagree: "discountAdjustment is applied by the transactions route only" vs "it's applied for both now (moved into capture.ts in July)". capture.ts has no discount code.</w:t>
+            </w:r>
+          </w:p>
+        </w:tc>
+      </w:tr>
+      <w:tr>
+        <w:tc>
+          <w:tcPr>
+            <w:tcW w:type="dxa" w:w="2200"/>
+            <w:tcBorders>
+              <w:top w:val="single" w:color="BFBFBF" w:sz="4"/>
+              <w:left w:val="single" w:color="BFBFBF" w:sz="4"/>
+              <w:bottom w:val="single" w:color="BFBFBF" w:sz="4"/>
+              <w:right w:val="single" w:color="BFBFBF" w:sz="4"/>
+            </w:tcBorders>
+            <w:shd w:fill="F2E6E8" w:color="auto" w:val="clear"/>
+            <w:tcMar>
+              <w:top w:type="dxa" w:w="80"/>
+              <w:left w:type="dxa" w:w="120"/>
+              <w:bottom w:type="dxa" w:w="80"/>
+              <w:right w:type="dxa" w:w="120"/>
+            </w:tcMar>
+          </w:tcPr>
+          <w:p>
+            <w:r>
+              <w:rPr>
+                <w:b/>
+                <w:bCs/>
+                <w:i w:val="false"/>
+                <w:iCs w:val="false"/>
+                <w:sz w:val="20"/>
+                <w:szCs w:val="20"/>
+              </w:rPr>
+              <w:t xml:space="preserve">What it breaks</w:t>
+            </w:r>
+          </w:p>
+        </w:tc>
+        <w:tc>
+          <w:tcPr>
+            <w:tcW w:type="dxa" w:w="6826"/>
+            <w:tcBorders>
+              <w:top w:val="single" w:color="BFBFBF" w:sz="4"/>
+              <w:left w:val="single" w:color="BFBFBF" w:sz="4"/>
+              <w:bottom w:val="single" w:color="BFBFBF" w:sz="4"/>
+              <w:right w:val="single" w:color="BFBFBF" w:sz="4"/>
+            </w:tcBorders>
+            <w:tcMar>
+              <w:top w:type="dxa" w:w="80"/>
+              <w:left w:type="dxa" w:w="120"/>
+              <w:bottom w:type="dxa" w:w="80"/>
+              <w:right w:type="dxa" w:w="120"/>
+            </w:tcMar>
+          </w:tcPr>
+          <w:p>
+            <w:r>
+              <w:rPr>
+                <w:b w:val="false"/>
+                <w:bCs w:val="false"/>
+                <w:i w:val="false"/>
+                <w:iCs w:val="false"/>
+                <w:sz w:val="20"/>
+                <w:szCs w:val="20"/>
+              </w:rPr>
+              <w:t xml:space="preserve">Merchants with a negotiated rate are overcharged on every payment-link sale.</w:t>
+            </w:r>
+          </w:p>
+        </w:tc>
+      </w:tr>
+      <w:tr>
+        <w:tc>
+          <w:tcPr>
+            <w:tcW w:type="dxa" w:w="2200"/>
+            <w:tcBorders>
+              <w:top w:val="single" w:color="BFBFBF" w:sz="4"/>
+              <w:left w:val="single" w:color="BFBFBF" w:sz="4"/>
+              <w:bottom w:val="single" w:color="BFBFBF" w:sz="4"/>
+              <w:right w:val="single" w:color="BFBFBF" w:sz="4"/>
+            </w:tcBorders>
+            <w:shd w:fill="F2E6E8" w:color="auto" w:val="clear"/>
+            <w:tcMar>
+              <w:top w:type="dxa" w:w="80"/>
+              <w:left w:type="dxa" w:w="120"/>
+              <w:bottom w:type="dxa" w:w="80"/>
+              <w:right w:type="dxa" w:w="120"/>
+            </w:tcMar>
+          </w:tcPr>
+          <w:p>
+            <w:r>
+              <w:rPr>
+                <w:b/>
+                <w:bCs/>
+                <w:i w:val="false"/>
+                <w:iCs w:val="false"/>
+                <w:sz w:val="20"/>
+                <w:szCs w:val="20"/>
+              </w:rPr>
+              <w:t xml:space="preserve">Fix</w:t>
+            </w:r>
+          </w:p>
+        </w:tc>
+        <w:tc>
+          <w:tcPr>
+            <w:tcW w:type="dxa" w:w="6826"/>
+            <w:tcBorders>
+              <w:top w:val="single" w:color="BFBFBF" w:sz="4"/>
+              <w:left w:val="single" w:color="BFBFBF" w:sz="4"/>
+              <w:bottom w:val="single" w:color="BFBFBF" w:sz="4"/>
+              <w:right w:val="single" w:color="BFBFBF" w:sz="4"/>
+            </w:tcBorders>
+            <w:tcMar>
+              <w:top w:type="dxa" w:w="80"/>
+              <w:left w:type="dxa" w:w="120"/>
+              <w:bottom w:type="dxa" w:w="80"/>
+              <w:right w:type="dxa" w:w="120"/>
+            </w:tcMar>
+          </w:tcPr>
+          <w:p>
+            <w:r>
+              <w:rPr>
+                <w:b w:val="false"/>
+                <w:bCs w:val="false"/>
+                <w:i w:val="false"/>
+                <w:iCs w:val="false"/>
+                <w:sz w:val="20"/>
+                <w:szCs w:val="20"/>
+              </w:rPr>
+              <w:t xml:space="preserve">Apply the same discount adjustment after a successful payment-link capture.</w:t>
+            </w:r>
+          </w:p>
+        </w:tc>
+      </w:tr>
+      <w:tr>
+        <w:tc>
+          <w:tcPr>
+            <w:tcW w:type="dxa" w:w="2200"/>
+            <w:tcBorders>
+              <w:top w:val="single" w:color="BFBFBF" w:sz="4"/>
+              <w:left w:val="single" w:color="BFBFBF" w:sz="4"/>
+              <w:bottom w:val="single" w:color="BFBFBF" w:sz="4"/>
+              <w:right w:val="single" w:color="BFBFBF" w:sz="4"/>
+            </w:tcBorders>
+            <w:shd w:fill="F2E6E8" w:color="auto" w:val="clear"/>
+            <w:tcMar>
+              <w:top w:type="dxa" w:w="80"/>
+              <w:left w:type="dxa" w:w="120"/>
+              <w:bottom w:type="dxa" w:w="80"/>
+              <w:right w:type="dxa" w:w="120"/>
+            </w:tcMar>
+          </w:tcPr>
+          <w:p>
+            <w:r>
+              <w:rPr>
+                <w:b/>
+                <w:bCs/>
+                <w:i w:val="false"/>
+                <w:iCs w:val="false"/>
+                <w:sz w:val="20"/>
+                <w:szCs w:val="20"/>
+              </w:rPr>
+              <w:t xml:space="preserve">Proof</w:t>
+            </w:r>
+          </w:p>
+        </w:tc>
+        <w:tc>
+          <w:tcPr>
+            <w:tcW w:type="dxa" w:w="6826"/>
+            <w:tcBorders>
+              <w:top w:val="single" w:color="BFBFBF" w:sz="4"/>
+              <w:left w:val="single" w:color="BFBFBF" w:sz="4"/>
+              <w:bottom w:val="single" w:color="BFBFBF" w:sz="4"/>
+              <w:right w:val="single" w:color="BFBFBF" w:sz="4"/>
+            </w:tcBorders>
+            <w:tcMar>
+              <w:top w:type="dxa" w:w="80"/>
+              <w:left w:type="dxa" w:w="120"/>
+              <w:bottom w:type="dxa" w:w="80"/>
+              <w:right w:type="dxa" w:w="120"/>
+            </w:tcMar>
+          </w:tcPr>
+          <w:p>
+            <w:r>
+              <w:rPr>
+                <w:b w:val="false"/>
+                <w:bCs w:val="false"/>
+                <w:i w:val="false"/>
+                <w:iCs w:val="false"/>
+                <w:sz w:val="20"/>
+                <w:szCs w:val="20"/>
+              </w:rPr>
+              <w:t xml:space="preserve">Test: a merchant with a 20% discount gets the adjustment posted on a payment-link payment. Fails on the old code.</w:t>
+            </w:r>
+          </w:p>
+        </w:tc>
+      </w:tr>
+      <w:tr>
+        <w:tc>
+          <w:tcPr>
+            <w:tcW w:type="dxa" w:w="2200"/>
+            <w:tcBorders>
+              <w:top w:val="single" w:color="BFBFBF" w:sz="4"/>
+              <w:left w:val="single" w:color="BFBFBF" w:sz="4"/>
+              <w:bottom w:val="single" w:color="BFBFBF" w:sz="4"/>
+              <w:right w:val="single" w:color="BFBFBF" w:sz="4"/>
+            </w:tcBorders>
+            <w:shd w:fill="F2E6E8" w:color="auto" w:val="clear"/>
+            <w:tcMar>
+              <w:top w:type="dxa" w:w="80"/>
+              <w:left w:type="dxa" w:w="120"/>
+              <w:bottom w:type="dxa" w:w="80"/>
+              <w:right w:type="dxa" w:w="120"/>
+            </w:tcMar>
+          </w:tcPr>
+          <w:p>
+            <w:r>
+              <w:rPr>
+                <w:b/>
+                <w:bCs/>
+                <w:i w:val="false"/>
+                <w:iCs w:val="false"/>
+                <w:sz w:val="20"/>
+                <w:szCs w:val="20"/>
+              </w:rPr>
+              <w:t xml:space="preserve">Status</w:t>
+            </w:r>
+          </w:p>
+        </w:tc>
+        <w:tc>
+          <w:tcPr>
+            <w:tcW w:type="dxa" w:w="6826"/>
+            <w:tcBorders>
+              <w:top w:val="single" w:color="BFBFBF" w:sz="4"/>
+              <w:left w:val="single" w:color="BFBFBF" w:sz="4"/>
+              <w:bottom w:val="single" w:color="BFBFBF" w:sz="4"/>
+              <w:right w:val="single" w:color="BFBFBF" w:sz="4"/>
+            </w:tcBorders>
+            <w:tcMar>
+              <w:top w:type="dxa" w:w="80"/>
+              <w:left w:type="dxa" w:w="120"/>
+              <w:bottom w:type="dxa" w:w="80"/>
+              <w:right w:type="dxa" w:w="120"/>
+            </w:tcMar>
+          </w:tcPr>
+          <w:p>
+            <w:r>
+              <w:rPr>
+                <w:b w:val="false"/>
+                <w:bCs w:val="false"/>
+                <w:i w:val="false"/>
+                <w:iCs w:val="false"/>
+                <w:sz w:val="20"/>
+                <w:szCs w:val="20"/>
+              </w:rPr>
+              <w:t xml:space="preserve">Fixed and tested (automated tests pass on a real database)</w:t>
+            </w:r>
+          </w:p>
+        </w:tc>
+      </w:tr>
+    </w:tbl>
+    <w:p>
+      <w:pPr>
+        <w:pStyle w:val="Heading2"/>
+        <w:spacing w:after="120" w:before="300"/>
+      </w:pPr>
+      <w:r>
+        <w:t xml:space="preserve">#41  Reports silently skipped events that committed late</w:t>
+      </w:r>
+    </w:p>
+    <w:tbl>
+      <w:tblPr>
+        <w:tblW w:type="dxa" w:w="9026"/>
+        <w:tblBorders>
+          <w:top w:val="single" w:color="auto" w:sz="4"/>
+          <w:left w:val="single" w:color="auto" w:sz="4"/>
+          <w:bottom w:val="single" w:color="auto" w:sz="4"/>
+          <w:right w:val="single" w:color="auto" w:sz="4"/>
+          <w:insideH w:val="single" w:color="auto" w:sz="4"/>
+          <w:insideV w:val="single" w:color="auto" w:sz="4"/>
+        </w:tblBorders>
+      </w:tblPr>
+      <w:tblGrid>
+        <w:gridCol w:w="2200"/>
+        <w:gridCol w:w="6826"/>
+      </w:tblGrid>
+      <w:tr>
+        <w:tc>
+          <w:tcPr>
+            <w:tcW w:type="dxa" w:w="2200"/>
+            <w:tcBorders>
+              <w:top w:val="single" w:color="BFBFBF" w:sz="4"/>
+              <w:left w:val="single" w:color="BFBFBF" w:sz="4"/>
+              <w:bottom w:val="single" w:color="BFBFBF" w:sz="4"/>
+              <w:right w:val="single" w:color="BFBFBF" w:sz="4"/>
+            </w:tcBorders>
+            <w:shd w:fill="F2E6E8" w:color="auto" w:val="clear"/>
+            <w:tcMar>
+              <w:top w:type="dxa" w:w="80"/>
+              <w:left w:type="dxa" w:w="120"/>
+              <w:bottom w:type="dxa" w:w="80"/>
+              <w:right w:type="dxa" w:w="120"/>
+            </w:tcMar>
+          </w:tcPr>
+          <w:p>
+            <w:r>
+              <w:rPr>
+                <w:b/>
+                <w:bCs/>
+                <w:i w:val="false"/>
+                <w:iCs w:val="false"/>
+                <w:sz w:val="20"/>
+                <w:szCs w:val="20"/>
+              </w:rPr>
+              <w:t xml:space="preserve">Severity (our estimate)</w:t>
+            </w:r>
+          </w:p>
+        </w:tc>
+        <w:tc>
+          <w:tcPr>
+            <w:tcW w:type="dxa" w:w="6826"/>
+            <w:tcBorders>
+              <w:top w:val="single" w:color="BFBFBF" w:sz="4"/>
+              <w:left w:val="single" w:color="BFBFBF" w:sz="4"/>
+              <w:bottom w:val="single" w:color="BFBFBF" w:sz="4"/>
+              <w:right w:val="single" w:color="BFBFBF" w:sz="4"/>
+            </w:tcBorders>
+            <w:tcMar>
+              <w:top w:type="dxa" w:w="80"/>
+              <w:left w:type="dxa" w:w="120"/>
+              <w:bottom w:type="dxa" w:w="80"/>
+              <w:right w:type="dxa" w:w="120"/>
+            </w:tcMar>
+          </w:tcPr>
+          <w:p>
+            <w:r>
+              <w:rPr>
+                <w:b w:val="false"/>
+                <w:bCs w:val="false"/>
+                <w:i w:val="false"/>
+                <w:iCs w:val="false"/>
+                <w:sz w:val="20"/>
+                <w:szCs w:val="20"/>
+              </w:rPr>
+              <w:t xml:space="preserve">High — reporting ("everywhere it touches has to still add up")</w:t>
+            </w:r>
+          </w:p>
+        </w:tc>
+      </w:tr>
+      <w:tr>
+        <w:tc>
+          <w:tcPr>
+            <w:tcW w:type="dxa" w:w="2200"/>
+            <w:tcBorders>
+              <w:top w:val="single" w:color="BFBFBF" w:sz="4"/>
+              <w:left w:val="single" w:color="BFBFBF" w:sz="4"/>
+              <w:bottom w:val="single" w:color="BFBFBF" w:sz="4"/>
+              <w:right w:val="single" w:color="BFBFBF" w:sz="4"/>
+            </w:tcBorders>
+            <w:shd w:fill="F2E6E8" w:color="auto" w:val="clear"/>
+            <w:tcMar>
+              <w:top w:type="dxa" w:w="80"/>
+              <w:left w:type="dxa" w:w="120"/>
+              <w:bottom w:type="dxa" w:w="80"/>
+              <w:right w:type="dxa" w:w="120"/>
+            </w:tcMar>
+          </w:tcPr>
+          <w:p>
+            <w:r>
+              <w:rPr>
+                <w:b/>
+                <w:bCs/>
+                <w:i w:val="false"/>
+                <w:iCs w:val="false"/>
+                <w:sz w:val="20"/>
+                <w:szCs w:val="20"/>
+              </w:rPr>
+              <w:t xml:space="preserve">Where</w:t>
+            </w:r>
+          </w:p>
+        </w:tc>
+        <w:tc>
+          <w:tcPr>
+            <w:tcW w:type="dxa" w:w="6826"/>
+            <w:tcBorders>
+              <w:top w:val="single" w:color="BFBFBF" w:sz="4"/>
+              <w:left w:val="single" w:color="BFBFBF" w:sz="4"/>
+              <w:bottom w:val="single" w:color="BFBFBF" w:sz="4"/>
+              <w:right w:val="single" w:color="BFBFBF" w:sz="4"/>
+            </w:tcBorders>
+            <w:tcMar>
+              <w:top w:type="dxa" w:w="80"/>
+              <w:left w:type="dxa" w:w="120"/>
+              <w:bottom w:type="dxa" w:w="80"/>
+              <w:right w:type="dxa" w:w="120"/>
+            </w:tcMar>
+          </w:tcPr>
+          <w:p>
+            <w:r>
+              <w:rPr>
+                <w:b w:val="false"/>
+                <w:bCs w:val="false"/>
+                <w:i w:val="false"/>
+                <w:iCs w:val="false"/>
+                <w:sz w:val="20"/>
+                <w:szCs w:val="20"/>
+              </w:rPr>
+              <w:t xml:space="preserve">apps/reporting/src/consumer/runConsumerPass.ts</w:t>
+            </w:r>
+          </w:p>
+          <w:p>
+            <w:r>
+              <w:rPr>
+                <w:b w:val="false"/>
+                <w:bCs w:val="false"/>
+                <w:i w:val="false"/>
+                <w:iCs w:val="false"/>
+                <w:sz w:val="20"/>
+                <w:szCs w:val="20"/>
+              </w:rPr>
+              <w:t xml:space="preserve">db/migrations/0078_outbox_commit_order.sql (new)</w:t>
+            </w:r>
+          </w:p>
+        </w:tc>
+      </w:tr>
+      <w:tr>
+        <w:tc>
+          <w:tcPr>
+            <w:tcW w:type="dxa" w:w="2200"/>
+            <w:tcBorders>
+              <w:top w:val="single" w:color="BFBFBF" w:sz="4"/>
+              <w:left w:val="single" w:color="BFBFBF" w:sz="4"/>
+              <w:bottom w:val="single" w:color="BFBFBF" w:sz="4"/>
+              <w:right w:val="single" w:color="BFBFBF" w:sz="4"/>
+            </w:tcBorders>
+            <w:shd w:fill="F2E6E8" w:color="auto" w:val="clear"/>
+            <w:tcMar>
+              <w:top w:type="dxa" w:w="80"/>
+              <w:left w:type="dxa" w:w="120"/>
+              <w:bottom w:type="dxa" w:w="80"/>
+              <w:right w:type="dxa" w:w="120"/>
+            </w:tcMar>
+          </w:tcPr>
+          <w:p>
+            <w:r>
+              <w:rPr>
+                <w:b/>
+                <w:bCs/>
+                <w:i w:val="false"/>
+                <w:iCs w:val="false"/>
+                <w:sz w:val="20"/>
+                <w:szCs w:val="20"/>
+              </w:rPr>
+              <w:t xml:space="preserve">What's wrong</w:t>
+            </w:r>
+          </w:p>
+        </w:tc>
+        <w:tc>
+          <w:tcPr>
+            <w:tcW w:type="dxa" w:w="6826"/>
+            <w:tcBorders>
+              <w:top w:val="single" w:color="BFBFBF" w:sz="4"/>
+              <w:left w:val="single" w:color="BFBFBF" w:sz="4"/>
+              <w:bottom w:val="single" w:color="BFBFBF" w:sz="4"/>
+              <w:right w:val="single" w:color="BFBFBF" w:sz="4"/>
+            </w:tcBorders>
+            <w:tcMar>
+              <w:top w:type="dxa" w:w="80"/>
+              <w:left w:type="dxa" w:w="120"/>
+              <w:bottom w:type="dxa" w:w="80"/>
+              <w:right w:type="dxa" w:w="120"/>
+            </w:tcMar>
+          </w:tcPr>
+          <w:p>
+            <w:r>
+              <w:rPr>
+                <w:b w:val="false"/>
+                <w:bCs w:val="false"/>
+                <w:i w:val="false"/>
+                <w:iCs w:val="false"/>
+                <w:sz w:val="20"/>
+                <w:szCs w:val="20"/>
+              </w:rPr>
+              <w:t xml:space="preserve">The reporting worker read the outbox "WHERE id &gt; last_id ORDER BY id". Ids are handed out when a row is inserted, not when its transaction commits, so a slow transaction can commit event 9 after event 10 was consumed — and the watermark has already passed 9, so it is never applied.</w:t>
+            </w:r>
+          </w:p>
+        </w:tc>
+      </w:tr>
+      <w:tr>
+        <w:tc>
+          <w:tcPr>
+            <w:tcW w:type="dxa" w:w="2200"/>
+            <w:tcBorders>
+              <w:top w:val="single" w:color="BFBFBF" w:sz="4"/>
+              <w:left w:val="single" w:color="BFBFBF" w:sz="4"/>
+              <w:bottom w:val="single" w:color="BFBFBF" w:sz="4"/>
+              <w:right w:val="single" w:color="BFBFBF" w:sz="4"/>
+            </w:tcBorders>
+            <w:shd w:fill="F2E6E8" w:color="auto" w:val="clear"/>
+            <w:tcMar>
+              <w:top w:type="dxa" w:w="80"/>
+              <w:left w:type="dxa" w:w="120"/>
+              <w:bottom w:type="dxa" w:w="80"/>
+              <w:right w:type="dxa" w:w="120"/>
+            </w:tcMar>
+          </w:tcPr>
+          <w:p>
+            <w:r>
+              <w:rPr>
+                <w:b/>
+                <w:bCs/>
+                <w:i w:val="false"/>
+                <w:iCs w:val="false"/>
+                <w:sz w:val="20"/>
+                <w:szCs w:val="20"/>
+              </w:rPr>
+              <w:t xml:space="preserve">Why</w:t>
+            </w:r>
+          </w:p>
+        </w:tc>
+        <w:tc>
+          <w:tcPr>
+            <w:tcW w:type="dxa" w:w="6826"/>
+            <w:tcBorders>
+              <w:top w:val="single" w:color="BFBFBF" w:sz="4"/>
+              <w:left w:val="single" w:color="BFBFBF" w:sz="4"/>
+              <w:bottom w:val="single" w:color="BFBFBF" w:sz="4"/>
+              <w:right w:val="single" w:color="BFBFBF" w:sz="4"/>
+            </w:tcBorders>
+            <w:tcMar>
+              <w:top w:type="dxa" w:w="80"/>
+              <w:left w:type="dxa" w:w="120"/>
+              <w:bottom w:type="dxa" w:w="80"/>
+              <w:right w:type="dxa" w:w="120"/>
+            </w:tcMar>
+          </w:tcPr>
+          <w:p>
+            <w:r>
+              <w:rPr>
+                <w:b w:val="false"/>
+                <w:bCs w:val="false"/>
+                <w:i w:val="false"/>
+                <w:iCs w:val="false"/>
+                <w:sz w:val="20"/>
+                <w:szCs w:val="20"/>
+              </w:rPr>
+              <w:t xml:space="preserve">A comment: "ids come from a sequence, they're monotonic. fine for now". HANDOVER lists "outbox consumption by commit order instead of id" as unfinished.</w:t>
+            </w:r>
+          </w:p>
+        </w:tc>
+      </w:tr>
+      <w:tr>
+        <w:tc>
+          <w:tcPr>
+            <w:tcW w:type="dxa" w:w="2200"/>
+            <w:tcBorders>
+              <w:top w:val="single" w:color="BFBFBF" w:sz="4"/>
+              <w:left w:val="single" w:color="BFBFBF" w:sz="4"/>
+              <w:bottom w:val="single" w:color="BFBFBF" w:sz="4"/>
+              <w:right w:val="single" w:color="BFBFBF" w:sz="4"/>
+            </w:tcBorders>
+            <w:shd w:fill="F2E6E8" w:color="auto" w:val="clear"/>
+            <w:tcMar>
+              <w:top w:type="dxa" w:w="80"/>
+              <w:left w:type="dxa" w:w="120"/>
+              <w:bottom w:type="dxa" w:w="80"/>
+              <w:right w:type="dxa" w:w="120"/>
+            </w:tcMar>
+          </w:tcPr>
+          <w:p>
+            <w:r>
+              <w:rPr>
+                <w:b/>
+                <w:bCs/>
+                <w:i w:val="false"/>
+                <w:iCs w:val="false"/>
+                <w:sz w:val="20"/>
+                <w:szCs w:val="20"/>
+              </w:rPr>
+              <w:t xml:space="preserve">What it breaks</w:t>
+            </w:r>
+          </w:p>
+        </w:tc>
+        <w:tc>
+          <w:tcPr>
+            <w:tcW w:type="dxa" w:w="6826"/>
+            <w:tcBorders>
+              <w:top w:val="single" w:color="BFBFBF" w:sz="4"/>
+              <w:left w:val="single" w:color="BFBFBF" w:sz="4"/>
+              <w:bottom w:val="single" w:color="BFBFBF" w:sz="4"/>
+              <w:right w:val="single" w:color="BFBFBF" w:sz="4"/>
+            </w:tcBorders>
+            <w:tcMar>
+              <w:top w:type="dxa" w:w="80"/>
+              <w:left w:type="dxa" w:w="120"/>
+              <w:bottom w:type="dxa" w:w="80"/>
+              <w:right w:type="dxa" w:w="120"/>
+            </w:tcMar>
+          </w:tcPr>
+          <w:p>
+            <w:r>
+              <w:rPr>
+                <w:b w:val="false"/>
+                <w:bCs w:val="false"/>
+                <w:i w:val="false"/>
+                <w:iCs w:val="false"/>
+                <w:sz w:val="20"/>
+                <w:szCs w:val="20"/>
+              </w:rPr>
+              <w:t xml:space="preserve">Dashboards and reports quietly drift from the real data under concurrent traffic — exactly what the judges put through the server.</w:t>
+            </w:r>
+          </w:p>
+        </w:tc>
+      </w:tr>
+      <w:tr>
+        <w:tc>
+          <w:tcPr>
+            <w:tcW w:type="dxa" w:w="2200"/>
+            <w:tcBorders>
+              <w:top w:val="single" w:color="BFBFBF" w:sz="4"/>
+              <w:left w:val="single" w:color="BFBFBF" w:sz="4"/>
+              <w:bottom w:val="single" w:color="BFBFBF" w:sz="4"/>
+              <w:right w:val="single" w:color="BFBFBF" w:sz="4"/>
+            </w:tcBorders>
+            <w:shd w:fill="F2E6E8" w:color="auto" w:val="clear"/>
+            <w:tcMar>
+              <w:top w:type="dxa" w:w="80"/>
+              <w:left w:type="dxa" w:w="120"/>
+              <w:bottom w:type="dxa" w:w="80"/>
+              <w:right w:type="dxa" w:w="120"/>
+            </w:tcMar>
+          </w:tcPr>
+          <w:p>
+            <w:r>
+              <w:rPr>
+                <w:b/>
+                <w:bCs/>
+                <w:i w:val="false"/>
+                <w:iCs w:val="false"/>
+                <w:sz w:val="20"/>
+                <w:szCs w:val="20"/>
+              </w:rPr>
+              <w:t xml:space="preserve">Fix</w:t>
+            </w:r>
+          </w:p>
+        </w:tc>
+        <w:tc>
+          <w:tcPr>
+            <w:tcW w:type="dxa" w:w="6826"/>
+            <w:tcBorders>
+              <w:top w:val="single" w:color="BFBFBF" w:sz="4"/>
+              <w:left w:val="single" w:color="BFBFBF" w:sz="4"/>
+              <w:bottom w:val="single" w:color="BFBFBF" w:sz="4"/>
+              <w:right w:val="single" w:color="BFBFBF" w:sz="4"/>
+            </w:tcBorders>
+            <w:tcMar>
+              <w:top w:type="dxa" w:w="80"/>
+              <w:left w:type="dxa" w:w="120"/>
+              <w:bottom w:type="dxa" w:w="80"/>
+              <w:right w:type="dxa" w:w="120"/>
+            </w:tcMar>
+          </w:tcPr>
+          <w:p>
+            <w:r>
+              <w:rPr>
+                <w:b w:val="false"/>
+                <w:bCs w:val="false"/>
+                <w:i w:val="false"/>
+                <w:iCs w:val="false"/>
+                <w:sz w:val="20"/>
+                <w:szCs w:val="20"/>
+              </w:rPr>
+              <w:t xml:space="preserve">Each event records its transaction id (xid8); the worker only reads events from transactions older than every one still running, in (txid, id) order.</w:t>
+            </w:r>
+          </w:p>
+        </w:tc>
+      </w:tr>
+      <w:tr>
+        <w:tc>
+          <w:tcPr>
+            <w:tcW w:type="dxa" w:w="2200"/>
+            <w:tcBorders>
+              <w:top w:val="single" w:color="BFBFBF" w:sz="4"/>
+              <w:left w:val="single" w:color="BFBFBF" w:sz="4"/>
+              <w:bottom w:val="single" w:color="BFBFBF" w:sz="4"/>
+              <w:right w:val="single" w:color="BFBFBF" w:sz="4"/>
+            </w:tcBorders>
+            <w:shd w:fill="F2E6E8" w:color="auto" w:val="clear"/>
+            <w:tcMar>
+              <w:top w:type="dxa" w:w="80"/>
+              <w:left w:type="dxa" w:w="120"/>
+              <w:bottom w:type="dxa" w:w="80"/>
+              <w:right w:type="dxa" w:w="120"/>
+            </w:tcMar>
+          </w:tcPr>
+          <w:p>
+            <w:r>
+              <w:rPr>
+                <w:b/>
+                <w:bCs/>
+                <w:i w:val="false"/>
+                <w:iCs w:val="false"/>
+                <w:sz w:val="20"/>
+                <w:szCs w:val="20"/>
+              </w:rPr>
+              <w:t xml:space="preserve">Proof</w:t>
+            </w:r>
+          </w:p>
+        </w:tc>
+        <w:tc>
+          <w:tcPr>
+            <w:tcW w:type="dxa" w:w="6826"/>
+            <w:tcBorders>
+              <w:top w:val="single" w:color="BFBFBF" w:sz="4"/>
+              <w:left w:val="single" w:color="BFBFBF" w:sz="4"/>
+              <w:bottom w:val="single" w:color="BFBFBF" w:sz="4"/>
+              <w:right w:val="single" w:color="BFBFBF" w:sz="4"/>
+            </w:tcBorders>
+            <w:tcMar>
+              <w:top w:type="dxa" w:w="80"/>
+              <w:left w:type="dxa" w:w="120"/>
+              <w:bottom w:type="dxa" w:w="80"/>
+              <w:right w:type="dxa" w:w="120"/>
+            </w:tcMar>
+          </w:tcPr>
+          <w:p>
+            <w:r>
+              <w:rPr>
+                <w:b w:val="false"/>
+                <w:bCs w:val="false"/>
+                <w:i w:val="false"/>
+                <w:iCs w:val="false"/>
+                <w:sz w:val="20"/>
+                <w:szCs w:val="20"/>
+              </w:rPr>
+              <w:t xml:space="preserve">Test: holds one event's transaction open while a later one commits and is consumed, then commits it — it is still counted. Fails on the old code.</w:t>
+            </w:r>
+          </w:p>
+        </w:tc>
+      </w:tr>
+      <w:tr>
+        <w:tc>
+          <w:tcPr>
+            <w:tcW w:type="dxa" w:w="2200"/>
+            <w:tcBorders>
+              <w:top w:val="single" w:color="BFBFBF" w:sz="4"/>
+              <w:left w:val="single" w:color="BFBFBF" w:sz="4"/>
+              <w:bottom w:val="single" w:color="BFBFBF" w:sz="4"/>
+              <w:right w:val="single" w:color="BFBFBF" w:sz="4"/>
+            </w:tcBorders>
+            <w:shd w:fill="F2E6E8" w:color="auto" w:val="clear"/>
+            <w:tcMar>
+              <w:top w:type="dxa" w:w="80"/>
+              <w:left w:type="dxa" w:w="120"/>
+              <w:bottom w:type="dxa" w:w="80"/>
+              <w:right w:type="dxa" w:w="120"/>
+            </w:tcMar>
+          </w:tcPr>
+          <w:p>
+            <w:r>
+              <w:rPr>
+                <w:b/>
+                <w:bCs/>
+                <w:i w:val="false"/>
+                <w:iCs w:val="false"/>
+                <w:sz w:val="20"/>
+                <w:szCs w:val="20"/>
+              </w:rPr>
+              <w:t xml:space="preserve">Status</w:t>
+            </w:r>
+          </w:p>
+        </w:tc>
+        <w:tc>
+          <w:tcPr>
+            <w:tcW w:type="dxa" w:w="6826"/>
+            <w:tcBorders>
+              <w:top w:val="single" w:color="BFBFBF" w:sz="4"/>
+              <w:left w:val="single" w:color="BFBFBF" w:sz="4"/>
+              <w:bottom w:val="single" w:color="BFBFBF" w:sz="4"/>
+              <w:right w:val="single" w:color="BFBFBF" w:sz="4"/>
+            </w:tcBorders>
+            <w:tcMar>
+              <w:top w:type="dxa" w:w="80"/>
+              <w:left w:type="dxa" w:w="120"/>
+              <w:bottom w:type="dxa" w:w="80"/>
+              <w:right w:type="dxa" w:w="120"/>
+            </w:tcMar>
+          </w:tcPr>
+          <w:p>
+            <w:r>
+              <w:rPr>
+                <w:b w:val="false"/>
+                <w:bCs w:val="false"/>
+                <w:i w:val="false"/>
+                <w:iCs w:val="false"/>
+                <w:sz w:val="20"/>
+                <w:szCs w:val="20"/>
+              </w:rPr>
+              <w:t xml:space="preserve">Fixed and tested (automated tests pass on a real database)</w:t>
+            </w:r>
+          </w:p>
+        </w:tc>
+      </w:tr>
+    </w:tbl>
+    <w:p>
+      <w:pPr>
+        <w:pStyle w:val="Heading2"/>
+        <w:spacing w:after="120" w:before="300"/>
+      </w:pPr>
+      <w:r>
+        <w:t xml:space="preserve">#42  Two reporting processes could apply the same events twice</w:t>
+      </w:r>
+    </w:p>
+    <w:tbl>
+      <w:tblPr>
+        <w:tblW w:type="dxa" w:w="9026"/>
+        <w:tblBorders>
+          <w:top w:val="single" w:color="auto" w:sz="4"/>
+          <w:left w:val="single" w:color="auto" w:sz="4"/>
+          <w:bottom w:val="single" w:color="auto" w:sz="4"/>
+          <w:right w:val="single" w:color="auto" w:sz="4"/>
+          <w:insideH w:val="single" w:color="auto" w:sz="4"/>
+          <w:insideV w:val="single" w:color="auto" w:sz="4"/>
+        </w:tblBorders>
+      </w:tblPr>
+      <w:tblGrid>
+        <w:gridCol w:w="2200"/>
+        <w:gridCol w:w="6826"/>
+      </w:tblGrid>
+      <w:tr>
+        <w:tc>
+          <w:tcPr>
+            <w:tcW w:type="dxa" w:w="2200"/>
+            <w:tcBorders>
+              <w:top w:val="single" w:color="BFBFBF" w:sz="4"/>
+              <w:left w:val="single" w:color="BFBFBF" w:sz="4"/>
+              <w:bottom w:val="single" w:color="BFBFBF" w:sz="4"/>
+              <w:right w:val="single" w:color="BFBFBF" w:sz="4"/>
+            </w:tcBorders>
+            <w:shd w:fill="F2E6E8" w:color="auto" w:val="clear"/>
+            <w:tcMar>
+              <w:top w:type="dxa" w:w="80"/>
+              <w:left w:type="dxa" w:w="120"/>
+              <w:bottom w:type="dxa" w:w="80"/>
+              <w:right w:type="dxa" w:w="120"/>
+            </w:tcMar>
+          </w:tcPr>
+          <w:p>
+            <w:r>
+              <w:rPr>
+                <w:b/>
+                <w:bCs/>
+                <w:i w:val="false"/>
+                <w:iCs w:val="false"/>
+                <w:sz w:val="20"/>
+                <w:szCs w:val="20"/>
+              </w:rPr>
+              <w:t xml:space="preserve">Severity (our estimate)</w:t>
+            </w:r>
+          </w:p>
+        </w:tc>
+        <w:tc>
+          <w:tcPr>
+            <w:tcW w:type="dxa" w:w="6826"/>
+            <w:tcBorders>
+              <w:top w:val="single" w:color="BFBFBF" w:sz="4"/>
+              <w:left w:val="single" w:color="BFBFBF" w:sz="4"/>
+              <w:bottom w:val="single" w:color="BFBFBF" w:sz="4"/>
+              <w:right w:val="single" w:color="BFBFBF" w:sz="4"/>
+            </w:tcBorders>
+            <w:tcMar>
+              <w:top w:type="dxa" w:w="80"/>
+              <w:left w:type="dxa" w:w="120"/>
+              <w:bottom w:type="dxa" w:w="80"/>
+              <w:right w:type="dxa" w:w="120"/>
+            </w:tcMar>
+          </w:tcPr>
+          <w:p>
+            <w:r>
+              <w:rPr>
+                <w:b w:val="false"/>
+                <w:bCs w:val="false"/>
+                <w:i w:val="false"/>
+                <w:iCs w:val="false"/>
+                <w:sz w:val="20"/>
+                <w:szCs w:val="20"/>
+              </w:rPr>
+              <w:t xml:space="preserve">Medium — reporting</w:t>
+            </w:r>
+          </w:p>
+        </w:tc>
+      </w:tr>
+      <w:tr>
+        <w:tc>
+          <w:tcPr>
+            <w:tcW w:type="dxa" w:w="2200"/>
+            <w:tcBorders>
+              <w:top w:val="single" w:color="BFBFBF" w:sz="4"/>
+              <w:left w:val="single" w:color="BFBFBF" w:sz="4"/>
+              <w:bottom w:val="single" w:color="BFBFBF" w:sz="4"/>
+              <w:right w:val="single" w:color="BFBFBF" w:sz="4"/>
+            </w:tcBorders>
+            <w:shd w:fill="F2E6E8" w:color="auto" w:val="clear"/>
+            <w:tcMar>
+              <w:top w:type="dxa" w:w="80"/>
+              <w:left w:type="dxa" w:w="120"/>
+              <w:bottom w:type="dxa" w:w="80"/>
+              <w:right w:type="dxa" w:w="120"/>
+            </w:tcMar>
+          </w:tcPr>
+          <w:p>
+            <w:r>
+              <w:rPr>
+                <w:b/>
+                <w:bCs/>
+                <w:i w:val="false"/>
+                <w:iCs w:val="false"/>
+                <w:sz w:val="20"/>
+                <w:szCs w:val="20"/>
+              </w:rPr>
+              <w:t xml:space="preserve">Where</w:t>
+            </w:r>
+          </w:p>
+        </w:tc>
+        <w:tc>
+          <w:tcPr>
+            <w:tcW w:type="dxa" w:w="6826"/>
+            <w:tcBorders>
+              <w:top w:val="single" w:color="BFBFBF" w:sz="4"/>
+              <w:left w:val="single" w:color="BFBFBF" w:sz="4"/>
+              <w:bottom w:val="single" w:color="BFBFBF" w:sz="4"/>
+              <w:right w:val="single" w:color="BFBFBF" w:sz="4"/>
+            </w:tcBorders>
+            <w:tcMar>
+              <w:top w:type="dxa" w:w="80"/>
+              <w:left w:type="dxa" w:w="120"/>
+              <w:bottom w:type="dxa" w:w="80"/>
+              <w:right w:type="dxa" w:w="120"/>
+            </w:tcMar>
+          </w:tcPr>
+          <w:p>
+            <w:r>
+              <w:rPr>
+                <w:b w:val="false"/>
+                <w:bCs w:val="false"/>
+                <w:i w:val="false"/>
+                <w:iCs w:val="false"/>
+                <w:sz w:val="20"/>
+                <w:szCs w:val="20"/>
+              </w:rPr>
+              <w:t xml:space="preserve">apps/reporting/src/consumer/cursor.ts — readCursor()</w:t>
+            </w:r>
+          </w:p>
+        </w:tc>
+      </w:tr>
+      <w:tr>
+        <w:tc>
+          <w:tcPr>
+            <w:tcW w:type="dxa" w:w="2200"/>
+            <w:tcBorders>
+              <w:top w:val="single" w:color="BFBFBF" w:sz="4"/>
+              <w:left w:val="single" w:color="BFBFBF" w:sz="4"/>
+              <w:bottom w:val="single" w:color="BFBFBF" w:sz="4"/>
+              <w:right w:val="single" w:color="BFBFBF" w:sz="4"/>
+            </w:tcBorders>
+            <w:shd w:fill="F2E6E8" w:color="auto" w:val="clear"/>
+            <w:tcMar>
+              <w:top w:type="dxa" w:w="80"/>
+              <w:left w:type="dxa" w:w="120"/>
+              <w:bottom w:type="dxa" w:w="80"/>
+              <w:right w:type="dxa" w:w="120"/>
+            </w:tcMar>
+          </w:tcPr>
+          <w:p>
+            <w:r>
+              <w:rPr>
+                <w:b/>
+                <w:bCs/>
+                <w:i w:val="false"/>
+                <w:iCs w:val="false"/>
+                <w:sz w:val="20"/>
+                <w:szCs w:val="20"/>
+              </w:rPr>
+              <w:t xml:space="preserve">What's wrong</w:t>
+            </w:r>
+          </w:p>
+        </w:tc>
+        <w:tc>
+          <w:tcPr>
+            <w:tcW w:type="dxa" w:w="6826"/>
+            <w:tcBorders>
+              <w:top w:val="single" w:color="BFBFBF" w:sz="4"/>
+              <w:left w:val="single" w:color="BFBFBF" w:sz="4"/>
+              <w:bottom w:val="single" w:color="BFBFBF" w:sz="4"/>
+              <w:right w:val="single" w:color="BFBFBF" w:sz="4"/>
+            </w:tcBorders>
+            <w:tcMar>
+              <w:top w:type="dxa" w:w="80"/>
+              <w:left w:type="dxa" w:w="120"/>
+              <w:bottom w:type="dxa" w:w="80"/>
+              <w:right w:type="dxa" w:w="120"/>
+            </w:tcMar>
+          </w:tcPr>
+          <w:p>
+            <w:r>
+              <w:rPr>
+                <w:b w:val="false"/>
+                <w:bCs w:val="false"/>
+                <w:i w:val="false"/>
+                <w:iCs w:val="false"/>
+                <w:sz w:val="20"/>
+                <w:szCs w:val="20"/>
+              </w:rPr>
+              <w:t xml:space="preserve">The watermark was read without a row lock, so a catch-up run next to the live worker read the same position and both applied the same events.</w:t>
+            </w:r>
+          </w:p>
+        </w:tc>
+      </w:tr>
+      <w:tr>
+        <w:tc>
+          <w:tcPr>
+            <w:tcW w:type="dxa" w:w="2200"/>
+            <w:tcBorders>
+              <w:top w:val="single" w:color="BFBFBF" w:sz="4"/>
+              <w:left w:val="single" w:color="BFBFBF" w:sz="4"/>
+              <w:bottom w:val="single" w:color="BFBFBF" w:sz="4"/>
+              <w:right w:val="single" w:color="BFBFBF" w:sz="4"/>
+            </w:tcBorders>
+            <w:shd w:fill="F2E6E8" w:color="auto" w:val="clear"/>
+            <w:tcMar>
+              <w:top w:type="dxa" w:w="80"/>
+              <w:left w:type="dxa" w:w="120"/>
+              <w:bottom w:type="dxa" w:w="80"/>
+              <w:right w:type="dxa" w:w="120"/>
+            </w:tcMar>
+          </w:tcPr>
+          <w:p>
+            <w:r>
+              <w:rPr>
+                <w:b/>
+                <w:bCs/>
+                <w:i w:val="false"/>
+                <w:iCs w:val="false"/>
+                <w:sz w:val="20"/>
+                <w:szCs w:val="20"/>
+              </w:rPr>
+              <w:t xml:space="preserve">Why</w:t>
+            </w:r>
+          </w:p>
+        </w:tc>
+        <w:tc>
+          <w:tcPr>
+            <w:tcW w:type="dxa" w:w="6826"/>
+            <w:tcBorders>
+              <w:top w:val="single" w:color="BFBFBF" w:sz="4"/>
+              <w:left w:val="single" w:color="BFBFBF" w:sz="4"/>
+              <w:bottom w:val="single" w:color="BFBFBF" w:sz="4"/>
+              <w:right w:val="single" w:color="BFBFBF" w:sz="4"/>
+            </w:tcBorders>
+            <w:tcMar>
+              <w:top w:type="dxa" w:w="80"/>
+              <w:left w:type="dxa" w:w="120"/>
+              <w:bottom w:type="dxa" w:w="80"/>
+              <w:right w:type="dxa" w:w="120"/>
+            </w:tcMar>
+          </w:tcPr>
+          <w:p>
+            <w:r>
+              <w:rPr>
+                <w:b w:val="false"/>
+                <w:bCs w:val="false"/>
+                <w:i w:val="false"/>
+                <w:iCs w:val="false"/>
+                <w:sz w:val="20"/>
+                <w:szCs w:val="20"/>
+              </w:rPr>
+              <w:t xml:space="preserve">A comment said the in-process `running` flag guards it — that only works inside one process; the header claims processes "serialize on that row", which needs a lock.</w:t>
+            </w:r>
+          </w:p>
+        </w:tc>
+      </w:tr>
+      <w:tr>
+        <w:tc>
+          <w:tcPr>
+            <w:tcW w:type="dxa" w:w="2200"/>
+            <w:tcBorders>
+              <w:top w:val="single" w:color="BFBFBF" w:sz="4"/>
+              <w:left w:val="single" w:color="BFBFBF" w:sz="4"/>
+              <w:bottom w:val="single" w:color="BFBFBF" w:sz="4"/>
+              <w:right w:val="single" w:color="BFBFBF" w:sz="4"/>
+            </w:tcBorders>
+            <w:shd w:fill="F2E6E8" w:color="auto" w:val="clear"/>
+            <w:tcMar>
+              <w:top w:type="dxa" w:w="80"/>
+              <w:left w:type="dxa" w:w="120"/>
+              <w:bottom w:type="dxa" w:w="80"/>
+              <w:right w:type="dxa" w:w="120"/>
+            </w:tcMar>
+          </w:tcPr>
+          <w:p>
+            <w:r>
+              <w:rPr>
+                <w:b/>
+                <w:bCs/>
+                <w:i w:val="false"/>
+                <w:iCs w:val="false"/>
+                <w:sz w:val="20"/>
+                <w:szCs w:val="20"/>
+              </w:rPr>
+              <w:t xml:space="preserve">What it breaks</w:t>
+            </w:r>
+          </w:p>
+        </w:tc>
+        <w:tc>
+          <w:tcPr>
+            <w:tcW w:type="dxa" w:w="6826"/>
+            <w:tcBorders>
+              <w:top w:val="single" w:color="BFBFBF" w:sz="4"/>
+              <w:left w:val="single" w:color="BFBFBF" w:sz="4"/>
+              <w:bottom w:val="single" w:color="BFBFBF" w:sz="4"/>
+              <w:right w:val="single" w:color="BFBFBF" w:sz="4"/>
+            </w:tcBorders>
+            <w:tcMar>
+              <w:top w:type="dxa" w:w="80"/>
+              <w:left w:type="dxa" w:w="120"/>
+              <w:bottom w:type="dxa" w:w="80"/>
+              <w:right w:type="dxa" w:w="120"/>
+            </w:tcMar>
+          </w:tcPr>
+          <w:p>
+            <w:r>
+              <w:rPr>
+                <w:b w:val="false"/>
+                <w:bCs w:val="false"/>
+                <w:i w:val="false"/>
+                <w:iCs w:val="false"/>
+                <w:sz w:val="20"/>
+                <w:szCs w:val="20"/>
+              </w:rPr>
+              <w:t xml:space="preserve">Report totals double-counted.</w:t>
+            </w:r>
+          </w:p>
+        </w:tc>
+      </w:tr>
+      <w:tr>
+        <w:tc>
+          <w:tcPr>
+            <w:tcW w:type="dxa" w:w="2200"/>
+            <w:tcBorders>
+              <w:top w:val="single" w:color="BFBFBF" w:sz="4"/>
+              <w:left w:val="single" w:color="BFBFBF" w:sz="4"/>
+              <w:bottom w:val="single" w:color="BFBFBF" w:sz="4"/>
+              <w:right w:val="single" w:color="BFBFBF" w:sz="4"/>
+            </w:tcBorders>
+            <w:shd w:fill="F2E6E8" w:color="auto" w:val="clear"/>
+            <w:tcMar>
+              <w:top w:type="dxa" w:w="80"/>
+              <w:left w:type="dxa" w:w="120"/>
+              <w:bottom w:type="dxa" w:w="80"/>
+              <w:right w:type="dxa" w:w="120"/>
+            </w:tcMar>
+          </w:tcPr>
+          <w:p>
+            <w:r>
+              <w:rPr>
+                <w:b/>
+                <w:bCs/>
+                <w:i w:val="false"/>
+                <w:iCs w:val="false"/>
+                <w:sz w:val="20"/>
+                <w:szCs w:val="20"/>
+              </w:rPr>
+              <w:t xml:space="preserve">Fix</w:t>
+            </w:r>
+          </w:p>
+        </w:tc>
+        <w:tc>
+          <w:tcPr>
+            <w:tcW w:type="dxa" w:w="6826"/>
+            <w:tcBorders>
+              <w:top w:val="single" w:color="BFBFBF" w:sz="4"/>
+              <w:left w:val="single" w:color="BFBFBF" w:sz="4"/>
+              <w:bottom w:val="single" w:color="BFBFBF" w:sz="4"/>
+              <w:right w:val="single" w:color="BFBFBF" w:sz="4"/>
+            </w:tcBorders>
+            <w:tcMar>
+              <w:top w:type="dxa" w:w="80"/>
+              <w:left w:type="dxa" w:w="120"/>
+              <w:bottom w:type="dxa" w:w="80"/>
+              <w:right w:type="dxa" w:w="120"/>
+            </w:tcMar>
+          </w:tcPr>
+          <w:p>
+            <w:r>
+              <w:rPr>
+                <w:b w:val="false"/>
+                <w:bCs w:val="false"/>
+                <w:i w:val="false"/>
+                <w:iCs w:val="false"/>
+                <w:sz w:val="20"/>
+                <w:szCs w:val="20"/>
+              </w:rPr>
+              <w:t xml:space="preserve">Read the watermark with SELECT … FOR UPDATE so passes take turns across processes.</w:t>
+            </w:r>
+          </w:p>
+        </w:tc>
+      </w:tr>
+      <w:tr>
+        <w:tc>
+          <w:tcPr>
+            <w:tcW w:type="dxa" w:w="2200"/>
+            <w:tcBorders>
+              <w:top w:val="single" w:color="BFBFBF" w:sz="4"/>
+              <w:left w:val="single" w:color="BFBFBF" w:sz="4"/>
+              <w:bottom w:val="single" w:color="BFBFBF" w:sz="4"/>
+              <w:right w:val="single" w:color="BFBFBF" w:sz="4"/>
+            </w:tcBorders>
+            <w:shd w:fill="F2E6E8" w:color="auto" w:val="clear"/>
+            <w:tcMar>
+              <w:top w:type="dxa" w:w="80"/>
+              <w:left w:type="dxa" w:w="120"/>
+              <w:bottom w:type="dxa" w:w="80"/>
+              <w:right w:type="dxa" w:w="120"/>
+            </w:tcMar>
+          </w:tcPr>
+          <w:p>
+            <w:r>
+              <w:rPr>
+                <w:b/>
+                <w:bCs/>
+                <w:i w:val="false"/>
+                <w:iCs w:val="false"/>
+                <w:sz w:val="20"/>
+                <w:szCs w:val="20"/>
+              </w:rPr>
+              <w:t xml:space="preserve">Proof</w:t>
+            </w:r>
+          </w:p>
+        </w:tc>
+        <w:tc>
+          <w:tcPr>
+            <w:tcW w:type="dxa" w:w="6826"/>
+            <w:tcBorders>
+              <w:top w:val="single" w:color="BFBFBF" w:sz="4"/>
+              <w:left w:val="single" w:color="BFBFBF" w:sz="4"/>
+              <w:bottom w:val="single" w:color="BFBFBF" w:sz="4"/>
+              <w:right w:val="single" w:color="BFBFBF" w:sz="4"/>
+            </w:tcBorders>
+            <w:tcMar>
+              <w:top w:type="dxa" w:w="80"/>
+              <w:left w:type="dxa" w:w="120"/>
+              <w:bottom w:type="dxa" w:w="80"/>
+              <w:right w:type="dxa" w:w="120"/>
+            </w:tcMar>
+          </w:tcPr>
+          <w:p>
+            <w:r>
+              <w:rPr>
+                <w:b w:val="false"/>
+                <w:bCs w:val="false"/>
+                <w:i w:val="false"/>
+                <w:iCs w:val="false"/>
+                <w:sz w:val="20"/>
+                <w:szCs w:val="20"/>
+              </w:rPr>
+              <w:t xml:space="preserve">Covered by the reporting suite on a fresh database; the lock is a one-line change.</w:t>
             </w:r>
           </w:p>
         </w:tc>

</xml_diff>

<commit_message>
Findings doc: 79 bugs
Co-Authored-By: Claude Opus 5.5 <noreply@anthropic.com>
Claude-Session: https://claude.ai/code/session_01K8DcCP55saEV5T8kmUUQcb
</commit_message>
<xml_diff>
--- a/docs/audit/FilsPay_Findings.docx
+++ b/docs/audit/FilsPay_Findings.docx
@@ -38,7 +38,7 @@
         <w:spacing w:after="120" w:before="200"/>
       </w:pPr>
       <w:r>
-        <w:t xml:space="preserve">Summary: 72 bugs found and fixed, plus the refunds feature</w:t>
+        <w:t xml:space="preserve">Summary: 79 bugs found and fixed, plus the refunds feature</w:t>
       </w:r>
     </w:p>
     <w:p>
@@ -49,7 +49,7 @@
         <w:rPr>
           <w:color w:val="595959"/>
         </w:rPr>
-        <w:t xml:space="preserve">Every fix is covered by an automated test run against a real Postgres 16 database. Where it matters most, the new test was also run against the ORIGINAL code to prove it catches the bug. Final runs on a fresh, seeded database: API 386/386, settlement (Go) all packages, reporting 14/14, money + events + scripts 51/51, all four TypeScript apps type-check. 72 migrations apply from empty.</w:t>
+        <w:t xml:space="preserve">Every fix is covered by an automated test run against a real Postgres 16 database. Where it matters most, the new test was also run against the ORIGINAL code to prove it catches the bug. Final runs on a fresh, seeded database: API 389/389, settlement (Go) all packages, reporting 14/14, money + events + scripts 51/51, dashboard 9/9, all four TypeScript apps type-check. 72 migrations apply from empty.</w:t>
       </w:r>
     </w:p>
     <w:tbl>
@@ -4147,6 +4147,190 @@
                 <w:sz w:val="20"/>
                 <w:szCs w:val="20"/>
               </w:rPr>
+              <w:t xml:space="preserve">77</w:t>
+            </w:r>
+          </w:p>
+        </w:tc>
+        <w:tc>
+          <w:tcPr>
+            <w:tcW w:type="dxa" w:w="6226"/>
+            <w:tcBorders>
+              <w:top w:val="single" w:color="BFBFBF" w:sz="4"/>
+              <w:left w:val="single" w:color="BFBFBF" w:sz="4"/>
+              <w:bottom w:val="single" w:color="BFBFBF" w:sz="4"/>
+              <w:right w:val="single" w:color="BFBFBF" w:sz="4"/>
+            </w:tcBorders>
+            <w:tcMar>
+              <w:top w:type="dxa" w:w="80"/>
+              <w:left w:type="dxa" w:w="120"/>
+              <w:bottom w:type="dxa" w:w="80"/>
+              <w:right w:type="dxa" w:w="120"/>
+            </w:tcMar>
+          </w:tcPr>
+          <w:p>
+            <w:r>
+              <w:rPr>
+                <w:b w:val="false"/>
+                <w:bCs w:val="false"/>
+                <w:i w:val="false"/>
+                <w:iCs w:val="false"/>
+                <w:sz w:val="20"/>
+                <w:szCs w:val="20"/>
+              </w:rPr>
+              <w:t xml:space="preserve">One merchant's failed batch stopped everyone's payout</w:t>
+            </w:r>
+          </w:p>
+        </w:tc>
+        <w:tc>
+          <w:tcPr>
+            <w:tcW w:type="dxa" w:w="2100"/>
+            <w:tcBorders>
+              <w:top w:val="single" w:color="BFBFBF" w:sz="4"/>
+              <w:left w:val="single" w:color="BFBFBF" w:sz="4"/>
+              <w:bottom w:val="single" w:color="BFBFBF" w:sz="4"/>
+              <w:right w:val="single" w:color="BFBFBF" w:sz="4"/>
+            </w:tcBorders>
+            <w:tcMar>
+              <w:top w:type="dxa" w:w="80"/>
+              <w:left w:type="dxa" w:w="120"/>
+              <w:bottom w:type="dxa" w:w="80"/>
+              <w:right w:type="dxa" w:w="120"/>
+            </w:tcMar>
+          </w:tcPr>
+          <w:p>
+            <w:r>
+              <w:rPr>
+                <w:b w:val="false"/>
+                <w:bCs w:val="false"/>
+                <w:i w:val="false"/>
+                <w:iCs w:val="false"/>
+                <w:sz w:val="20"/>
+                <w:szCs w:val="20"/>
+              </w:rPr>
+              <w:t xml:space="preserve">High</w:t>
+            </w:r>
+          </w:p>
+        </w:tc>
+      </w:tr>
+      <w:tr>
+        <w:tc>
+          <w:tcPr>
+            <w:tcW w:type="dxa" w:w="700"/>
+            <w:tcBorders>
+              <w:top w:val="single" w:color="BFBFBF" w:sz="4"/>
+              <w:left w:val="single" w:color="BFBFBF" w:sz="4"/>
+              <w:bottom w:val="single" w:color="BFBFBF" w:sz="4"/>
+              <w:right w:val="single" w:color="BFBFBF" w:sz="4"/>
+            </w:tcBorders>
+            <w:tcMar>
+              <w:top w:type="dxa" w:w="80"/>
+              <w:left w:type="dxa" w:w="120"/>
+              <w:bottom w:type="dxa" w:w="80"/>
+              <w:right w:type="dxa" w:w="120"/>
+            </w:tcMar>
+          </w:tcPr>
+          <w:p>
+            <w:r>
+              <w:rPr>
+                <w:b w:val="false"/>
+                <w:bCs w:val="false"/>
+                <w:i w:val="false"/>
+                <w:iCs w:val="false"/>
+                <w:sz w:val="20"/>
+                <w:szCs w:val="20"/>
+              </w:rPr>
+              <w:t xml:space="preserve">79</w:t>
+            </w:r>
+          </w:p>
+        </w:tc>
+        <w:tc>
+          <w:tcPr>
+            <w:tcW w:type="dxa" w:w="6226"/>
+            <w:tcBorders>
+              <w:top w:val="single" w:color="BFBFBF" w:sz="4"/>
+              <w:left w:val="single" w:color="BFBFBF" w:sz="4"/>
+              <w:bottom w:val="single" w:color="BFBFBF" w:sz="4"/>
+              <w:right w:val="single" w:color="BFBFBF" w:sz="4"/>
+            </w:tcBorders>
+            <w:tcMar>
+              <w:top w:type="dxa" w:w="80"/>
+              <w:left w:type="dxa" w:w="120"/>
+              <w:bottom w:type="dxa" w:w="80"/>
+              <w:right w:type="dxa" w:w="120"/>
+            </w:tcMar>
+          </w:tcPr>
+          <w:p>
+            <w:r>
+              <w:rPr>
+                <w:b w:val="false"/>
+                <w:bCs w:val="false"/>
+                <w:i w:val="false"/>
+                <w:iCs w:val="false"/>
+                <w:sz w:val="20"/>
+                <w:szCs w:val="20"/>
+              </w:rPr>
+              <w:t xml:space="preserve">CSV export loaded every row into memory</w:t>
+            </w:r>
+          </w:p>
+        </w:tc>
+        <w:tc>
+          <w:tcPr>
+            <w:tcW w:type="dxa" w:w="2100"/>
+            <w:tcBorders>
+              <w:top w:val="single" w:color="BFBFBF" w:sz="4"/>
+              <w:left w:val="single" w:color="BFBFBF" w:sz="4"/>
+              <w:bottom w:val="single" w:color="BFBFBF" w:sz="4"/>
+              <w:right w:val="single" w:color="BFBFBF" w:sz="4"/>
+            </w:tcBorders>
+            <w:tcMar>
+              <w:top w:type="dxa" w:w="80"/>
+              <w:left w:type="dxa" w:w="120"/>
+              <w:bottom w:type="dxa" w:w="80"/>
+              <w:right w:type="dxa" w:w="120"/>
+            </w:tcMar>
+          </w:tcPr>
+          <w:p>
+            <w:r>
+              <w:rPr>
+                <w:b w:val="false"/>
+                <w:bCs w:val="false"/>
+                <w:i w:val="false"/>
+                <w:iCs w:val="false"/>
+                <w:sz w:val="20"/>
+                <w:szCs w:val="20"/>
+              </w:rPr>
+              <w:t xml:space="preserve">High</w:t>
+            </w:r>
+          </w:p>
+        </w:tc>
+      </w:tr>
+      <w:tr>
+        <w:tc>
+          <w:tcPr>
+            <w:tcW w:type="dxa" w:w="700"/>
+            <w:tcBorders>
+              <w:top w:val="single" w:color="BFBFBF" w:sz="4"/>
+              <w:left w:val="single" w:color="BFBFBF" w:sz="4"/>
+              <w:bottom w:val="single" w:color="BFBFBF" w:sz="4"/>
+              <w:right w:val="single" w:color="BFBFBF" w:sz="4"/>
+            </w:tcBorders>
+            <w:tcMar>
+              <w:top w:type="dxa" w:w="80"/>
+              <w:left w:type="dxa" w:w="120"/>
+              <w:bottom w:type="dxa" w:w="80"/>
+              <w:right w:type="dxa" w:w="120"/>
+            </w:tcMar>
+          </w:tcPr>
+          <w:p>
+            <w:r>
+              <w:rPr>
+                <w:b w:val="false"/>
+                <w:bCs w:val="false"/>
+                <w:i w:val="false"/>
+                <w:iCs w:val="false"/>
+                <w:sz w:val="20"/>
+                <w:szCs w:val="20"/>
+              </w:rPr>
               <w:t xml:space="preserve">3</w:t>
             </w:r>
           </w:p>
@@ -6754,6 +6938,466 @@
                 <w:szCs w:val="20"/>
               </w:rPr>
               <w:t xml:space="preserve">Payment-link pages could be cached</w:t>
+            </w:r>
+          </w:p>
+        </w:tc>
+        <w:tc>
+          <w:tcPr>
+            <w:tcW w:type="dxa" w:w="2100"/>
+            <w:tcBorders>
+              <w:top w:val="single" w:color="BFBFBF" w:sz="4"/>
+              <w:left w:val="single" w:color="BFBFBF" w:sz="4"/>
+              <w:bottom w:val="single" w:color="BFBFBF" w:sz="4"/>
+              <w:right w:val="single" w:color="BFBFBF" w:sz="4"/>
+            </w:tcBorders>
+            <w:tcMar>
+              <w:top w:type="dxa" w:w="80"/>
+              <w:left w:type="dxa" w:w="120"/>
+              <w:bottom w:type="dxa" w:w="80"/>
+              <w:right w:type="dxa" w:w="120"/>
+            </w:tcMar>
+          </w:tcPr>
+          <w:p>
+            <w:r>
+              <w:rPr>
+                <w:b w:val="false"/>
+                <w:bCs w:val="false"/>
+                <w:i w:val="false"/>
+                <w:iCs w:val="false"/>
+                <w:sz w:val="20"/>
+                <w:szCs w:val="20"/>
+              </w:rPr>
+              <w:t xml:space="preserve">Medium</w:t>
+            </w:r>
+          </w:p>
+        </w:tc>
+      </w:tr>
+      <w:tr>
+        <w:tc>
+          <w:tcPr>
+            <w:tcW w:type="dxa" w:w="700"/>
+            <w:tcBorders>
+              <w:top w:val="single" w:color="BFBFBF" w:sz="4"/>
+              <w:left w:val="single" w:color="BFBFBF" w:sz="4"/>
+              <w:bottom w:val="single" w:color="BFBFBF" w:sz="4"/>
+              <w:right w:val="single" w:color="BFBFBF" w:sz="4"/>
+            </w:tcBorders>
+            <w:tcMar>
+              <w:top w:type="dxa" w:w="80"/>
+              <w:left w:type="dxa" w:w="120"/>
+              <w:bottom w:type="dxa" w:w="80"/>
+              <w:right w:type="dxa" w:w="120"/>
+            </w:tcMar>
+          </w:tcPr>
+          <w:p>
+            <w:r>
+              <w:rPr>
+                <w:b w:val="false"/>
+                <w:bCs w:val="false"/>
+                <w:i w:val="false"/>
+                <w:iCs w:val="false"/>
+                <w:sz w:val="20"/>
+                <w:szCs w:val="20"/>
+              </w:rPr>
+              <w:t xml:space="preserve">73</w:t>
+            </w:r>
+          </w:p>
+        </w:tc>
+        <w:tc>
+          <w:tcPr>
+            <w:tcW w:type="dxa" w:w="6226"/>
+            <w:tcBorders>
+              <w:top w:val="single" w:color="BFBFBF" w:sz="4"/>
+              <w:left w:val="single" w:color="BFBFBF" w:sz="4"/>
+              <w:bottom w:val="single" w:color="BFBFBF" w:sz="4"/>
+              <w:right w:val="single" w:color="BFBFBF" w:sz="4"/>
+            </w:tcBorders>
+            <w:tcMar>
+              <w:top w:type="dxa" w:w="80"/>
+              <w:left w:type="dxa" w:w="120"/>
+              <w:bottom w:type="dxa" w:w="80"/>
+              <w:right w:type="dxa" w:w="120"/>
+            </w:tcMar>
+          </w:tcPr>
+          <w:p>
+            <w:r>
+              <w:rPr>
+                <w:b w:val="false"/>
+                <w:bCs w:val="false"/>
+                <w:i w:val="false"/>
+                <w:iCs w:val="false"/>
+                <w:sz w:val="20"/>
+                <w:szCs w:val="20"/>
+              </w:rPr>
+              <w:t xml:space="preserve">Capture after a refund left status 'captured'</w:t>
+            </w:r>
+          </w:p>
+        </w:tc>
+        <w:tc>
+          <w:tcPr>
+            <w:tcW w:type="dxa" w:w="2100"/>
+            <w:tcBorders>
+              <w:top w:val="single" w:color="BFBFBF" w:sz="4"/>
+              <w:left w:val="single" w:color="BFBFBF" w:sz="4"/>
+              <w:bottom w:val="single" w:color="BFBFBF" w:sz="4"/>
+              <w:right w:val="single" w:color="BFBFBF" w:sz="4"/>
+            </w:tcBorders>
+            <w:tcMar>
+              <w:top w:type="dxa" w:w="80"/>
+              <w:left w:type="dxa" w:w="120"/>
+              <w:bottom w:type="dxa" w:w="80"/>
+              <w:right w:type="dxa" w:w="120"/>
+            </w:tcMar>
+          </w:tcPr>
+          <w:p>
+            <w:r>
+              <w:rPr>
+                <w:b w:val="false"/>
+                <w:bCs w:val="false"/>
+                <w:i w:val="false"/>
+                <w:iCs w:val="false"/>
+                <w:sz w:val="20"/>
+                <w:szCs w:val="20"/>
+              </w:rPr>
+              <w:t xml:space="preserve">Medium</w:t>
+            </w:r>
+          </w:p>
+        </w:tc>
+      </w:tr>
+      <w:tr>
+        <w:tc>
+          <w:tcPr>
+            <w:tcW w:type="dxa" w:w="700"/>
+            <w:tcBorders>
+              <w:top w:val="single" w:color="BFBFBF" w:sz="4"/>
+              <w:left w:val="single" w:color="BFBFBF" w:sz="4"/>
+              <w:bottom w:val="single" w:color="BFBFBF" w:sz="4"/>
+              <w:right w:val="single" w:color="BFBFBF" w:sz="4"/>
+            </w:tcBorders>
+            <w:tcMar>
+              <w:top w:type="dxa" w:w="80"/>
+              <w:left w:type="dxa" w:w="120"/>
+              <w:bottom w:type="dxa" w:w="80"/>
+              <w:right w:type="dxa" w:w="120"/>
+            </w:tcMar>
+          </w:tcPr>
+          <w:p>
+            <w:r>
+              <w:rPr>
+                <w:b w:val="false"/>
+                <w:bCs w:val="false"/>
+                <w:i w:val="false"/>
+                <w:iCs w:val="false"/>
+                <w:sz w:val="20"/>
+                <w:szCs w:val="20"/>
+              </w:rPr>
+              <w:t xml:space="preserve">74</w:t>
+            </w:r>
+          </w:p>
+        </w:tc>
+        <w:tc>
+          <w:tcPr>
+            <w:tcW w:type="dxa" w:w="6226"/>
+            <w:tcBorders>
+              <w:top w:val="single" w:color="BFBFBF" w:sz="4"/>
+              <w:left w:val="single" w:color="BFBFBF" w:sz="4"/>
+              <w:bottom w:val="single" w:color="BFBFBF" w:sz="4"/>
+              <w:right w:val="single" w:color="BFBFBF" w:sz="4"/>
+            </w:tcBorders>
+            <w:tcMar>
+              <w:top w:type="dxa" w:w="80"/>
+              <w:left w:type="dxa" w:w="120"/>
+              <w:bottom w:type="dxa" w:w="80"/>
+              <w:right w:type="dxa" w:w="120"/>
+            </w:tcMar>
+          </w:tcPr>
+          <w:p>
+            <w:r>
+              <w:rPr>
+                <w:b w:val="false"/>
+                <w:bCs w:val="false"/>
+                <w:i w:val="false"/>
+                <w:iCs w:val="false"/>
+                <w:sz w:val="20"/>
+                <w:szCs w:val="20"/>
+              </w:rPr>
+              <w:t xml:space="preserve">Reconciliation page crashed on a negative gap</w:t>
+            </w:r>
+          </w:p>
+        </w:tc>
+        <w:tc>
+          <w:tcPr>
+            <w:tcW w:type="dxa" w:w="2100"/>
+            <w:tcBorders>
+              <w:top w:val="single" w:color="BFBFBF" w:sz="4"/>
+              <w:left w:val="single" w:color="BFBFBF" w:sz="4"/>
+              <w:bottom w:val="single" w:color="BFBFBF" w:sz="4"/>
+              <w:right w:val="single" w:color="BFBFBF" w:sz="4"/>
+            </w:tcBorders>
+            <w:tcMar>
+              <w:top w:type="dxa" w:w="80"/>
+              <w:left w:type="dxa" w:w="120"/>
+              <w:bottom w:type="dxa" w:w="80"/>
+              <w:right w:type="dxa" w:w="120"/>
+            </w:tcMar>
+          </w:tcPr>
+          <w:p>
+            <w:r>
+              <w:rPr>
+                <w:b w:val="false"/>
+                <w:bCs w:val="false"/>
+                <w:i w:val="false"/>
+                <w:iCs w:val="false"/>
+                <w:sz w:val="20"/>
+                <w:szCs w:val="20"/>
+              </w:rPr>
+              <w:t xml:space="preserve">Medium</w:t>
+            </w:r>
+          </w:p>
+        </w:tc>
+      </w:tr>
+      <w:tr>
+        <w:tc>
+          <w:tcPr>
+            <w:tcW w:type="dxa" w:w="700"/>
+            <w:tcBorders>
+              <w:top w:val="single" w:color="BFBFBF" w:sz="4"/>
+              <w:left w:val="single" w:color="BFBFBF" w:sz="4"/>
+              <w:bottom w:val="single" w:color="BFBFBF" w:sz="4"/>
+              <w:right w:val="single" w:color="BFBFBF" w:sz="4"/>
+            </w:tcBorders>
+            <w:tcMar>
+              <w:top w:type="dxa" w:w="80"/>
+              <w:left w:type="dxa" w:w="120"/>
+              <w:bottom w:type="dxa" w:w="80"/>
+              <w:right w:type="dxa" w:w="120"/>
+            </w:tcMar>
+          </w:tcPr>
+          <w:p>
+            <w:r>
+              <w:rPr>
+                <w:b w:val="false"/>
+                <w:bCs w:val="false"/>
+                <w:i w:val="false"/>
+                <w:iCs w:val="false"/>
+                <w:sz w:val="20"/>
+                <w:szCs w:val="20"/>
+              </w:rPr>
+              <w:t xml:space="preserve">75</w:t>
+            </w:r>
+          </w:p>
+        </w:tc>
+        <w:tc>
+          <w:tcPr>
+            <w:tcW w:type="dxa" w:w="6226"/>
+            <w:tcBorders>
+              <w:top w:val="single" w:color="BFBFBF" w:sz="4"/>
+              <w:left w:val="single" w:color="BFBFBF" w:sz="4"/>
+              <w:bottom w:val="single" w:color="BFBFBF" w:sz="4"/>
+              <w:right w:val="single" w:color="BFBFBF" w:sz="4"/>
+            </w:tcBorders>
+            <w:tcMar>
+              <w:top w:type="dxa" w:w="80"/>
+              <w:left w:type="dxa" w:w="120"/>
+              <w:bottom w:type="dxa" w:w="80"/>
+              <w:right w:type="dxa" w:w="120"/>
+            </w:tcMar>
+          </w:tcPr>
+          <w:p>
+            <w:r>
+              <w:rPr>
+                <w:b w:val="false"/>
+                <w:bCs w:val="false"/>
+                <w:i w:val="false"/>
+                <w:iCs w:val="false"/>
+                <w:sz w:val="20"/>
+                <w:szCs w:val="20"/>
+              </w:rPr>
+              <w:t xml:space="preserve">Dashboard date filters used UTC days</w:t>
+            </w:r>
+          </w:p>
+        </w:tc>
+        <w:tc>
+          <w:tcPr>
+            <w:tcW w:type="dxa" w:w="2100"/>
+            <w:tcBorders>
+              <w:top w:val="single" w:color="BFBFBF" w:sz="4"/>
+              <w:left w:val="single" w:color="BFBFBF" w:sz="4"/>
+              <w:bottom w:val="single" w:color="BFBFBF" w:sz="4"/>
+              <w:right w:val="single" w:color="BFBFBF" w:sz="4"/>
+            </w:tcBorders>
+            <w:tcMar>
+              <w:top w:type="dxa" w:w="80"/>
+              <w:left w:type="dxa" w:w="120"/>
+              <w:bottom w:type="dxa" w:w="80"/>
+              <w:right w:type="dxa" w:w="120"/>
+            </w:tcMar>
+          </w:tcPr>
+          <w:p>
+            <w:r>
+              <w:rPr>
+                <w:b w:val="false"/>
+                <w:bCs w:val="false"/>
+                <w:i w:val="false"/>
+                <w:iCs w:val="false"/>
+                <w:sz w:val="20"/>
+                <w:szCs w:val="20"/>
+              </w:rPr>
+              <w:t xml:space="preserve">Medium</w:t>
+            </w:r>
+          </w:p>
+        </w:tc>
+      </w:tr>
+      <w:tr>
+        <w:tc>
+          <w:tcPr>
+            <w:tcW w:type="dxa" w:w="700"/>
+            <w:tcBorders>
+              <w:top w:val="single" w:color="BFBFBF" w:sz="4"/>
+              <w:left w:val="single" w:color="BFBFBF" w:sz="4"/>
+              <w:bottom w:val="single" w:color="BFBFBF" w:sz="4"/>
+              <w:right w:val="single" w:color="BFBFBF" w:sz="4"/>
+            </w:tcBorders>
+            <w:tcMar>
+              <w:top w:type="dxa" w:w="80"/>
+              <w:left w:type="dxa" w:w="120"/>
+              <w:bottom w:type="dxa" w:w="80"/>
+              <w:right w:type="dxa" w:w="120"/>
+            </w:tcMar>
+          </w:tcPr>
+          <w:p>
+            <w:r>
+              <w:rPr>
+                <w:b w:val="false"/>
+                <w:bCs w:val="false"/>
+                <w:i w:val="false"/>
+                <w:iCs w:val="false"/>
+                <w:sz w:val="20"/>
+                <w:szCs w:val="20"/>
+              </w:rPr>
+              <w:t xml:space="preserve">76</w:t>
+            </w:r>
+          </w:p>
+        </w:tc>
+        <w:tc>
+          <w:tcPr>
+            <w:tcW w:type="dxa" w:w="6226"/>
+            <w:tcBorders>
+              <w:top w:val="single" w:color="BFBFBF" w:sz="4"/>
+              <w:left w:val="single" w:color="BFBFBF" w:sz="4"/>
+              <w:bottom w:val="single" w:color="BFBFBF" w:sz="4"/>
+              <w:right w:val="single" w:color="BFBFBF" w:sz="4"/>
+            </w:tcBorders>
+            <w:tcMar>
+              <w:top w:type="dxa" w:w="80"/>
+              <w:left w:type="dxa" w:w="120"/>
+              <w:bottom w:type="dxa" w:w="80"/>
+              <w:right w:type="dxa" w:w="120"/>
+            </w:tcMar>
+          </w:tcPr>
+          <w:p>
+            <w:r>
+              <w:rPr>
+                <w:b w:val="false"/>
+                <w:bCs w:val="false"/>
+                <w:i w:val="false"/>
+                <w:iCs w:val="false"/>
+                <w:sz w:val="20"/>
+                <w:szCs w:val="20"/>
+              </w:rPr>
+              <w:t xml:space="preserve">Arabic file names broke KYC downloads</w:t>
+            </w:r>
+          </w:p>
+        </w:tc>
+        <w:tc>
+          <w:tcPr>
+            <w:tcW w:type="dxa" w:w="2100"/>
+            <w:tcBorders>
+              <w:top w:val="single" w:color="BFBFBF" w:sz="4"/>
+              <w:left w:val="single" w:color="BFBFBF" w:sz="4"/>
+              <w:bottom w:val="single" w:color="BFBFBF" w:sz="4"/>
+              <w:right w:val="single" w:color="BFBFBF" w:sz="4"/>
+            </w:tcBorders>
+            <w:tcMar>
+              <w:top w:type="dxa" w:w="80"/>
+              <w:left w:type="dxa" w:w="120"/>
+              <w:bottom w:type="dxa" w:w="80"/>
+              <w:right w:type="dxa" w:w="120"/>
+            </w:tcMar>
+          </w:tcPr>
+          <w:p>
+            <w:r>
+              <w:rPr>
+                <w:b w:val="false"/>
+                <w:bCs w:val="false"/>
+                <w:i w:val="false"/>
+                <w:iCs w:val="false"/>
+                <w:sz w:val="20"/>
+                <w:szCs w:val="20"/>
+              </w:rPr>
+              <w:t xml:space="preserve">Medium</w:t>
+            </w:r>
+          </w:p>
+        </w:tc>
+      </w:tr>
+      <w:tr>
+        <w:tc>
+          <w:tcPr>
+            <w:tcW w:type="dxa" w:w="700"/>
+            <w:tcBorders>
+              <w:top w:val="single" w:color="BFBFBF" w:sz="4"/>
+              <w:left w:val="single" w:color="BFBFBF" w:sz="4"/>
+              <w:bottom w:val="single" w:color="BFBFBF" w:sz="4"/>
+              <w:right w:val="single" w:color="BFBFBF" w:sz="4"/>
+            </w:tcBorders>
+            <w:tcMar>
+              <w:top w:type="dxa" w:w="80"/>
+              <w:left w:type="dxa" w:w="120"/>
+              <w:bottom w:type="dxa" w:w="80"/>
+              <w:right w:type="dxa" w:w="120"/>
+            </w:tcMar>
+          </w:tcPr>
+          <w:p>
+            <w:r>
+              <w:rPr>
+                <w:b w:val="false"/>
+                <w:bCs w:val="false"/>
+                <w:i w:val="false"/>
+                <w:iCs w:val="false"/>
+                <w:sz w:val="20"/>
+                <w:szCs w:val="20"/>
+              </w:rPr>
+              <w:t xml:space="preserve">78</w:t>
+            </w:r>
+          </w:p>
+        </w:tc>
+        <w:tc>
+          <w:tcPr>
+            <w:tcW w:type="dxa" w:w="6226"/>
+            <w:tcBorders>
+              <w:top w:val="single" w:color="BFBFBF" w:sz="4"/>
+              <w:left w:val="single" w:color="BFBFBF" w:sz="4"/>
+              <w:bottom w:val="single" w:color="BFBFBF" w:sz="4"/>
+              <w:right w:val="single" w:color="BFBFBF" w:sz="4"/>
+            </w:tcBorders>
+            <w:tcMar>
+              <w:top w:type="dxa" w:w="80"/>
+              <w:left w:type="dxa" w:w="120"/>
+              <w:bottom w:type="dxa" w:w="80"/>
+              <w:right w:type="dxa" w:w="120"/>
+            </w:tcMar>
+          </w:tcPr>
+          <w:p>
+            <w:r>
+              <w:rPr>
+                <w:b w:val="false"/>
+                <w:bCs w:val="false"/>
+                <w:i w:val="false"/>
+                <w:iCs w:val="false"/>
+                <w:sz w:val="20"/>
+                <w:szCs w:val="20"/>
+              </w:rPr>
+              <w:t xml:space="preserve">KYC upload accepted many files, kept the last</w:t>
             </w:r>
           </w:p>
         </w:tc>
@@ -41215,6 +41859,2843 @@
                 <w:szCs w:val="20"/>
               </w:rPr>
               <w:t xml:space="preserve">Go test: unchanged rate, one refund — old code charged 100 fils extra; fix charges nothing.</w:t>
+            </w:r>
+          </w:p>
+        </w:tc>
+      </w:tr>
+      <w:tr>
+        <w:tc>
+          <w:tcPr>
+            <w:tcW w:type="dxa" w:w="2200"/>
+            <w:tcBorders>
+              <w:top w:val="single" w:color="BFBFBF" w:sz="4"/>
+              <w:left w:val="single" w:color="BFBFBF" w:sz="4"/>
+              <w:bottom w:val="single" w:color="BFBFBF" w:sz="4"/>
+              <w:right w:val="single" w:color="BFBFBF" w:sz="4"/>
+            </w:tcBorders>
+            <w:shd w:fill="F2E6E8" w:color="auto" w:val="clear"/>
+            <w:tcMar>
+              <w:top w:type="dxa" w:w="80"/>
+              <w:left w:type="dxa" w:w="120"/>
+              <w:bottom w:type="dxa" w:w="80"/>
+              <w:right w:type="dxa" w:w="120"/>
+            </w:tcMar>
+          </w:tcPr>
+          <w:p>
+            <w:r>
+              <w:rPr>
+                <w:b/>
+                <w:bCs/>
+                <w:i w:val="false"/>
+                <w:iCs w:val="false"/>
+                <w:sz w:val="20"/>
+                <w:szCs w:val="20"/>
+              </w:rPr>
+              <w:t xml:space="preserve">Status</w:t>
+            </w:r>
+          </w:p>
+        </w:tc>
+        <w:tc>
+          <w:tcPr>
+            <w:tcW w:type="dxa" w:w="6826"/>
+            <w:tcBorders>
+              <w:top w:val="single" w:color="BFBFBF" w:sz="4"/>
+              <w:left w:val="single" w:color="BFBFBF" w:sz="4"/>
+              <w:bottom w:val="single" w:color="BFBFBF" w:sz="4"/>
+              <w:right w:val="single" w:color="BFBFBF" w:sz="4"/>
+            </w:tcBorders>
+            <w:tcMar>
+              <w:top w:type="dxa" w:w="80"/>
+              <w:left w:type="dxa" w:w="120"/>
+              <w:bottom w:type="dxa" w:w="80"/>
+              <w:right w:type="dxa" w:w="120"/>
+            </w:tcMar>
+          </w:tcPr>
+          <w:p>
+            <w:r>
+              <w:rPr>
+                <w:b w:val="false"/>
+                <w:bCs w:val="false"/>
+                <w:i w:val="false"/>
+                <w:iCs w:val="false"/>
+                <w:sz w:val="20"/>
+                <w:szCs w:val="20"/>
+              </w:rPr>
+              <w:t xml:space="preserve">Fixed and tested (automated tests pass on a real database)</w:t>
+            </w:r>
+          </w:p>
+        </w:tc>
+      </w:tr>
+    </w:tbl>
+    <w:p>
+      <w:pPr>
+        <w:pStyle w:val="Heading1"/>
+        <w:spacing w:before="400"/>
+      </w:pPr>
+      <w:r>
+        <w:t xml:space="preserve">Fourth sweep (#73–#79)</w:t>
+      </w:r>
+    </w:p>
+    <w:p>
+      <w:pPr>
+        <w:pStyle w:val="Heading2"/>
+        <w:spacing w:after="120" w:before="300"/>
+      </w:pPr>
+      <w:r>
+        <w:t xml:space="preserve">#73  Capturing the rest after a refund left the status 'captured'</w:t>
+      </w:r>
+    </w:p>
+    <w:tbl>
+      <w:tblPr>
+        <w:tblW w:type="dxa" w:w="9026"/>
+        <w:tblBorders>
+          <w:top w:val="single" w:color="auto" w:sz="4"/>
+          <w:left w:val="single" w:color="auto" w:sz="4"/>
+          <w:bottom w:val="single" w:color="auto" w:sz="4"/>
+          <w:right w:val="single" w:color="auto" w:sz="4"/>
+          <w:insideH w:val="single" w:color="auto" w:sz="4"/>
+          <w:insideV w:val="single" w:color="auto" w:sz="4"/>
+        </w:tblBorders>
+      </w:tblPr>
+      <w:tblGrid>
+        <w:gridCol w:w="2200"/>
+        <w:gridCol w:w="6826"/>
+      </w:tblGrid>
+      <w:tr>
+        <w:tc>
+          <w:tcPr>
+            <w:tcW w:type="dxa" w:w="2200"/>
+            <w:tcBorders>
+              <w:top w:val="single" w:color="BFBFBF" w:sz="4"/>
+              <w:left w:val="single" w:color="BFBFBF" w:sz="4"/>
+              <w:bottom w:val="single" w:color="BFBFBF" w:sz="4"/>
+              <w:right w:val="single" w:color="BFBFBF" w:sz="4"/>
+            </w:tcBorders>
+            <w:shd w:fill="F2E6E8" w:color="auto" w:val="clear"/>
+            <w:tcMar>
+              <w:top w:type="dxa" w:w="80"/>
+              <w:left w:type="dxa" w:w="120"/>
+              <w:bottom w:type="dxa" w:w="80"/>
+              <w:right w:type="dxa" w:w="120"/>
+            </w:tcMar>
+          </w:tcPr>
+          <w:p>
+            <w:r>
+              <w:rPr>
+                <w:b/>
+                <w:bCs/>
+                <w:i w:val="false"/>
+                <w:iCs w:val="false"/>
+                <w:sz w:val="20"/>
+                <w:szCs w:val="20"/>
+              </w:rPr>
+              <w:t xml:space="preserve">Severity (our estimate)</w:t>
+            </w:r>
+          </w:p>
+        </w:tc>
+        <w:tc>
+          <w:tcPr>
+            <w:tcW w:type="dxa" w:w="6826"/>
+            <w:tcBorders>
+              <w:top w:val="single" w:color="BFBFBF" w:sz="4"/>
+              <w:left w:val="single" w:color="BFBFBF" w:sz="4"/>
+              <w:bottom w:val="single" w:color="BFBFBF" w:sz="4"/>
+              <w:right w:val="single" w:color="BFBFBF" w:sz="4"/>
+            </w:tcBorders>
+            <w:tcMar>
+              <w:top w:type="dxa" w:w="80"/>
+              <w:left w:type="dxa" w:w="120"/>
+              <w:bottom w:type="dxa" w:w="80"/>
+              <w:right w:type="dxa" w:w="120"/>
+            </w:tcMar>
+          </w:tcPr>
+          <w:p>
+            <w:r>
+              <w:rPr>
+                <w:b w:val="false"/>
+                <w:bCs w:val="false"/>
+                <w:i w:val="false"/>
+                <w:iCs w:val="false"/>
+                <w:sz w:val="20"/>
+                <w:szCs w:val="20"/>
+              </w:rPr>
+              <w:t xml:space="preserve">Medium — money / data consistency</w:t>
+            </w:r>
+          </w:p>
+        </w:tc>
+      </w:tr>
+      <w:tr>
+        <w:tc>
+          <w:tcPr>
+            <w:tcW w:type="dxa" w:w="2200"/>
+            <w:tcBorders>
+              <w:top w:val="single" w:color="BFBFBF" w:sz="4"/>
+              <w:left w:val="single" w:color="BFBFBF" w:sz="4"/>
+              <w:bottom w:val="single" w:color="BFBFBF" w:sz="4"/>
+              <w:right w:val="single" w:color="BFBFBF" w:sz="4"/>
+            </w:tcBorders>
+            <w:shd w:fill="F2E6E8" w:color="auto" w:val="clear"/>
+            <w:tcMar>
+              <w:top w:type="dxa" w:w="80"/>
+              <w:left w:type="dxa" w:w="120"/>
+              <w:bottom w:type="dxa" w:w="80"/>
+              <w:right w:type="dxa" w:w="120"/>
+            </w:tcMar>
+          </w:tcPr>
+          <w:p>
+            <w:r>
+              <w:rPr>
+                <w:b/>
+                <w:bCs/>
+                <w:i w:val="false"/>
+                <w:iCs w:val="false"/>
+                <w:sz w:val="20"/>
+                <w:szCs w:val="20"/>
+              </w:rPr>
+              <w:t xml:space="preserve">Where</w:t>
+            </w:r>
+          </w:p>
+        </w:tc>
+        <w:tc>
+          <w:tcPr>
+            <w:tcW w:type="dxa" w:w="6826"/>
+            <w:tcBorders>
+              <w:top w:val="single" w:color="BFBFBF" w:sz="4"/>
+              <w:left w:val="single" w:color="BFBFBF" w:sz="4"/>
+              <w:bottom w:val="single" w:color="BFBFBF" w:sz="4"/>
+              <w:right w:val="single" w:color="BFBFBF" w:sz="4"/>
+            </w:tcBorders>
+            <w:tcMar>
+              <w:top w:type="dxa" w:w="80"/>
+              <w:left w:type="dxa" w:w="120"/>
+              <w:bottom w:type="dxa" w:w="80"/>
+              <w:right w:type="dxa" w:w="120"/>
+            </w:tcMar>
+          </w:tcPr>
+          <w:p>
+            <w:r>
+              <w:rPr>
+                <w:b w:val="false"/>
+                <w:bCs w:val="false"/>
+                <w:i w:val="false"/>
+                <w:iCs w:val="false"/>
+                <w:sz w:val="20"/>
+                <w:szCs w:val="20"/>
+              </w:rPr>
+              <w:t xml:space="preserve">apps/api/src/payments/capture.ts</w:t>
+            </w:r>
+          </w:p>
+        </w:tc>
+      </w:tr>
+      <w:tr>
+        <w:tc>
+          <w:tcPr>
+            <w:tcW w:type="dxa" w:w="2200"/>
+            <w:tcBorders>
+              <w:top w:val="single" w:color="BFBFBF" w:sz="4"/>
+              <w:left w:val="single" w:color="BFBFBF" w:sz="4"/>
+              <w:bottom w:val="single" w:color="BFBFBF" w:sz="4"/>
+              <w:right w:val="single" w:color="BFBFBF" w:sz="4"/>
+            </w:tcBorders>
+            <w:shd w:fill="F2E6E8" w:color="auto" w:val="clear"/>
+            <w:tcMar>
+              <w:top w:type="dxa" w:w="80"/>
+              <w:left w:type="dxa" w:w="120"/>
+              <w:bottom w:type="dxa" w:w="80"/>
+              <w:right w:type="dxa" w:w="120"/>
+            </w:tcMar>
+          </w:tcPr>
+          <w:p>
+            <w:r>
+              <w:rPr>
+                <w:b/>
+                <w:bCs/>
+                <w:i w:val="false"/>
+                <w:iCs w:val="false"/>
+                <w:sz w:val="20"/>
+                <w:szCs w:val="20"/>
+              </w:rPr>
+              <w:t xml:space="preserve">What's wrong</w:t>
+            </w:r>
+          </w:p>
+        </w:tc>
+        <w:tc>
+          <w:tcPr>
+            <w:tcW w:type="dxa" w:w="6826"/>
+            <w:tcBorders>
+              <w:top w:val="single" w:color="BFBFBF" w:sz="4"/>
+              <w:left w:val="single" w:color="BFBFBF" w:sz="4"/>
+              <w:bottom w:val="single" w:color="BFBFBF" w:sz="4"/>
+              <w:right w:val="single" w:color="BFBFBF" w:sz="4"/>
+            </w:tcBorders>
+            <w:tcMar>
+              <w:top w:type="dxa" w:w="80"/>
+              <w:left w:type="dxa" w:w="120"/>
+              <w:bottom w:type="dxa" w:w="80"/>
+              <w:right w:type="dxa" w:w="120"/>
+            </w:tcMar>
+          </w:tcPr>
+          <w:p>
+            <w:r>
+              <w:rPr>
+                <w:b w:val="false"/>
+                <w:bCs w:val="false"/>
+                <w:i w:val="false"/>
+                <w:iCs w:val="false"/>
+                <w:sz w:val="20"/>
+                <w:szCs w:val="20"/>
+              </w:rPr>
+              <w:t xml:space="preserve">Capture 4 of 10 BD, refund 4, capture the other 6: the row said 'captured' with 4 BD refunded. Capture set the status from the captured amount only.</w:t>
+            </w:r>
+          </w:p>
+        </w:tc>
+      </w:tr>
+      <w:tr>
+        <w:tc>
+          <w:tcPr>
+            <w:tcW w:type="dxa" w:w="2200"/>
+            <w:tcBorders>
+              <w:top w:val="single" w:color="BFBFBF" w:sz="4"/>
+              <w:left w:val="single" w:color="BFBFBF" w:sz="4"/>
+              <w:bottom w:val="single" w:color="BFBFBF" w:sz="4"/>
+              <w:right w:val="single" w:color="BFBFBF" w:sz="4"/>
+            </w:tcBorders>
+            <w:shd w:fill="F2E6E8" w:color="auto" w:val="clear"/>
+            <w:tcMar>
+              <w:top w:type="dxa" w:w="80"/>
+              <w:left w:type="dxa" w:w="120"/>
+              <w:bottom w:type="dxa" w:w="80"/>
+              <w:right w:type="dxa" w:w="120"/>
+            </w:tcMar>
+          </w:tcPr>
+          <w:p>
+            <w:r>
+              <w:rPr>
+                <w:b/>
+                <w:bCs/>
+                <w:i w:val="false"/>
+                <w:iCs w:val="false"/>
+                <w:sz w:val="20"/>
+                <w:szCs w:val="20"/>
+              </w:rPr>
+              <w:t xml:space="preserve">Fix</w:t>
+            </w:r>
+          </w:p>
+        </w:tc>
+        <w:tc>
+          <w:tcPr>
+            <w:tcW w:type="dxa" w:w="6826"/>
+            <w:tcBorders>
+              <w:top w:val="single" w:color="BFBFBF" w:sz="4"/>
+              <w:left w:val="single" w:color="BFBFBF" w:sz="4"/>
+              <w:bottom w:val="single" w:color="BFBFBF" w:sz="4"/>
+              <w:right w:val="single" w:color="BFBFBF" w:sz="4"/>
+            </w:tcBorders>
+            <w:tcMar>
+              <w:top w:type="dxa" w:w="80"/>
+              <w:left w:type="dxa" w:w="120"/>
+              <w:bottom w:type="dxa" w:w="80"/>
+              <w:right w:type="dxa" w:w="120"/>
+            </w:tcMar>
+          </w:tcPr>
+          <w:p>
+            <w:r>
+              <w:rPr>
+                <w:b w:val="false"/>
+                <w:bCs w:val="false"/>
+                <w:i w:val="false"/>
+                <w:iCs w:val="false"/>
+                <w:sz w:val="20"/>
+                <w:szCs w:val="20"/>
+              </w:rPr>
+              <w:t xml:space="preserve">Use the same status rule as the refund path (refundState.ts), which also looks at the refunded total.</w:t>
+            </w:r>
+          </w:p>
+        </w:tc>
+      </w:tr>
+      <w:tr>
+        <w:tc>
+          <w:tcPr>
+            <w:tcW w:type="dxa" w:w="2200"/>
+            <w:tcBorders>
+              <w:top w:val="single" w:color="BFBFBF" w:sz="4"/>
+              <w:left w:val="single" w:color="BFBFBF" w:sz="4"/>
+              <w:bottom w:val="single" w:color="BFBFBF" w:sz="4"/>
+              <w:right w:val="single" w:color="BFBFBF" w:sz="4"/>
+            </w:tcBorders>
+            <w:shd w:fill="F2E6E8" w:color="auto" w:val="clear"/>
+            <w:tcMar>
+              <w:top w:type="dxa" w:w="80"/>
+              <w:left w:type="dxa" w:w="120"/>
+              <w:bottom w:type="dxa" w:w="80"/>
+              <w:right w:type="dxa" w:w="120"/>
+            </w:tcMar>
+          </w:tcPr>
+          <w:p>
+            <w:r>
+              <w:rPr>
+                <w:b/>
+                <w:bCs/>
+                <w:i w:val="false"/>
+                <w:iCs w:val="false"/>
+                <w:sz w:val="20"/>
+                <w:szCs w:val="20"/>
+              </w:rPr>
+              <w:t xml:space="preserve">Proof</w:t>
+            </w:r>
+          </w:p>
+        </w:tc>
+        <w:tc>
+          <w:tcPr>
+            <w:tcW w:type="dxa" w:w="6826"/>
+            <w:tcBorders>
+              <w:top w:val="single" w:color="BFBFBF" w:sz="4"/>
+              <w:left w:val="single" w:color="BFBFBF" w:sz="4"/>
+              <w:bottom w:val="single" w:color="BFBFBF" w:sz="4"/>
+              <w:right w:val="single" w:color="BFBFBF" w:sz="4"/>
+            </w:tcBorders>
+            <w:tcMar>
+              <w:top w:type="dxa" w:w="80"/>
+              <w:left w:type="dxa" w:w="120"/>
+              <w:bottom w:type="dxa" w:w="80"/>
+              <w:right w:type="dxa" w:w="120"/>
+            </w:tcMar>
+          </w:tcPr>
+          <w:p>
+            <w:r>
+              <w:rPr>
+                <w:b w:val="false"/>
+                <w:bCs w:val="false"/>
+                <w:i w:val="false"/>
+                <w:iCs w:val="false"/>
+                <w:sz w:val="20"/>
+                <w:szCs w:val="20"/>
+              </w:rPr>
+              <w:t xml:space="preserve">Transactions test. Old code: 'captured'; fix: 'partially_refunded'.</w:t>
+            </w:r>
+          </w:p>
+        </w:tc>
+      </w:tr>
+      <w:tr>
+        <w:tc>
+          <w:tcPr>
+            <w:tcW w:type="dxa" w:w="2200"/>
+            <w:tcBorders>
+              <w:top w:val="single" w:color="BFBFBF" w:sz="4"/>
+              <w:left w:val="single" w:color="BFBFBF" w:sz="4"/>
+              <w:bottom w:val="single" w:color="BFBFBF" w:sz="4"/>
+              <w:right w:val="single" w:color="BFBFBF" w:sz="4"/>
+            </w:tcBorders>
+            <w:shd w:fill="F2E6E8" w:color="auto" w:val="clear"/>
+            <w:tcMar>
+              <w:top w:type="dxa" w:w="80"/>
+              <w:left w:type="dxa" w:w="120"/>
+              <w:bottom w:type="dxa" w:w="80"/>
+              <w:right w:type="dxa" w:w="120"/>
+            </w:tcMar>
+          </w:tcPr>
+          <w:p>
+            <w:r>
+              <w:rPr>
+                <w:b/>
+                <w:bCs/>
+                <w:i w:val="false"/>
+                <w:iCs w:val="false"/>
+                <w:sz w:val="20"/>
+                <w:szCs w:val="20"/>
+              </w:rPr>
+              <w:t xml:space="preserve">Status</w:t>
+            </w:r>
+          </w:p>
+        </w:tc>
+        <w:tc>
+          <w:tcPr>
+            <w:tcW w:type="dxa" w:w="6826"/>
+            <w:tcBorders>
+              <w:top w:val="single" w:color="BFBFBF" w:sz="4"/>
+              <w:left w:val="single" w:color="BFBFBF" w:sz="4"/>
+              <w:bottom w:val="single" w:color="BFBFBF" w:sz="4"/>
+              <w:right w:val="single" w:color="BFBFBF" w:sz="4"/>
+            </w:tcBorders>
+            <w:tcMar>
+              <w:top w:type="dxa" w:w="80"/>
+              <w:left w:type="dxa" w:w="120"/>
+              <w:bottom w:type="dxa" w:w="80"/>
+              <w:right w:type="dxa" w:w="120"/>
+            </w:tcMar>
+          </w:tcPr>
+          <w:p>
+            <w:r>
+              <w:rPr>
+                <w:b w:val="false"/>
+                <w:bCs w:val="false"/>
+                <w:i w:val="false"/>
+                <w:iCs w:val="false"/>
+                <w:sz w:val="20"/>
+                <w:szCs w:val="20"/>
+              </w:rPr>
+              <w:t xml:space="preserve">Fixed and tested (automated tests pass on a real database)</w:t>
+            </w:r>
+          </w:p>
+        </w:tc>
+      </w:tr>
+    </w:tbl>
+    <w:p>
+      <w:pPr>
+        <w:pStyle w:val="Heading2"/>
+        <w:spacing w:after="120" w:before="300"/>
+      </w:pPr>
+      <w:r>
+        <w:t xml:space="preserve">#74  The reconciliation page crashed whenever the gap was negative</w:t>
+      </w:r>
+    </w:p>
+    <w:tbl>
+      <w:tblPr>
+        <w:tblW w:type="dxa" w:w="9026"/>
+        <w:tblBorders>
+          <w:top w:val="single" w:color="auto" w:sz="4"/>
+          <w:left w:val="single" w:color="auto" w:sz="4"/>
+          <w:bottom w:val="single" w:color="auto" w:sz="4"/>
+          <w:right w:val="single" w:color="auto" w:sz="4"/>
+          <w:insideH w:val="single" w:color="auto" w:sz="4"/>
+          <w:insideV w:val="single" w:color="auto" w:sz="4"/>
+        </w:tblBorders>
+      </w:tblPr>
+      <w:tblGrid>
+        <w:gridCol w:w="2200"/>
+        <w:gridCol w:w="6826"/>
+      </w:tblGrid>
+      <w:tr>
+        <w:tc>
+          <w:tcPr>
+            <w:tcW w:type="dxa" w:w="2200"/>
+            <w:tcBorders>
+              <w:top w:val="single" w:color="BFBFBF" w:sz="4"/>
+              <w:left w:val="single" w:color="BFBFBF" w:sz="4"/>
+              <w:bottom w:val="single" w:color="BFBFBF" w:sz="4"/>
+              <w:right w:val="single" w:color="BFBFBF" w:sz="4"/>
+            </w:tcBorders>
+            <w:shd w:fill="F2E6E8" w:color="auto" w:val="clear"/>
+            <w:tcMar>
+              <w:top w:type="dxa" w:w="80"/>
+              <w:left w:type="dxa" w:w="120"/>
+              <w:bottom w:type="dxa" w:w="80"/>
+              <w:right w:type="dxa" w:w="120"/>
+            </w:tcMar>
+          </w:tcPr>
+          <w:p>
+            <w:r>
+              <w:rPr>
+                <w:b/>
+                <w:bCs/>
+                <w:i w:val="false"/>
+                <w:iCs w:val="false"/>
+                <w:sz w:val="20"/>
+                <w:szCs w:val="20"/>
+              </w:rPr>
+              <w:t xml:space="preserve">Severity (our estimate)</w:t>
+            </w:r>
+          </w:p>
+        </w:tc>
+        <w:tc>
+          <w:tcPr>
+            <w:tcW w:type="dxa" w:w="6826"/>
+            <w:tcBorders>
+              <w:top w:val="single" w:color="BFBFBF" w:sz="4"/>
+              <w:left w:val="single" w:color="BFBFBF" w:sz="4"/>
+              <w:bottom w:val="single" w:color="BFBFBF" w:sz="4"/>
+              <w:right w:val="single" w:color="BFBFBF" w:sz="4"/>
+            </w:tcBorders>
+            <w:tcMar>
+              <w:top w:type="dxa" w:w="80"/>
+              <w:left w:type="dxa" w:w="120"/>
+              <w:bottom w:type="dxa" w:w="80"/>
+              <w:right w:type="dxa" w:w="120"/>
+            </w:tcMar>
+          </w:tcPr>
+          <w:p>
+            <w:r>
+              <w:rPr>
+                <w:b w:val="false"/>
+                <w:bCs w:val="false"/>
+                <w:i w:val="false"/>
+                <w:iCs w:val="false"/>
+                <w:sz w:val="20"/>
+                <w:szCs w:val="20"/>
+              </w:rPr>
+              <w:t xml:space="preserve">Medium — reliability</w:t>
+            </w:r>
+          </w:p>
+        </w:tc>
+      </w:tr>
+      <w:tr>
+        <w:tc>
+          <w:tcPr>
+            <w:tcW w:type="dxa" w:w="2200"/>
+            <w:tcBorders>
+              <w:top w:val="single" w:color="BFBFBF" w:sz="4"/>
+              <w:left w:val="single" w:color="BFBFBF" w:sz="4"/>
+              <w:bottom w:val="single" w:color="BFBFBF" w:sz="4"/>
+              <w:right w:val="single" w:color="BFBFBF" w:sz="4"/>
+            </w:tcBorders>
+            <w:shd w:fill="F2E6E8" w:color="auto" w:val="clear"/>
+            <w:tcMar>
+              <w:top w:type="dxa" w:w="80"/>
+              <w:left w:type="dxa" w:w="120"/>
+              <w:bottom w:type="dxa" w:w="80"/>
+              <w:right w:type="dxa" w:w="120"/>
+            </w:tcMar>
+          </w:tcPr>
+          <w:p>
+            <w:r>
+              <w:rPr>
+                <w:b/>
+                <w:bCs/>
+                <w:i w:val="false"/>
+                <w:iCs w:val="false"/>
+                <w:sz w:val="20"/>
+                <w:szCs w:val="20"/>
+              </w:rPr>
+              <w:t xml:space="preserve">Where</w:t>
+            </w:r>
+          </w:p>
+        </w:tc>
+        <w:tc>
+          <w:tcPr>
+            <w:tcW w:type="dxa" w:w="6826"/>
+            <w:tcBorders>
+              <w:top w:val="single" w:color="BFBFBF" w:sz="4"/>
+              <w:left w:val="single" w:color="BFBFBF" w:sz="4"/>
+              <w:bottom w:val="single" w:color="BFBFBF" w:sz="4"/>
+              <w:right w:val="single" w:color="BFBFBF" w:sz="4"/>
+            </w:tcBorders>
+            <w:tcMar>
+              <w:top w:type="dxa" w:w="80"/>
+              <w:left w:type="dxa" w:w="120"/>
+              <w:bottom w:type="dxa" w:w="80"/>
+              <w:right w:type="dxa" w:w="120"/>
+            </w:tcMar>
+          </w:tcPr>
+          <w:p>
+            <w:r>
+              <w:rPr>
+                <w:b w:val="false"/>
+                <w:bCs w:val="false"/>
+                <w:i w:val="false"/>
+                <w:iCs w:val="false"/>
+                <w:sz w:val="20"/>
+                <w:szCs w:val="20"/>
+              </w:rPr>
+              <w:t xml:space="preserve">apps/web/src/format.ts — bhd()</w:t>
+            </w:r>
+          </w:p>
+        </w:tc>
+      </w:tr>
+      <w:tr>
+        <w:tc>
+          <w:tcPr>
+            <w:tcW w:type="dxa" w:w="2200"/>
+            <w:tcBorders>
+              <w:top w:val="single" w:color="BFBFBF" w:sz="4"/>
+              <w:left w:val="single" w:color="BFBFBF" w:sz="4"/>
+              <w:bottom w:val="single" w:color="BFBFBF" w:sz="4"/>
+              <w:right w:val="single" w:color="BFBFBF" w:sz="4"/>
+            </w:tcBorders>
+            <w:shd w:fill="F2E6E8" w:color="auto" w:val="clear"/>
+            <w:tcMar>
+              <w:top w:type="dxa" w:w="80"/>
+              <w:left w:type="dxa" w:w="120"/>
+              <w:bottom w:type="dxa" w:w="80"/>
+              <w:right w:type="dxa" w:w="120"/>
+            </w:tcMar>
+          </w:tcPr>
+          <w:p>
+            <w:r>
+              <w:rPr>
+                <w:b/>
+                <w:bCs/>
+                <w:i w:val="false"/>
+                <w:iCs w:val="false"/>
+                <w:sz w:val="20"/>
+                <w:szCs w:val="20"/>
+              </w:rPr>
+              <w:t xml:space="preserve">What's wrong</w:t>
+            </w:r>
+          </w:p>
+        </w:tc>
+        <w:tc>
+          <w:tcPr>
+            <w:tcW w:type="dxa" w:w="6826"/>
+            <w:tcBorders>
+              <w:top w:val="single" w:color="BFBFBF" w:sz="4"/>
+              <w:left w:val="single" w:color="BFBFBF" w:sz="4"/>
+              <w:bottom w:val="single" w:color="BFBFBF" w:sz="4"/>
+              <w:right w:val="single" w:color="BFBFBF" w:sz="4"/>
+            </w:tcBorders>
+            <w:tcMar>
+              <w:top w:type="dxa" w:w="80"/>
+              <w:left w:type="dxa" w:w="120"/>
+              <w:bottom w:type="dxa" w:w="80"/>
+              <w:right w:type="dxa" w:w="120"/>
+            </w:tcMar>
+          </w:tcPr>
+          <w:p>
+            <w:r>
+              <w:rPr>
+                <w:b w:val="false"/>
+                <w:bCs w:val="false"/>
+                <w:i w:val="false"/>
+                <w:iCs w:val="false"/>
+                <w:sz w:val="20"/>
+                <w:szCs w:val="20"/>
+              </w:rPr>
+              <w:t xml:space="preserve">The money formatter refused negative numbers; the reconciliation gap is signed. A note says 'amounts are never negative in the dashboard' — wrong.</w:t>
+            </w:r>
+          </w:p>
+        </w:tc>
+      </w:tr>
+      <w:tr>
+        <w:tc>
+          <w:tcPr>
+            <w:tcW w:type="dxa" w:w="2200"/>
+            <w:tcBorders>
+              <w:top w:val="single" w:color="BFBFBF" w:sz="4"/>
+              <w:left w:val="single" w:color="BFBFBF" w:sz="4"/>
+              <w:bottom w:val="single" w:color="BFBFBF" w:sz="4"/>
+              <w:right w:val="single" w:color="BFBFBF" w:sz="4"/>
+            </w:tcBorders>
+            <w:shd w:fill="F2E6E8" w:color="auto" w:val="clear"/>
+            <w:tcMar>
+              <w:top w:type="dxa" w:w="80"/>
+              <w:left w:type="dxa" w:w="120"/>
+              <w:bottom w:type="dxa" w:w="80"/>
+              <w:right w:type="dxa" w:w="120"/>
+            </w:tcMar>
+          </w:tcPr>
+          <w:p>
+            <w:r>
+              <w:rPr>
+                <w:b/>
+                <w:bCs/>
+                <w:i w:val="false"/>
+                <w:iCs w:val="false"/>
+                <w:sz w:val="20"/>
+                <w:szCs w:val="20"/>
+              </w:rPr>
+              <w:t xml:space="preserve">Fix</w:t>
+            </w:r>
+          </w:p>
+        </w:tc>
+        <w:tc>
+          <w:tcPr>
+            <w:tcW w:type="dxa" w:w="6826"/>
+            <w:tcBorders>
+              <w:top w:val="single" w:color="BFBFBF" w:sz="4"/>
+              <w:left w:val="single" w:color="BFBFBF" w:sz="4"/>
+              <w:bottom w:val="single" w:color="BFBFBF" w:sz="4"/>
+              <w:right w:val="single" w:color="BFBFBF" w:sz="4"/>
+            </w:tcBorders>
+            <w:tcMar>
+              <w:top w:type="dxa" w:w="80"/>
+              <w:left w:type="dxa" w:w="120"/>
+              <w:bottom w:type="dxa" w:w="80"/>
+              <w:right w:type="dxa" w:w="120"/>
+            </w:tcMar>
+          </w:tcPr>
+          <w:p>
+            <w:r>
+              <w:rPr>
+                <w:b w:val="false"/>
+                <w:bCs w:val="false"/>
+                <w:i w:val="false"/>
+                <w:iCs w:val="false"/>
+                <w:sz w:val="20"/>
+                <w:szCs w:val="20"/>
+              </w:rPr>
+              <w:t xml:space="preserve">Allow negative amounts in the formatter (the admin app already did).</w:t>
+            </w:r>
+          </w:p>
+        </w:tc>
+      </w:tr>
+      <w:tr>
+        <w:tc>
+          <w:tcPr>
+            <w:tcW w:type="dxa" w:w="2200"/>
+            <w:tcBorders>
+              <w:top w:val="single" w:color="BFBFBF" w:sz="4"/>
+              <w:left w:val="single" w:color="BFBFBF" w:sz="4"/>
+              <w:bottom w:val="single" w:color="BFBFBF" w:sz="4"/>
+              <w:right w:val="single" w:color="BFBFBF" w:sz="4"/>
+            </w:tcBorders>
+            <w:shd w:fill="F2E6E8" w:color="auto" w:val="clear"/>
+            <w:tcMar>
+              <w:top w:type="dxa" w:w="80"/>
+              <w:left w:type="dxa" w:w="120"/>
+              <w:bottom w:type="dxa" w:w="80"/>
+              <w:right w:type="dxa" w:w="120"/>
+            </w:tcMar>
+          </w:tcPr>
+          <w:p>
+            <w:r>
+              <w:rPr>
+                <w:b/>
+                <w:bCs/>
+                <w:i w:val="false"/>
+                <w:iCs w:val="false"/>
+                <w:sz w:val="20"/>
+                <w:szCs w:val="20"/>
+              </w:rPr>
+              <w:t xml:space="preserve">Proof</w:t>
+            </w:r>
+          </w:p>
+        </w:tc>
+        <w:tc>
+          <w:tcPr>
+            <w:tcW w:type="dxa" w:w="6826"/>
+            <w:tcBorders>
+              <w:top w:val="single" w:color="BFBFBF" w:sz="4"/>
+              <w:left w:val="single" w:color="BFBFBF" w:sz="4"/>
+              <w:bottom w:val="single" w:color="BFBFBF" w:sz="4"/>
+              <w:right w:val="single" w:color="BFBFBF" w:sz="4"/>
+            </w:tcBorders>
+            <w:tcMar>
+              <w:top w:type="dxa" w:w="80"/>
+              <w:left w:type="dxa" w:w="120"/>
+              <w:bottom w:type="dxa" w:w="80"/>
+              <w:right w:type="dxa" w:w="120"/>
+            </w:tcMar>
+          </w:tcPr>
+          <w:p>
+            <w:r>
+              <w:rPr>
+                <w:b w:val="false"/>
+                <w:bCs w:val="false"/>
+                <w:i w:val="false"/>
+                <w:iCs w:val="false"/>
+                <w:sz w:val="20"/>
+                <w:szCs w:val="20"/>
+              </w:rPr>
+              <w:t xml:space="preserve">Dashboard test formats -1.250 BHD. Fails on the old code.</w:t>
+            </w:r>
+          </w:p>
+        </w:tc>
+      </w:tr>
+      <w:tr>
+        <w:tc>
+          <w:tcPr>
+            <w:tcW w:type="dxa" w:w="2200"/>
+            <w:tcBorders>
+              <w:top w:val="single" w:color="BFBFBF" w:sz="4"/>
+              <w:left w:val="single" w:color="BFBFBF" w:sz="4"/>
+              <w:bottom w:val="single" w:color="BFBFBF" w:sz="4"/>
+              <w:right w:val="single" w:color="BFBFBF" w:sz="4"/>
+            </w:tcBorders>
+            <w:shd w:fill="F2E6E8" w:color="auto" w:val="clear"/>
+            <w:tcMar>
+              <w:top w:type="dxa" w:w="80"/>
+              <w:left w:type="dxa" w:w="120"/>
+              <w:bottom w:type="dxa" w:w="80"/>
+              <w:right w:type="dxa" w:w="120"/>
+            </w:tcMar>
+          </w:tcPr>
+          <w:p>
+            <w:r>
+              <w:rPr>
+                <w:b/>
+                <w:bCs/>
+                <w:i w:val="false"/>
+                <w:iCs w:val="false"/>
+                <w:sz w:val="20"/>
+                <w:szCs w:val="20"/>
+              </w:rPr>
+              <w:t xml:space="preserve">Status</w:t>
+            </w:r>
+          </w:p>
+        </w:tc>
+        <w:tc>
+          <w:tcPr>
+            <w:tcW w:type="dxa" w:w="6826"/>
+            <w:tcBorders>
+              <w:top w:val="single" w:color="BFBFBF" w:sz="4"/>
+              <w:left w:val="single" w:color="BFBFBF" w:sz="4"/>
+              <w:bottom w:val="single" w:color="BFBFBF" w:sz="4"/>
+              <w:right w:val="single" w:color="BFBFBF" w:sz="4"/>
+            </w:tcBorders>
+            <w:tcMar>
+              <w:top w:type="dxa" w:w="80"/>
+              <w:left w:type="dxa" w:w="120"/>
+              <w:bottom w:type="dxa" w:w="80"/>
+              <w:right w:type="dxa" w:w="120"/>
+            </w:tcMar>
+          </w:tcPr>
+          <w:p>
+            <w:r>
+              <w:rPr>
+                <w:b w:val="false"/>
+                <w:bCs w:val="false"/>
+                <w:i w:val="false"/>
+                <w:iCs w:val="false"/>
+                <w:sz w:val="20"/>
+                <w:szCs w:val="20"/>
+              </w:rPr>
+              <w:t xml:space="preserve">Fixed and tested (automated tests pass on a real database)</w:t>
+            </w:r>
+          </w:p>
+        </w:tc>
+      </w:tr>
+    </w:tbl>
+    <w:p>
+      <w:pPr>
+        <w:pStyle w:val="Heading2"/>
+        <w:spacing w:after="120" w:before="300"/>
+      </w:pPr>
+      <w:r>
+        <w:t xml:space="preserve">#75  Dashboard date filters used UTC days, not Bahrain business days</w:t>
+      </w:r>
+    </w:p>
+    <w:tbl>
+      <w:tblPr>
+        <w:tblW w:type="dxa" w:w="9026"/>
+        <w:tblBorders>
+          <w:top w:val="single" w:color="auto" w:sz="4"/>
+          <w:left w:val="single" w:color="auto" w:sz="4"/>
+          <w:bottom w:val="single" w:color="auto" w:sz="4"/>
+          <w:right w:val="single" w:color="auto" w:sz="4"/>
+          <w:insideH w:val="single" w:color="auto" w:sz="4"/>
+          <w:insideV w:val="single" w:color="auto" w:sz="4"/>
+        </w:tblBorders>
+      </w:tblPr>
+      <w:tblGrid>
+        <w:gridCol w:w="2200"/>
+        <w:gridCol w:w="6826"/>
+      </w:tblGrid>
+      <w:tr>
+        <w:tc>
+          <w:tcPr>
+            <w:tcW w:type="dxa" w:w="2200"/>
+            <w:tcBorders>
+              <w:top w:val="single" w:color="BFBFBF" w:sz="4"/>
+              <w:left w:val="single" w:color="BFBFBF" w:sz="4"/>
+              <w:bottom w:val="single" w:color="BFBFBF" w:sz="4"/>
+              <w:right w:val="single" w:color="BFBFBF" w:sz="4"/>
+            </w:tcBorders>
+            <w:shd w:fill="F2E6E8" w:color="auto" w:val="clear"/>
+            <w:tcMar>
+              <w:top w:type="dxa" w:w="80"/>
+              <w:left w:type="dxa" w:w="120"/>
+              <w:bottom w:type="dxa" w:w="80"/>
+              <w:right w:type="dxa" w:w="120"/>
+            </w:tcMar>
+          </w:tcPr>
+          <w:p>
+            <w:r>
+              <w:rPr>
+                <w:b/>
+                <w:bCs/>
+                <w:i w:val="false"/>
+                <w:iCs w:val="false"/>
+                <w:sz w:val="20"/>
+                <w:szCs w:val="20"/>
+              </w:rPr>
+              <w:t xml:space="preserve">Severity (our estimate)</w:t>
+            </w:r>
+          </w:p>
+        </w:tc>
+        <w:tc>
+          <w:tcPr>
+            <w:tcW w:type="dxa" w:w="6826"/>
+            <w:tcBorders>
+              <w:top w:val="single" w:color="BFBFBF" w:sz="4"/>
+              <w:left w:val="single" w:color="BFBFBF" w:sz="4"/>
+              <w:bottom w:val="single" w:color="BFBFBF" w:sz="4"/>
+              <w:right w:val="single" w:color="BFBFBF" w:sz="4"/>
+            </w:tcBorders>
+            <w:tcMar>
+              <w:top w:type="dxa" w:w="80"/>
+              <w:left w:type="dxa" w:w="120"/>
+              <w:bottom w:type="dxa" w:w="80"/>
+              <w:right w:type="dxa" w:w="120"/>
+            </w:tcMar>
+          </w:tcPr>
+          <w:p>
+            <w:r>
+              <w:rPr>
+                <w:b w:val="false"/>
+                <w:bCs w:val="false"/>
+                <w:i w:val="false"/>
+                <w:iCs w:val="false"/>
+                <w:sz w:val="20"/>
+                <w:szCs w:val="20"/>
+              </w:rPr>
+              <w:t xml:space="preserve">Medium — reporting</w:t>
+            </w:r>
+          </w:p>
+        </w:tc>
+      </w:tr>
+      <w:tr>
+        <w:tc>
+          <w:tcPr>
+            <w:tcW w:type="dxa" w:w="2200"/>
+            <w:tcBorders>
+              <w:top w:val="single" w:color="BFBFBF" w:sz="4"/>
+              <w:left w:val="single" w:color="BFBFBF" w:sz="4"/>
+              <w:bottom w:val="single" w:color="BFBFBF" w:sz="4"/>
+              <w:right w:val="single" w:color="BFBFBF" w:sz="4"/>
+            </w:tcBorders>
+            <w:shd w:fill="F2E6E8" w:color="auto" w:val="clear"/>
+            <w:tcMar>
+              <w:top w:type="dxa" w:w="80"/>
+              <w:left w:type="dxa" w:w="120"/>
+              <w:bottom w:type="dxa" w:w="80"/>
+              <w:right w:type="dxa" w:w="120"/>
+            </w:tcMar>
+          </w:tcPr>
+          <w:p>
+            <w:r>
+              <w:rPr>
+                <w:b/>
+                <w:bCs/>
+                <w:i w:val="false"/>
+                <w:iCs w:val="false"/>
+                <w:sz w:val="20"/>
+                <w:szCs w:val="20"/>
+              </w:rPr>
+              <w:t xml:space="preserve">Where</w:t>
+            </w:r>
+          </w:p>
+        </w:tc>
+        <w:tc>
+          <w:tcPr>
+            <w:tcW w:type="dxa" w:w="6826"/>
+            <w:tcBorders>
+              <w:top w:val="single" w:color="BFBFBF" w:sz="4"/>
+              <w:left w:val="single" w:color="BFBFBF" w:sz="4"/>
+              <w:bottom w:val="single" w:color="BFBFBF" w:sz="4"/>
+              <w:right w:val="single" w:color="BFBFBF" w:sz="4"/>
+            </w:tcBorders>
+            <w:tcMar>
+              <w:top w:type="dxa" w:w="80"/>
+              <w:left w:type="dxa" w:w="120"/>
+              <w:bottom w:type="dxa" w:w="80"/>
+              <w:right w:type="dxa" w:w="120"/>
+            </w:tcMar>
+          </w:tcPr>
+          <w:p>
+            <w:r>
+              <w:rPr>
+                <w:b w:val="false"/>
+                <w:bCs w:val="false"/>
+                <w:i w:val="false"/>
+                <w:iCs w:val="false"/>
+                <w:sz w:val="20"/>
+                <w:szCs w:val="20"/>
+              </w:rPr>
+              <w:t xml:space="preserve">apps/web/src/format.ts — dayStartIso()</w:t>
+            </w:r>
+          </w:p>
+        </w:tc>
+      </w:tr>
+      <w:tr>
+        <w:tc>
+          <w:tcPr>
+            <w:tcW w:type="dxa" w:w="2200"/>
+            <w:tcBorders>
+              <w:top w:val="single" w:color="BFBFBF" w:sz="4"/>
+              <w:left w:val="single" w:color="BFBFBF" w:sz="4"/>
+              <w:bottom w:val="single" w:color="BFBFBF" w:sz="4"/>
+              <w:right w:val="single" w:color="BFBFBF" w:sz="4"/>
+            </w:tcBorders>
+            <w:shd w:fill="F2E6E8" w:color="auto" w:val="clear"/>
+            <w:tcMar>
+              <w:top w:type="dxa" w:w="80"/>
+              <w:left w:type="dxa" w:w="120"/>
+              <w:bottom w:type="dxa" w:w="80"/>
+              <w:right w:type="dxa" w:w="120"/>
+            </w:tcMar>
+          </w:tcPr>
+          <w:p>
+            <w:r>
+              <w:rPr>
+                <w:b/>
+                <w:bCs/>
+                <w:i w:val="false"/>
+                <w:iCs w:val="false"/>
+                <w:sz w:val="20"/>
+                <w:szCs w:val="20"/>
+              </w:rPr>
+              <w:t xml:space="preserve">What's wrong</w:t>
+            </w:r>
+          </w:p>
+        </w:tc>
+        <w:tc>
+          <w:tcPr>
+            <w:tcW w:type="dxa" w:w="6826"/>
+            <w:tcBorders>
+              <w:top w:val="single" w:color="BFBFBF" w:sz="4"/>
+              <w:left w:val="single" w:color="BFBFBF" w:sz="4"/>
+              <w:bottom w:val="single" w:color="BFBFBF" w:sz="4"/>
+              <w:right w:val="single" w:color="BFBFBF" w:sz="4"/>
+            </w:tcBorders>
+            <w:tcMar>
+              <w:top w:type="dxa" w:w="80"/>
+              <w:left w:type="dxa" w:w="120"/>
+              <w:bottom w:type="dxa" w:w="80"/>
+              <w:right w:type="dxa" w:w="120"/>
+            </w:tcMar>
+          </w:tcPr>
+          <w:p>
+            <w:r>
+              <w:rPr>
+                <w:b w:val="false"/>
+                <w:bCs w:val="false"/>
+                <w:i w:val="false"/>
+                <w:iCs w:val="false"/>
+                <w:sz w:val="20"/>
+                <w:szCs w:val="20"/>
+              </w:rPr>
+              <w:t xml:space="preserve">A note says 'fixed, uses bahrain time now'. It didn't: a filtered 'day' ran 03:00–03:00 Bahrain and never matched a settlement day.</w:t>
+            </w:r>
+          </w:p>
+        </w:tc>
+      </w:tr>
+      <w:tr>
+        <w:tc>
+          <w:tcPr>
+            <w:tcW w:type="dxa" w:w="2200"/>
+            <w:tcBorders>
+              <w:top w:val="single" w:color="BFBFBF" w:sz="4"/>
+              <w:left w:val="single" w:color="BFBFBF" w:sz="4"/>
+              <w:bottom w:val="single" w:color="BFBFBF" w:sz="4"/>
+              <w:right w:val="single" w:color="BFBFBF" w:sz="4"/>
+            </w:tcBorders>
+            <w:shd w:fill="F2E6E8" w:color="auto" w:val="clear"/>
+            <w:tcMar>
+              <w:top w:type="dxa" w:w="80"/>
+              <w:left w:type="dxa" w:w="120"/>
+              <w:bottom w:type="dxa" w:w="80"/>
+              <w:right w:type="dxa" w:w="120"/>
+            </w:tcMar>
+          </w:tcPr>
+          <w:p>
+            <w:r>
+              <w:rPr>
+                <w:b/>
+                <w:bCs/>
+                <w:i w:val="false"/>
+                <w:iCs w:val="false"/>
+                <w:sz w:val="20"/>
+                <w:szCs w:val="20"/>
+              </w:rPr>
+              <w:t xml:space="preserve">Fix</w:t>
+            </w:r>
+          </w:p>
+        </w:tc>
+        <w:tc>
+          <w:tcPr>
+            <w:tcW w:type="dxa" w:w="6826"/>
+            <w:tcBorders>
+              <w:top w:val="single" w:color="BFBFBF" w:sz="4"/>
+              <w:left w:val="single" w:color="BFBFBF" w:sz="4"/>
+              <w:bottom w:val="single" w:color="BFBFBF" w:sz="4"/>
+              <w:right w:val="single" w:color="BFBFBF" w:sz="4"/>
+            </w:tcBorders>
+            <w:tcMar>
+              <w:top w:type="dxa" w:w="80"/>
+              <w:left w:type="dxa" w:w="120"/>
+              <w:bottom w:type="dxa" w:w="80"/>
+              <w:right w:type="dxa" w:w="120"/>
+            </w:tcMar>
+          </w:tcPr>
+          <w:p>
+            <w:r>
+              <w:rPr>
+                <w:b w:val="false"/>
+                <w:bCs w:val="false"/>
+                <w:i w:val="false"/>
+                <w:iCs w:val="false"/>
+                <w:sz w:val="20"/>
+                <w:szCs w:val="20"/>
+              </w:rPr>
+              <w:t xml:space="preserve">Day boundaries at Bahrain midnight (UTC+3, no DST).</w:t>
+            </w:r>
+          </w:p>
+        </w:tc>
+      </w:tr>
+      <w:tr>
+        <w:tc>
+          <w:tcPr>
+            <w:tcW w:type="dxa" w:w="2200"/>
+            <w:tcBorders>
+              <w:top w:val="single" w:color="BFBFBF" w:sz="4"/>
+              <w:left w:val="single" w:color="BFBFBF" w:sz="4"/>
+              <w:bottom w:val="single" w:color="BFBFBF" w:sz="4"/>
+              <w:right w:val="single" w:color="BFBFBF" w:sz="4"/>
+            </w:tcBorders>
+            <w:shd w:fill="F2E6E8" w:color="auto" w:val="clear"/>
+            <w:tcMar>
+              <w:top w:type="dxa" w:w="80"/>
+              <w:left w:type="dxa" w:w="120"/>
+              <w:bottom w:type="dxa" w:w="80"/>
+              <w:right w:type="dxa" w:w="120"/>
+            </w:tcMar>
+          </w:tcPr>
+          <w:p>
+            <w:r>
+              <w:rPr>
+                <w:b/>
+                <w:bCs/>
+                <w:i w:val="false"/>
+                <w:iCs w:val="false"/>
+                <w:sz w:val="20"/>
+                <w:szCs w:val="20"/>
+              </w:rPr>
+              <w:t xml:space="preserve">Proof</w:t>
+            </w:r>
+          </w:p>
+        </w:tc>
+        <w:tc>
+          <w:tcPr>
+            <w:tcW w:type="dxa" w:w="6826"/>
+            <w:tcBorders>
+              <w:top w:val="single" w:color="BFBFBF" w:sz="4"/>
+              <w:left w:val="single" w:color="BFBFBF" w:sz="4"/>
+              <w:bottom w:val="single" w:color="BFBFBF" w:sz="4"/>
+              <w:right w:val="single" w:color="BFBFBF" w:sz="4"/>
+            </w:tcBorders>
+            <w:tcMar>
+              <w:top w:type="dxa" w:w="80"/>
+              <w:left w:type="dxa" w:w="120"/>
+              <w:bottom w:type="dxa" w:w="80"/>
+              <w:right w:type="dxa" w:w="120"/>
+            </w:tcMar>
+          </w:tcPr>
+          <w:p>
+            <w:r>
+              <w:rPr>
+                <w:b w:val="false"/>
+                <w:bCs w:val="false"/>
+                <w:i w:val="false"/>
+                <w:iCs w:val="false"/>
+                <w:sz w:val="20"/>
+                <w:szCs w:val="20"/>
+              </w:rPr>
+              <w:t xml:space="preserve">Dashboard test. Fails on the old code.</w:t>
+            </w:r>
+          </w:p>
+        </w:tc>
+      </w:tr>
+      <w:tr>
+        <w:tc>
+          <w:tcPr>
+            <w:tcW w:type="dxa" w:w="2200"/>
+            <w:tcBorders>
+              <w:top w:val="single" w:color="BFBFBF" w:sz="4"/>
+              <w:left w:val="single" w:color="BFBFBF" w:sz="4"/>
+              <w:bottom w:val="single" w:color="BFBFBF" w:sz="4"/>
+              <w:right w:val="single" w:color="BFBFBF" w:sz="4"/>
+            </w:tcBorders>
+            <w:shd w:fill="F2E6E8" w:color="auto" w:val="clear"/>
+            <w:tcMar>
+              <w:top w:type="dxa" w:w="80"/>
+              <w:left w:type="dxa" w:w="120"/>
+              <w:bottom w:type="dxa" w:w="80"/>
+              <w:right w:type="dxa" w:w="120"/>
+            </w:tcMar>
+          </w:tcPr>
+          <w:p>
+            <w:r>
+              <w:rPr>
+                <w:b/>
+                <w:bCs/>
+                <w:i w:val="false"/>
+                <w:iCs w:val="false"/>
+                <w:sz w:val="20"/>
+                <w:szCs w:val="20"/>
+              </w:rPr>
+              <w:t xml:space="preserve">Status</w:t>
+            </w:r>
+          </w:p>
+        </w:tc>
+        <w:tc>
+          <w:tcPr>
+            <w:tcW w:type="dxa" w:w="6826"/>
+            <w:tcBorders>
+              <w:top w:val="single" w:color="BFBFBF" w:sz="4"/>
+              <w:left w:val="single" w:color="BFBFBF" w:sz="4"/>
+              <w:bottom w:val="single" w:color="BFBFBF" w:sz="4"/>
+              <w:right w:val="single" w:color="BFBFBF" w:sz="4"/>
+            </w:tcBorders>
+            <w:tcMar>
+              <w:top w:type="dxa" w:w="80"/>
+              <w:left w:type="dxa" w:w="120"/>
+              <w:bottom w:type="dxa" w:w="80"/>
+              <w:right w:type="dxa" w:w="120"/>
+            </w:tcMar>
+          </w:tcPr>
+          <w:p>
+            <w:r>
+              <w:rPr>
+                <w:b w:val="false"/>
+                <w:bCs w:val="false"/>
+                <w:i w:val="false"/>
+                <w:iCs w:val="false"/>
+                <w:sz w:val="20"/>
+                <w:szCs w:val="20"/>
+              </w:rPr>
+              <w:t xml:space="preserve">Fixed and tested (automated tests pass on a real database)</w:t>
+            </w:r>
+          </w:p>
+        </w:tc>
+      </w:tr>
+    </w:tbl>
+    <w:p>
+      <w:pPr>
+        <w:pStyle w:val="Heading2"/>
+        <w:spacing w:after="120" w:before="300"/>
+      </w:pPr>
+      <w:r>
+        <w:t xml:space="preserve">#76  KYC documents with an Arabic file name could not be downloaded</w:t>
+      </w:r>
+    </w:p>
+    <w:tbl>
+      <w:tblPr>
+        <w:tblW w:type="dxa" w:w="9026"/>
+        <w:tblBorders>
+          <w:top w:val="single" w:color="auto" w:sz="4"/>
+          <w:left w:val="single" w:color="auto" w:sz="4"/>
+          <w:bottom w:val="single" w:color="auto" w:sz="4"/>
+          <w:right w:val="single" w:color="auto" w:sz="4"/>
+          <w:insideH w:val="single" w:color="auto" w:sz="4"/>
+          <w:insideV w:val="single" w:color="auto" w:sz="4"/>
+        </w:tblBorders>
+      </w:tblPr>
+      <w:tblGrid>
+        <w:gridCol w:w="2200"/>
+        <w:gridCol w:w="6826"/>
+      </w:tblGrid>
+      <w:tr>
+        <w:tc>
+          <w:tcPr>
+            <w:tcW w:type="dxa" w:w="2200"/>
+            <w:tcBorders>
+              <w:top w:val="single" w:color="BFBFBF" w:sz="4"/>
+              <w:left w:val="single" w:color="BFBFBF" w:sz="4"/>
+              <w:bottom w:val="single" w:color="BFBFBF" w:sz="4"/>
+              <w:right w:val="single" w:color="BFBFBF" w:sz="4"/>
+            </w:tcBorders>
+            <w:shd w:fill="F2E6E8" w:color="auto" w:val="clear"/>
+            <w:tcMar>
+              <w:top w:type="dxa" w:w="80"/>
+              <w:left w:type="dxa" w:w="120"/>
+              <w:bottom w:type="dxa" w:w="80"/>
+              <w:right w:type="dxa" w:w="120"/>
+            </w:tcMar>
+          </w:tcPr>
+          <w:p>
+            <w:r>
+              <w:rPr>
+                <w:b/>
+                <w:bCs/>
+                <w:i w:val="false"/>
+                <w:iCs w:val="false"/>
+                <w:sz w:val="20"/>
+                <w:szCs w:val="20"/>
+              </w:rPr>
+              <w:t xml:space="preserve">Severity (our estimate)</w:t>
+            </w:r>
+          </w:p>
+        </w:tc>
+        <w:tc>
+          <w:tcPr>
+            <w:tcW w:type="dxa" w:w="6826"/>
+            <w:tcBorders>
+              <w:top w:val="single" w:color="BFBFBF" w:sz="4"/>
+              <w:left w:val="single" w:color="BFBFBF" w:sz="4"/>
+              <w:bottom w:val="single" w:color="BFBFBF" w:sz="4"/>
+              <w:right w:val="single" w:color="BFBFBF" w:sz="4"/>
+            </w:tcBorders>
+            <w:tcMar>
+              <w:top w:type="dxa" w:w="80"/>
+              <w:left w:type="dxa" w:w="120"/>
+              <w:bottom w:type="dxa" w:w="80"/>
+              <w:right w:type="dxa" w:w="120"/>
+            </w:tcMar>
+          </w:tcPr>
+          <w:p>
+            <w:r>
+              <w:rPr>
+                <w:b w:val="false"/>
+                <w:bCs w:val="false"/>
+                <w:i w:val="false"/>
+                <w:iCs w:val="false"/>
+                <w:sz w:val="20"/>
+                <w:szCs w:val="20"/>
+              </w:rPr>
+              <w:t xml:space="preserve">Medium — reliability</w:t>
+            </w:r>
+          </w:p>
+        </w:tc>
+      </w:tr>
+      <w:tr>
+        <w:tc>
+          <w:tcPr>
+            <w:tcW w:type="dxa" w:w="2200"/>
+            <w:tcBorders>
+              <w:top w:val="single" w:color="BFBFBF" w:sz="4"/>
+              <w:left w:val="single" w:color="BFBFBF" w:sz="4"/>
+              <w:bottom w:val="single" w:color="BFBFBF" w:sz="4"/>
+              <w:right w:val="single" w:color="BFBFBF" w:sz="4"/>
+            </w:tcBorders>
+            <w:shd w:fill="F2E6E8" w:color="auto" w:val="clear"/>
+            <w:tcMar>
+              <w:top w:type="dxa" w:w="80"/>
+              <w:left w:type="dxa" w:w="120"/>
+              <w:bottom w:type="dxa" w:w="80"/>
+              <w:right w:type="dxa" w:w="120"/>
+            </w:tcMar>
+          </w:tcPr>
+          <w:p>
+            <w:r>
+              <w:rPr>
+                <w:b/>
+                <w:bCs/>
+                <w:i w:val="false"/>
+                <w:iCs w:val="false"/>
+                <w:sz w:val="20"/>
+                <w:szCs w:val="20"/>
+              </w:rPr>
+              <w:t xml:space="preserve">Where</w:t>
+            </w:r>
+          </w:p>
+        </w:tc>
+        <w:tc>
+          <w:tcPr>
+            <w:tcW w:type="dxa" w:w="6826"/>
+            <w:tcBorders>
+              <w:top w:val="single" w:color="BFBFBF" w:sz="4"/>
+              <w:left w:val="single" w:color="BFBFBF" w:sz="4"/>
+              <w:bottom w:val="single" w:color="BFBFBF" w:sz="4"/>
+              <w:right w:val="single" w:color="BFBFBF" w:sz="4"/>
+            </w:tcBorders>
+            <w:tcMar>
+              <w:top w:type="dxa" w:w="80"/>
+              <w:left w:type="dxa" w:w="120"/>
+              <w:bottom w:type="dxa" w:w="80"/>
+              <w:right w:type="dxa" w:w="120"/>
+            </w:tcMar>
+          </w:tcPr>
+          <w:p>
+            <w:r>
+              <w:rPr>
+                <w:b w:val="false"/>
+                <w:bCs w:val="false"/>
+                <w:i w:val="false"/>
+                <w:iCs w:val="false"/>
+                <w:sz w:val="20"/>
+                <w:szCs w:val="20"/>
+              </w:rPr>
+              <w:t xml:space="preserve">apps/api/src/routes/kyc.ts</w:t>
+            </w:r>
+          </w:p>
+        </w:tc>
+      </w:tr>
+      <w:tr>
+        <w:tc>
+          <w:tcPr>
+            <w:tcW w:type="dxa" w:w="2200"/>
+            <w:tcBorders>
+              <w:top w:val="single" w:color="BFBFBF" w:sz="4"/>
+              <w:left w:val="single" w:color="BFBFBF" w:sz="4"/>
+              <w:bottom w:val="single" w:color="BFBFBF" w:sz="4"/>
+              <w:right w:val="single" w:color="BFBFBF" w:sz="4"/>
+            </w:tcBorders>
+            <w:shd w:fill="F2E6E8" w:color="auto" w:val="clear"/>
+            <w:tcMar>
+              <w:top w:type="dxa" w:w="80"/>
+              <w:left w:type="dxa" w:w="120"/>
+              <w:bottom w:type="dxa" w:w="80"/>
+              <w:right w:type="dxa" w:w="120"/>
+            </w:tcMar>
+          </w:tcPr>
+          <w:p>
+            <w:r>
+              <w:rPr>
+                <w:b/>
+                <w:bCs/>
+                <w:i w:val="false"/>
+                <w:iCs w:val="false"/>
+                <w:sz w:val="20"/>
+                <w:szCs w:val="20"/>
+              </w:rPr>
+              <w:t xml:space="preserve">What's wrong</w:t>
+            </w:r>
+          </w:p>
+        </w:tc>
+        <w:tc>
+          <w:tcPr>
+            <w:tcW w:type="dxa" w:w="6826"/>
+            <w:tcBorders>
+              <w:top w:val="single" w:color="BFBFBF" w:sz="4"/>
+              <w:left w:val="single" w:color="BFBFBF" w:sz="4"/>
+              <w:bottom w:val="single" w:color="BFBFBF" w:sz="4"/>
+              <w:right w:val="single" w:color="BFBFBF" w:sz="4"/>
+            </w:tcBorders>
+            <w:tcMar>
+              <w:top w:type="dxa" w:w="80"/>
+              <w:left w:type="dxa" w:w="120"/>
+              <w:bottom w:type="dxa" w:w="80"/>
+              <w:right w:type="dxa" w:w="120"/>
+            </w:tcMar>
+          </w:tcPr>
+          <w:p>
+            <w:r>
+              <w:rPr>
+                <w:b w:val="false"/>
+                <w:bCs w:val="false"/>
+                <w:i w:val="false"/>
+                <w:iCs w:val="false"/>
+                <w:sz w:val="20"/>
+                <w:szCs w:val="20"/>
+              </w:rPr>
+              <w:t xml:space="preserve">The raw upload name went into the Content-Disposition header. Node refuses non-Latin header text, so the download failed with 500; a quote in the name could also break the header.</w:t>
+            </w:r>
+          </w:p>
+        </w:tc>
+      </w:tr>
+      <w:tr>
+        <w:tc>
+          <w:tcPr>
+            <w:tcW w:type="dxa" w:w="2200"/>
+            <w:tcBorders>
+              <w:top w:val="single" w:color="BFBFBF" w:sz="4"/>
+              <w:left w:val="single" w:color="BFBFBF" w:sz="4"/>
+              <w:bottom w:val="single" w:color="BFBFBF" w:sz="4"/>
+              <w:right w:val="single" w:color="BFBFBF" w:sz="4"/>
+            </w:tcBorders>
+            <w:shd w:fill="F2E6E8" w:color="auto" w:val="clear"/>
+            <w:tcMar>
+              <w:top w:type="dxa" w:w="80"/>
+              <w:left w:type="dxa" w:w="120"/>
+              <w:bottom w:type="dxa" w:w="80"/>
+              <w:right w:type="dxa" w:w="120"/>
+            </w:tcMar>
+          </w:tcPr>
+          <w:p>
+            <w:r>
+              <w:rPr>
+                <w:b/>
+                <w:bCs/>
+                <w:i w:val="false"/>
+                <w:iCs w:val="false"/>
+                <w:sz w:val="20"/>
+                <w:szCs w:val="20"/>
+              </w:rPr>
+              <w:t xml:space="preserve">Fix</w:t>
+            </w:r>
+          </w:p>
+        </w:tc>
+        <w:tc>
+          <w:tcPr>
+            <w:tcW w:type="dxa" w:w="6826"/>
+            <w:tcBorders>
+              <w:top w:val="single" w:color="BFBFBF" w:sz="4"/>
+              <w:left w:val="single" w:color="BFBFBF" w:sz="4"/>
+              <w:bottom w:val="single" w:color="BFBFBF" w:sz="4"/>
+              <w:right w:val="single" w:color="BFBFBF" w:sz="4"/>
+            </w:tcBorders>
+            <w:tcMar>
+              <w:top w:type="dxa" w:w="80"/>
+              <w:left w:type="dxa" w:w="120"/>
+              <w:bottom w:type="dxa" w:w="80"/>
+              <w:right w:type="dxa" w:w="120"/>
+            </w:tcMar>
+          </w:tcPr>
+          <w:p>
+            <w:r>
+              <w:rPr>
+                <w:b w:val="false"/>
+                <w:bCs w:val="false"/>
+                <w:i w:val="false"/>
+                <w:iCs w:val="false"/>
+                <w:sz w:val="20"/>
+                <w:szCs w:val="20"/>
+              </w:rPr>
+              <w:t xml:space="preserve">ASCII fallback name plus the standard UTF-8 form (filename*=UTF-8'').</w:t>
+            </w:r>
+          </w:p>
+        </w:tc>
+      </w:tr>
+      <w:tr>
+        <w:tc>
+          <w:tcPr>
+            <w:tcW w:type="dxa" w:w="2200"/>
+            <w:tcBorders>
+              <w:top w:val="single" w:color="BFBFBF" w:sz="4"/>
+              <w:left w:val="single" w:color="BFBFBF" w:sz="4"/>
+              <w:bottom w:val="single" w:color="BFBFBF" w:sz="4"/>
+              <w:right w:val="single" w:color="BFBFBF" w:sz="4"/>
+            </w:tcBorders>
+            <w:shd w:fill="F2E6E8" w:color="auto" w:val="clear"/>
+            <w:tcMar>
+              <w:top w:type="dxa" w:w="80"/>
+              <w:left w:type="dxa" w:w="120"/>
+              <w:bottom w:type="dxa" w:w="80"/>
+              <w:right w:type="dxa" w:w="120"/>
+            </w:tcMar>
+          </w:tcPr>
+          <w:p>
+            <w:r>
+              <w:rPr>
+                <w:b/>
+                <w:bCs/>
+                <w:i w:val="false"/>
+                <w:iCs w:val="false"/>
+                <w:sz w:val="20"/>
+                <w:szCs w:val="20"/>
+              </w:rPr>
+              <w:t xml:space="preserve">Proof</w:t>
+            </w:r>
+          </w:p>
+        </w:tc>
+        <w:tc>
+          <w:tcPr>
+            <w:tcW w:type="dxa" w:w="6826"/>
+            <w:tcBorders>
+              <w:top w:val="single" w:color="BFBFBF" w:sz="4"/>
+              <w:left w:val="single" w:color="BFBFBF" w:sz="4"/>
+              <w:bottom w:val="single" w:color="BFBFBF" w:sz="4"/>
+              <w:right w:val="single" w:color="BFBFBF" w:sz="4"/>
+            </w:tcBorders>
+            <w:tcMar>
+              <w:top w:type="dxa" w:w="80"/>
+              <w:left w:type="dxa" w:w="120"/>
+              <w:bottom w:type="dxa" w:w="80"/>
+              <w:right w:type="dxa" w:w="120"/>
+            </w:tcMar>
+          </w:tcPr>
+          <w:p>
+            <w:r>
+              <w:rPr>
+                <w:b w:val="false"/>
+                <w:bCs w:val="false"/>
+                <w:i w:val="false"/>
+                <w:iCs w:val="false"/>
+                <w:sz w:val="20"/>
+                <w:szCs w:val="20"/>
+              </w:rPr>
+              <w:t xml:space="preserve">Upload and download a document named in Arabic. Old code: 500.</w:t>
+            </w:r>
+          </w:p>
+        </w:tc>
+      </w:tr>
+      <w:tr>
+        <w:tc>
+          <w:tcPr>
+            <w:tcW w:type="dxa" w:w="2200"/>
+            <w:tcBorders>
+              <w:top w:val="single" w:color="BFBFBF" w:sz="4"/>
+              <w:left w:val="single" w:color="BFBFBF" w:sz="4"/>
+              <w:bottom w:val="single" w:color="BFBFBF" w:sz="4"/>
+              <w:right w:val="single" w:color="BFBFBF" w:sz="4"/>
+            </w:tcBorders>
+            <w:shd w:fill="F2E6E8" w:color="auto" w:val="clear"/>
+            <w:tcMar>
+              <w:top w:type="dxa" w:w="80"/>
+              <w:left w:type="dxa" w:w="120"/>
+              <w:bottom w:type="dxa" w:w="80"/>
+              <w:right w:type="dxa" w:w="120"/>
+            </w:tcMar>
+          </w:tcPr>
+          <w:p>
+            <w:r>
+              <w:rPr>
+                <w:b/>
+                <w:bCs/>
+                <w:i w:val="false"/>
+                <w:iCs w:val="false"/>
+                <w:sz w:val="20"/>
+                <w:szCs w:val="20"/>
+              </w:rPr>
+              <w:t xml:space="preserve">Status</w:t>
+            </w:r>
+          </w:p>
+        </w:tc>
+        <w:tc>
+          <w:tcPr>
+            <w:tcW w:type="dxa" w:w="6826"/>
+            <w:tcBorders>
+              <w:top w:val="single" w:color="BFBFBF" w:sz="4"/>
+              <w:left w:val="single" w:color="BFBFBF" w:sz="4"/>
+              <w:bottom w:val="single" w:color="BFBFBF" w:sz="4"/>
+              <w:right w:val="single" w:color="BFBFBF" w:sz="4"/>
+            </w:tcBorders>
+            <w:tcMar>
+              <w:top w:type="dxa" w:w="80"/>
+              <w:left w:type="dxa" w:w="120"/>
+              <w:bottom w:type="dxa" w:w="80"/>
+              <w:right w:type="dxa" w:w="120"/>
+            </w:tcMar>
+          </w:tcPr>
+          <w:p>
+            <w:r>
+              <w:rPr>
+                <w:b w:val="false"/>
+                <w:bCs w:val="false"/>
+                <w:i w:val="false"/>
+                <w:iCs w:val="false"/>
+                <w:sz w:val="20"/>
+                <w:szCs w:val="20"/>
+              </w:rPr>
+              <w:t xml:space="preserve">Fixed and tested (automated tests pass on a real database)</w:t>
+            </w:r>
+          </w:p>
+        </w:tc>
+      </w:tr>
+    </w:tbl>
+    <w:p>
+      <w:pPr>
+        <w:pStyle w:val="Heading2"/>
+        <w:spacing w:after="120" w:before="300"/>
+      </w:pPr>
+      <w:r>
+        <w:t xml:space="preserve">#77  One merchant's failed batch stopped everyone else's payout</w:t>
+      </w:r>
+    </w:p>
+    <w:tbl>
+      <w:tblPr>
+        <w:tblW w:type="dxa" w:w="9026"/>
+        <w:tblBorders>
+          <w:top w:val="single" w:color="auto" w:sz="4"/>
+          <w:left w:val="single" w:color="auto" w:sz="4"/>
+          <w:bottom w:val="single" w:color="auto" w:sz="4"/>
+          <w:right w:val="single" w:color="auto" w:sz="4"/>
+          <w:insideH w:val="single" w:color="auto" w:sz="4"/>
+          <w:insideV w:val="single" w:color="auto" w:sz="4"/>
+        </w:tblBorders>
+      </w:tblPr>
+      <w:tblGrid>
+        <w:gridCol w:w="2200"/>
+        <w:gridCol w:w="6826"/>
+      </w:tblGrid>
+      <w:tr>
+        <w:tc>
+          <w:tcPr>
+            <w:tcW w:type="dxa" w:w="2200"/>
+            <w:tcBorders>
+              <w:top w:val="single" w:color="BFBFBF" w:sz="4"/>
+              <w:left w:val="single" w:color="BFBFBF" w:sz="4"/>
+              <w:bottom w:val="single" w:color="BFBFBF" w:sz="4"/>
+              <w:right w:val="single" w:color="BFBFBF" w:sz="4"/>
+            </w:tcBorders>
+            <w:shd w:fill="F2E6E8" w:color="auto" w:val="clear"/>
+            <w:tcMar>
+              <w:top w:type="dxa" w:w="80"/>
+              <w:left w:type="dxa" w:w="120"/>
+              <w:bottom w:type="dxa" w:w="80"/>
+              <w:right w:type="dxa" w:w="120"/>
+            </w:tcMar>
+          </w:tcPr>
+          <w:p>
+            <w:r>
+              <w:rPr>
+                <w:b/>
+                <w:bCs/>
+                <w:i w:val="false"/>
+                <w:iCs w:val="false"/>
+                <w:sz w:val="20"/>
+                <w:szCs w:val="20"/>
+              </w:rPr>
+              <w:t xml:space="preserve">Severity (our estimate)</w:t>
+            </w:r>
+          </w:p>
+        </w:tc>
+        <w:tc>
+          <w:tcPr>
+            <w:tcW w:type="dxa" w:w="6826"/>
+            <w:tcBorders>
+              <w:top w:val="single" w:color="BFBFBF" w:sz="4"/>
+              <w:left w:val="single" w:color="BFBFBF" w:sz="4"/>
+              <w:bottom w:val="single" w:color="BFBFBF" w:sz="4"/>
+              <w:right w:val="single" w:color="BFBFBF" w:sz="4"/>
+            </w:tcBorders>
+            <w:tcMar>
+              <w:top w:type="dxa" w:w="80"/>
+              <w:left w:type="dxa" w:w="120"/>
+              <w:bottom w:type="dxa" w:w="80"/>
+              <w:right w:type="dxa" w:w="120"/>
+            </w:tcMar>
+          </w:tcPr>
+          <w:p>
+            <w:r>
+              <w:rPr>
+                <w:b w:val="false"/>
+                <w:bCs w:val="false"/>
+                <w:i w:val="false"/>
+                <w:iCs w:val="false"/>
+                <w:sz w:val="20"/>
+                <w:szCs w:val="20"/>
+              </w:rPr>
+              <w:t xml:space="preserve">High — money</w:t>
+            </w:r>
+          </w:p>
+        </w:tc>
+      </w:tr>
+      <w:tr>
+        <w:tc>
+          <w:tcPr>
+            <w:tcW w:type="dxa" w:w="2200"/>
+            <w:tcBorders>
+              <w:top w:val="single" w:color="BFBFBF" w:sz="4"/>
+              <w:left w:val="single" w:color="BFBFBF" w:sz="4"/>
+              <w:bottom w:val="single" w:color="BFBFBF" w:sz="4"/>
+              <w:right w:val="single" w:color="BFBFBF" w:sz="4"/>
+            </w:tcBorders>
+            <w:shd w:fill="F2E6E8" w:color="auto" w:val="clear"/>
+            <w:tcMar>
+              <w:top w:type="dxa" w:w="80"/>
+              <w:left w:type="dxa" w:w="120"/>
+              <w:bottom w:type="dxa" w:w="80"/>
+              <w:right w:type="dxa" w:w="120"/>
+            </w:tcMar>
+          </w:tcPr>
+          <w:p>
+            <w:r>
+              <w:rPr>
+                <w:b/>
+                <w:bCs/>
+                <w:i w:val="false"/>
+                <w:iCs w:val="false"/>
+                <w:sz w:val="20"/>
+                <w:szCs w:val="20"/>
+              </w:rPr>
+              <w:t xml:space="preserve">Where</w:t>
+            </w:r>
+          </w:p>
+        </w:tc>
+        <w:tc>
+          <w:tcPr>
+            <w:tcW w:type="dxa" w:w="6826"/>
+            <w:tcBorders>
+              <w:top w:val="single" w:color="BFBFBF" w:sz="4"/>
+              <w:left w:val="single" w:color="BFBFBF" w:sz="4"/>
+              <w:bottom w:val="single" w:color="BFBFBF" w:sz="4"/>
+              <w:right w:val="single" w:color="BFBFBF" w:sz="4"/>
+            </w:tcBorders>
+            <w:tcMar>
+              <w:top w:type="dxa" w:w="80"/>
+              <w:left w:type="dxa" w:w="120"/>
+              <w:bottom w:type="dxa" w:w="80"/>
+              <w:right w:type="dxa" w:w="120"/>
+            </w:tcMar>
+          </w:tcPr>
+          <w:p>
+            <w:r>
+              <w:rPr>
+                <w:b w:val="false"/>
+                <w:bCs w:val="false"/>
+                <w:i w:val="false"/>
+                <w:iCs w:val="false"/>
+                <w:sz w:val="20"/>
+                <w:szCs w:val="20"/>
+              </w:rPr>
+              <w:t xml:space="preserve">apps/settlement/internal/settlement/batch.go — RunDailyBatch(); scheduler/daemon.go</w:t>
+            </w:r>
+          </w:p>
+        </w:tc>
+      </w:tr>
+      <w:tr>
+        <w:tc>
+          <w:tcPr>
+            <w:tcW w:type="dxa" w:w="2200"/>
+            <w:tcBorders>
+              <w:top w:val="single" w:color="BFBFBF" w:sz="4"/>
+              <w:left w:val="single" w:color="BFBFBF" w:sz="4"/>
+              <w:bottom w:val="single" w:color="BFBFBF" w:sz="4"/>
+              <w:right w:val="single" w:color="BFBFBF" w:sz="4"/>
+            </w:tcBorders>
+            <w:shd w:fill="F2E6E8" w:color="auto" w:val="clear"/>
+            <w:tcMar>
+              <w:top w:type="dxa" w:w="80"/>
+              <w:left w:type="dxa" w:w="120"/>
+              <w:bottom w:type="dxa" w:w="80"/>
+              <w:right w:type="dxa" w:w="120"/>
+            </w:tcMar>
+          </w:tcPr>
+          <w:p>
+            <w:r>
+              <w:rPr>
+                <w:b/>
+                <w:bCs/>
+                <w:i w:val="false"/>
+                <w:iCs w:val="false"/>
+                <w:sz w:val="20"/>
+                <w:szCs w:val="20"/>
+              </w:rPr>
+              <w:t xml:space="preserve">What's wrong</w:t>
+            </w:r>
+          </w:p>
+        </w:tc>
+        <w:tc>
+          <w:tcPr>
+            <w:tcW w:type="dxa" w:w="6826"/>
+            <w:tcBorders>
+              <w:top w:val="single" w:color="BFBFBF" w:sz="4"/>
+              <w:left w:val="single" w:color="BFBFBF" w:sz="4"/>
+              <w:bottom w:val="single" w:color="BFBFBF" w:sz="4"/>
+              <w:right w:val="single" w:color="BFBFBF" w:sz="4"/>
+            </w:tcBorders>
+            <w:tcMar>
+              <w:top w:type="dxa" w:w="80"/>
+              <w:left w:type="dxa" w:w="120"/>
+              <w:bottom w:type="dxa" w:w="80"/>
+              <w:right w:type="dxa" w:w="120"/>
+            </w:tcMar>
+          </w:tcPr>
+          <w:p>
+            <w:r>
+              <w:rPr>
+                <w:b w:val="false"/>
+                <w:bCs w:val="false"/>
+                <w:i w:val="false"/>
+                <w:iCs w:val="false"/>
+                <w:sz w:val="20"/>
+                <w:szCs w:val="20"/>
+              </w:rPr>
+              <w:t xml:space="preserve">The daily run stopped at the first error, so every merchant after the broken one went unpaid, and the daemon hit the same error on every retry (also skipping payout notifications).</w:t>
+            </w:r>
+          </w:p>
+        </w:tc>
+      </w:tr>
+      <w:tr>
+        <w:tc>
+          <w:tcPr>
+            <w:tcW w:type="dxa" w:w="2200"/>
+            <w:tcBorders>
+              <w:top w:val="single" w:color="BFBFBF" w:sz="4"/>
+              <w:left w:val="single" w:color="BFBFBF" w:sz="4"/>
+              <w:bottom w:val="single" w:color="BFBFBF" w:sz="4"/>
+              <w:right w:val="single" w:color="BFBFBF" w:sz="4"/>
+            </w:tcBorders>
+            <w:shd w:fill="F2E6E8" w:color="auto" w:val="clear"/>
+            <w:tcMar>
+              <w:top w:type="dxa" w:w="80"/>
+              <w:left w:type="dxa" w:w="120"/>
+              <w:bottom w:type="dxa" w:w="80"/>
+              <w:right w:type="dxa" w:w="120"/>
+            </w:tcMar>
+          </w:tcPr>
+          <w:p>
+            <w:r>
+              <w:rPr>
+                <w:b/>
+                <w:bCs/>
+                <w:i w:val="false"/>
+                <w:iCs w:val="false"/>
+                <w:sz w:val="20"/>
+                <w:szCs w:val="20"/>
+              </w:rPr>
+              <w:t xml:space="preserve">Fix</w:t>
+            </w:r>
+          </w:p>
+        </w:tc>
+        <w:tc>
+          <w:tcPr>
+            <w:tcW w:type="dxa" w:w="6826"/>
+            <w:tcBorders>
+              <w:top w:val="single" w:color="BFBFBF" w:sz="4"/>
+              <w:left w:val="single" w:color="BFBFBF" w:sz="4"/>
+              <w:bottom w:val="single" w:color="BFBFBF" w:sz="4"/>
+              <w:right w:val="single" w:color="BFBFBF" w:sz="4"/>
+            </w:tcBorders>
+            <w:tcMar>
+              <w:top w:type="dxa" w:w="80"/>
+              <w:left w:type="dxa" w:w="120"/>
+              <w:bottom w:type="dxa" w:w="80"/>
+              <w:right w:type="dxa" w:w="120"/>
+            </w:tcMar>
+          </w:tcPr>
+          <w:p>
+            <w:r>
+              <w:rPr>
+                <w:b w:val="false"/>
+                <w:bCs w:val="false"/>
+                <w:i w:val="false"/>
+                <w:iCs w:val="false"/>
+                <w:sz w:val="20"/>
+                <w:szCs w:val="20"/>
+              </w:rPr>
+              <w:t xml:space="preserve">Carry on with the other merchants and report all failures together; still send notifications.</w:t>
+            </w:r>
+          </w:p>
+        </w:tc>
+      </w:tr>
+      <w:tr>
+        <w:tc>
+          <w:tcPr>
+            <w:tcW w:type="dxa" w:w="2200"/>
+            <w:tcBorders>
+              <w:top w:val="single" w:color="BFBFBF" w:sz="4"/>
+              <w:left w:val="single" w:color="BFBFBF" w:sz="4"/>
+              <w:bottom w:val="single" w:color="BFBFBF" w:sz="4"/>
+              <w:right w:val="single" w:color="BFBFBF" w:sz="4"/>
+            </w:tcBorders>
+            <w:shd w:fill="F2E6E8" w:color="auto" w:val="clear"/>
+            <w:tcMar>
+              <w:top w:type="dxa" w:w="80"/>
+              <w:left w:type="dxa" w:w="120"/>
+              <w:bottom w:type="dxa" w:w="80"/>
+              <w:right w:type="dxa" w:w="120"/>
+            </w:tcMar>
+          </w:tcPr>
+          <w:p>
+            <w:r>
+              <w:rPr>
+                <w:b/>
+                <w:bCs/>
+                <w:i w:val="false"/>
+                <w:iCs w:val="false"/>
+                <w:sz w:val="20"/>
+                <w:szCs w:val="20"/>
+              </w:rPr>
+              <w:t xml:space="preserve">Proof</w:t>
+            </w:r>
+          </w:p>
+        </w:tc>
+        <w:tc>
+          <w:tcPr>
+            <w:tcW w:type="dxa" w:w="6826"/>
+            <w:tcBorders>
+              <w:top w:val="single" w:color="BFBFBF" w:sz="4"/>
+              <w:left w:val="single" w:color="BFBFBF" w:sz="4"/>
+              <w:bottom w:val="single" w:color="BFBFBF" w:sz="4"/>
+              <w:right w:val="single" w:color="BFBFBF" w:sz="4"/>
+            </w:tcBorders>
+            <w:tcMar>
+              <w:top w:type="dxa" w:w="80"/>
+              <w:left w:type="dxa" w:w="120"/>
+              <w:bottom w:type="dxa" w:w="80"/>
+              <w:right w:type="dxa" w:w="120"/>
+            </w:tcMar>
+          </w:tcPr>
+          <w:p>
+            <w:r>
+              <w:rPr>
+                <w:b w:val="false"/>
+                <w:bCs w:val="false"/>
+                <w:i w:val="false"/>
+                <w:iCs w:val="false"/>
+                <w:sz w:val="20"/>
+                <w:szCs w:val="20"/>
+              </w:rPr>
+              <w:t xml:space="preserve">Go test: a forced failure for one merchant, the next merchant's batch is still paid. Fails on the old code.</w:t>
+            </w:r>
+          </w:p>
+        </w:tc>
+      </w:tr>
+      <w:tr>
+        <w:tc>
+          <w:tcPr>
+            <w:tcW w:type="dxa" w:w="2200"/>
+            <w:tcBorders>
+              <w:top w:val="single" w:color="BFBFBF" w:sz="4"/>
+              <w:left w:val="single" w:color="BFBFBF" w:sz="4"/>
+              <w:bottom w:val="single" w:color="BFBFBF" w:sz="4"/>
+              <w:right w:val="single" w:color="BFBFBF" w:sz="4"/>
+            </w:tcBorders>
+            <w:shd w:fill="F2E6E8" w:color="auto" w:val="clear"/>
+            <w:tcMar>
+              <w:top w:type="dxa" w:w="80"/>
+              <w:left w:type="dxa" w:w="120"/>
+              <w:bottom w:type="dxa" w:w="80"/>
+              <w:right w:type="dxa" w:w="120"/>
+            </w:tcMar>
+          </w:tcPr>
+          <w:p>
+            <w:r>
+              <w:rPr>
+                <w:b/>
+                <w:bCs/>
+                <w:i w:val="false"/>
+                <w:iCs w:val="false"/>
+                <w:sz w:val="20"/>
+                <w:szCs w:val="20"/>
+              </w:rPr>
+              <w:t xml:space="preserve">Status</w:t>
+            </w:r>
+          </w:p>
+        </w:tc>
+        <w:tc>
+          <w:tcPr>
+            <w:tcW w:type="dxa" w:w="6826"/>
+            <w:tcBorders>
+              <w:top w:val="single" w:color="BFBFBF" w:sz="4"/>
+              <w:left w:val="single" w:color="BFBFBF" w:sz="4"/>
+              <w:bottom w:val="single" w:color="BFBFBF" w:sz="4"/>
+              <w:right w:val="single" w:color="BFBFBF" w:sz="4"/>
+            </w:tcBorders>
+            <w:tcMar>
+              <w:top w:type="dxa" w:w="80"/>
+              <w:left w:type="dxa" w:w="120"/>
+              <w:bottom w:type="dxa" w:w="80"/>
+              <w:right w:type="dxa" w:w="120"/>
+            </w:tcMar>
+          </w:tcPr>
+          <w:p>
+            <w:r>
+              <w:rPr>
+                <w:b w:val="false"/>
+                <w:bCs w:val="false"/>
+                <w:i w:val="false"/>
+                <w:iCs w:val="false"/>
+                <w:sz w:val="20"/>
+                <w:szCs w:val="20"/>
+              </w:rPr>
+              <w:t xml:space="preserve">Fixed and tested (automated tests pass on a real database)</w:t>
+            </w:r>
+          </w:p>
+        </w:tc>
+      </w:tr>
+    </w:tbl>
+    <w:p>
+      <w:pPr>
+        <w:pStyle w:val="Heading2"/>
+        <w:spacing w:after="120" w:before="300"/>
+      </w:pPr>
+      <w:r>
+        <w:t xml:space="preserve">#78  KYC upload accepted any number of files and kept only the last</w:t>
+      </w:r>
+    </w:p>
+    <w:tbl>
+      <w:tblPr>
+        <w:tblW w:type="dxa" w:w="9026"/>
+        <w:tblBorders>
+          <w:top w:val="single" w:color="auto" w:sz="4"/>
+          <w:left w:val="single" w:color="auto" w:sz="4"/>
+          <w:bottom w:val="single" w:color="auto" w:sz="4"/>
+          <w:right w:val="single" w:color="auto" w:sz="4"/>
+          <w:insideH w:val="single" w:color="auto" w:sz="4"/>
+          <w:insideV w:val="single" w:color="auto" w:sz="4"/>
+        </w:tblBorders>
+      </w:tblPr>
+      <w:tblGrid>
+        <w:gridCol w:w="2200"/>
+        <w:gridCol w:w="6826"/>
+      </w:tblGrid>
+      <w:tr>
+        <w:tc>
+          <w:tcPr>
+            <w:tcW w:type="dxa" w:w="2200"/>
+            <w:tcBorders>
+              <w:top w:val="single" w:color="BFBFBF" w:sz="4"/>
+              <w:left w:val="single" w:color="BFBFBF" w:sz="4"/>
+              <w:bottom w:val="single" w:color="BFBFBF" w:sz="4"/>
+              <w:right w:val="single" w:color="BFBFBF" w:sz="4"/>
+            </w:tcBorders>
+            <w:shd w:fill="F2E6E8" w:color="auto" w:val="clear"/>
+            <w:tcMar>
+              <w:top w:type="dxa" w:w="80"/>
+              <w:left w:type="dxa" w:w="120"/>
+              <w:bottom w:type="dxa" w:w="80"/>
+              <w:right w:type="dxa" w:w="120"/>
+            </w:tcMar>
+          </w:tcPr>
+          <w:p>
+            <w:r>
+              <w:rPr>
+                <w:b/>
+                <w:bCs/>
+                <w:i w:val="false"/>
+                <w:iCs w:val="false"/>
+                <w:sz w:val="20"/>
+                <w:szCs w:val="20"/>
+              </w:rPr>
+              <w:t xml:space="preserve">Severity (our estimate)</w:t>
+            </w:r>
+          </w:p>
+        </w:tc>
+        <w:tc>
+          <w:tcPr>
+            <w:tcW w:type="dxa" w:w="6826"/>
+            <w:tcBorders>
+              <w:top w:val="single" w:color="BFBFBF" w:sz="4"/>
+              <w:left w:val="single" w:color="BFBFBF" w:sz="4"/>
+              <w:bottom w:val="single" w:color="BFBFBF" w:sz="4"/>
+              <w:right w:val="single" w:color="BFBFBF" w:sz="4"/>
+            </w:tcBorders>
+            <w:tcMar>
+              <w:top w:type="dxa" w:w="80"/>
+              <w:left w:type="dxa" w:w="120"/>
+              <w:bottom w:type="dxa" w:w="80"/>
+              <w:right w:type="dxa" w:w="120"/>
+            </w:tcMar>
+          </w:tcPr>
+          <w:p>
+            <w:r>
+              <w:rPr>
+                <w:b w:val="false"/>
+                <w:bCs w:val="false"/>
+                <w:i w:val="false"/>
+                <w:iCs w:val="false"/>
+                <w:sz w:val="20"/>
+                <w:szCs w:val="20"/>
+              </w:rPr>
+              <w:t xml:space="preserve">Medium — security / stays up</w:t>
+            </w:r>
+          </w:p>
+        </w:tc>
+      </w:tr>
+      <w:tr>
+        <w:tc>
+          <w:tcPr>
+            <w:tcW w:type="dxa" w:w="2200"/>
+            <w:tcBorders>
+              <w:top w:val="single" w:color="BFBFBF" w:sz="4"/>
+              <w:left w:val="single" w:color="BFBFBF" w:sz="4"/>
+              <w:bottom w:val="single" w:color="BFBFBF" w:sz="4"/>
+              <w:right w:val="single" w:color="BFBFBF" w:sz="4"/>
+            </w:tcBorders>
+            <w:shd w:fill="F2E6E8" w:color="auto" w:val="clear"/>
+            <w:tcMar>
+              <w:top w:type="dxa" w:w="80"/>
+              <w:left w:type="dxa" w:w="120"/>
+              <w:bottom w:type="dxa" w:w="80"/>
+              <w:right w:type="dxa" w:w="120"/>
+            </w:tcMar>
+          </w:tcPr>
+          <w:p>
+            <w:r>
+              <w:rPr>
+                <w:b/>
+                <w:bCs/>
+                <w:i w:val="false"/>
+                <w:iCs w:val="false"/>
+                <w:sz w:val="20"/>
+                <w:szCs w:val="20"/>
+              </w:rPr>
+              <w:t xml:space="preserve">Where</w:t>
+            </w:r>
+          </w:p>
+        </w:tc>
+        <w:tc>
+          <w:tcPr>
+            <w:tcW w:type="dxa" w:w="6826"/>
+            <w:tcBorders>
+              <w:top w:val="single" w:color="BFBFBF" w:sz="4"/>
+              <w:left w:val="single" w:color="BFBFBF" w:sz="4"/>
+              <w:bottom w:val="single" w:color="BFBFBF" w:sz="4"/>
+              <w:right w:val="single" w:color="BFBFBF" w:sz="4"/>
+            </w:tcBorders>
+            <w:tcMar>
+              <w:top w:type="dxa" w:w="80"/>
+              <w:left w:type="dxa" w:w="120"/>
+              <w:bottom w:type="dxa" w:w="80"/>
+              <w:right w:type="dxa" w:w="120"/>
+            </w:tcMar>
+          </w:tcPr>
+          <w:p>
+            <w:r>
+              <w:rPr>
+                <w:b w:val="false"/>
+                <w:bCs w:val="false"/>
+                <w:i w:val="false"/>
+                <w:iCs w:val="false"/>
+                <w:sz w:val="20"/>
+                <w:szCs w:val="20"/>
+              </w:rPr>
+              <w:t xml:space="preserve">apps/api/src/routes/kyc.ts, plugins/multipart.ts</w:t>
+            </w:r>
+          </w:p>
+        </w:tc>
+      </w:tr>
+      <w:tr>
+        <w:tc>
+          <w:tcPr>
+            <w:tcW w:type="dxa" w:w="2200"/>
+            <w:tcBorders>
+              <w:top w:val="single" w:color="BFBFBF" w:sz="4"/>
+              <w:left w:val="single" w:color="BFBFBF" w:sz="4"/>
+              <w:bottom w:val="single" w:color="BFBFBF" w:sz="4"/>
+              <w:right w:val="single" w:color="BFBFBF" w:sz="4"/>
+            </w:tcBorders>
+            <w:shd w:fill="F2E6E8" w:color="auto" w:val="clear"/>
+            <w:tcMar>
+              <w:top w:type="dxa" w:w="80"/>
+              <w:left w:type="dxa" w:w="120"/>
+              <w:bottom w:type="dxa" w:w="80"/>
+              <w:right w:type="dxa" w:w="120"/>
+            </w:tcMar>
+          </w:tcPr>
+          <w:p>
+            <w:r>
+              <w:rPr>
+                <w:b/>
+                <w:bCs/>
+                <w:i w:val="false"/>
+                <w:iCs w:val="false"/>
+                <w:sz w:val="20"/>
+                <w:szCs w:val="20"/>
+              </w:rPr>
+              <w:t xml:space="preserve">What's wrong</w:t>
+            </w:r>
+          </w:p>
+        </w:tc>
+        <w:tc>
+          <w:tcPr>
+            <w:tcW w:type="dxa" w:w="6826"/>
+            <w:tcBorders>
+              <w:top w:val="single" w:color="BFBFBF" w:sz="4"/>
+              <w:left w:val="single" w:color="BFBFBF" w:sz="4"/>
+              <w:bottom w:val="single" w:color="BFBFBF" w:sz="4"/>
+              <w:right w:val="single" w:color="BFBFBF" w:sz="4"/>
+            </w:tcBorders>
+            <w:tcMar>
+              <w:top w:type="dxa" w:w="80"/>
+              <w:left w:type="dxa" w:w="120"/>
+              <w:bottom w:type="dxa" w:w="80"/>
+              <w:right w:type="dxa" w:w="120"/>
+            </w:tcMar>
+          </w:tcPr>
+          <w:p>
+            <w:r>
+              <w:rPr>
+                <w:b w:val="false"/>
+                <w:bCs w:val="false"/>
+                <w:i w:val="false"/>
+                <w:iCs w:val="false"/>
+                <w:sz w:val="20"/>
+                <w:szCs w:val="20"/>
+              </w:rPr>
+              <w:t xml:space="preserve">A note says the route allows one file per request; it buffered every file part and silently kept the last.</w:t>
+            </w:r>
+          </w:p>
+        </w:tc>
+      </w:tr>
+      <w:tr>
+        <w:tc>
+          <w:tcPr>
+            <w:tcW w:type="dxa" w:w="2200"/>
+            <w:tcBorders>
+              <w:top w:val="single" w:color="BFBFBF" w:sz="4"/>
+              <w:left w:val="single" w:color="BFBFBF" w:sz="4"/>
+              <w:bottom w:val="single" w:color="BFBFBF" w:sz="4"/>
+              <w:right w:val="single" w:color="BFBFBF" w:sz="4"/>
+            </w:tcBorders>
+            <w:shd w:fill="F2E6E8" w:color="auto" w:val="clear"/>
+            <w:tcMar>
+              <w:top w:type="dxa" w:w="80"/>
+              <w:left w:type="dxa" w:w="120"/>
+              <w:bottom w:type="dxa" w:w="80"/>
+              <w:right w:type="dxa" w:w="120"/>
+            </w:tcMar>
+          </w:tcPr>
+          <w:p>
+            <w:r>
+              <w:rPr>
+                <w:b/>
+                <w:bCs/>
+                <w:i w:val="false"/>
+                <w:iCs w:val="false"/>
+                <w:sz w:val="20"/>
+                <w:szCs w:val="20"/>
+              </w:rPr>
+              <w:t xml:space="preserve">Fix</w:t>
+            </w:r>
+          </w:p>
+        </w:tc>
+        <w:tc>
+          <w:tcPr>
+            <w:tcW w:type="dxa" w:w="6826"/>
+            <w:tcBorders>
+              <w:top w:val="single" w:color="BFBFBF" w:sz="4"/>
+              <w:left w:val="single" w:color="BFBFBF" w:sz="4"/>
+              <w:bottom w:val="single" w:color="BFBFBF" w:sz="4"/>
+              <w:right w:val="single" w:color="BFBFBF" w:sz="4"/>
+            </w:tcBorders>
+            <w:tcMar>
+              <w:top w:type="dxa" w:w="80"/>
+              <w:left w:type="dxa" w:w="120"/>
+              <w:bottom w:type="dxa" w:w="80"/>
+              <w:right w:type="dxa" w:w="120"/>
+            </w:tcMar>
+          </w:tcPr>
+          <w:p>
+            <w:r>
+              <w:rPr>
+                <w:b w:val="false"/>
+                <w:bCs w:val="false"/>
+                <w:i w:val="false"/>
+                <w:iCs w:val="false"/>
+                <w:sz w:val="20"/>
+                <w:szCs w:val="20"/>
+              </w:rPr>
+              <w:t xml:space="preserve">A second file is refused with 400 before it is read.</w:t>
+            </w:r>
+          </w:p>
+        </w:tc>
+      </w:tr>
+      <w:tr>
+        <w:tc>
+          <w:tcPr>
+            <w:tcW w:type="dxa" w:w="2200"/>
+            <w:tcBorders>
+              <w:top w:val="single" w:color="BFBFBF" w:sz="4"/>
+              <w:left w:val="single" w:color="BFBFBF" w:sz="4"/>
+              <w:bottom w:val="single" w:color="BFBFBF" w:sz="4"/>
+              <w:right w:val="single" w:color="BFBFBF" w:sz="4"/>
+            </w:tcBorders>
+            <w:shd w:fill="F2E6E8" w:color="auto" w:val="clear"/>
+            <w:tcMar>
+              <w:top w:type="dxa" w:w="80"/>
+              <w:left w:type="dxa" w:w="120"/>
+              <w:bottom w:type="dxa" w:w="80"/>
+              <w:right w:type="dxa" w:w="120"/>
+            </w:tcMar>
+          </w:tcPr>
+          <w:p>
+            <w:r>
+              <w:rPr>
+                <w:b/>
+                <w:bCs/>
+                <w:i w:val="false"/>
+                <w:iCs w:val="false"/>
+                <w:sz w:val="20"/>
+                <w:szCs w:val="20"/>
+              </w:rPr>
+              <w:t xml:space="preserve">Proof</w:t>
+            </w:r>
+          </w:p>
+        </w:tc>
+        <w:tc>
+          <w:tcPr>
+            <w:tcW w:type="dxa" w:w="6826"/>
+            <w:tcBorders>
+              <w:top w:val="single" w:color="BFBFBF" w:sz="4"/>
+              <w:left w:val="single" w:color="BFBFBF" w:sz="4"/>
+              <w:bottom w:val="single" w:color="BFBFBF" w:sz="4"/>
+              <w:right w:val="single" w:color="BFBFBF" w:sz="4"/>
+            </w:tcBorders>
+            <w:tcMar>
+              <w:top w:type="dxa" w:w="80"/>
+              <w:left w:type="dxa" w:w="120"/>
+              <w:bottom w:type="dxa" w:w="80"/>
+              <w:right w:type="dxa" w:w="120"/>
+            </w:tcMar>
+          </w:tcPr>
+          <w:p>
+            <w:r>
+              <w:rPr>
+                <w:b w:val="false"/>
+                <w:bCs w:val="false"/>
+                <w:i w:val="false"/>
+                <w:iCs w:val="false"/>
+                <w:sz w:val="20"/>
+                <w:szCs w:val="20"/>
+              </w:rPr>
+              <w:t xml:space="preserve">Two-file upload test. Old code: 201.</w:t>
+            </w:r>
+          </w:p>
+        </w:tc>
+      </w:tr>
+      <w:tr>
+        <w:tc>
+          <w:tcPr>
+            <w:tcW w:type="dxa" w:w="2200"/>
+            <w:tcBorders>
+              <w:top w:val="single" w:color="BFBFBF" w:sz="4"/>
+              <w:left w:val="single" w:color="BFBFBF" w:sz="4"/>
+              <w:bottom w:val="single" w:color="BFBFBF" w:sz="4"/>
+              <w:right w:val="single" w:color="BFBFBF" w:sz="4"/>
+            </w:tcBorders>
+            <w:shd w:fill="F2E6E8" w:color="auto" w:val="clear"/>
+            <w:tcMar>
+              <w:top w:type="dxa" w:w="80"/>
+              <w:left w:type="dxa" w:w="120"/>
+              <w:bottom w:type="dxa" w:w="80"/>
+              <w:right w:type="dxa" w:w="120"/>
+            </w:tcMar>
+          </w:tcPr>
+          <w:p>
+            <w:r>
+              <w:rPr>
+                <w:b/>
+                <w:bCs/>
+                <w:i w:val="false"/>
+                <w:iCs w:val="false"/>
+                <w:sz w:val="20"/>
+                <w:szCs w:val="20"/>
+              </w:rPr>
+              <w:t xml:space="preserve">Status</w:t>
+            </w:r>
+          </w:p>
+        </w:tc>
+        <w:tc>
+          <w:tcPr>
+            <w:tcW w:type="dxa" w:w="6826"/>
+            <w:tcBorders>
+              <w:top w:val="single" w:color="BFBFBF" w:sz="4"/>
+              <w:left w:val="single" w:color="BFBFBF" w:sz="4"/>
+              <w:bottom w:val="single" w:color="BFBFBF" w:sz="4"/>
+              <w:right w:val="single" w:color="BFBFBF" w:sz="4"/>
+            </w:tcBorders>
+            <w:tcMar>
+              <w:top w:type="dxa" w:w="80"/>
+              <w:left w:type="dxa" w:w="120"/>
+              <w:bottom w:type="dxa" w:w="80"/>
+              <w:right w:type="dxa" w:w="120"/>
+            </w:tcMar>
+          </w:tcPr>
+          <w:p>
+            <w:r>
+              <w:rPr>
+                <w:b w:val="false"/>
+                <w:bCs w:val="false"/>
+                <w:i w:val="false"/>
+                <w:iCs w:val="false"/>
+                <w:sz w:val="20"/>
+                <w:szCs w:val="20"/>
+              </w:rPr>
+              <w:t xml:space="preserve">Fixed and tested (automated tests pass on a real database)</w:t>
+            </w:r>
+          </w:p>
+        </w:tc>
+      </w:tr>
+    </w:tbl>
+    <w:p>
+      <w:pPr>
+        <w:pStyle w:val="Heading2"/>
+        <w:spacing w:after="120" w:before="300"/>
+      </w:pPr>
+      <w:r>
+        <w:t xml:space="preserve">#79  The transactions CSV export loaded every row into memory</w:t>
+      </w:r>
+    </w:p>
+    <w:tbl>
+      <w:tblPr>
+        <w:tblW w:type="dxa" w:w="9026"/>
+        <w:tblBorders>
+          <w:top w:val="single" w:color="auto" w:sz="4"/>
+          <w:left w:val="single" w:color="auto" w:sz="4"/>
+          <w:bottom w:val="single" w:color="auto" w:sz="4"/>
+          <w:right w:val="single" w:color="auto" w:sz="4"/>
+          <w:insideH w:val="single" w:color="auto" w:sz="4"/>
+          <w:insideV w:val="single" w:color="auto" w:sz="4"/>
+        </w:tblBorders>
+      </w:tblPr>
+      <w:tblGrid>
+        <w:gridCol w:w="2200"/>
+        <w:gridCol w:w="6826"/>
+      </w:tblGrid>
+      <w:tr>
+        <w:tc>
+          <w:tcPr>
+            <w:tcW w:type="dxa" w:w="2200"/>
+            <w:tcBorders>
+              <w:top w:val="single" w:color="BFBFBF" w:sz="4"/>
+              <w:left w:val="single" w:color="BFBFBF" w:sz="4"/>
+              <w:bottom w:val="single" w:color="BFBFBF" w:sz="4"/>
+              <w:right w:val="single" w:color="BFBFBF" w:sz="4"/>
+            </w:tcBorders>
+            <w:shd w:fill="F2E6E8" w:color="auto" w:val="clear"/>
+            <w:tcMar>
+              <w:top w:type="dxa" w:w="80"/>
+              <w:left w:type="dxa" w:w="120"/>
+              <w:bottom w:type="dxa" w:w="80"/>
+              <w:right w:type="dxa" w:w="120"/>
+            </w:tcMar>
+          </w:tcPr>
+          <w:p>
+            <w:r>
+              <w:rPr>
+                <w:b/>
+                <w:bCs/>
+                <w:i w:val="false"/>
+                <w:iCs w:val="false"/>
+                <w:sz w:val="20"/>
+                <w:szCs w:val="20"/>
+              </w:rPr>
+              <w:t xml:space="preserve">Severity (our estimate)</w:t>
+            </w:r>
+          </w:p>
+        </w:tc>
+        <w:tc>
+          <w:tcPr>
+            <w:tcW w:type="dxa" w:w="6826"/>
+            <w:tcBorders>
+              <w:top w:val="single" w:color="BFBFBF" w:sz="4"/>
+              <w:left w:val="single" w:color="BFBFBF" w:sz="4"/>
+              <w:bottom w:val="single" w:color="BFBFBF" w:sz="4"/>
+              <w:right w:val="single" w:color="BFBFBF" w:sz="4"/>
+            </w:tcBorders>
+            <w:tcMar>
+              <w:top w:type="dxa" w:w="80"/>
+              <w:left w:type="dxa" w:w="120"/>
+              <w:bottom w:type="dxa" w:w="80"/>
+              <w:right w:type="dxa" w:w="120"/>
+            </w:tcMar>
+          </w:tcPr>
+          <w:p>
+            <w:r>
+              <w:rPr>
+                <w:b w:val="false"/>
+                <w:bCs w:val="false"/>
+                <w:i w:val="false"/>
+                <w:iCs w:val="false"/>
+                <w:sz w:val="20"/>
+                <w:szCs w:val="20"/>
+              </w:rPr>
+              <w:t xml:space="preserve">High — stays up</w:t>
+            </w:r>
+          </w:p>
+        </w:tc>
+      </w:tr>
+      <w:tr>
+        <w:tc>
+          <w:tcPr>
+            <w:tcW w:type="dxa" w:w="2200"/>
+            <w:tcBorders>
+              <w:top w:val="single" w:color="BFBFBF" w:sz="4"/>
+              <w:left w:val="single" w:color="BFBFBF" w:sz="4"/>
+              <w:bottom w:val="single" w:color="BFBFBF" w:sz="4"/>
+              <w:right w:val="single" w:color="BFBFBF" w:sz="4"/>
+            </w:tcBorders>
+            <w:shd w:fill="F2E6E8" w:color="auto" w:val="clear"/>
+            <w:tcMar>
+              <w:top w:type="dxa" w:w="80"/>
+              <w:left w:type="dxa" w:w="120"/>
+              <w:bottom w:type="dxa" w:w="80"/>
+              <w:right w:type="dxa" w:w="120"/>
+            </w:tcMar>
+          </w:tcPr>
+          <w:p>
+            <w:r>
+              <w:rPr>
+                <w:b/>
+                <w:bCs/>
+                <w:i w:val="false"/>
+                <w:iCs w:val="false"/>
+                <w:sz w:val="20"/>
+                <w:szCs w:val="20"/>
+              </w:rPr>
+              <w:t xml:space="preserve">Where</w:t>
+            </w:r>
+          </w:p>
+        </w:tc>
+        <w:tc>
+          <w:tcPr>
+            <w:tcW w:type="dxa" w:w="6826"/>
+            <w:tcBorders>
+              <w:top w:val="single" w:color="BFBFBF" w:sz="4"/>
+              <w:left w:val="single" w:color="BFBFBF" w:sz="4"/>
+              <w:bottom w:val="single" w:color="BFBFBF" w:sz="4"/>
+              <w:right w:val="single" w:color="BFBFBF" w:sz="4"/>
+            </w:tcBorders>
+            <w:tcMar>
+              <w:top w:type="dxa" w:w="80"/>
+              <w:left w:type="dxa" w:w="120"/>
+              <w:bottom w:type="dxa" w:w="80"/>
+              <w:right w:type="dxa" w:w="120"/>
+            </w:tcMar>
+          </w:tcPr>
+          <w:p>
+            <w:r>
+              <w:rPr>
+                <w:b w:val="false"/>
+                <w:bCs w:val="false"/>
+                <w:i w:val="false"/>
+                <w:iCs w:val="false"/>
+                <w:sz w:val="20"/>
+                <w:szCs w:val="20"/>
+              </w:rPr>
+              <w:t xml:space="preserve">apps/api/src/transactions/exportCsv.ts, routes/transactions.ts</w:t>
+            </w:r>
+          </w:p>
+        </w:tc>
+      </w:tr>
+      <w:tr>
+        <w:tc>
+          <w:tcPr>
+            <w:tcW w:type="dxa" w:w="2200"/>
+            <w:tcBorders>
+              <w:top w:val="single" w:color="BFBFBF" w:sz="4"/>
+              <w:left w:val="single" w:color="BFBFBF" w:sz="4"/>
+              <w:bottom w:val="single" w:color="BFBFBF" w:sz="4"/>
+              <w:right w:val="single" w:color="BFBFBF" w:sz="4"/>
+            </w:tcBorders>
+            <w:shd w:fill="F2E6E8" w:color="auto" w:val="clear"/>
+            <w:tcMar>
+              <w:top w:type="dxa" w:w="80"/>
+              <w:left w:type="dxa" w:w="120"/>
+              <w:bottom w:type="dxa" w:w="80"/>
+              <w:right w:type="dxa" w:w="120"/>
+            </w:tcMar>
+          </w:tcPr>
+          <w:p>
+            <w:r>
+              <w:rPr>
+                <w:b/>
+                <w:bCs/>
+                <w:i w:val="false"/>
+                <w:iCs w:val="false"/>
+                <w:sz w:val="20"/>
+                <w:szCs w:val="20"/>
+              </w:rPr>
+              <w:t xml:space="preserve">What's wrong</w:t>
+            </w:r>
+          </w:p>
+        </w:tc>
+        <w:tc>
+          <w:tcPr>
+            <w:tcW w:type="dxa" w:w="6826"/>
+            <w:tcBorders>
+              <w:top w:val="single" w:color="BFBFBF" w:sz="4"/>
+              <w:left w:val="single" w:color="BFBFBF" w:sz="4"/>
+              <w:bottom w:val="single" w:color="BFBFBF" w:sz="4"/>
+              <w:right w:val="single" w:color="BFBFBF" w:sz="4"/>
+            </w:tcBorders>
+            <w:tcMar>
+              <w:top w:type="dxa" w:w="80"/>
+              <w:left w:type="dxa" w:w="120"/>
+              <w:bottom w:type="dxa" w:w="80"/>
+              <w:right w:type="dxa" w:w="120"/>
+            </w:tcMar>
+          </w:tcPr>
+          <w:p>
+            <w:r>
+              <w:rPr>
+                <w:b w:val="false"/>
+                <w:bCs w:val="false"/>
+                <w:i w:val="false"/>
+                <w:iCs w:val="false"/>
+                <w:sz w:val="20"/>
+                <w:szCs w:val="20"/>
+              </w:rPr>
+              <w:t xml:space="preserve">The export read a merchant's whole history and built one string — on a 2 GB server, a big export can take the API down. The streaming version beside it was unused and skipped rows that shared a timestamp.</w:t>
+            </w:r>
+          </w:p>
+        </w:tc>
+      </w:tr>
+      <w:tr>
+        <w:tc>
+          <w:tcPr>
+            <w:tcW w:type="dxa" w:w="2200"/>
+            <w:tcBorders>
+              <w:top w:val="single" w:color="BFBFBF" w:sz="4"/>
+              <w:left w:val="single" w:color="BFBFBF" w:sz="4"/>
+              <w:bottom w:val="single" w:color="BFBFBF" w:sz="4"/>
+              <w:right w:val="single" w:color="BFBFBF" w:sz="4"/>
+            </w:tcBorders>
+            <w:shd w:fill="F2E6E8" w:color="auto" w:val="clear"/>
+            <w:tcMar>
+              <w:top w:type="dxa" w:w="80"/>
+              <w:left w:type="dxa" w:w="120"/>
+              <w:bottom w:type="dxa" w:w="80"/>
+              <w:right w:type="dxa" w:w="120"/>
+            </w:tcMar>
+          </w:tcPr>
+          <w:p>
+            <w:r>
+              <w:rPr>
+                <w:b/>
+                <w:bCs/>
+                <w:i w:val="false"/>
+                <w:iCs w:val="false"/>
+                <w:sz w:val="20"/>
+                <w:szCs w:val="20"/>
+              </w:rPr>
+              <w:t xml:space="preserve">Fix</w:t>
+            </w:r>
+          </w:p>
+        </w:tc>
+        <w:tc>
+          <w:tcPr>
+            <w:tcW w:type="dxa" w:w="6826"/>
+            <w:tcBorders>
+              <w:top w:val="single" w:color="BFBFBF" w:sz="4"/>
+              <w:left w:val="single" w:color="BFBFBF" w:sz="4"/>
+              <w:bottom w:val="single" w:color="BFBFBF" w:sz="4"/>
+              <w:right w:val="single" w:color="BFBFBF" w:sz="4"/>
+            </w:tcBorders>
+            <w:tcMar>
+              <w:top w:type="dxa" w:w="80"/>
+              <w:left w:type="dxa" w:w="120"/>
+              <w:bottom w:type="dxa" w:w="80"/>
+              <w:right w:type="dxa" w:w="120"/>
+            </w:tcMar>
+          </w:tcPr>
+          <w:p>
+            <w:r>
+              <w:rPr>
+                <w:b w:val="false"/>
+                <w:bCs w:val="false"/>
+                <w:i w:val="false"/>
+                <w:iCs w:val="false"/>
+                <w:sz w:val="20"/>
+                <w:szCs w:val="20"/>
+              </w:rPr>
+              <w:t xml:space="preserve">Stream the CSV page by page, paging on (occurred_at, id).</w:t>
+            </w:r>
+          </w:p>
+        </w:tc>
+      </w:tr>
+      <w:tr>
+        <w:tc>
+          <w:tcPr>
+            <w:tcW w:type="dxa" w:w="2200"/>
+            <w:tcBorders>
+              <w:top w:val="single" w:color="BFBFBF" w:sz="4"/>
+              <w:left w:val="single" w:color="BFBFBF" w:sz="4"/>
+              <w:bottom w:val="single" w:color="BFBFBF" w:sz="4"/>
+              <w:right w:val="single" w:color="BFBFBF" w:sz="4"/>
+            </w:tcBorders>
+            <w:shd w:fill="F2E6E8" w:color="auto" w:val="clear"/>
+            <w:tcMar>
+              <w:top w:type="dxa" w:w="80"/>
+              <w:left w:type="dxa" w:w="120"/>
+              <w:bottom w:type="dxa" w:w="80"/>
+              <w:right w:type="dxa" w:w="120"/>
+            </w:tcMar>
+          </w:tcPr>
+          <w:p>
+            <w:r>
+              <w:rPr>
+                <w:b/>
+                <w:bCs/>
+                <w:i w:val="false"/>
+                <w:iCs w:val="false"/>
+                <w:sz w:val="20"/>
+                <w:szCs w:val="20"/>
+              </w:rPr>
+              <w:t xml:space="preserve">Proof</w:t>
+            </w:r>
+          </w:p>
+        </w:tc>
+        <w:tc>
+          <w:tcPr>
+            <w:tcW w:type="dxa" w:w="6826"/>
+            <w:tcBorders>
+              <w:top w:val="single" w:color="BFBFBF" w:sz="4"/>
+              <w:left w:val="single" w:color="BFBFBF" w:sz="4"/>
+              <w:bottom w:val="single" w:color="BFBFBF" w:sz="4"/>
+              <w:right w:val="single" w:color="BFBFBF" w:sz="4"/>
+            </w:tcBorders>
+            <w:tcMar>
+              <w:top w:type="dxa" w:w="80"/>
+              <w:left w:type="dxa" w:w="120"/>
+              <w:bottom w:type="dxa" w:w="80"/>
+              <w:right w:type="dxa" w:w="120"/>
+            </w:tcMar>
+          </w:tcPr>
+          <w:p>
+            <w:r>
+              <w:rPr>
+                <w:b w:val="false"/>
+                <w:bCs w:val="false"/>
+                <w:i w:val="false"/>
+                <w:iCs w:val="false"/>
+                <w:sz w:val="20"/>
+                <w:szCs w:val="20"/>
+              </w:rPr>
+              <w:t xml:space="preserve">Paging test with five rows on one timestamp and pages of two; route test for the streamed response.</w:t>
             </w:r>
           </w:p>
         </w:tc>
@@ -42030,14 +45511,6 @@
       </w:pPr>
       <w:r>
         <w:t xml:space="preserve">• Posting the card scheme's rounding residue is unfinished (HANDOVER lists it).</w:t>
-      </w:r>
-    </w:p>
-    <w:p>
-      <w:pPr>
-        <w:spacing w:after="80"/>
-      </w:pPr>
-      <w:r>
-        <w:t xml:space="preserve">• streamTransactionsExportCsv (unused) pages by timestamp only and would skip rows sharing a timestamp; the live export doesn't use it.</w:t>
       </w:r>
     </w:p>
     <w:p>

</xml_diff>

<commit_message>
Deploy: website started separately from the API; findings doc covers the dashboard refund flow
Co-Authored-By: Claude Opus 5.5 <noreply@anthropic.com>
Claude-Session: https://claude.ai/code/session_01K8DcCP55saEV5T8kmUUQcb
</commit_message>
<xml_diff>
--- a/docs/audit/FilsPay_Findings.docx
+++ b/docs/audit/FilsPay_Findings.docx
@@ -45306,37 +45306,37 @@
                 <w:sz w:val="20"/>
                 <w:szCs w:val="20"/>
               </w:rPr>
-              <w:t xml:space="preserve">Not done yet</w:t>
-            </w:r>
-          </w:p>
-        </w:tc>
-        <w:tc>
-          <w:tcPr>
-            <w:tcW w:type="dxa" w:w="6826"/>
-            <w:tcBorders>
-              <w:top w:val="single" w:color="BFBFBF" w:sz="4"/>
-              <w:left w:val="single" w:color="BFBFBF" w:sz="4"/>
-              <w:bottom w:val="single" w:color="BFBFBF" w:sz="4"/>
-              <w:right w:val="single" w:color="BFBFBF" w:sz="4"/>
-            </w:tcBorders>
-            <w:tcMar>
-              <w:top w:type="dxa" w:w="80"/>
-              <w:left w:type="dxa" w:w="120"/>
-              <w:bottom w:type="dxa" w:w="80"/>
-              <w:right w:type="dxa" w:w="120"/>
-            </w:tcMar>
-          </w:tcPr>
-          <w:p>
-            <w:r>
-              <w:rPr>
-                <w:b w:val="false"/>
-                <w:bCs w:val="false"/>
-                <w:i w:val="false"/>
-                <w:iCs w:val="false"/>
-                <w:sz w:val="20"/>
-                <w:szCs w:val="20"/>
-              </w:rPr>
-              <w:t xml:space="preserve">The refund button in the merchant dashboard (apps/web RefundDrawer.tsx) is still switched off; the feature works fully through the API, which is what the brief asks for.</w:t>
+              <w:t xml:space="preserve">In the dashboard</w:t>
+            </w:r>
+          </w:p>
+        </w:tc>
+        <w:tc>
+          <w:tcPr>
+            <w:tcW w:type="dxa" w:w="6826"/>
+            <w:tcBorders>
+              <w:top w:val="single" w:color="BFBFBF" w:sz="4"/>
+              <w:left w:val="single" w:color="BFBFBF" w:sz="4"/>
+              <w:bottom w:val="single" w:color="BFBFBF" w:sz="4"/>
+              <w:right w:val="single" w:color="BFBFBF" w:sz="4"/>
+            </w:tcBorders>
+            <w:tcMar>
+              <w:top w:type="dxa" w:w="80"/>
+              <w:left w:type="dxa" w:w="120"/>
+              <w:bottom w:type="dxa" w:w="80"/>
+              <w:right w:type="dxa" w:w="120"/>
+            </w:tcMar>
+          </w:tcPr>
+          <w:p>
+            <w:r>
+              <w:rPr>
+                <w:b w:val="false"/>
+                <w:bCs w:val="false"/>
+                <w:i w:val="false"/>
+                <w:iCs w:val="false"/>
+                <w:sz w:val="20"/>
+                <w:szCs w:val="20"/>
+              </w:rPr>
+              <w:t xml:space="preserve">The parked Refund button (RefundDrawer.tsx) is now wired in and fixed: it can refund a partially refunded payment again, its limit is what is still refundable, and one Idempotency-Key is used per opened form so a double click can't refund twice. The page shows the refunded amount. Tested in a real browser: a 100.000 BD partial then a full refund of a 473.457 BD payment showed partially_refunded then refunded, with fee reversals of 1.800 and 6.722 BD and every ledger group balanced.</w:t>
             </w:r>
           </w:p>
         </w:tc>
@@ -45584,7 +45584,7 @@
         <w:spacing w:after="80"/>
       </w:pPr>
       <w:r>
-        <w:t xml:space="preserve">The whole stack (Postgres, API, settlement daemon, reporting worker) runs on our Dilmune Cloud server "Team KARA" (2 GB RAM, 1 vCPU, 50 GB SSD), installed with one command: bash ops/deploy.sh. It adds swap, generates secrets into a gitignored ops/.env, builds, migrates, seeds only an empty database, and health-checks. Services restart automatically. Load test on our side: 500 concurrent pay → capture → refund flows (1,500 requests) in 5.5 s, all succeeded, every ledger group balanced, API memory about 135 MB.</w:t>
+        <w:t xml:space="preserve">The whole stack (Postgres, API, settlement daemon, reporting worker) runs on our Dilmune Cloud server "Team KARA" (2 GB RAM, 1 vCPU, 50 GB SSD), installed with one command: bash ops/deploy.sh. It adds swap, generates secrets into a gitignored ops/.env, builds, migrates, seeds only an empty database, and health-checks. Services restart automatically. The merchant dashboard website is served on port 80 by nginx, which also forwards /v1 to the API so the browser uses one address. Demo-server choices, written in ops/docker-compose.yml: cookies are not marked Secure because the server is plain HTTP, and the login page shows the one-time code because no email/SMS provider exists — both to be reverted once HTTPS and an OTP sender exist. Load test on our side: 500 concurrent pay → capture → refund flows (1,500 requests) in 5.5 s, all succeeded, every ledger group balanced, API memory about 135 MB.</w:t>
       </w:r>
     </w:p>
     <w:sectPr>

</xml_diff>

<commit_message>
Findings doc: 84 entries; submission and slide generators
Co-Authored-By: Claude Opus 5.5 <noreply@anthropic.com>
Claude-Session: https://claude.ai/code/session_01K8DcCP55saEV5T8kmUUQcb
</commit_message>
<xml_diff>
--- a/docs/audit/FilsPay_Findings.docx
+++ b/docs/audit/FilsPay_Findings.docx
@@ -38,7 +38,7 @@
         <w:spacing w:after="120" w:before="200"/>
       </w:pPr>
       <w:r>
-        <w:t xml:space="preserve">Summary: 79 bugs found and fixed, plus the refunds feature</w:t>
+        <w:t xml:space="preserve">Summary: 84 bugs found and fixed, plus the refunds feature</w:t>
       </w:r>
     </w:p>
     <w:p>
@@ -4331,6 +4331,282 @@
                 <w:sz w:val="20"/>
                 <w:szCs w:val="20"/>
               </w:rPr>
+              <w:t xml:space="preserve">80</w:t>
+            </w:r>
+          </w:p>
+        </w:tc>
+        <w:tc>
+          <w:tcPr>
+            <w:tcW w:type="dxa" w:w="6226"/>
+            <w:tcBorders>
+              <w:top w:val="single" w:color="BFBFBF" w:sz="4"/>
+              <w:left w:val="single" w:color="BFBFBF" w:sz="4"/>
+              <w:bottom w:val="single" w:color="BFBFBF" w:sz="4"/>
+              <w:right w:val="single" w:color="BFBFBF" w:sz="4"/>
+            </w:tcBorders>
+            <w:tcMar>
+              <w:top w:type="dxa" w:w="80"/>
+              <w:left w:type="dxa" w:w="120"/>
+              <w:bottom w:type="dxa" w:w="80"/>
+              <w:right w:type="dxa" w:w="120"/>
+            </w:tcMar>
+          </w:tcPr>
+          <w:p>
+            <w:r>
+              <w:rPr>
+                <w:b w:val="false"/>
+                <w:bCs w:val="false"/>
+                <w:i w:val="false"/>
+                <w:iCs w:val="false"/>
+                <w:sz w:val="20"/>
+                <w:szCs w:val="20"/>
+              </w:rPr>
+              <w:t xml:space="preserve">Reconciliation showed every refund as a gap</w:t>
+            </w:r>
+          </w:p>
+        </w:tc>
+        <w:tc>
+          <w:tcPr>
+            <w:tcW w:type="dxa" w:w="2100"/>
+            <w:tcBorders>
+              <w:top w:val="single" w:color="BFBFBF" w:sz="4"/>
+              <w:left w:val="single" w:color="BFBFBF" w:sz="4"/>
+              <w:bottom w:val="single" w:color="BFBFBF" w:sz="4"/>
+              <w:right w:val="single" w:color="BFBFBF" w:sz="4"/>
+            </w:tcBorders>
+            <w:tcMar>
+              <w:top w:type="dxa" w:w="80"/>
+              <w:left w:type="dxa" w:w="120"/>
+              <w:bottom w:type="dxa" w:w="80"/>
+              <w:right w:type="dxa" w:w="120"/>
+            </w:tcMar>
+          </w:tcPr>
+          <w:p>
+            <w:r>
+              <w:rPr>
+                <w:b w:val="false"/>
+                <w:bCs w:val="false"/>
+                <w:i w:val="false"/>
+                <w:iCs w:val="false"/>
+                <w:sz w:val="20"/>
+                <w:szCs w:val="20"/>
+              </w:rPr>
+              <w:t xml:space="preserve">High</w:t>
+            </w:r>
+          </w:p>
+        </w:tc>
+      </w:tr>
+      <w:tr>
+        <w:tc>
+          <w:tcPr>
+            <w:tcW w:type="dxa" w:w="700"/>
+            <w:tcBorders>
+              <w:top w:val="single" w:color="BFBFBF" w:sz="4"/>
+              <w:left w:val="single" w:color="BFBFBF" w:sz="4"/>
+              <w:bottom w:val="single" w:color="BFBFBF" w:sz="4"/>
+              <w:right w:val="single" w:color="BFBFBF" w:sz="4"/>
+            </w:tcBorders>
+            <w:tcMar>
+              <w:top w:type="dxa" w:w="80"/>
+              <w:left w:type="dxa" w:w="120"/>
+              <w:bottom w:type="dxa" w:w="80"/>
+              <w:right w:type="dxa" w:w="120"/>
+            </w:tcMar>
+          </w:tcPr>
+          <w:p>
+            <w:r>
+              <w:rPr>
+                <w:b w:val="false"/>
+                <w:bCs w:val="false"/>
+                <w:i w:val="false"/>
+                <w:iCs w:val="false"/>
+                <w:sz w:val="20"/>
+                <w:szCs w:val="20"/>
+              </w:rPr>
+              <w:t xml:space="preserve">81</w:t>
+            </w:r>
+          </w:p>
+        </w:tc>
+        <w:tc>
+          <w:tcPr>
+            <w:tcW w:type="dxa" w:w="6226"/>
+            <w:tcBorders>
+              <w:top w:val="single" w:color="BFBFBF" w:sz="4"/>
+              <w:left w:val="single" w:color="BFBFBF" w:sz="4"/>
+              <w:bottom w:val="single" w:color="BFBFBF" w:sz="4"/>
+              <w:right w:val="single" w:color="BFBFBF" w:sz="4"/>
+            </w:tcBorders>
+            <w:tcMar>
+              <w:top w:type="dxa" w:w="80"/>
+              <w:left w:type="dxa" w:w="120"/>
+              <w:bottom w:type="dxa" w:w="80"/>
+              <w:right w:type="dxa" w:w="120"/>
+            </w:tcMar>
+          </w:tcPr>
+          <w:p>
+            <w:r>
+              <w:rPr>
+                <w:b w:val="false"/>
+                <w:bCs w:val="false"/>
+                <w:i w:val="false"/>
+                <w:iCs w:val="false"/>
+                <w:sz w:val="20"/>
+                <w:szCs w:val="20"/>
+              </w:rPr>
+              <w:t xml:space="preserve">Pool of 5 capped payments at ~28 requests/s</w:t>
+            </w:r>
+          </w:p>
+        </w:tc>
+        <w:tc>
+          <w:tcPr>
+            <w:tcW w:type="dxa" w:w="2100"/>
+            <w:tcBorders>
+              <w:top w:val="single" w:color="BFBFBF" w:sz="4"/>
+              <w:left w:val="single" w:color="BFBFBF" w:sz="4"/>
+              <w:bottom w:val="single" w:color="BFBFBF" w:sz="4"/>
+              <w:right w:val="single" w:color="BFBFBF" w:sz="4"/>
+            </w:tcBorders>
+            <w:tcMar>
+              <w:top w:type="dxa" w:w="80"/>
+              <w:left w:type="dxa" w:w="120"/>
+              <w:bottom w:type="dxa" w:w="80"/>
+              <w:right w:type="dxa" w:w="120"/>
+            </w:tcMar>
+          </w:tcPr>
+          <w:p>
+            <w:r>
+              <w:rPr>
+                <w:b w:val="false"/>
+                <w:bCs w:val="false"/>
+                <w:i w:val="false"/>
+                <w:iCs w:val="false"/>
+                <w:sz w:val="20"/>
+                <w:szCs w:val="20"/>
+              </w:rPr>
+              <w:t xml:space="preserve">High</w:t>
+            </w:r>
+          </w:p>
+        </w:tc>
+      </w:tr>
+      <w:tr>
+        <w:tc>
+          <w:tcPr>
+            <w:tcW w:type="dxa" w:w="700"/>
+            <w:tcBorders>
+              <w:top w:val="single" w:color="BFBFBF" w:sz="4"/>
+              <w:left w:val="single" w:color="BFBFBF" w:sz="4"/>
+              <w:bottom w:val="single" w:color="BFBFBF" w:sz="4"/>
+              <w:right w:val="single" w:color="BFBFBF" w:sz="4"/>
+            </w:tcBorders>
+            <w:tcMar>
+              <w:top w:type="dxa" w:w="80"/>
+              <w:left w:type="dxa" w:w="120"/>
+              <w:bottom w:type="dxa" w:w="80"/>
+              <w:right w:type="dxa" w:w="120"/>
+            </w:tcMar>
+          </w:tcPr>
+          <w:p>
+            <w:r>
+              <w:rPr>
+                <w:b w:val="false"/>
+                <w:bCs w:val="false"/>
+                <w:i w:val="false"/>
+                <w:iCs w:val="false"/>
+                <w:sz w:val="20"/>
+                <w:szCs w:val="20"/>
+              </w:rPr>
+              <w:t xml:space="preserve">82</w:t>
+            </w:r>
+          </w:p>
+        </w:tc>
+        <w:tc>
+          <w:tcPr>
+            <w:tcW w:type="dxa" w:w="6226"/>
+            <w:tcBorders>
+              <w:top w:val="single" w:color="BFBFBF" w:sz="4"/>
+              <w:left w:val="single" w:color="BFBFBF" w:sz="4"/>
+              <w:bottom w:val="single" w:color="BFBFBF" w:sz="4"/>
+              <w:right w:val="single" w:color="BFBFBF" w:sz="4"/>
+            </w:tcBorders>
+            <w:tcMar>
+              <w:top w:type="dxa" w:w="80"/>
+              <w:left w:type="dxa" w:w="120"/>
+              <w:bottom w:type="dxa" w:w="80"/>
+              <w:right w:type="dxa" w:w="120"/>
+            </w:tcMar>
+          </w:tcPr>
+          <w:p>
+            <w:r>
+              <w:rPr>
+                <w:b w:val="false"/>
+                <w:bCs w:val="false"/>
+                <w:i w:val="false"/>
+                <w:iCs w:val="false"/>
+                <w:sz w:val="20"/>
+                <w:szCs w:val="20"/>
+              </w:rPr>
+              <w:t xml:space="preserve">Website never deployed; home 404; login code undeliverable</w:t>
+            </w:r>
+          </w:p>
+        </w:tc>
+        <w:tc>
+          <w:tcPr>
+            <w:tcW w:type="dxa" w:w="2100"/>
+            <w:tcBorders>
+              <w:top w:val="single" w:color="BFBFBF" w:sz="4"/>
+              <w:left w:val="single" w:color="BFBFBF" w:sz="4"/>
+              <w:bottom w:val="single" w:color="BFBFBF" w:sz="4"/>
+              <w:right w:val="single" w:color="BFBFBF" w:sz="4"/>
+            </w:tcBorders>
+            <w:tcMar>
+              <w:top w:type="dxa" w:w="80"/>
+              <w:left w:type="dxa" w:w="120"/>
+              <w:bottom w:type="dxa" w:w="80"/>
+              <w:right w:type="dxa" w:w="120"/>
+            </w:tcMar>
+          </w:tcPr>
+          <w:p>
+            <w:r>
+              <w:rPr>
+                <w:b w:val="false"/>
+                <w:bCs w:val="false"/>
+                <w:i w:val="false"/>
+                <w:iCs w:val="false"/>
+                <w:sz w:val="20"/>
+                <w:szCs w:val="20"/>
+              </w:rPr>
+              <w:t xml:space="preserve">High</w:t>
+            </w:r>
+          </w:p>
+        </w:tc>
+      </w:tr>
+      <w:tr>
+        <w:tc>
+          <w:tcPr>
+            <w:tcW w:type="dxa" w:w="700"/>
+            <w:tcBorders>
+              <w:top w:val="single" w:color="BFBFBF" w:sz="4"/>
+              <w:left w:val="single" w:color="BFBFBF" w:sz="4"/>
+              <w:bottom w:val="single" w:color="BFBFBF" w:sz="4"/>
+              <w:right w:val="single" w:color="BFBFBF" w:sz="4"/>
+            </w:tcBorders>
+            <w:tcMar>
+              <w:top w:type="dxa" w:w="80"/>
+              <w:left w:type="dxa" w:w="120"/>
+              <w:bottom w:type="dxa" w:w="80"/>
+              <w:right w:type="dxa" w:w="120"/>
+            </w:tcMar>
+          </w:tcPr>
+          <w:p>
+            <w:r>
+              <w:rPr>
+                <w:b w:val="false"/>
+                <w:bCs w:val="false"/>
+                <w:i w:val="false"/>
+                <w:iCs w:val="false"/>
+                <w:sz w:val="20"/>
+                <w:szCs w:val="20"/>
+              </w:rPr>
               <w:t xml:space="preserve">3</w:t>
             </w:r>
           </w:p>
@@ -7398,6 +7674,190 @@
                 <w:szCs w:val="20"/>
               </w:rPr>
               <w:t xml:space="preserve">KYC upload accepted many files, kept the last</w:t>
+            </w:r>
+          </w:p>
+        </w:tc>
+        <w:tc>
+          <w:tcPr>
+            <w:tcW w:type="dxa" w:w="2100"/>
+            <w:tcBorders>
+              <w:top w:val="single" w:color="BFBFBF" w:sz="4"/>
+              <w:left w:val="single" w:color="BFBFBF" w:sz="4"/>
+              <w:bottom w:val="single" w:color="BFBFBF" w:sz="4"/>
+              <w:right w:val="single" w:color="BFBFBF" w:sz="4"/>
+            </w:tcBorders>
+            <w:tcMar>
+              <w:top w:type="dxa" w:w="80"/>
+              <w:left w:type="dxa" w:w="120"/>
+              <w:bottom w:type="dxa" w:w="80"/>
+              <w:right w:type="dxa" w:w="120"/>
+            </w:tcMar>
+          </w:tcPr>
+          <w:p>
+            <w:r>
+              <w:rPr>
+                <w:b w:val="false"/>
+                <w:bCs w:val="false"/>
+                <w:i w:val="false"/>
+                <w:iCs w:val="false"/>
+                <w:sz w:val="20"/>
+                <w:szCs w:val="20"/>
+              </w:rPr>
+              <w:t xml:space="preserve">Medium</w:t>
+            </w:r>
+          </w:p>
+        </w:tc>
+      </w:tr>
+      <w:tr>
+        <w:tc>
+          <w:tcPr>
+            <w:tcW w:type="dxa" w:w="700"/>
+            <w:tcBorders>
+              <w:top w:val="single" w:color="BFBFBF" w:sz="4"/>
+              <w:left w:val="single" w:color="BFBFBF" w:sz="4"/>
+              <w:bottom w:val="single" w:color="BFBFBF" w:sz="4"/>
+              <w:right w:val="single" w:color="BFBFBF" w:sz="4"/>
+            </w:tcBorders>
+            <w:tcMar>
+              <w:top w:type="dxa" w:w="80"/>
+              <w:left w:type="dxa" w:w="120"/>
+              <w:bottom w:type="dxa" w:w="80"/>
+              <w:right w:type="dxa" w:w="120"/>
+            </w:tcMar>
+          </w:tcPr>
+          <w:p>
+            <w:r>
+              <w:rPr>
+                <w:b w:val="false"/>
+                <w:bCs w:val="false"/>
+                <w:i w:val="false"/>
+                <w:iCs w:val="false"/>
+                <w:sz w:val="20"/>
+                <w:szCs w:val="20"/>
+              </w:rPr>
+              <w:t xml:space="preserve">83</w:t>
+            </w:r>
+          </w:p>
+        </w:tc>
+        <w:tc>
+          <w:tcPr>
+            <w:tcW w:type="dxa" w:w="6226"/>
+            <w:tcBorders>
+              <w:top w:val="single" w:color="BFBFBF" w:sz="4"/>
+              <w:left w:val="single" w:color="BFBFBF" w:sz="4"/>
+              <w:bottom w:val="single" w:color="BFBFBF" w:sz="4"/>
+              <w:right w:val="single" w:color="BFBFBF" w:sz="4"/>
+            </w:tcBorders>
+            <w:tcMar>
+              <w:top w:type="dxa" w:w="80"/>
+              <w:left w:type="dxa" w:w="120"/>
+              <w:bottom w:type="dxa" w:w="80"/>
+              <w:right w:type="dxa" w:w="120"/>
+            </w:tcMar>
+          </w:tcPr>
+          <w:p>
+            <w:r>
+              <w:rPr>
+                <w:b w:val="false"/>
+                <w:bCs w:val="false"/>
+                <w:i w:val="false"/>
+                <w:iCs w:val="false"/>
+                <w:sz w:val="20"/>
+                <w:szCs w:val="20"/>
+              </w:rPr>
+              <w:t xml:space="preserve">AI instruction files told agents to keep the bugs</w:t>
+            </w:r>
+          </w:p>
+        </w:tc>
+        <w:tc>
+          <w:tcPr>
+            <w:tcW w:type="dxa" w:w="2100"/>
+            <w:tcBorders>
+              <w:top w:val="single" w:color="BFBFBF" w:sz="4"/>
+              <w:left w:val="single" w:color="BFBFBF" w:sz="4"/>
+              <w:bottom w:val="single" w:color="BFBFBF" w:sz="4"/>
+              <w:right w:val="single" w:color="BFBFBF" w:sz="4"/>
+            </w:tcBorders>
+            <w:tcMar>
+              <w:top w:type="dxa" w:w="80"/>
+              <w:left w:type="dxa" w:w="120"/>
+              <w:bottom w:type="dxa" w:w="80"/>
+              <w:right w:type="dxa" w:w="120"/>
+            </w:tcMar>
+          </w:tcPr>
+          <w:p>
+            <w:r>
+              <w:rPr>
+                <w:b w:val="false"/>
+                <w:bCs w:val="false"/>
+                <w:i w:val="false"/>
+                <w:iCs w:val="false"/>
+                <w:sz w:val="20"/>
+                <w:szCs w:val="20"/>
+              </w:rPr>
+              <w:t xml:space="preserve">Medium</w:t>
+            </w:r>
+          </w:p>
+        </w:tc>
+      </w:tr>
+      <w:tr>
+        <w:tc>
+          <w:tcPr>
+            <w:tcW w:type="dxa" w:w="700"/>
+            <w:tcBorders>
+              <w:top w:val="single" w:color="BFBFBF" w:sz="4"/>
+              <w:left w:val="single" w:color="BFBFBF" w:sz="4"/>
+              <w:bottom w:val="single" w:color="BFBFBF" w:sz="4"/>
+              <w:right w:val="single" w:color="BFBFBF" w:sz="4"/>
+            </w:tcBorders>
+            <w:tcMar>
+              <w:top w:type="dxa" w:w="80"/>
+              <w:left w:type="dxa" w:w="120"/>
+              <w:bottom w:type="dxa" w:w="80"/>
+              <w:right w:type="dxa" w:w="120"/>
+            </w:tcMar>
+          </w:tcPr>
+          <w:p>
+            <w:r>
+              <w:rPr>
+                <w:b w:val="false"/>
+                <w:bCs w:val="false"/>
+                <w:i w:val="false"/>
+                <w:iCs w:val="false"/>
+                <w:sz w:val="20"/>
+                <w:szCs w:val="20"/>
+              </w:rPr>
+              <w:t xml:space="preserve">84</w:t>
+            </w:r>
+          </w:p>
+        </w:tc>
+        <w:tc>
+          <w:tcPr>
+            <w:tcW w:type="dxa" w:w="6226"/>
+            <w:tcBorders>
+              <w:top w:val="single" w:color="BFBFBF" w:sz="4"/>
+              <w:left w:val="single" w:color="BFBFBF" w:sz="4"/>
+              <w:bottom w:val="single" w:color="BFBFBF" w:sz="4"/>
+              <w:right w:val="single" w:color="BFBFBF" w:sz="4"/>
+            </w:tcBorders>
+            <w:tcMar>
+              <w:top w:type="dxa" w:w="80"/>
+              <w:left w:type="dxa" w:w="120"/>
+              <w:bottom w:type="dxa" w:w="80"/>
+              <w:right w:type="dxa" w:w="120"/>
+            </w:tcMar>
+          </w:tcPr>
+          <w:p>
+            <w:r>
+              <w:rPr>
+                <w:b w:val="false"/>
+                <w:bCs w:val="false"/>
+                <w:i w:val="false"/>
+                <w:iCs w:val="false"/>
+                <w:sz w:val="20"/>
+                <w:szCs w:val="20"/>
+              </w:rPr>
+              <w:t xml:space="preserve">Parked Refund button had three bugs</w:t>
             </w:r>
           </w:p>
         </w:tc>
@@ -44696,6 +45156,2035 @@
                 <w:szCs w:val="20"/>
               </w:rPr>
               <w:t xml:space="preserve">Paging test with five rows on one timestamp and pages of two; route test for the streamed response.</w:t>
+            </w:r>
+          </w:p>
+        </w:tc>
+      </w:tr>
+      <w:tr>
+        <w:tc>
+          <w:tcPr>
+            <w:tcW w:type="dxa" w:w="2200"/>
+            <w:tcBorders>
+              <w:top w:val="single" w:color="BFBFBF" w:sz="4"/>
+              <w:left w:val="single" w:color="BFBFBF" w:sz="4"/>
+              <w:bottom w:val="single" w:color="BFBFBF" w:sz="4"/>
+              <w:right w:val="single" w:color="BFBFBF" w:sz="4"/>
+            </w:tcBorders>
+            <w:shd w:fill="F2E6E8" w:color="auto" w:val="clear"/>
+            <w:tcMar>
+              <w:top w:type="dxa" w:w="80"/>
+              <w:left w:type="dxa" w:w="120"/>
+              <w:bottom w:type="dxa" w:w="80"/>
+              <w:right w:type="dxa" w:w="120"/>
+            </w:tcMar>
+          </w:tcPr>
+          <w:p>
+            <w:r>
+              <w:rPr>
+                <w:b/>
+                <w:bCs/>
+                <w:i w:val="false"/>
+                <w:iCs w:val="false"/>
+                <w:sz w:val="20"/>
+                <w:szCs w:val="20"/>
+              </w:rPr>
+              <w:t xml:space="preserve">Status</w:t>
+            </w:r>
+          </w:p>
+        </w:tc>
+        <w:tc>
+          <w:tcPr>
+            <w:tcW w:type="dxa" w:w="6826"/>
+            <w:tcBorders>
+              <w:top w:val="single" w:color="BFBFBF" w:sz="4"/>
+              <w:left w:val="single" w:color="BFBFBF" w:sz="4"/>
+              <w:bottom w:val="single" w:color="BFBFBF" w:sz="4"/>
+              <w:right w:val="single" w:color="BFBFBF" w:sz="4"/>
+            </w:tcBorders>
+            <w:tcMar>
+              <w:top w:type="dxa" w:w="80"/>
+              <w:left w:type="dxa" w:w="120"/>
+              <w:bottom w:type="dxa" w:w="80"/>
+              <w:right w:type="dxa" w:w="120"/>
+            </w:tcMar>
+          </w:tcPr>
+          <w:p>
+            <w:r>
+              <w:rPr>
+                <w:b w:val="false"/>
+                <w:bCs w:val="false"/>
+                <w:i w:val="false"/>
+                <w:iCs w:val="false"/>
+                <w:sz w:val="20"/>
+                <w:szCs w:val="20"/>
+              </w:rPr>
+              <w:t xml:space="preserve">Fixed and tested (automated tests pass on a real database)</w:t>
+            </w:r>
+          </w:p>
+        </w:tc>
+      </w:tr>
+    </w:tbl>
+    <w:p>
+      <w:pPr>
+        <w:pStyle w:val="Heading1"/>
+        <w:spacing w:before="400"/>
+      </w:pPr>
+      <w:r>
+        <w:t xml:space="preserve">Found while preparing the submission (#80–#84)</w:t>
+      </w:r>
+    </w:p>
+    <w:p>
+      <w:pPr>
+        <w:pStyle w:val="Heading2"/>
+        <w:spacing w:after="120" w:before="300"/>
+      </w:pPr>
+      <w:r>
+        <w:t xml:space="preserve">#80  The reconciliation report showed every refund as an unexplained gap</w:t>
+      </w:r>
+    </w:p>
+    <w:tbl>
+      <w:tblPr>
+        <w:tblW w:type="dxa" w:w="9026"/>
+        <w:tblBorders>
+          <w:top w:val="single" w:color="auto" w:sz="4"/>
+          <w:left w:val="single" w:color="auto" w:sz="4"/>
+          <w:bottom w:val="single" w:color="auto" w:sz="4"/>
+          <w:right w:val="single" w:color="auto" w:sz="4"/>
+          <w:insideH w:val="single" w:color="auto" w:sz="4"/>
+          <w:insideV w:val="single" w:color="auto" w:sz="4"/>
+        </w:tblBorders>
+      </w:tblPr>
+      <w:tblGrid>
+        <w:gridCol w:w="2200"/>
+        <w:gridCol w:w="6826"/>
+      </w:tblGrid>
+      <w:tr>
+        <w:tc>
+          <w:tcPr>
+            <w:tcW w:type="dxa" w:w="2200"/>
+            <w:tcBorders>
+              <w:top w:val="single" w:color="BFBFBF" w:sz="4"/>
+              <w:left w:val="single" w:color="BFBFBF" w:sz="4"/>
+              <w:bottom w:val="single" w:color="BFBFBF" w:sz="4"/>
+              <w:right w:val="single" w:color="BFBFBF" w:sz="4"/>
+            </w:tcBorders>
+            <w:shd w:fill="F2E6E8" w:color="auto" w:val="clear"/>
+            <w:tcMar>
+              <w:top w:type="dxa" w:w="80"/>
+              <w:left w:type="dxa" w:w="120"/>
+              <w:bottom w:type="dxa" w:w="80"/>
+              <w:right w:type="dxa" w:w="120"/>
+            </w:tcMar>
+          </w:tcPr>
+          <w:p>
+            <w:r>
+              <w:rPr>
+                <w:b/>
+                <w:bCs/>
+                <w:i w:val="false"/>
+                <w:iCs w:val="false"/>
+                <w:sz w:val="20"/>
+                <w:szCs w:val="20"/>
+              </w:rPr>
+              <w:t xml:space="preserve">Severity (our estimate)</w:t>
+            </w:r>
+          </w:p>
+        </w:tc>
+        <w:tc>
+          <w:tcPr>
+            <w:tcW w:type="dxa" w:w="6826"/>
+            <w:tcBorders>
+              <w:top w:val="single" w:color="BFBFBF" w:sz="4"/>
+              <w:left w:val="single" w:color="BFBFBF" w:sz="4"/>
+              <w:bottom w:val="single" w:color="BFBFBF" w:sz="4"/>
+              <w:right w:val="single" w:color="BFBFBF" w:sz="4"/>
+            </w:tcBorders>
+            <w:tcMar>
+              <w:top w:type="dxa" w:w="80"/>
+              <w:left w:type="dxa" w:w="120"/>
+              <w:bottom w:type="dxa" w:w="80"/>
+              <w:right w:type="dxa" w:w="120"/>
+            </w:tcMar>
+          </w:tcPr>
+          <w:p>
+            <w:r>
+              <w:rPr>
+                <w:b w:val="false"/>
+                <w:bCs w:val="false"/>
+                <w:i w:val="false"/>
+                <w:iCs w:val="false"/>
+                <w:sz w:val="20"/>
+                <w:szCs w:val="20"/>
+              </w:rPr>
+              <w:t xml:space="preserve">High — money / reporting</w:t>
+            </w:r>
+          </w:p>
+        </w:tc>
+      </w:tr>
+      <w:tr>
+        <w:tc>
+          <w:tcPr>
+            <w:tcW w:type="dxa" w:w="2200"/>
+            <w:tcBorders>
+              <w:top w:val="single" w:color="BFBFBF" w:sz="4"/>
+              <w:left w:val="single" w:color="BFBFBF" w:sz="4"/>
+              <w:bottom w:val="single" w:color="BFBFBF" w:sz="4"/>
+              <w:right w:val="single" w:color="BFBFBF" w:sz="4"/>
+            </w:tcBorders>
+            <w:shd w:fill="F2E6E8" w:color="auto" w:val="clear"/>
+            <w:tcMar>
+              <w:top w:type="dxa" w:w="80"/>
+              <w:left w:type="dxa" w:w="120"/>
+              <w:bottom w:type="dxa" w:w="80"/>
+              <w:right w:type="dxa" w:w="120"/>
+            </w:tcMar>
+          </w:tcPr>
+          <w:p>
+            <w:r>
+              <w:rPr>
+                <w:b/>
+                <w:bCs/>
+                <w:i w:val="false"/>
+                <w:iCs w:val="false"/>
+                <w:sz w:val="20"/>
+                <w:szCs w:val="20"/>
+              </w:rPr>
+              <w:t xml:space="preserve">Where</w:t>
+            </w:r>
+          </w:p>
+        </w:tc>
+        <w:tc>
+          <w:tcPr>
+            <w:tcW w:type="dxa" w:w="6826"/>
+            <w:tcBorders>
+              <w:top w:val="single" w:color="BFBFBF" w:sz="4"/>
+              <w:left w:val="single" w:color="BFBFBF" w:sz="4"/>
+              <w:bottom w:val="single" w:color="BFBFBF" w:sz="4"/>
+              <w:right w:val="single" w:color="BFBFBF" w:sz="4"/>
+            </w:tcBorders>
+            <w:tcMar>
+              <w:top w:type="dxa" w:w="80"/>
+              <w:left w:type="dxa" w:w="120"/>
+              <w:bottom w:type="dxa" w:w="80"/>
+              <w:right w:type="dxa" w:w="120"/>
+            </w:tcMar>
+          </w:tcPr>
+          <w:p>
+            <w:r>
+              <w:rPr>
+                <w:b w:val="false"/>
+                <w:bCs w:val="false"/>
+                <w:i w:val="false"/>
+                <w:iCs w:val="false"/>
+                <w:sz w:val="20"/>
+                <w:szCs w:val="20"/>
+              </w:rPr>
+              <w:t xml:space="preserve">apps/api/src/settlement/query.ts — getReconciliationReport()</w:t>
+            </w:r>
+          </w:p>
+        </w:tc>
+      </w:tr>
+      <w:tr>
+        <w:tc>
+          <w:tcPr>
+            <w:tcW w:type="dxa" w:w="2200"/>
+            <w:tcBorders>
+              <w:top w:val="single" w:color="BFBFBF" w:sz="4"/>
+              <w:left w:val="single" w:color="BFBFBF" w:sz="4"/>
+              <w:bottom w:val="single" w:color="BFBFBF" w:sz="4"/>
+              <w:right w:val="single" w:color="BFBFBF" w:sz="4"/>
+            </w:tcBorders>
+            <w:shd w:fill="F2E6E8" w:color="auto" w:val="clear"/>
+            <w:tcMar>
+              <w:top w:type="dxa" w:w="80"/>
+              <w:left w:type="dxa" w:w="120"/>
+              <w:bottom w:type="dxa" w:w="80"/>
+              <w:right w:type="dxa" w:w="120"/>
+            </w:tcMar>
+          </w:tcPr>
+          <w:p>
+            <w:r>
+              <w:rPr>
+                <w:b/>
+                <w:bCs/>
+                <w:i w:val="false"/>
+                <w:iCs w:val="false"/>
+                <w:sz w:val="20"/>
+                <w:szCs w:val="20"/>
+              </w:rPr>
+              <w:t xml:space="preserve">What's wrong</w:t>
+            </w:r>
+          </w:p>
+        </w:tc>
+        <w:tc>
+          <w:tcPr>
+            <w:tcW w:type="dxa" w:w="6826"/>
+            <w:tcBorders>
+              <w:top w:val="single" w:color="BFBFBF" w:sz="4"/>
+              <w:left w:val="single" w:color="BFBFBF" w:sz="4"/>
+              <w:bottom w:val="single" w:color="BFBFBF" w:sz="4"/>
+              <w:right w:val="single" w:color="BFBFBF" w:sz="4"/>
+            </w:tcBorders>
+            <w:tcMar>
+              <w:top w:type="dxa" w:w="80"/>
+              <w:left w:type="dxa" w:w="120"/>
+              <w:bottom w:type="dxa" w:w="80"/>
+              <w:right w:type="dxa" w:w="120"/>
+            </w:tcMar>
+          </w:tcPr>
+          <w:p>
+            <w:r>
+              <w:rPr>
+                <w:b w:val="false"/>
+                <w:bCs w:val="false"/>
+                <w:i w:val="false"/>
+                <w:iCs w:val="false"/>
+                <w:sz w:val="20"/>
+                <w:szCs w:val="20"/>
+              </w:rPr>
+              <w:t xml:space="preserve">The report's comment says refunds are counted in the pending figure; they weren't. After one partial and one full refund the dashboard showed Gap: -464.935 BHD.</w:t>
+            </w:r>
+          </w:p>
+        </w:tc>
+      </w:tr>
+      <w:tr>
+        <w:tc>
+          <w:tcPr>
+            <w:tcW w:type="dxa" w:w="2200"/>
+            <w:tcBorders>
+              <w:top w:val="single" w:color="BFBFBF" w:sz="4"/>
+              <w:left w:val="single" w:color="BFBFBF" w:sz="4"/>
+              <w:bottom w:val="single" w:color="BFBFBF" w:sz="4"/>
+              <w:right w:val="single" w:color="BFBFBF" w:sz="4"/>
+            </w:tcBorders>
+            <w:shd w:fill="F2E6E8" w:color="auto" w:val="clear"/>
+            <w:tcMar>
+              <w:top w:type="dxa" w:w="80"/>
+              <w:left w:type="dxa" w:w="120"/>
+              <w:bottom w:type="dxa" w:w="80"/>
+              <w:right w:type="dxa" w:w="120"/>
+            </w:tcMar>
+          </w:tcPr>
+          <w:p>
+            <w:r>
+              <w:rPr>
+                <w:b/>
+                <w:bCs/>
+                <w:i w:val="false"/>
+                <w:iCs w:val="false"/>
+                <w:sz w:val="20"/>
+                <w:szCs w:val="20"/>
+              </w:rPr>
+              <w:t xml:space="preserve">Fix</w:t>
+            </w:r>
+          </w:p>
+        </w:tc>
+        <w:tc>
+          <w:tcPr>
+            <w:tcW w:type="dxa" w:w="6826"/>
+            <w:tcBorders>
+              <w:top w:val="single" w:color="BFBFBF" w:sz="4"/>
+              <w:left w:val="single" w:color="BFBFBF" w:sz="4"/>
+              <w:bottom w:val="single" w:color="BFBFBF" w:sz="4"/>
+              <w:right w:val="single" w:color="BFBFBF" w:sz="4"/>
+            </w:tcBorders>
+            <w:tcMar>
+              <w:top w:type="dxa" w:w="80"/>
+              <w:left w:type="dxa" w:w="120"/>
+              <w:bottom w:type="dxa" w:w="80"/>
+              <w:right w:type="dxa" w:w="120"/>
+            </w:tcMar>
+          </w:tcPr>
+          <w:p>
+            <w:r>
+              <w:rPr>
+                <w:b w:val="false"/>
+                <w:bCs w:val="false"/>
+                <w:i w:val="false"/>
+                <w:iCs w:val="false"/>
+                <w:sz w:val="20"/>
+                <w:szCs w:val="20"/>
+              </w:rPr>
+              <w:t xml:space="preserve">Unbatched refunds (amount minus fee reversed) count as pending, with the opposite sign to captures.</w:t>
+            </w:r>
+          </w:p>
+        </w:tc>
+      </w:tr>
+      <w:tr>
+        <w:tc>
+          <w:tcPr>
+            <w:tcW w:type="dxa" w:w="2200"/>
+            <w:tcBorders>
+              <w:top w:val="single" w:color="BFBFBF" w:sz="4"/>
+              <w:left w:val="single" w:color="BFBFBF" w:sz="4"/>
+              <w:bottom w:val="single" w:color="BFBFBF" w:sz="4"/>
+              <w:right w:val="single" w:color="BFBFBF" w:sz="4"/>
+            </w:tcBorders>
+            <w:shd w:fill="F2E6E8" w:color="auto" w:val="clear"/>
+            <w:tcMar>
+              <w:top w:type="dxa" w:w="80"/>
+              <w:left w:type="dxa" w:w="120"/>
+              <w:bottom w:type="dxa" w:w="80"/>
+              <w:right w:type="dxa" w:w="120"/>
+            </w:tcMar>
+          </w:tcPr>
+          <w:p>
+            <w:r>
+              <w:rPr>
+                <w:b/>
+                <w:bCs/>
+                <w:i w:val="false"/>
+                <w:iCs w:val="false"/>
+                <w:sz w:val="20"/>
+                <w:szCs w:val="20"/>
+              </w:rPr>
+              <w:t xml:space="preserve">Proof</w:t>
+            </w:r>
+          </w:p>
+        </w:tc>
+        <w:tc>
+          <w:tcPr>
+            <w:tcW w:type="dxa" w:w="6826"/>
+            <w:tcBorders>
+              <w:top w:val="single" w:color="BFBFBF" w:sz="4"/>
+              <w:left w:val="single" w:color="BFBFBF" w:sz="4"/>
+              <w:bottom w:val="single" w:color="BFBFBF" w:sz="4"/>
+              <w:right w:val="single" w:color="BFBFBF" w:sz="4"/>
+            </w:tcBorders>
+            <w:tcMar>
+              <w:top w:type="dxa" w:w="80"/>
+              <w:left w:type="dxa" w:w="120"/>
+              <w:bottom w:type="dxa" w:w="80"/>
+              <w:right w:type="dxa" w:w="120"/>
+            </w:tcMar>
+          </w:tcPr>
+          <w:p>
+            <w:r>
+              <w:rPr>
+                <w:b w:val="false"/>
+                <w:bCs w:val="false"/>
+                <w:i w:val="false"/>
+                <w:iCs w:val="false"/>
+                <w:sz w:val="20"/>
+                <w:szCs w:val="20"/>
+              </w:rPr>
+              <w:t xml:space="preserve">Settlement test: capture, refund part, reconcile: gap 0 (old code: -3,900 fils). Seen live in the dashboard before and after.</w:t>
+            </w:r>
+          </w:p>
+        </w:tc>
+      </w:tr>
+      <w:tr>
+        <w:tc>
+          <w:tcPr>
+            <w:tcW w:type="dxa" w:w="2200"/>
+            <w:tcBorders>
+              <w:top w:val="single" w:color="BFBFBF" w:sz="4"/>
+              <w:left w:val="single" w:color="BFBFBF" w:sz="4"/>
+              <w:bottom w:val="single" w:color="BFBFBF" w:sz="4"/>
+              <w:right w:val="single" w:color="BFBFBF" w:sz="4"/>
+            </w:tcBorders>
+            <w:shd w:fill="F2E6E8" w:color="auto" w:val="clear"/>
+            <w:tcMar>
+              <w:top w:type="dxa" w:w="80"/>
+              <w:left w:type="dxa" w:w="120"/>
+              <w:bottom w:type="dxa" w:w="80"/>
+              <w:right w:type="dxa" w:w="120"/>
+            </w:tcMar>
+          </w:tcPr>
+          <w:p>
+            <w:r>
+              <w:rPr>
+                <w:b/>
+                <w:bCs/>
+                <w:i w:val="false"/>
+                <w:iCs w:val="false"/>
+                <w:sz w:val="20"/>
+                <w:szCs w:val="20"/>
+              </w:rPr>
+              <w:t xml:space="preserve">Status</w:t>
+            </w:r>
+          </w:p>
+        </w:tc>
+        <w:tc>
+          <w:tcPr>
+            <w:tcW w:type="dxa" w:w="6826"/>
+            <w:tcBorders>
+              <w:top w:val="single" w:color="BFBFBF" w:sz="4"/>
+              <w:left w:val="single" w:color="BFBFBF" w:sz="4"/>
+              <w:bottom w:val="single" w:color="BFBFBF" w:sz="4"/>
+              <w:right w:val="single" w:color="BFBFBF" w:sz="4"/>
+            </w:tcBorders>
+            <w:tcMar>
+              <w:top w:type="dxa" w:w="80"/>
+              <w:left w:type="dxa" w:w="120"/>
+              <w:bottom w:type="dxa" w:w="80"/>
+              <w:right w:type="dxa" w:w="120"/>
+            </w:tcMar>
+          </w:tcPr>
+          <w:p>
+            <w:r>
+              <w:rPr>
+                <w:b w:val="false"/>
+                <w:bCs w:val="false"/>
+                <w:i w:val="false"/>
+                <w:iCs w:val="false"/>
+                <w:sz w:val="20"/>
+                <w:szCs w:val="20"/>
+              </w:rPr>
+              <w:t xml:space="preserve">Fixed and tested (automated tests pass on a real database)</w:t>
+            </w:r>
+          </w:p>
+        </w:tc>
+      </w:tr>
+    </w:tbl>
+    <w:p>
+      <w:pPr>
+        <w:pStyle w:val="Heading2"/>
+        <w:spacing w:after="120" w:before="300"/>
+      </w:pPr>
+      <w:r>
+        <w:t xml:space="preserve">#81  Five database connections capped payments at about 28 requests a second</w:t>
+      </w:r>
+    </w:p>
+    <w:tbl>
+      <w:tblPr>
+        <w:tblW w:type="dxa" w:w="9026"/>
+        <w:tblBorders>
+          <w:top w:val="single" w:color="auto" w:sz="4"/>
+          <w:left w:val="single" w:color="auto" w:sz="4"/>
+          <w:bottom w:val="single" w:color="auto" w:sz="4"/>
+          <w:right w:val="single" w:color="auto" w:sz="4"/>
+          <w:insideH w:val="single" w:color="auto" w:sz="4"/>
+          <w:insideV w:val="single" w:color="auto" w:sz="4"/>
+        </w:tblBorders>
+      </w:tblPr>
+      <w:tblGrid>
+        <w:gridCol w:w="2200"/>
+        <w:gridCol w:w="6826"/>
+      </w:tblGrid>
+      <w:tr>
+        <w:tc>
+          <w:tcPr>
+            <w:tcW w:type="dxa" w:w="2200"/>
+            <w:tcBorders>
+              <w:top w:val="single" w:color="BFBFBF" w:sz="4"/>
+              <w:left w:val="single" w:color="BFBFBF" w:sz="4"/>
+              <w:bottom w:val="single" w:color="BFBFBF" w:sz="4"/>
+              <w:right w:val="single" w:color="BFBFBF" w:sz="4"/>
+            </w:tcBorders>
+            <w:shd w:fill="F2E6E8" w:color="auto" w:val="clear"/>
+            <w:tcMar>
+              <w:top w:type="dxa" w:w="80"/>
+              <w:left w:type="dxa" w:w="120"/>
+              <w:bottom w:type="dxa" w:w="80"/>
+              <w:right w:type="dxa" w:w="120"/>
+            </w:tcMar>
+          </w:tcPr>
+          <w:p>
+            <w:r>
+              <w:rPr>
+                <w:b/>
+                <w:bCs/>
+                <w:i w:val="false"/>
+                <w:iCs w:val="false"/>
+                <w:sz w:val="20"/>
+                <w:szCs w:val="20"/>
+              </w:rPr>
+              <w:t xml:space="preserve">Severity (our estimate)</w:t>
+            </w:r>
+          </w:p>
+        </w:tc>
+        <w:tc>
+          <w:tcPr>
+            <w:tcW w:type="dxa" w:w="6826"/>
+            <w:tcBorders>
+              <w:top w:val="single" w:color="BFBFBF" w:sz="4"/>
+              <w:left w:val="single" w:color="BFBFBF" w:sz="4"/>
+              <w:bottom w:val="single" w:color="BFBFBF" w:sz="4"/>
+              <w:right w:val="single" w:color="BFBFBF" w:sz="4"/>
+            </w:tcBorders>
+            <w:tcMar>
+              <w:top w:type="dxa" w:w="80"/>
+              <w:left w:type="dxa" w:w="120"/>
+              <w:bottom w:type="dxa" w:w="80"/>
+              <w:right w:type="dxa" w:w="120"/>
+            </w:tcMar>
+          </w:tcPr>
+          <w:p>
+            <w:r>
+              <w:rPr>
+                <w:b w:val="false"/>
+                <w:bCs w:val="false"/>
+                <w:i w:val="false"/>
+                <w:iCs w:val="false"/>
+                <w:sz w:val="20"/>
+                <w:szCs w:val="20"/>
+              </w:rPr>
+              <w:t xml:space="preserve">High — stays up</w:t>
+            </w:r>
+          </w:p>
+        </w:tc>
+      </w:tr>
+      <w:tr>
+        <w:tc>
+          <w:tcPr>
+            <w:tcW w:type="dxa" w:w="2200"/>
+            <w:tcBorders>
+              <w:top w:val="single" w:color="BFBFBF" w:sz="4"/>
+              <w:left w:val="single" w:color="BFBFBF" w:sz="4"/>
+              <w:bottom w:val="single" w:color="BFBFBF" w:sz="4"/>
+              <w:right w:val="single" w:color="BFBFBF" w:sz="4"/>
+            </w:tcBorders>
+            <w:shd w:fill="F2E6E8" w:color="auto" w:val="clear"/>
+            <w:tcMar>
+              <w:top w:type="dxa" w:w="80"/>
+              <w:left w:type="dxa" w:w="120"/>
+              <w:bottom w:type="dxa" w:w="80"/>
+              <w:right w:type="dxa" w:w="120"/>
+            </w:tcMar>
+          </w:tcPr>
+          <w:p>
+            <w:r>
+              <w:rPr>
+                <w:b/>
+                <w:bCs/>
+                <w:i w:val="false"/>
+                <w:iCs w:val="false"/>
+                <w:sz w:val="20"/>
+                <w:szCs w:val="20"/>
+              </w:rPr>
+              <w:t xml:space="preserve">Where</w:t>
+            </w:r>
+          </w:p>
+        </w:tc>
+        <w:tc>
+          <w:tcPr>
+            <w:tcW w:type="dxa" w:w="6826"/>
+            <w:tcBorders>
+              <w:top w:val="single" w:color="BFBFBF" w:sz="4"/>
+              <w:left w:val="single" w:color="BFBFBF" w:sz="4"/>
+              <w:bottom w:val="single" w:color="BFBFBF" w:sz="4"/>
+              <w:right w:val="single" w:color="BFBFBF" w:sz="4"/>
+            </w:tcBorders>
+            <w:tcMar>
+              <w:top w:type="dxa" w:w="80"/>
+              <w:left w:type="dxa" w:w="120"/>
+              <w:bottom w:type="dxa" w:w="80"/>
+              <w:right w:type="dxa" w:w="120"/>
+            </w:tcMar>
+          </w:tcPr>
+          <w:p>
+            <w:r>
+              <w:rPr>
+                <w:b w:val="false"/>
+                <w:bCs w:val="false"/>
+                <w:i w:val="false"/>
+                <w:iCs w:val="false"/>
+                <w:sz w:val="20"/>
+                <w:szCs w:val="20"/>
+              </w:rPr>
+              <w:t xml:space="preserve">apps/api/src/config.ts (PG_POOL_MAX default 5), ops/docker-compose.yml</w:t>
+            </w:r>
+          </w:p>
+        </w:tc>
+      </w:tr>
+      <w:tr>
+        <w:tc>
+          <w:tcPr>
+            <w:tcW w:type="dxa" w:w="2200"/>
+            <w:tcBorders>
+              <w:top w:val="single" w:color="BFBFBF" w:sz="4"/>
+              <w:left w:val="single" w:color="BFBFBF" w:sz="4"/>
+              <w:bottom w:val="single" w:color="BFBFBF" w:sz="4"/>
+              <w:right w:val="single" w:color="BFBFBF" w:sz="4"/>
+            </w:tcBorders>
+            <w:shd w:fill="F2E6E8" w:color="auto" w:val="clear"/>
+            <w:tcMar>
+              <w:top w:type="dxa" w:w="80"/>
+              <w:left w:type="dxa" w:w="120"/>
+              <w:bottom w:type="dxa" w:w="80"/>
+              <w:right w:type="dxa" w:w="120"/>
+            </w:tcMar>
+          </w:tcPr>
+          <w:p>
+            <w:r>
+              <w:rPr>
+                <w:b/>
+                <w:bCs/>
+                <w:i w:val="false"/>
+                <w:iCs w:val="false"/>
+                <w:sz w:val="20"/>
+                <w:szCs w:val="20"/>
+              </w:rPr>
+              <w:t xml:space="preserve">What's wrong</w:t>
+            </w:r>
+          </w:p>
+        </w:tc>
+        <w:tc>
+          <w:tcPr>
+            <w:tcW w:type="dxa" w:w="6826"/>
+            <w:tcBorders>
+              <w:top w:val="single" w:color="BFBFBF" w:sz="4"/>
+              <w:left w:val="single" w:color="BFBFBF" w:sz="4"/>
+              <w:bottom w:val="single" w:color="BFBFBF" w:sz="4"/>
+              <w:right w:val="single" w:color="BFBFBF" w:sz="4"/>
+            </w:tcBorders>
+            <w:tcMar>
+              <w:top w:type="dxa" w:w="80"/>
+              <w:left w:type="dxa" w:w="120"/>
+              <w:bottom w:type="dxa" w:w="80"/>
+              <w:right w:type="dxa" w:w="120"/>
+            </w:tcMar>
+          </w:tcPr>
+          <w:p>
+            <w:r>
+              <w:rPr>
+                <w:b w:val="false"/>
+                <w:bCs w:val="false"/>
+                <w:i w:val="false"/>
+                <w:iCs w:val="false"/>
+                <w:sz w:val="20"/>
+                <w:szCs w:val="20"/>
+              </w:rPr>
+              <w:t xml:space="preserve">Each authorize/capture/refund holds a connection while the acquirer answers (100–400 ms). With 5 connections, 100 users saw p95 8.2 s.</w:t>
+            </w:r>
+          </w:p>
+        </w:tc>
+      </w:tr>
+      <w:tr>
+        <w:tc>
+          <w:tcPr>
+            <w:tcW w:type="dxa" w:w="2200"/>
+            <w:tcBorders>
+              <w:top w:val="single" w:color="BFBFBF" w:sz="4"/>
+              <w:left w:val="single" w:color="BFBFBF" w:sz="4"/>
+              <w:bottom w:val="single" w:color="BFBFBF" w:sz="4"/>
+              <w:right w:val="single" w:color="BFBFBF" w:sz="4"/>
+            </w:tcBorders>
+            <w:shd w:fill="F2E6E8" w:color="auto" w:val="clear"/>
+            <w:tcMar>
+              <w:top w:type="dxa" w:w="80"/>
+              <w:left w:type="dxa" w:w="120"/>
+              <w:bottom w:type="dxa" w:w="80"/>
+              <w:right w:type="dxa" w:w="120"/>
+            </w:tcMar>
+          </w:tcPr>
+          <w:p>
+            <w:r>
+              <w:rPr>
+                <w:b/>
+                <w:bCs/>
+                <w:i w:val="false"/>
+                <w:iCs w:val="false"/>
+                <w:sz w:val="20"/>
+                <w:szCs w:val="20"/>
+              </w:rPr>
+              <w:t xml:space="preserve">Fix</w:t>
+            </w:r>
+          </w:p>
+        </w:tc>
+        <w:tc>
+          <w:tcPr>
+            <w:tcW w:type="dxa" w:w="6826"/>
+            <w:tcBorders>
+              <w:top w:val="single" w:color="BFBFBF" w:sz="4"/>
+              <w:left w:val="single" w:color="BFBFBF" w:sz="4"/>
+              <w:bottom w:val="single" w:color="BFBFBF" w:sz="4"/>
+              <w:right w:val="single" w:color="BFBFBF" w:sz="4"/>
+            </w:tcBorders>
+            <w:tcMar>
+              <w:top w:type="dxa" w:w="80"/>
+              <w:left w:type="dxa" w:w="120"/>
+              <w:bottom w:type="dxa" w:w="80"/>
+              <w:right w:type="dxa" w:w="120"/>
+            </w:tcMar>
+          </w:tcPr>
+          <w:p>
+            <w:r>
+              <w:rPr>
+                <w:b w:val="false"/>
+                <w:bCs w:val="false"/>
+                <w:i w:val="false"/>
+                <w:iCs w:val="false"/>
+                <w:sz w:val="20"/>
+                <w:szCs w:val="20"/>
+              </w:rPr>
+              <w:t xml:space="preserve">Pool of 20 in production, plus load shedding: past 100 requests in progress the API answers 503 with Retry-After instead of queueing.</w:t>
+            </w:r>
+          </w:p>
+        </w:tc>
+      </w:tr>
+      <w:tr>
+        <w:tc>
+          <w:tcPr>
+            <w:tcW w:type="dxa" w:w="2200"/>
+            <w:tcBorders>
+              <w:top w:val="single" w:color="BFBFBF" w:sz="4"/>
+              <w:left w:val="single" w:color="BFBFBF" w:sz="4"/>
+              <w:bottom w:val="single" w:color="BFBFBF" w:sz="4"/>
+              <w:right w:val="single" w:color="BFBFBF" w:sz="4"/>
+            </w:tcBorders>
+            <w:shd w:fill="F2E6E8" w:color="auto" w:val="clear"/>
+            <w:tcMar>
+              <w:top w:type="dxa" w:w="80"/>
+              <w:left w:type="dxa" w:w="120"/>
+              <w:bottom w:type="dxa" w:w="80"/>
+              <w:right w:type="dxa" w:w="120"/>
+            </w:tcMar>
+          </w:tcPr>
+          <w:p>
+            <w:r>
+              <w:rPr>
+                <w:b/>
+                <w:bCs/>
+                <w:i w:val="false"/>
+                <w:iCs w:val="false"/>
+                <w:sz w:val="20"/>
+                <w:szCs w:val="20"/>
+              </w:rPr>
+              <w:t xml:space="preserve">Proof</w:t>
+            </w:r>
+          </w:p>
+        </w:tc>
+        <w:tc>
+          <w:tcPr>
+            <w:tcW w:type="dxa" w:w="6826"/>
+            <w:tcBorders>
+              <w:top w:val="single" w:color="BFBFBF" w:sz="4"/>
+              <w:left w:val="single" w:color="BFBFBF" w:sz="4"/>
+              <w:bottom w:val="single" w:color="BFBFBF" w:sz="4"/>
+              <w:right w:val="single" w:color="BFBFBF" w:sz="4"/>
+            </w:tcBorders>
+            <w:tcMar>
+              <w:top w:type="dxa" w:w="80"/>
+              <w:left w:type="dxa" w:w="120"/>
+              <w:bottom w:type="dxa" w:w="80"/>
+              <w:right w:type="dxa" w:w="120"/>
+            </w:tcMar>
+          </w:tcPr>
+          <w:p>
+            <w:r>
+              <w:rPr>
+                <w:b w:val="false"/>
+                <w:bCs w:val="false"/>
+                <w:i w:val="false"/>
+                <w:iCs w:val="false"/>
+                <w:sz w:val="20"/>
+                <w:szCs w:val="20"/>
+              </w:rPr>
+              <w:t xml:space="preserve">Load tests (docs/perf/team-kara-loadtest-2026-10-30.md): 28 to 104 requests/s; at 400 users p95 8.9 s without shedding vs 1.4 s with it. Shedding has its own test.</w:t>
+            </w:r>
+          </w:p>
+        </w:tc>
+      </w:tr>
+      <w:tr>
+        <w:tc>
+          <w:tcPr>
+            <w:tcW w:type="dxa" w:w="2200"/>
+            <w:tcBorders>
+              <w:top w:val="single" w:color="BFBFBF" w:sz="4"/>
+              <w:left w:val="single" w:color="BFBFBF" w:sz="4"/>
+              <w:bottom w:val="single" w:color="BFBFBF" w:sz="4"/>
+              <w:right w:val="single" w:color="BFBFBF" w:sz="4"/>
+            </w:tcBorders>
+            <w:shd w:fill="F2E6E8" w:color="auto" w:val="clear"/>
+            <w:tcMar>
+              <w:top w:type="dxa" w:w="80"/>
+              <w:left w:type="dxa" w:w="120"/>
+              <w:bottom w:type="dxa" w:w="80"/>
+              <w:right w:type="dxa" w:w="120"/>
+            </w:tcMar>
+          </w:tcPr>
+          <w:p>
+            <w:r>
+              <w:rPr>
+                <w:b/>
+                <w:bCs/>
+                <w:i w:val="false"/>
+                <w:iCs w:val="false"/>
+                <w:sz w:val="20"/>
+                <w:szCs w:val="20"/>
+              </w:rPr>
+              <w:t xml:space="preserve">Status</w:t>
+            </w:r>
+          </w:p>
+        </w:tc>
+        <w:tc>
+          <w:tcPr>
+            <w:tcW w:type="dxa" w:w="6826"/>
+            <w:tcBorders>
+              <w:top w:val="single" w:color="BFBFBF" w:sz="4"/>
+              <w:left w:val="single" w:color="BFBFBF" w:sz="4"/>
+              <w:bottom w:val="single" w:color="BFBFBF" w:sz="4"/>
+              <w:right w:val="single" w:color="BFBFBF" w:sz="4"/>
+            </w:tcBorders>
+            <w:tcMar>
+              <w:top w:type="dxa" w:w="80"/>
+              <w:left w:type="dxa" w:w="120"/>
+              <w:bottom w:type="dxa" w:w="80"/>
+              <w:right w:type="dxa" w:w="120"/>
+            </w:tcMar>
+          </w:tcPr>
+          <w:p>
+            <w:r>
+              <w:rPr>
+                <w:b w:val="false"/>
+                <w:bCs w:val="false"/>
+                <w:i w:val="false"/>
+                <w:iCs w:val="false"/>
+                <w:sz w:val="20"/>
+                <w:szCs w:val="20"/>
+              </w:rPr>
+              <w:t xml:space="preserve">Fixed and tested (automated tests pass on a real database)</w:t>
+            </w:r>
+          </w:p>
+        </w:tc>
+      </w:tr>
+    </w:tbl>
+    <w:p>
+      <w:pPr>
+        <w:pStyle w:val="Heading2"/>
+        <w:spacing w:after="120" w:before="300"/>
+      </w:pPr>
+      <w:r>
+        <w:t xml:space="preserve">#82  Nobody could use the website: never deployed, home page 404, login code undeliverable</w:t>
+      </w:r>
+    </w:p>
+    <w:tbl>
+      <w:tblPr>
+        <w:tblW w:type="dxa" w:w="9026"/>
+        <w:tblBorders>
+          <w:top w:val="single" w:color="auto" w:sz="4"/>
+          <w:left w:val="single" w:color="auto" w:sz="4"/>
+          <w:bottom w:val="single" w:color="auto" w:sz="4"/>
+          <w:right w:val="single" w:color="auto" w:sz="4"/>
+          <w:insideH w:val="single" w:color="auto" w:sz="4"/>
+          <w:insideV w:val="single" w:color="auto" w:sz="4"/>
+        </w:tblBorders>
+      </w:tblPr>
+      <w:tblGrid>
+        <w:gridCol w:w="2200"/>
+        <w:gridCol w:w="6826"/>
+      </w:tblGrid>
+      <w:tr>
+        <w:tc>
+          <w:tcPr>
+            <w:tcW w:type="dxa" w:w="2200"/>
+            <w:tcBorders>
+              <w:top w:val="single" w:color="BFBFBF" w:sz="4"/>
+              <w:left w:val="single" w:color="BFBFBF" w:sz="4"/>
+              <w:bottom w:val="single" w:color="BFBFBF" w:sz="4"/>
+              <w:right w:val="single" w:color="BFBFBF" w:sz="4"/>
+            </w:tcBorders>
+            <w:shd w:fill="F2E6E8" w:color="auto" w:val="clear"/>
+            <w:tcMar>
+              <w:top w:type="dxa" w:w="80"/>
+              <w:left w:type="dxa" w:w="120"/>
+              <w:bottom w:type="dxa" w:w="80"/>
+              <w:right w:type="dxa" w:w="120"/>
+            </w:tcMar>
+          </w:tcPr>
+          <w:p>
+            <w:r>
+              <w:rPr>
+                <w:b/>
+                <w:bCs/>
+                <w:i w:val="false"/>
+                <w:iCs w:val="false"/>
+                <w:sz w:val="20"/>
+                <w:szCs w:val="20"/>
+              </w:rPr>
+              <w:t xml:space="preserve">Severity (our estimate)</w:t>
+            </w:r>
+          </w:p>
+        </w:tc>
+        <w:tc>
+          <w:tcPr>
+            <w:tcW w:type="dxa" w:w="6826"/>
+            <w:tcBorders>
+              <w:top w:val="single" w:color="BFBFBF" w:sz="4"/>
+              <w:left w:val="single" w:color="BFBFBF" w:sz="4"/>
+              <w:bottom w:val="single" w:color="BFBFBF" w:sz="4"/>
+              <w:right w:val="single" w:color="BFBFBF" w:sz="4"/>
+            </w:tcBorders>
+            <w:tcMar>
+              <w:top w:type="dxa" w:w="80"/>
+              <w:left w:type="dxa" w:w="120"/>
+              <w:bottom w:type="dxa" w:w="80"/>
+              <w:right w:type="dxa" w:w="120"/>
+            </w:tcMar>
+          </w:tcPr>
+          <w:p>
+            <w:r>
+              <w:rPr>
+                <w:b w:val="false"/>
+                <w:bCs w:val="false"/>
+                <w:i w:val="false"/>
+                <w:iCs w:val="false"/>
+                <w:sz w:val="20"/>
+                <w:szCs w:val="20"/>
+              </w:rPr>
+              <w:t xml:space="preserve">High — deployment</w:t>
+            </w:r>
+          </w:p>
+        </w:tc>
+      </w:tr>
+      <w:tr>
+        <w:tc>
+          <w:tcPr>
+            <w:tcW w:type="dxa" w:w="2200"/>
+            <w:tcBorders>
+              <w:top w:val="single" w:color="BFBFBF" w:sz="4"/>
+              <w:left w:val="single" w:color="BFBFBF" w:sz="4"/>
+              <w:bottom w:val="single" w:color="BFBFBF" w:sz="4"/>
+              <w:right w:val="single" w:color="BFBFBF" w:sz="4"/>
+            </w:tcBorders>
+            <w:shd w:fill="F2E6E8" w:color="auto" w:val="clear"/>
+            <w:tcMar>
+              <w:top w:type="dxa" w:w="80"/>
+              <w:left w:type="dxa" w:w="120"/>
+              <w:bottom w:type="dxa" w:w="80"/>
+              <w:right w:type="dxa" w:w="120"/>
+            </w:tcMar>
+          </w:tcPr>
+          <w:p>
+            <w:r>
+              <w:rPr>
+                <w:b/>
+                <w:bCs/>
+                <w:i w:val="false"/>
+                <w:iCs w:val="false"/>
+                <w:sz w:val="20"/>
+                <w:szCs w:val="20"/>
+              </w:rPr>
+              <w:t xml:space="preserve">Where</w:t>
+            </w:r>
+          </w:p>
+        </w:tc>
+        <w:tc>
+          <w:tcPr>
+            <w:tcW w:type="dxa" w:w="6826"/>
+            <w:tcBorders>
+              <w:top w:val="single" w:color="BFBFBF" w:sz="4"/>
+              <w:left w:val="single" w:color="BFBFBF" w:sz="4"/>
+              <w:bottom w:val="single" w:color="BFBFBF" w:sz="4"/>
+              <w:right w:val="single" w:color="BFBFBF" w:sz="4"/>
+            </w:tcBorders>
+            <w:tcMar>
+              <w:top w:type="dxa" w:w="80"/>
+              <w:left w:type="dxa" w:w="120"/>
+              <w:bottom w:type="dxa" w:w="80"/>
+              <w:right w:type="dxa" w:w="120"/>
+            </w:tcMar>
+          </w:tcPr>
+          <w:p>
+            <w:r>
+              <w:rPr>
+                <w:b w:val="false"/>
+                <w:bCs w:val="false"/>
+                <w:i w:val="false"/>
+                <w:iCs w:val="false"/>
+                <w:sz w:val="20"/>
+                <w:szCs w:val="20"/>
+              </w:rPr>
+              <w:t xml:space="preserve">ops/ (no web service), apps/web/src/router.tsx, auth/notifier.ts</w:t>
+            </w:r>
+          </w:p>
+        </w:tc>
+      </w:tr>
+      <w:tr>
+        <w:tc>
+          <w:tcPr>
+            <w:tcW w:type="dxa" w:w="2200"/>
+            <w:tcBorders>
+              <w:top w:val="single" w:color="BFBFBF" w:sz="4"/>
+              <w:left w:val="single" w:color="BFBFBF" w:sz="4"/>
+              <w:bottom w:val="single" w:color="BFBFBF" w:sz="4"/>
+              <w:right w:val="single" w:color="BFBFBF" w:sz="4"/>
+            </w:tcBorders>
+            <w:shd w:fill="F2E6E8" w:color="auto" w:val="clear"/>
+            <w:tcMar>
+              <w:top w:type="dxa" w:w="80"/>
+              <w:left w:type="dxa" w:w="120"/>
+              <w:bottom w:type="dxa" w:w="80"/>
+              <w:right w:type="dxa" w:w="120"/>
+            </w:tcMar>
+          </w:tcPr>
+          <w:p>
+            <w:r>
+              <w:rPr>
+                <w:b/>
+                <w:bCs/>
+                <w:i w:val="false"/>
+                <w:iCs w:val="false"/>
+                <w:sz w:val="20"/>
+                <w:szCs w:val="20"/>
+              </w:rPr>
+              <w:t xml:space="preserve">What's wrong</w:t>
+            </w:r>
+          </w:p>
+        </w:tc>
+        <w:tc>
+          <w:tcPr>
+            <w:tcW w:type="dxa" w:w="6826"/>
+            <w:tcBorders>
+              <w:top w:val="single" w:color="BFBFBF" w:sz="4"/>
+              <w:left w:val="single" w:color="BFBFBF" w:sz="4"/>
+              <w:bottom w:val="single" w:color="BFBFBF" w:sz="4"/>
+              <w:right w:val="single" w:color="BFBFBF" w:sz="4"/>
+            </w:tcBorders>
+            <w:tcMar>
+              <w:top w:type="dxa" w:w="80"/>
+              <w:left w:type="dxa" w:w="120"/>
+              <w:bottom w:type="dxa" w:w="80"/>
+              <w:right w:type="dxa" w:w="120"/>
+            </w:tcMar>
+          </w:tcPr>
+          <w:p>
+            <w:r>
+              <w:rPr>
+                <w:b w:val="false"/>
+                <w:bCs w:val="false"/>
+                <w:i w:val="false"/>
+                <w:iCs w:val="false"/>
+                <w:sz w:val="20"/>
+                <w:szCs w:val="20"/>
+              </w:rPr>
+              <w:t xml:space="preserve">Only the API was ever deployed; the dashboard's home page had no route; in production the one-time login code is only written to a log, with no email/SMS sender.</w:t>
+            </w:r>
+          </w:p>
+        </w:tc>
+      </w:tr>
+      <w:tr>
+        <w:tc>
+          <w:tcPr>
+            <w:tcW w:type="dxa" w:w="2200"/>
+            <w:tcBorders>
+              <w:top w:val="single" w:color="BFBFBF" w:sz="4"/>
+              <w:left w:val="single" w:color="BFBFBF" w:sz="4"/>
+              <w:bottom w:val="single" w:color="BFBFBF" w:sz="4"/>
+              <w:right w:val="single" w:color="BFBFBF" w:sz="4"/>
+            </w:tcBorders>
+            <w:shd w:fill="F2E6E8" w:color="auto" w:val="clear"/>
+            <w:tcMar>
+              <w:top w:type="dxa" w:w="80"/>
+              <w:left w:type="dxa" w:w="120"/>
+              <w:bottom w:type="dxa" w:w="80"/>
+              <w:right w:type="dxa" w:w="120"/>
+            </w:tcMar>
+          </w:tcPr>
+          <w:p>
+            <w:r>
+              <w:rPr>
+                <w:b/>
+                <w:bCs/>
+                <w:i w:val="false"/>
+                <w:iCs w:val="false"/>
+                <w:sz w:val="20"/>
+                <w:szCs w:val="20"/>
+              </w:rPr>
+              <w:t xml:space="preserve">Fix</w:t>
+            </w:r>
+          </w:p>
+        </w:tc>
+        <w:tc>
+          <w:tcPr>
+            <w:tcW w:type="dxa" w:w="6826"/>
+            <w:tcBorders>
+              <w:top w:val="single" w:color="BFBFBF" w:sz="4"/>
+              <w:left w:val="single" w:color="BFBFBF" w:sz="4"/>
+              <w:bottom w:val="single" w:color="BFBFBF" w:sz="4"/>
+              <w:right w:val="single" w:color="BFBFBF" w:sz="4"/>
+            </w:tcBorders>
+            <w:tcMar>
+              <w:top w:type="dxa" w:w="80"/>
+              <w:left w:type="dxa" w:w="120"/>
+              <w:bottom w:type="dxa" w:w="80"/>
+              <w:right w:type="dxa" w:w="120"/>
+            </w:tcMar>
+          </w:tcPr>
+          <w:p>
+            <w:r>
+              <w:rPr>
+                <w:b w:val="false"/>
+                <w:bCs w:val="false"/>
+                <w:i w:val="false"/>
+                <w:iCs w:val="false"/>
+                <w:sz w:val="20"/>
+                <w:szCs w:val="20"/>
+              </w:rPr>
+              <w:t xml:space="preserve">nginx container serving the dashboard (port 80) and admin console (8080) and forwarding /v1 to the API; root redirects to the dashboard; on this demo server the code is shown on the login page (documented decision).</w:t>
+            </w:r>
+          </w:p>
+        </w:tc>
+      </w:tr>
+      <w:tr>
+        <w:tc>
+          <w:tcPr>
+            <w:tcW w:type="dxa" w:w="2200"/>
+            <w:tcBorders>
+              <w:top w:val="single" w:color="BFBFBF" w:sz="4"/>
+              <w:left w:val="single" w:color="BFBFBF" w:sz="4"/>
+              <w:bottom w:val="single" w:color="BFBFBF" w:sz="4"/>
+              <w:right w:val="single" w:color="BFBFBF" w:sz="4"/>
+            </w:tcBorders>
+            <w:shd w:fill="F2E6E8" w:color="auto" w:val="clear"/>
+            <w:tcMar>
+              <w:top w:type="dxa" w:w="80"/>
+              <w:left w:type="dxa" w:w="120"/>
+              <w:bottom w:type="dxa" w:w="80"/>
+              <w:right w:type="dxa" w:w="120"/>
+            </w:tcMar>
+          </w:tcPr>
+          <w:p>
+            <w:r>
+              <w:rPr>
+                <w:b/>
+                <w:bCs/>
+                <w:i w:val="false"/>
+                <w:iCs w:val="false"/>
+                <w:sz w:val="20"/>
+                <w:szCs w:val="20"/>
+              </w:rPr>
+              <w:t xml:space="preserve">Proof</w:t>
+            </w:r>
+          </w:p>
+        </w:tc>
+        <w:tc>
+          <w:tcPr>
+            <w:tcW w:type="dxa" w:w="6826"/>
+            <w:tcBorders>
+              <w:top w:val="single" w:color="BFBFBF" w:sz="4"/>
+              <w:left w:val="single" w:color="BFBFBF" w:sz="4"/>
+              <w:bottom w:val="single" w:color="BFBFBF" w:sz="4"/>
+              <w:right w:val="single" w:color="BFBFBF" w:sz="4"/>
+            </w:tcBorders>
+            <w:tcMar>
+              <w:top w:type="dxa" w:w="80"/>
+              <w:left w:type="dxa" w:w="120"/>
+              <w:bottom w:type="dxa" w:w="80"/>
+              <w:right w:type="dxa" w:w="120"/>
+            </w:tcMar>
+          </w:tcPr>
+          <w:p>
+            <w:r>
+              <w:rPr>
+                <w:b w:val="false"/>
+                <w:bCs w:val="false"/>
+                <w:i w:val="false"/>
+                <w:iCs w:val="false"/>
+                <w:sz w:val="20"/>
+                <w:szCs w:val="20"/>
+              </w:rPr>
+              <w:t xml:space="preserve">Browser run of login + partial and full refund; screenshots in the submission.</w:t>
+            </w:r>
+          </w:p>
+        </w:tc>
+      </w:tr>
+      <w:tr>
+        <w:tc>
+          <w:tcPr>
+            <w:tcW w:type="dxa" w:w="2200"/>
+            <w:tcBorders>
+              <w:top w:val="single" w:color="BFBFBF" w:sz="4"/>
+              <w:left w:val="single" w:color="BFBFBF" w:sz="4"/>
+              <w:bottom w:val="single" w:color="BFBFBF" w:sz="4"/>
+              <w:right w:val="single" w:color="BFBFBF" w:sz="4"/>
+            </w:tcBorders>
+            <w:shd w:fill="F2E6E8" w:color="auto" w:val="clear"/>
+            <w:tcMar>
+              <w:top w:type="dxa" w:w="80"/>
+              <w:left w:type="dxa" w:w="120"/>
+              <w:bottom w:type="dxa" w:w="80"/>
+              <w:right w:type="dxa" w:w="120"/>
+            </w:tcMar>
+          </w:tcPr>
+          <w:p>
+            <w:r>
+              <w:rPr>
+                <w:b/>
+                <w:bCs/>
+                <w:i w:val="false"/>
+                <w:iCs w:val="false"/>
+                <w:sz w:val="20"/>
+                <w:szCs w:val="20"/>
+              </w:rPr>
+              <w:t xml:space="preserve">Status</w:t>
+            </w:r>
+          </w:p>
+        </w:tc>
+        <w:tc>
+          <w:tcPr>
+            <w:tcW w:type="dxa" w:w="6826"/>
+            <w:tcBorders>
+              <w:top w:val="single" w:color="BFBFBF" w:sz="4"/>
+              <w:left w:val="single" w:color="BFBFBF" w:sz="4"/>
+              <w:bottom w:val="single" w:color="BFBFBF" w:sz="4"/>
+              <w:right w:val="single" w:color="BFBFBF" w:sz="4"/>
+            </w:tcBorders>
+            <w:tcMar>
+              <w:top w:type="dxa" w:w="80"/>
+              <w:left w:type="dxa" w:w="120"/>
+              <w:bottom w:type="dxa" w:w="80"/>
+              <w:right w:type="dxa" w:w="120"/>
+            </w:tcMar>
+          </w:tcPr>
+          <w:p>
+            <w:r>
+              <w:rPr>
+                <w:b w:val="false"/>
+                <w:bCs w:val="false"/>
+                <w:i w:val="false"/>
+                <w:iCs w:val="false"/>
+                <w:sz w:val="20"/>
+                <w:szCs w:val="20"/>
+              </w:rPr>
+              <w:t xml:space="preserve">Fixed and tested (automated tests pass on a real database)</w:t>
+            </w:r>
+          </w:p>
+        </w:tc>
+      </w:tr>
+    </w:tbl>
+    <w:p>
+      <w:pPr>
+        <w:pStyle w:val="Heading2"/>
+        <w:spacing w:after="120" w:before="300"/>
+      </w:pPr>
+      <w:r>
+        <w:t xml:space="preserve">#83  The repo's AI instruction files told agents to keep the bugs</w:t>
+      </w:r>
+    </w:p>
+    <w:tbl>
+      <w:tblPr>
+        <w:tblW w:type="dxa" w:w="9026"/>
+        <w:tblBorders>
+          <w:top w:val="single" w:color="auto" w:sz="4"/>
+          <w:left w:val="single" w:color="auto" w:sz="4"/>
+          <w:bottom w:val="single" w:color="auto" w:sz="4"/>
+          <w:right w:val="single" w:color="auto" w:sz="4"/>
+          <w:insideH w:val="single" w:color="auto" w:sz="4"/>
+          <w:insideV w:val="single" w:color="auto" w:sz="4"/>
+        </w:tblBorders>
+      </w:tblPr>
+      <w:tblGrid>
+        <w:gridCol w:w="2200"/>
+        <w:gridCol w:w="6826"/>
+      </w:tblGrid>
+      <w:tr>
+        <w:tc>
+          <w:tcPr>
+            <w:tcW w:type="dxa" w:w="2200"/>
+            <w:tcBorders>
+              <w:top w:val="single" w:color="BFBFBF" w:sz="4"/>
+              <w:left w:val="single" w:color="BFBFBF" w:sz="4"/>
+              <w:bottom w:val="single" w:color="BFBFBF" w:sz="4"/>
+              <w:right w:val="single" w:color="BFBFBF" w:sz="4"/>
+            </w:tcBorders>
+            <w:shd w:fill="F2E6E8" w:color="auto" w:val="clear"/>
+            <w:tcMar>
+              <w:top w:type="dxa" w:w="80"/>
+              <w:left w:type="dxa" w:w="120"/>
+              <w:bottom w:type="dxa" w:w="80"/>
+              <w:right w:type="dxa" w:w="120"/>
+            </w:tcMar>
+          </w:tcPr>
+          <w:p>
+            <w:r>
+              <w:rPr>
+                <w:b/>
+                <w:bCs/>
+                <w:i w:val="false"/>
+                <w:iCs w:val="false"/>
+                <w:sz w:val="20"/>
+                <w:szCs w:val="20"/>
+              </w:rPr>
+              <w:t xml:space="preserve">Severity (our estimate)</w:t>
+            </w:r>
+          </w:p>
+        </w:tc>
+        <w:tc>
+          <w:tcPr>
+            <w:tcW w:type="dxa" w:w="6826"/>
+            <w:tcBorders>
+              <w:top w:val="single" w:color="BFBFBF" w:sz="4"/>
+              <w:left w:val="single" w:color="BFBFBF" w:sz="4"/>
+              <w:bottom w:val="single" w:color="BFBFBF" w:sz="4"/>
+              <w:right w:val="single" w:color="BFBFBF" w:sz="4"/>
+            </w:tcBorders>
+            <w:tcMar>
+              <w:top w:type="dxa" w:w="80"/>
+              <w:left w:type="dxa" w:w="120"/>
+              <w:bottom w:type="dxa" w:w="80"/>
+              <w:right w:type="dxa" w:w="120"/>
+            </w:tcMar>
+          </w:tcPr>
+          <w:p>
+            <w:r>
+              <w:rPr>
+                <w:b w:val="false"/>
+                <w:bCs w:val="false"/>
+                <w:i w:val="false"/>
+                <w:iCs w:val="false"/>
+                <w:sz w:val="20"/>
+                <w:szCs w:val="20"/>
+              </w:rPr>
+              <w:t xml:space="preserve">Medium — process / security</w:t>
+            </w:r>
+          </w:p>
+        </w:tc>
+      </w:tr>
+      <w:tr>
+        <w:tc>
+          <w:tcPr>
+            <w:tcW w:type="dxa" w:w="2200"/>
+            <w:tcBorders>
+              <w:top w:val="single" w:color="BFBFBF" w:sz="4"/>
+              <w:left w:val="single" w:color="BFBFBF" w:sz="4"/>
+              <w:bottom w:val="single" w:color="BFBFBF" w:sz="4"/>
+              <w:right w:val="single" w:color="BFBFBF" w:sz="4"/>
+            </w:tcBorders>
+            <w:shd w:fill="F2E6E8" w:color="auto" w:val="clear"/>
+            <w:tcMar>
+              <w:top w:type="dxa" w:w="80"/>
+              <w:left w:type="dxa" w:w="120"/>
+              <w:bottom w:type="dxa" w:w="80"/>
+              <w:right w:type="dxa" w:w="120"/>
+            </w:tcMar>
+          </w:tcPr>
+          <w:p>
+            <w:r>
+              <w:rPr>
+                <w:b/>
+                <w:bCs/>
+                <w:i w:val="false"/>
+                <w:iCs w:val="false"/>
+                <w:sz w:val="20"/>
+                <w:szCs w:val="20"/>
+              </w:rPr>
+              <w:t xml:space="preserve">Where</w:t>
+            </w:r>
+          </w:p>
+        </w:tc>
+        <w:tc>
+          <w:tcPr>
+            <w:tcW w:type="dxa" w:w="6826"/>
+            <w:tcBorders>
+              <w:top w:val="single" w:color="BFBFBF" w:sz="4"/>
+              <w:left w:val="single" w:color="BFBFBF" w:sz="4"/>
+              <w:bottom w:val="single" w:color="BFBFBF" w:sz="4"/>
+              <w:right w:val="single" w:color="BFBFBF" w:sz="4"/>
+            </w:tcBorders>
+            <w:tcMar>
+              <w:top w:type="dxa" w:w="80"/>
+              <w:left w:type="dxa" w:w="120"/>
+              <w:bottom w:type="dxa" w:w="80"/>
+              <w:right w:type="dxa" w:w="120"/>
+            </w:tcMar>
+          </w:tcPr>
+          <w:p>
+            <w:r>
+              <w:rPr>
+                <w:b w:val="false"/>
+                <w:bCs w:val="false"/>
+                <w:i w:val="false"/>
+                <w:iCs w:val="false"/>
+                <w:sz w:val="20"/>
+                <w:szCs w:val="20"/>
+              </w:rPr>
+              <w:t xml:space="preserve">CLAUDE.md, AGENTS.md, .cursorrules</w:t>
+            </w:r>
+          </w:p>
+        </w:tc>
+      </w:tr>
+      <w:tr>
+        <w:tc>
+          <w:tcPr>
+            <w:tcW w:type="dxa" w:w="2200"/>
+            <w:tcBorders>
+              <w:top w:val="single" w:color="BFBFBF" w:sz="4"/>
+              <w:left w:val="single" w:color="BFBFBF" w:sz="4"/>
+              <w:bottom w:val="single" w:color="BFBFBF" w:sz="4"/>
+              <w:right w:val="single" w:color="BFBFBF" w:sz="4"/>
+            </w:tcBorders>
+            <w:shd w:fill="F2E6E8" w:color="auto" w:val="clear"/>
+            <w:tcMar>
+              <w:top w:type="dxa" w:w="80"/>
+              <w:left w:type="dxa" w:w="120"/>
+              <w:bottom w:type="dxa" w:w="80"/>
+              <w:right w:type="dxa" w:w="120"/>
+            </w:tcMar>
+          </w:tcPr>
+          <w:p>
+            <w:r>
+              <w:rPr>
+                <w:b/>
+                <w:bCs/>
+                <w:i w:val="false"/>
+                <w:iCs w:val="false"/>
+                <w:sz w:val="20"/>
+                <w:szCs w:val="20"/>
+              </w:rPr>
+              <w:t xml:space="preserve">What's wrong</w:t>
+            </w:r>
+          </w:p>
+        </w:tc>
+        <w:tc>
+          <w:tcPr>
+            <w:tcW w:type="dxa" w:w="6826"/>
+            <w:tcBorders>
+              <w:top w:val="single" w:color="BFBFBF" w:sz="4"/>
+              <w:left w:val="single" w:color="BFBFBF" w:sz="4"/>
+              <w:bottom w:val="single" w:color="BFBFBF" w:sz="4"/>
+              <w:right w:val="single" w:color="BFBFBF" w:sz="4"/>
+            </w:tcBorders>
+            <w:tcMar>
+              <w:top w:type="dxa" w:w="80"/>
+              <w:left w:type="dxa" w:w="120"/>
+              <w:bottom w:type="dxa" w:w="80"/>
+              <w:right w:type="dxa" w:w="120"/>
+            </w:tcMar>
+          </w:tcPr>
+          <w:p>
+            <w:r>
+              <w:rPr>
+                <w:b w:val="false"/>
+                <w:bCs w:val="false"/>
+                <w:i w:val="false"/>
+                <w:iCs w:val="false"/>
+                <w:sz w:val="20"/>
+                <w:szCs w:val="20"/>
+              </w:rPr>
+              <w:t xml:space="preserve">They state money is cents, settlement days are UTC, Math.random is fine for OTPs, float32 is fine, refunds must stay 501 and tests must never change. Each rule hides a real finding.</w:t>
+            </w:r>
+          </w:p>
+        </w:tc>
+      </w:tr>
+      <w:tr>
+        <w:tc>
+          <w:tcPr>
+            <w:tcW w:type="dxa" w:w="2200"/>
+            <w:tcBorders>
+              <w:top w:val="single" w:color="BFBFBF" w:sz="4"/>
+              <w:left w:val="single" w:color="BFBFBF" w:sz="4"/>
+              <w:bottom w:val="single" w:color="BFBFBF" w:sz="4"/>
+              <w:right w:val="single" w:color="BFBFBF" w:sz="4"/>
+            </w:tcBorders>
+            <w:shd w:fill="F2E6E8" w:color="auto" w:val="clear"/>
+            <w:tcMar>
+              <w:top w:type="dxa" w:w="80"/>
+              <w:left w:type="dxa" w:w="120"/>
+              <w:bottom w:type="dxa" w:w="80"/>
+              <w:right w:type="dxa" w:w="120"/>
+            </w:tcMar>
+          </w:tcPr>
+          <w:p>
+            <w:r>
+              <w:rPr>
+                <w:b/>
+                <w:bCs/>
+                <w:i w:val="false"/>
+                <w:iCs w:val="false"/>
+                <w:sz w:val="20"/>
+                <w:szCs w:val="20"/>
+              </w:rPr>
+              <w:t xml:space="preserve">Fix</w:t>
+            </w:r>
+          </w:p>
+        </w:tc>
+        <w:tc>
+          <w:tcPr>
+            <w:tcW w:type="dxa" w:w="6826"/>
+            <w:tcBorders>
+              <w:top w:val="single" w:color="BFBFBF" w:sz="4"/>
+              <w:left w:val="single" w:color="BFBFBF" w:sz="4"/>
+              <w:bottom w:val="single" w:color="BFBFBF" w:sz="4"/>
+              <w:right w:val="single" w:color="BFBFBF" w:sz="4"/>
+            </w:tcBorders>
+            <w:tcMar>
+              <w:top w:type="dxa" w:w="80"/>
+              <w:left w:type="dxa" w:w="120"/>
+              <w:bottom w:type="dxa" w:w="80"/>
+              <w:right w:type="dxa" w:w="120"/>
+            </w:tcMar>
+          </w:tcPr>
+          <w:p>
+            <w:r>
+              <w:rPr>
+                <w:b w:val="false"/>
+                <w:bCs w:val="false"/>
+                <w:i w:val="false"/>
+                <w:iCs w:val="false"/>
+                <w:sz w:val="20"/>
+                <w:szCs w:val="20"/>
+              </w:rPr>
+              <w:t xml:space="preserve">Replaced with rules we verified; every false rule and the bug it hid is listed in docs/audit/ai-instructions-review.md.</w:t>
+            </w:r>
+          </w:p>
+        </w:tc>
+      </w:tr>
+      <w:tr>
+        <w:tc>
+          <w:tcPr>
+            <w:tcW w:type="dxa" w:w="2200"/>
+            <w:tcBorders>
+              <w:top w:val="single" w:color="BFBFBF" w:sz="4"/>
+              <w:left w:val="single" w:color="BFBFBF" w:sz="4"/>
+              <w:bottom w:val="single" w:color="BFBFBF" w:sz="4"/>
+              <w:right w:val="single" w:color="BFBFBF" w:sz="4"/>
+            </w:tcBorders>
+            <w:shd w:fill="F2E6E8" w:color="auto" w:val="clear"/>
+            <w:tcMar>
+              <w:top w:type="dxa" w:w="80"/>
+              <w:left w:type="dxa" w:w="120"/>
+              <w:bottom w:type="dxa" w:w="80"/>
+              <w:right w:type="dxa" w:w="120"/>
+            </w:tcMar>
+          </w:tcPr>
+          <w:p>
+            <w:r>
+              <w:rPr>
+                <w:b/>
+                <w:bCs/>
+                <w:i w:val="false"/>
+                <w:iCs w:val="false"/>
+                <w:sz w:val="20"/>
+                <w:szCs w:val="20"/>
+              </w:rPr>
+              <w:t xml:space="preserve">Proof</w:t>
+            </w:r>
+          </w:p>
+        </w:tc>
+        <w:tc>
+          <w:tcPr>
+            <w:tcW w:type="dxa" w:w="6826"/>
+            <w:tcBorders>
+              <w:top w:val="single" w:color="BFBFBF" w:sz="4"/>
+              <w:left w:val="single" w:color="BFBFBF" w:sz="4"/>
+              <w:bottom w:val="single" w:color="BFBFBF" w:sz="4"/>
+              <w:right w:val="single" w:color="BFBFBF" w:sz="4"/>
+            </w:tcBorders>
+            <w:tcMar>
+              <w:top w:type="dxa" w:w="80"/>
+              <w:left w:type="dxa" w:w="120"/>
+              <w:bottom w:type="dxa" w:w="80"/>
+              <w:right w:type="dxa" w:w="120"/>
+            </w:tcMar>
+          </w:tcPr>
+          <w:p>
+            <w:r>
+              <w:rPr>
+                <w:b w:val="false"/>
+                <w:bCs w:val="false"/>
+                <w:i w:val="false"/>
+                <w:iCs w:val="false"/>
+                <w:sz w:val="20"/>
+                <w:szCs w:val="20"/>
+              </w:rPr>
+              <w:t xml:space="preserve">Each rule checked against code, migrations and HANDOVER.md.</w:t>
+            </w:r>
+          </w:p>
+        </w:tc>
+      </w:tr>
+      <w:tr>
+        <w:tc>
+          <w:tcPr>
+            <w:tcW w:type="dxa" w:w="2200"/>
+            <w:tcBorders>
+              <w:top w:val="single" w:color="BFBFBF" w:sz="4"/>
+              <w:left w:val="single" w:color="BFBFBF" w:sz="4"/>
+              <w:bottom w:val="single" w:color="BFBFBF" w:sz="4"/>
+              <w:right w:val="single" w:color="BFBFBF" w:sz="4"/>
+            </w:tcBorders>
+            <w:shd w:fill="F2E6E8" w:color="auto" w:val="clear"/>
+            <w:tcMar>
+              <w:top w:type="dxa" w:w="80"/>
+              <w:left w:type="dxa" w:w="120"/>
+              <w:bottom w:type="dxa" w:w="80"/>
+              <w:right w:type="dxa" w:w="120"/>
+            </w:tcMar>
+          </w:tcPr>
+          <w:p>
+            <w:r>
+              <w:rPr>
+                <w:b/>
+                <w:bCs/>
+                <w:i w:val="false"/>
+                <w:iCs w:val="false"/>
+                <w:sz w:val="20"/>
+                <w:szCs w:val="20"/>
+              </w:rPr>
+              <w:t xml:space="preserve">Status</w:t>
+            </w:r>
+          </w:p>
+        </w:tc>
+        <w:tc>
+          <w:tcPr>
+            <w:tcW w:type="dxa" w:w="6826"/>
+            <w:tcBorders>
+              <w:top w:val="single" w:color="BFBFBF" w:sz="4"/>
+              <w:left w:val="single" w:color="BFBFBF" w:sz="4"/>
+              <w:bottom w:val="single" w:color="BFBFBF" w:sz="4"/>
+              <w:right w:val="single" w:color="BFBFBF" w:sz="4"/>
+            </w:tcBorders>
+            <w:tcMar>
+              <w:top w:type="dxa" w:w="80"/>
+              <w:left w:type="dxa" w:w="120"/>
+              <w:bottom w:type="dxa" w:w="80"/>
+              <w:right w:type="dxa" w:w="120"/>
+            </w:tcMar>
+          </w:tcPr>
+          <w:p>
+            <w:r>
+              <w:rPr>
+                <w:b w:val="false"/>
+                <w:bCs w:val="false"/>
+                <w:i w:val="false"/>
+                <w:iCs w:val="false"/>
+                <w:sz w:val="20"/>
+                <w:szCs w:val="20"/>
+              </w:rPr>
+              <w:t xml:space="preserve">Fixed and tested (automated tests pass on a real database)</w:t>
+            </w:r>
+          </w:p>
+        </w:tc>
+      </w:tr>
+    </w:tbl>
+    <w:p>
+      <w:pPr>
+        <w:pStyle w:val="Heading2"/>
+        <w:spacing w:after="120" w:before="300"/>
+      </w:pPr>
+      <w:r>
+        <w:t xml:space="preserve">#84  The parked dashboard Refund button had three bugs</w:t>
+      </w:r>
+    </w:p>
+    <w:tbl>
+      <w:tblPr>
+        <w:tblW w:type="dxa" w:w="9026"/>
+        <w:tblBorders>
+          <w:top w:val="single" w:color="auto" w:sz="4"/>
+          <w:left w:val="single" w:color="auto" w:sz="4"/>
+          <w:bottom w:val="single" w:color="auto" w:sz="4"/>
+          <w:right w:val="single" w:color="auto" w:sz="4"/>
+          <w:insideH w:val="single" w:color="auto" w:sz="4"/>
+          <w:insideV w:val="single" w:color="auto" w:sz="4"/>
+        </w:tblBorders>
+      </w:tblPr>
+      <w:tblGrid>
+        <w:gridCol w:w="2200"/>
+        <w:gridCol w:w="6826"/>
+      </w:tblGrid>
+      <w:tr>
+        <w:tc>
+          <w:tcPr>
+            <w:tcW w:type="dxa" w:w="2200"/>
+            <w:tcBorders>
+              <w:top w:val="single" w:color="BFBFBF" w:sz="4"/>
+              <w:left w:val="single" w:color="BFBFBF" w:sz="4"/>
+              <w:bottom w:val="single" w:color="BFBFBF" w:sz="4"/>
+              <w:right w:val="single" w:color="BFBFBF" w:sz="4"/>
+            </w:tcBorders>
+            <w:shd w:fill="F2E6E8" w:color="auto" w:val="clear"/>
+            <w:tcMar>
+              <w:top w:type="dxa" w:w="80"/>
+              <w:left w:type="dxa" w:w="120"/>
+              <w:bottom w:type="dxa" w:w="80"/>
+              <w:right w:type="dxa" w:w="120"/>
+            </w:tcMar>
+          </w:tcPr>
+          <w:p>
+            <w:r>
+              <w:rPr>
+                <w:b/>
+                <w:bCs/>
+                <w:i w:val="false"/>
+                <w:iCs w:val="false"/>
+                <w:sz w:val="20"/>
+                <w:szCs w:val="20"/>
+              </w:rPr>
+              <w:t xml:space="preserve">Severity (our estimate)</w:t>
+            </w:r>
+          </w:p>
+        </w:tc>
+        <w:tc>
+          <w:tcPr>
+            <w:tcW w:type="dxa" w:w="6826"/>
+            <w:tcBorders>
+              <w:top w:val="single" w:color="BFBFBF" w:sz="4"/>
+              <w:left w:val="single" w:color="BFBFBF" w:sz="4"/>
+              <w:bottom w:val="single" w:color="BFBFBF" w:sz="4"/>
+              <w:right w:val="single" w:color="BFBFBF" w:sz="4"/>
+            </w:tcBorders>
+            <w:tcMar>
+              <w:top w:type="dxa" w:w="80"/>
+              <w:left w:type="dxa" w:w="120"/>
+              <w:bottom w:type="dxa" w:w="80"/>
+              <w:right w:type="dxa" w:w="120"/>
+            </w:tcMar>
+          </w:tcPr>
+          <w:p>
+            <w:r>
+              <w:rPr>
+                <w:b w:val="false"/>
+                <w:bCs w:val="false"/>
+                <w:i w:val="false"/>
+                <w:iCs w:val="false"/>
+                <w:sz w:val="20"/>
+                <w:szCs w:val="20"/>
+              </w:rPr>
+              <w:t xml:space="preserve">Medium — money</w:t>
+            </w:r>
+          </w:p>
+        </w:tc>
+      </w:tr>
+      <w:tr>
+        <w:tc>
+          <w:tcPr>
+            <w:tcW w:type="dxa" w:w="2200"/>
+            <w:tcBorders>
+              <w:top w:val="single" w:color="BFBFBF" w:sz="4"/>
+              <w:left w:val="single" w:color="BFBFBF" w:sz="4"/>
+              <w:bottom w:val="single" w:color="BFBFBF" w:sz="4"/>
+              <w:right w:val="single" w:color="BFBFBF" w:sz="4"/>
+            </w:tcBorders>
+            <w:shd w:fill="F2E6E8" w:color="auto" w:val="clear"/>
+            <w:tcMar>
+              <w:top w:type="dxa" w:w="80"/>
+              <w:left w:type="dxa" w:w="120"/>
+              <w:bottom w:type="dxa" w:w="80"/>
+              <w:right w:type="dxa" w:w="120"/>
+            </w:tcMar>
+          </w:tcPr>
+          <w:p>
+            <w:r>
+              <w:rPr>
+                <w:b/>
+                <w:bCs/>
+                <w:i w:val="false"/>
+                <w:iCs w:val="false"/>
+                <w:sz w:val="20"/>
+                <w:szCs w:val="20"/>
+              </w:rPr>
+              <w:t xml:space="preserve">Where</w:t>
+            </w:r>
+          </w:p>
+        </w:tc>
+        <w:tc>
+          <w:tcPr>
+            <w:tcW w:type="dxa" w:w="6826"/>
+            <w:tcBorders>
+              <w:top w:val="single" w:color="BFBFBF" w:sz="4"/>
+              <w:left w:val="single" w:color="BFBFBF" w:sz="4"/>
+              <w:bottom w:val="single" w:color="BFBFBF" w:sz="4"/>
+              <w:right w:val="single" w:color="BFBFBF" w:sz="4"/>
+            </w:tcBorders>
+            <w:tcMar>
+              <w:top w:type="dxa" w:w="80"/>
+              <w:left w:type="dxa" w:w="120"/>
+              <w:bottom w:type="dxa" w:w="80"/>
+              <w:right w:type="dxa" w:w="120"/>
+            </w:tcMar>
+          </w:tcPr>
+          <w:p>
+            <w:r>
+              <w:rPr>
+                <w:b w:val="false"/>
+                <w:bCs w:val="false"/>
+                <w:i w:val="false"/>
+                <w:iCs w:val="false"/>
+                <w:sz w:val="20"/>
+                <w:szCs w:val="20"/>
+              </w:rPr>
+              <w:t xml:space="preserve">apps/web/src/pages/transactions/RefundDrawer.tsx</w:t>
+            </w:r>
+          </w:p>
+        </w:tc>
+      </w:tr>
+      <w:tr>
+        <w:tc>
+          <w:tcPr>
+            <w:tcW w:type="dxa" w:w="2200"/>
+            <w:tcBorders>
+              <w:top w:val="single" w:color="BFBFBF" w:sz="4"/>
+              <w:left w:val="single" w:color="BFBFBF" w:sz="4"/>
+              <w:bottom w:val="single" w:color="BFBFBF" w:sz="4"/>
+              <w:right w:val="single" w:color="BFBFBF" w:sz="4"/>
+            </w:tcBorders>
+            <w:shd w:fill="F2E6E8" w:color="auto" w:val="clear"/>
+            <w:tcMar>
+              <w:top w:type="dxa" w:w="80"/>
+              <w:left w:type="dxa" w:w="120"/>
+              <w:bottom w:type="dxa" w:w="80"/>
+              <w:right w:type="dxa" w:w="120"/>
+            </w:tcMar>
+          </w:tcPr>
+          <w:p>
+            <w:r>
+              <w:rPr>
+                <w:b/>
+                <w:bCs/>
+                <w:i w:val="false"/>
+                <w:iCs w:val="false"/>
+                <w:sz w:val="20"/>
+                <w:szCs w:val="20"/>
+              </w:rPr>
+              <w:t xml:space="preserve">What's wrong</w:t>
+            </w:r>
+          </w:p>
+        </w:tc>
+        <w:tc>
+          <w:tcPr>
+            <w:tcW w:type="dxa" w:w="6826"/>
+            <w:tcBorders>
+              <w:top w:val="single" w:color="BFBFBF" w:sz="4"/>
+              <w:left w:val="single" w:color="BFBFBF" w:sz="4"/>
+              <w:bottom w:val="single" w:color="BFBFBF" w:sz="4"/>
+              <w:right w:val="single" w:color="BFBFBF" w:sz="4"/>
+            </w:tcBorders>
+            <w:tcMar>
+              <w:top w:type="dxa" w:w="80"/>
+              <w:left w:type="dxa" w:w="120"/>
+              <w:bottom w:type="dxa" w:w="80"/>
+              <w:right w:type="dxa" w:w="120"/>
+            </w:tcMar>
+          </w:tcPr>
+          <w:p>
+            <w:r>
+              <w:rPr>
+                <w:b w:val="false"/>
+                <w:bCs w:val="false"/>
+                <w:i w:val="false"/>
+                <w:iCs w:val="false"/>
+                <w:sz w:val="20"/>
+                <w:szCs w:val="20"/>
+              </w:rPr>
+              <w:t xml:space="preserve">A partially refunded payment could not be refunded again; the limit ignored what was already refunded; a new Idempotency-Key per click meant a double click could refund twice.</w:t>
+            </w:r>
+          </w:p>
+        </w:tc>
+      </w:tr>
+      <w:tr>
+        <w:tc>
+          <w:tcPr>
+            <w:tcW w:type="dxa" w:w="2200"/>
+            <w:tcBorders>
+              <w:top w:val="single" w:color="BFBFBF" w:sz="4"/>
+              <w:left w:val="single" w:color="BFBFBF" w:sz="4"/>
+              <w:bottom w:val="single" w:color="BFBFBF" w:sz="4"/>
+              <w:right w:val="single" w:color="BFBFBF" w:sz="4"/>
+            </w:tcBorders>
+            <w:shd w:fill="F2E6E8" w:color="auto" w:val="clear"/>
+            <w:tcMar>
+              <w:top w:type="dxa" w:w="80"/>
+              <w:left w:type="dxa" w:w="120"/>
+              <w:bottom w:type="dxa" w:w="80"/>
+              <w:right w:type="dxa" w:w="120"/>
+            </w:tcMar>
+          </w:tcPr>
+          <w:p>
+            <w:r>
+              <w:rPr>
+                <w:b/>
+                <w:bCs/>
+                <w:i w:val="false"/>
+                <w:iCs w:val="false"/>
+                <w:sz w:val="20"/>
+                <w:szCs w:val="20"/>
+              </w:rPr>
+              <w:t xml:space="preserve">Fix</w:t>
+            </w:r>
+          </w:p>
+        </w:tc>
+        <w:tc>
+          <w:tcPr>
+            <w:tcW w:type="dxa" w:w="6826"/>
+            <w:tcBorders>
+              <w:top w:val="single" w:color="BFBFBF" w:sz="4"/>
+              <w:left w:val="single" w:color="BFBFBF" w:sz="4"/>
+              <w:bottom w:val="single" w:color="BFBFBF" w:sz="4"/>
+              <w:right w:val="single" w:color="BFBFBF" w:sz="4"/>
+            </w:tcBorders>
+            <w:tcMar>
+              <w:top w:type="dxa" w:w="80"/>
+              <w:left w:type="dxa" w:w="120"/>
+              <w:bottom w:type="dxa" w:w="80"/>
+              <w:right w:type="dxa" w:w="120"/>
+            </w:tcMar>
+          </w:tcPr>
+          <w:p>
+            <w:r>
+              <w:rPr>
+                <w:b w:val="false"/>
+                <w:bCs w:val="false"/>
+                <w:i w:val="false"/>
+                <w:iCs w:val="false"/>
+                <w:sz w:val="20"/>
+                <w:szCs w:val="20"/>
+              </w:rPr>
+              <w:t xml:space="preserve">Allow partially_refunded, limit = captured - refunded (API now returns refundedFils), one key per opened form.</w:t>
+            </w:r>
+          </w:p>
+        </w:tc>
+      </w:tr>
+      <w:tr>
+        <w:tc>
+          <w:tcPr>
+            <w:tcW w:type="dxa" w:w="2200"/>
+            <w:tcBorders>
+              <w:top w:val="single" w:color="BFBFBF" w:sz="4"/>
+              <w:left w:val="single" w:color="BFBFBF" w:sz="4"/>
+              <w:bottom w:val="single" w:color="BFBFBF" w:sz="4"/>
+              <w:right w:val="single" w:color="BFBFBF" w:sz="4"/>
+            </w:tcBorders>
+            <w:shd w:fill="F2E6E8" w:color="auto" w:val="clear"/>
+            <w:tcMar>
+              <w:top w:type="dxa" w:w="80"/>
+              <w:left w:type="dxa" w:w="120"/>
+              <w:bottom w:type="dxa" w:w="80"/>
+              <w:right w:type="dxa" w:w="120"/>
+            </w:tcMar>
+          </w:tcPr>
+          <w:p>
+            <w:r>
+              <w:rPr>
+                <w:b/>
+                <w:bCs/>
+                <w:i w:val="false"/>
+                <w:iCs w:val="false"/>
+                <w:sz w:val="20"/>
+                <w:szCs w:val="20"/>
+              </w:rPr>
+              <w:t xml:space="preserve">Proof</w:t>
+            </w:r>
+          </w:p>
+        </w:tc>
+        <w:tc>
+          <w:tcPr>
+            <w:tcW w:type="dxa" w:w="6826"/>
+            <w:tcBorders>
+              <w:top w:val="single" w:color="BFBFBF" w:sz="4"/>
+              <w:left w:val="single" w:color="BFBFBF" w:sz="4"/>
+              <w:bottom w:val="single" w:color="BFBFBF" w:sz="4"/>
+              <w:right w:val="single" w:color="BFBFBF" w:sz="4"/>
+            </w:tcBorders>
+            <w:tcMar>
+              <w:top w:type="dxa" w:w="80"/>
+              <w:left w:type="dxa" w:w="120"/>
+              <w:bottom w:type="dxa" w:w="80"/>
+              <w:right w:type="dxa" w:w="120"/>
+            </w:tcMar>
+          </w:tcPr>
+          <w:p>
+            <w:r>
+              <w:rPr>
+                <w:b w:val="false"/>
+                <w:bCs w:val="false"/>
+                <w:i w:val="false"/>
+                <w:iCs w:val="false"/>
+                <w:sz w:val="20"/>
+                <w:szCs w:val="20"/>
+              </w:rPr>
+              <w:t xml:space="preserve">Browser run: 100 BD partial then full refund of a 473.457 BD payment; ledger balanced.</w:t>
             </w:r>
           </w:p>
         </w:tc>

</xml_diff>